<commit_message>
Controlled mode: fixes from the independent test review; manual humanizer pass
- The app starts only when the server confirms the required password change
  (starting password, reset or expiry) is done; shinymanager_where comes from
  the browser and is no longer trusted on its own. An attempt raises a
  security alert. (review finding C1)
- Signing a record or the trail review is refused while a password change is
  due, and once the reviewer role has been removed from the account; roles
  are re-read from the store at signing. (C1, M2)
- A signature binds to the record shown in the signing dialog; a changed
  selection or a submit without the dialog is refused.
- Tests GXP-41..43 (478 automated tests, 349 critical).
- Manual: 8 wording edits from the humanizer pass.

Co-Authored-By: Claude Opus 5.5 <noreply@anthropic.com>
</commit_message>
<xml_diff>
--- a/NCA_Assistant_User_Manual_v1.9.docx
+++ b/NCA_Assistant_User_Manual_v1.9.docx
@@ -18749,7 +18749,7 @@
         <w:spacing w:after="120" w:line="276" w:lineRule="auto"/>
       </w:pPr>
       <w:r>
-        <w:t>Change it at once, and tell the system owner, when you think someone else knows it. If you have forgotten it, ask the system owner for a reset: you then sign in with admin and choose a new password.</w:t>
+        <w:t>If you think someone else knows it, change it at once and tell the system owner. If you have forgotten it, ask the system owner for a reset: you then sign in with admin and choose a new password.</w:t>
       </w:r>
     </w:p>
     <w:p>
@@ -19074,7 +19074,7 @@
         <w:t>Sign</w:t>
       </w:r>
       <w:r>
-        <w:t>, or press Enter. After a wrong password the message says how many attempts are left; the third failure signs you out. A record is reviewed once. After that it stays approved, or rejected.</w:t>
+        <w:t>, or press Enter. After a wrong password the message says how many attempts are left; the third failure signs you out. A record is reviewed once, and then stays approved or rejected.</w:t>
       </w:r>
     </w:p>
     <w:p>
@@ -19243,20 +19243,16 @@
         <w:t>Export CSV</w:t>
       </w:r>
       <w:r>
-        <w:t xml:space="preserve"> saves the entries of the current filter, for example one study, with the result of the check at the top. After a review, reviewers click </w:t>
+        <w:t xml:space="preserve"> saves the entries of the current filter, for example one study, with the result of the check at the top. After a review, a reviewer clicks Sign trail review and signs with user ID and password; this records the period</w:t>
       </w:r>
       <w:r>
         <w:rPr>
           <w:b/>
         </w:rPr>
-        <w:t>Sign trail review</w:t>
-      </w:r>
-      <w:r>
-        <w:t xml:space="preserve"> and sign with user ID and </w:t>
-      </w:r>
-      <w:r>
-        <w:lastRenderedPageBreak/>
-        <w:t>password; this records the period you reviewed. How often to review, and what else triggers a review, is set by your organisation's procedure.</w:t>
+      </w:r>
+      <w:r/>
+      <w:r>
+        <w:t xml:space="preserve"> reviewed. How often to review, and what else triggers a review, is set by your organisation's procedure.</w:t>
       </w:r>
     </w:p>
     <w:p>
@@ -19480,7 +19476,7 @@
         <w:spacing w:after="120" w:line="276" w:lineRule="auto"/>
       </w:pPr>
       <w:r>
-        <w:t>NCA Assistant is open-source software without warranty or supplier support, and it is not validated for your use. It performs average bioequivalence only, not ABEL or RSABE. The public instance on shinyapps.io is outside the scope of any qualification: its package versions are set by the deployment, not by the validated release. For records under 21 CFR Part 11 or EU GMP Annex 11, use a controlled installation; controlled mode is qualified for the server on which it was qualified, not in general.</w:t>
+        <w:t>NCA Assistant is open-source software without warranty or supplier support, and it is not validated for your use. It performs average bioequivalence only, not ABEL or RSABE. The public instance on shinyapps.io is outside the scope of any qualification: its package versions are set by the deployment, not by the validated release. For records under 21 CFR Part 11 or EU GMP Annex 11, use a controlled installation; a qualification of controlled mode holds only for the server on which it was carried out, not in general.</w:t>
       </w:r>
     </w:p>
     <w:p>
@@ -19719,7 +19715,7 @@
         <w:t>Limits you accept.</w:t>
       </w:r>
       <w:r>
-        <w:t xml:space="preserve"> A new account can be taken over with the starting password admin by someone who knows the user ID, until its owner signs in: create accounts only when the owner signs in at once. The audit trail shows any change, but someone with root access to the server could rebuild it; the heads you file, the signature sheets and the backups are what show this. Reviewers see every study on the server: separate sponsors need separate installations. A deactivated user's open session runs on until the 15-minute timeout, although signing is refused at once.</w:t>
+        <w:t xml:space="preserve"> Until its owner signs in, a new account can be taken over with the starting password admin by anyone who knows the user ID: create accounts only when the owner signs in at once. The audit trail shows any change, but someone with root access to the server could rebuild it; the heads you file, the signature sheets and the backups would reveal such a rebuild. Reviewers see every study on the server: separate sponsors need separate installations. A deactivated user's open session runs on until the 15-minute timeout, although signing is refused at once.</w:t>
       </w:r>
     </w:p>
     <w:p>
@@ -30833,7 +30829,7 @@
                 <w:sz w:val="20"/>
                 <w:szCs w:val="20"/>
               </w:rPr>
-              <w:t>On a controlled installation: the record of who did what, when and on which data, kept on the server and protected against change</w:t>
+              <w:t>On a controlled installation: the record of who did what, when and on which data, kept on the server; entries cannot be changed through the app, and any change made otherwise shows</w:t>
             </w:r>
           </w:p>
         </w:tc>
@@ -34272,7 +34268,7 @@
         <w:t>I was signed out while working</w:t>
       </w:r>
       <w:r>
-        <w:t>: nothing happened for 15 minutes. Upload the file again; records you created are stored on the server.</w:t>
+        <w:t>: there was no activity for 15 minutes. Upload the file again; records you created are stored on the server.</w:t>
       </w:r>
     </w:p>
     <w:p>
@@ -34407,7 +34403,7 @@
         <w:spacing w:after="120" w:line="276" w:lineRule="auto"/>
       </w:pPr>
       <w:r>
-        <w:t>2. Put the tagged release in /srv/shiny-server/nca, owned by root and read-only for the service account shiny. Create the empty file gxp/CONTROLLED in it, owned by root: with it, the app does not start without controlled mode.</w:t>
+        <w:t>2. Put the tagged release in /srv/shiny-server/nca, owned by root and read-only for the service account shiny. Create the empty file gxp/CONTROLLED in it, owned by root: while this file exists, the app starts only in controlled mode.</w:t>
       </w:r>
     </w:p>
     <w:p>

</xml_diff>

<commit_message>
Truncation check against filed heads in manage_users.R verify
verify accepts the heads filed from 'head' (seq:hash) and reports entries
removed from the end of the trail, which a bare chain check cannot see
(review finding M3). head prints the seq:hash form to file. Manual command
table updated. Test GXP-44 (479 automated tests, 350 critical).

Co-Authored-By: Claude Opus 5.5 <noreply@anthropic.com>
</commit_message>
<xml_diff>
--- a/NCA_Assistant_User_Manual_v1.9.docx
+++ b/NCA_Assistant_User_Manual_v1.9.docx
@@ -35261,7 +35261,7 @@
                 <w:sz w:val="20"/>
                 <w:szCs w:val="20"/>
               </w:rPr>
-              <w:t>verify</w:t>
+              <w:t>verify [folder] [seq:hash ...]</w:t>
             </w:r>
           </w:p>
         </w:tc>
@@ -35287,7 +35287,7 @@
                 <w:sz w:val="20"/>
                 <w:szCs w:val="20"/>
               </w:rPr>
-              <w:t>Checks the audit trail; verify folder checks an archived copy, also on another computer</w:t>
+              <w:t>Checks the audit trail; verify folder checks an archived copy, also on another computer. Add the heads you filed, for example verify 1234:&lt;hash&gt;, to check that those entries are still there: without them, entries removed from the end of the trail do not show.</w:t>
             </w:r>
           </w:p>
         </w:tc>
@@ -35341,7 +35341,7 @@
                 <w:sz w:val="20"/>
                 <w:szCs w:val="20"/>
               </w:rPr>
-              <w:t>Prints the last entry of the trail: file it in your quality system at a fixed interval</w:t>
+              <w:t>Prints the last entry of the trail as seq:hash: file it in your quality system at a fixed interval, and give the filed heads to verify</w:t>
             </w:r>
           </w:p>
         </w:tc>

</xml_diff>

<commit_message>
Release files refreshed after the fixes: manual PDF, manifest, protocol
Green run: 480 automated tests pass (62 manual), URS 89/89; protocol
section 3.20 lists 45 controlled-mode tests.

Co-Authored-By: Claude Opus 5.5 <noreply@anthropic.com>
</commit_message>
<xml_diff>
--- a/NCA_Assistant_User_Manual_v1.9.docx
+++ b/NCA_Assistant_User_Manual_v1.9.docx
@@ -154,7 +154,7 @@
       <w:pPr>
         <w:pStyle w:val="Kop1"/>
       </w:pPr>
-      <w:bookmarkStart w:id="0" w:name="_Toc241354257"/>
+      <w:bookmarkStart w:id="0" w:name="_Toc241361694"/>
       <w:r>
         <w:lastRenderedPageBreak/>
         <w:t>Table of Contents</w:t>
@@ -192,7 +192,7 @@
           <w:r>
             <w:fldChar w:fldCharType="separate"/>
           </w:r>
-          <w:hyperlink w:anchor="_Toc241354257" w:history="1">
+          <w:hyperlink w:anchor="_Toc241361694" w:history="1">
             <w:r>
               <w:rPr>
                 <w:rStyle w:val="Hyperlink"/>
@@ -216,7 +216,7 @@
               <w:rPr>
                 <w:noProof/>
               </w:rPr>
-              <w:instrText xml:space="preserve"> PAGEREF _Toc241354257 \h </w:instrText>
+              <w:instrText xml:space="preserve"> PAGEREF _Toc241361694 \h </w:instrText>
             </w:r>
             <w:r>
               <w:rPr>
@@ -258,7 +258,7 @@
               <w14:ligatures w14:val="standardContextual"/>
             </w:rPr>
           </w:pPr>
-          <w:hyperlink w:anchor="_Toc241354258" w:history="1">
+          <w:hyperlink w:anchor="_Toc241361695" w:history="1">
             <w:r>
               <w:rPr>
                 <w:rStyle w:val="Hyperlink"/>
@@ -282,7 +282,7 @@
               <w:rPr>
                 <w:noProof/>
               </w:rPr>
-              <w:instrText xml:space="preserve"> PAGEREF _Toc241354258 \h </w:instrText>
+              <w:instrText xml:space="preserve"> PAGEREF _Toc241361695 \h </w:instrText>
             </w:r>
             <w:r>
               <w:rPr>
@@ -324,7 +324,7 @@
               <w14:ligatures w14:val="standardContextual"/>
             </w:rPr>
           </w:pPr>
-          <w:hyperlink w:anchor="_Toc241354259" w:history="1">
+          <w:hyperlink w:anchor="_Toc241361696" w:history="1">
             <w:r>
               <w:rPr>
                 <w:rStyle w:val="Hyperlink"/>
@@ -348,7 +348,7 @@
               <w:rPr>
                 <w:noProof/>
               </w:rPr>
-              <w:instrText xml:space="preserve"> PAGEREF _Toc241354259 \h </w:instrText>
+              <w:instrText xml:space="preserve"> PAGEREF _Toc241361696 \h </w:instrText>
             </w:r>
             <w:r>
               <w:rPr>
@@ -390,7 +390,7 @@
               <w14:ligatures w14:val="standardContextual"/>
             </w:rPr>
           </w:pPr>
-          <w:hyperlink w:anchor="_Toc241354260" w:history="1">
+          <w:hyperlink w:anchor="_Toc241361697" w:history="1">
             <w:r>
               <w:rPr>
                 <w:rStyle w:val="Hyperlink"/>
@@ -414,7 +414,7 @@
               <w:rPr>
                 <w:noProof/>
               </w:rPr>
-              <w:instrText xml:space="preserve"> PAGEREF _Toc241354260 \h </w:instrText>
+              <w:instrText xml:space="preserve"> PAGEREF _Toc241361697 \h </w:instrText>
             </w:r>
             <w:r>
               <w:rPr>
@@ -456,7 +456,7 @@
               <w14:ligatures w14:val="standardContextual"/>
             </w:rPr>
           </w:pPr>
-          <w:hyperlink w:anchor="_Toc241354261" w:history="1">
+          <w:hyperlink w:anchor="_Toc241361698" w:history="1">
             <w:r>
               <w:rPr>
                 <w:rStyle w:val="Hyperlink"/>
@@ -480,7 +480,7 @@
               <w:rPr>
                 <w:noProof/>
               </w:rPr>
-              <w:instrText xml:space="preserve"> PAGEREF _Toc241354261 \h </w:instrText>
+              <w:instrText xml:space="preserve"> PAGEREF _Toc241361698 \h </w:instrText>
             </w:r>
             <w:r>
               <w:rPr>
@@ -522,7 +522,7 @@
               <w14:ligatures w14:val="standardContextual"/>
             </w:rPr>
           </w:pPr>
-          <w:hyperlink w:anchor="_Toc241354262" w:history="1">
+          <w:hyperlink w:anchor="_Toc241361699" w:history="1">
             <w:r>
               <w:rPr>
                 <w:rStyle w:val="Hyperlink"/>
@@ -546,7 +546,7 @@
               <w:rPr>
                 <w:noProof/>
               </w:rPr>
-              <w:instrText xml:space="preserve"> PAGEREF _Toc241354262 \h </w:instrText>
+              <w:instrText xml:space="preserve"> PAGEREF _Toc241361699 \h </w:instrText>
             </w:r>
             <w:r>
               <w:rPr>
@@ -588,7 +588,7 @@
               <w14:ligatures w14:val="standardContextual"/>
             </w:rPr>
           </w:pPr>
-          <w:hyperlink w:anchor="_Toc241354263" w:history="1">
+          <w:hyperlink w:anchor="_Toc241361700" w:history="1">
             <w:r>
               <w:rPr>
                 <w:rStyle w:val="Hyperlink"/>
@@ -612,7 +612,7 @@
               <w:rPr>
                 <w:noProof/>
               </w:rPr>
-              <w:instrText xml:space="preserve"> PAGEREF _Toc241354263 \h </w:instrText>
+              <w:instrText xml:space="preserve"> PAGEREF _Toc241361700 \h </w:instrText>
             </w:r>
             <w:r>
               <w:rPr>
@@ -654,7 +654,7 @@
               <w14:ligatures w14:val="standardContextual"/>
             </w:rPr>
           </w:pPr>
-          <w:hyperlink w:anchor="_Toc241354264" w:history="1">
+          <w:hyperlink w:anchor="_Toc241361701" w:history="1">
             <w:r>
               <w:rPr>
                 <w:rStyle w:val="Hyperlink"/>
@@ -678,7 +678,7 @@
               <w:rPr>
                 <w:noProof/>
               </w:rPr>
-              <w:instrText xml:space="preserve"> PAGEREF _Toc241354264 \h </w:instrText>
+              <w:instrText xml:space="preserve"> PAGEREF _Toc241361701 \h </w:instrText>
             </w:r>
             <w:r>
               <w:rPr>
@@ -720,7 +720,7 @@
               <w14:ligatures w14:val="standardContextual"/>
             </w:rPr>
           </w:pPr>
-          <w:hyperlink w:anchor="_Toc241354265" w:history="1">
+          <w:hyperlink w:anchor="_Toc241361702" w:history="1">
             <w:r>
               <w:rPr>
                 <w:rStyle w:val="Hyperlink"/>
@@ -744,7 +744,7 @@
               <w:rPr>
                 <w:noProof/>
               </w:rPr>
-              <w:instrText xml:space="preserve"> PAGEREF _Toc241354265 \h </w:instrText>
+              <w:instrText xml:space="preserve"> PAGEREF _Toc241361702 \h </w:instrText>
             </w:r>
             <w:r>
               <w:rPr>
@@ -786,7 +786,7 @@
               <w14:ligatures w14:val="standardContextual"/>
             </w:rPr>
           </w:pPr>
-          <w:hyperlink w:anchor="_Toc241354266" w:history="1">
+          <w:hyperlink w:anchor="_Toc241361703" w:history="1">
             <w:r>
               <w:rPr>
                 <w:rStyle w:val="Hyperlink"/>
@@ -810,7 +810,7 @@
               <w:rPr>
                 <w:noProof/>
               </w:rPr>
-              <w:instrText xml:space="preserve"> PAGEREF _Toc241354266 \h </w:instrText>
+              <w:instrText xml:space="preserve"> PAGEREF _Toc241361703 \h </w:instrText>
             </w:r>
             <w:r>
               <w:rPr>
@@ -852,7 +852,7 @@
               <w14:ligatures w14:val="standardContextual"/>
             </w:rPr>
           </w:pPr>
-          <w:hyperlink w:anchor="_Toc241354267" w:history="1">
+          <w:hyperlink w:anchor="_Toc241361704" w:history="1">
             <w:r>
               <w:rPr>
                 <w:rStyle w:val="Hyperlink"/>
@@ -876,7 +876,7 @@
               <w:rPr>
                 <w:noProof/>
               </w:rPr>
-              <w:instrText xml:space="preserve"> PAGEREF _Toc241354267 \h </w:instrText>
+              <w:instrText xml:space="preserve"> PAGEREF _Toc241361704 \h </w:instrText>
             </w:r>
             <w:r>
               <w:rPr>
@@ -918,7 +918,7 @@
               <w14:ligatures w14:val="standardContextual"/>
             </w:rPr>
           </w:pPr>
-          <w:hyperlink w:anchor="_Toc241354268" w:history="1">
+          <w:hyperlink w:anchor="_Toc241361705" w:history="1">
             <w:r>
               <w:rPr>
                 <w:rStyle w:val="Hyperlink"/>
@@ -942,7 +942,7 @@
               <w:rPr>
                 <w:noProof/>
               </w:rPr>
-              <w:instrText xml:space="preserve"> PAGEREF _Toc241354268 \h </w:instrText>
+              <w:instrText xml:space="preserve"> PAGEREF _Toc241361705 \h </w:instrText>
             </w:r>
             <w:r>
               <w:rPr>
@@ -984,7 +984,7 @@
               <w14:ligatures w14:val="standardContextual"/>
             </w:rPr>
           </w:pPr>
-          <w:hyperlink w:anchor="_Toc241354269" w:history="1">
+          <w:hyperlink w:anchor="_Toc241361706" w:history="1">
             <w:r>
               <w:rPr>
                 <w:rStyle w:val="Hyperlink"/>
@@ -1008,7 +1008,7 @@
               <w:rPr>
                 <w:noProof/>
               </w:rPr>
-              <w:instrText xml:space="preserve"> PAGEREF _Toc241354269 \h </w:instrText>
+              <w:instrText xml:space="preserve"> PAGEREF _Toc241361706 \h </w:instrText>
             </w:r>
             <w:r>
               <w:rPr>
@@ -1050,7 +1050,7 @@
               <w14:ligatures w14:val="standardContextual"/>
             </w:rPr>
           </w:pPr>
-          <w:hyperlink w:anchor="_Toc241354270" w:history="1">
+          <w:hyperlink w:anchor="_Toc241361707" w:history="1">
             <w:r>
               <w:rPr>
                 <w:rStyle w:val="Hyperlink"/>
@@ -1074,7 +1074,7 @@
               <w:rPr>
                 <w:noProof/>
               </w:rPr>
-              <w:instrText xml:space="preserve"> PAGEREF _Toc241354270 \h </w:instrText>
+              <w:instrText xml:space="preserve"> PAGEREF _Toc241361707 \h </w:instrText>
             </w:r>
             <w:r>
               <w:rPr>
@@ -1116,7 +1116,7 @@
               <w14:ligatures w14:val="standardContextual"/>
             </w:rPr>
           </w:pPr>
-          <w:hyperlink w:anchor="_Toc241354271" w:history="1">
+          <w:hyperlink w:anchor="_Toc241361708" w:history="1">
             <w:r>
               <w:rPr>
                 <w:rStyle w:val="Hyperlink"/>
@@ -1140,7 +1140,7 @@
               <w:rPr>
                 <w:noProof/>
               </w:rPr>
-              <w:instrText xml:space="preserve"> PAGEREF _Toc241354271 \h </w:instrText>
+              <w:instrText xml:space="preserve"> PAGEREF _Toc241361708 \h </w:instrText>
             </w:r>
             <w:r>
               <w:rPr>
@@ -1182,7 +1182,7 @@
               <w14:ligatures w14:val="standardContextual"/>
             </w:rPr>
           </w:pPr>
-          <w:hyperlink w:anchor="_Toc241354272" w:history="1">
+          <w:hyperlink w:anchor="_Toc241361709" w:history="1">
             <w:r>
               <w:rPr>
                 <w:rStyle w:val="Hyperlink"/>
@@ -1206,7 +1206,7 @@
               <w:rPr>
                 <w:noProof/>
               </w:rPr>
-              <w:instrText xml:space="preserve"> PAGEREF _Toc241354272 \h </w:instrText>
+              <w:instrText xml:space="preserve"> PAGEREF _Toc241361709 \h </w:instrText>
             </w:r>
             <w:r>
               <w:rPr>
@@ -1248,7 +1248,7 @@
               <w14:ligatures w14:val="standardContextual"/>
             </w:rPr>
           </w:pPr>
-          <w:hyperlink w:anchor="_Toc241354273" w:history="1">
+          <w:hyperlink w:anchor="_Toc241361710" w:history="1">
             <w:r>
               <w:rPr>
                 <w:rStyle w:val="Hyperlink"/>
@@ -1272,7 +1272,7 @@
               <w:rPr>
                 <w:noProof/>
               </w:rPr>
-              <w:instrText xml:space="preserve"> PAGEREF _Toc241354273 \h </w:instrText>
+              <w:instrText xml:space="preserve"> PAGEREF _Toc241361710 \h </w:instrText>
             </w:r>
             <w:r>
               <w:rPr>
@@ -1314,7 +1314,7 @@
               <w14:ligatures w14:val="standardContextual"/>
             </w:rPr>
           </w:pPr>
-          <w:hyperlink w:anchor="_Toc241354274" w:history="1">
+          <w:hyperlink w:anchor="_Toc241361711" w:history="1">
             <w:r>
               <w:rPr>
                 <w:rStyle w:val="Hyperlink"/>
@@ -1338,7 +1338,7 @@
               <w:rPr>
                 <w:noProof/>
               </w:rPr>
-              <w:instrText xml:space="preserve"> PAGEREF _Toc241354274 \h </w:instrText>
+              <w:instrText xml:space="preserve"> PAGEREF _Toc241361711 \h </w:instrText>
             </w:r>
             <w:r>
               <w:rPr>
@@ -1380,7 +1380,7 @@
               <w14:ligatures w14:val="standardContextual"/>
             </w:rPr>
           </w:pPr>
-          <w:hyperlink w:anchor="_Toc241354275" w:history="1">
+          <w:hyperlink w:anchor="_Toc241361712" w:history="1">
             <w:r>
               <w:rPr>
                 <w:rStyle w:val="Hyperlink"/>
@@ -1404,7 +1404,7 @@
               <w:rPr>
                 <w:noProof/>
               </w:rPr>
-              <w:instrText xml:space="preserve"> PAGEREF _Toc241354275 \h </w:instrText>
+              <w:instrText xml:space="preserve"> PAGEREF _Toc241361712 \h </w:instrText>
             </w:r>
             <w:r>
               <w:rPr>
@@ -1446,7 +1446,7 @@
               <w14:ligatures w14:val="standardContextual"/>
             </w:rPr>
           </w:pPr>
-          <w:hyperlink w:anchor="_Toc241354276" w:history="1">
+          <w:hyperlink w:anchor="_Toc241361713" w:history="1">
             <w:r>
               <w:rPr>
                 <w:rStyle w:val="Hyperlink"/>
@@ -1470,7 +1470,7 @@
               <w:rPr>
                 <w:noProof/>
               </w:rPr>
-              <w:instrText xml:space="preserve"> PAGEREF _Toc241354276 \h </w:instrText>
+              <w:instrText xml:space="preserve"> PAGEREF _Toc241361713 \h </w:instrText>
             </w:r>
             <w:r>
               <w:rPr>
@@ -1512,7 +1512,7 @@
               <w14:ligatures w14:val="standardContextual"/>
             </w:rPr>
           </w:pPr>
-          <w:hyperlink w:anchor="_Toc241354277" w:history="1">
+          <w:hyperlink w:anchor="_Toc241361714" w:history="1">
             <w:r>
               <w:rPr>
                 <w:rStyle w:val="Hyperlink"/>
@@ -1536,7 +1536,7 @@
               <w:rPr>
                 <w:noProof/>
               </w:rPr>
-              <w:instrText xml:space="preserve"> PAGEREF _Toc241354277 \h </w:instrText>
+              <w:instrText xml:space="preserve"> PAGEREF _Toc241361714 \h </w:instrText>
             </w:r>
             <w:r>
               <w:rPr>
@@ -1578,7 +1578,7 @@
               <w14:ligatures w14:val="standardContextual"/>
             </w:rPr>
           </w:pPr>
-          <w:hyperlink w:anchor="_Toc241354278" w:history="1">
+          <w:hyperlink w:anchor="_Toc241361715" w:history="1">
             <w:r>
               <w:rPr>
                 <w:rStyle w:val="Hyperlink"/>
@@ -1602,7 +1602,7 @@
               <w:rPr>
                 <w:noProof/>
               </w:rPr>
-              <w:instrText xml:space="preserve"> PAGEREF _Toc241354278 \h </w:instrText>
+              <w:instrText xml:space="preserve"> PAGEREF _Toc241361715 \h </w:instrText>
             </w:r>
             <w:r>
               <w:rPr>
@@ -1644,7 +1644,7 @@
               <w14:ligatures w14:val="standardContextual"/>
             </w:rPr>
           </w:pPr>
-          <w:hyperlink w:anchor="_Toc241354279" w:history="1">
+          <w:hyperlink w:anchor="_Toc241361716" w:history="1">
             <w:r>
               <w:rPr>
                 <w:rStyle w:val="Hyperlink"/>
@@ -1668,7 +1668,7 @@
               <w:rPr>
                 <w:noProof/>
               </w:rPr>
-              <w:instrText xml:space="preserve"> PAGEREF _Toc241354279 \h </w:instrText>
+              <w:instrText xml:space="preserve"> PAGEREF _Toc241361716 \h </w:instrText>
             </w:r>
             <w:r>
               <w:rPr>
@@ -1710,7 +1710,7 @@
               <w14:ligatures w14:val="standardContextual"/>
             </w:rPr>
           </w:pPr>
-          <w:hyperlink w:anchor="_Toc241354280" w:history="1">
+          <w:hyperlink w:anchor="_Toc241361717" w:history="1">
             <w:r>
               <w:rPr>
                 <w:rStyle w:val="Hyperlink"/>
@@ -1734,7 +1734,7 @@
               <w:rPr>
                 <w:noProof/>
               </w:rPr>
-              <w:instrText xml:space="preserve"> PAGEREF _Toc241354280 \h </w:instrText>
+              <w:instrText xml:space="preserve"> PAGEREF _Toc241361717 \h </w:instrText>
             </w:r>
             <w:r>
               <w:rPr>
@@ -1776,7 +1776,7 @@
               <w14:ligatures w14:val="standardContextual"/>
             </w:rPr>
           </w:pPr>
-          <w:hyperlink w:anchor="_Toc241354281" w:history="1">
+          <w:hyperlink w:anchor="_Toc241361718" w:history="1">
             <w:r>
               <w:rPr>
                 <w:rStyle w:val="Hyperlink"/>
@@ -1800,7 +1800,7 @@
               <w:rPr>
                 <w:noProof/>
               </w:rPr>
-              <w:instrText xml:space="preserve"> PAGEREF _Toc241354281 \h </w:instrText>
+              <w:instrText xml:space="preserve"> PAGEREF _Toc241361718 \h </w:instrText>
             </w:r>
             <w:r>
               <w:rPr>
@@ -1842,7 +1842,7 @@
               <w14:ligatures w14:val="standardContextual"/>
             </w:rPr>
           </w:pPr>
-          <w:hyperlink w:anchor="_Toc241354282" w:history="1">
+          <w:hyperlink w:anchor="_Toc241361719" w:history="1">
             <w:r>
               <w:rPr>
                 <w:rStyle w:val="Hyperlink"/>
@@ -1866,7 +1866,7 @@
               <w:rPr>
                 <w:noProof/>
               </w:rPr>
-              <w:instrText xml:space="preserve"> PAGEREF _Toc241354282 \h </w:instrText>
+              <w:instrText xml:space="preserve"> PAGEREF _Toc241361719 \h </w:instrText>
             </w:r>
             <w:r>
               <w:rPr>
@@ -1908,7 +1908,7 @@
               <w14:ligatures w14:val="standardContextual"/>
             </w:rPr>
           </w:pPr>
-          <w:hyperlink w:anchor="_Toc241354283" w:history="1">
+          <w:hyperlink w:anchor="_Toc241361720" w:history="1">
             <w:r>
               <w:rPr>
                 <w:rStyle w:val="Hyperlink"/>
@@ -1932,7 +1932,7 @@
               <w:rPr>
                 <w:noProof/>
               </w:rPr>
-              <w:instrText xml:space="preserve"> PAGEREF _Toc241354283 \h </w:instrText>
+              <w:instrText xml:space="preserve"> PAGEREF _Toc241361720 \h </w:instrText>
             </w:r>
             <w:r>
               <w:rPr>
@@ -1974,7 +1974,7 @@
               <w14:ligatures w14:val="standardContextual"/>
             </w:rPr>
           </w:pPr>
-          <w:hyperlink w:anchor="_Toc241354284" w:history="1">
+          <w:hyperlink w:anchor="_Toc241361721" w:history="1">
             <w:r>
               <w:rPr>
                 <w:rStyle w:val="Hyperlink"/>
@@ -1998,7 +1998,7 @@
               <w:rPr>
                 <w:noProof/>
               </w:rPr>
-              <w:instrText xml:space="preserve"> PAGEREF _Toc241354284 \h </w:instrText>
+              <w:instrText xml:space="preserve"> PAGEREF _Toc241361721 \h </w:instrText>
             </w:r>
             <w:r>
               <w:rPr>
@@ -2040,7 +2040,7 @@
               <w14:ligatures w14:val="standardContextual"/>
             </w:rPr>
           </w:pPr>
-          <w:hyperlink w:anchor="_Toc241354285" w:history="1">
+          <w:hyperlink w:anchor="_Toc241361722" w:history="1">
             <w:r>
               <w:rPr>
                 <w:rStyle w:val="Hyperlink"/>
@@ -2064,7 +2064,7 @@
               <w:rPr>
                 <w:noProof/>
               </w:rPr>
-              <w:instrText xml:space="preserve"> PAGEREF _Toc241354285 \h </w:instrText>
+              <w:instrText xml:space="preserve"> PAGEREF _Toc241361722 \h </w:instrText>
             </w:r>
             <w:r>
               <w:rPr>
@@ -2106,7 +2106,7 @@
               <w14:ligatures w14:val="standardContextual"/>
             </w:rPr>
           </w:pPr>
-          <w:hyperlink w:anchor="_Toc241354286" w:history="1">
+          <w:hyperlink w:anchor="_Toc241361723" w:history="1">
             <w:r>
               <w:rPr>
                 <w:rStyle w:val="Hyperlink"/>
@@ -2130,7 +2130,7 @@
               <w:rPr>
                 <w:noProof/>
               </w:rPr>
-              <w:instrText xml:space="preserve"> PAGEREF _Toc241354286 \h </w:instrText>
+              <w:instrText xml:space="preserve"> PAGEREF _Toc241361723 \h </w:instrText>
             </w:r>
             <w:r>
               <w:rPr>
@@ -2172,7 +2172,7 @@
               <w14:ligatures w14:val="standardContextual"/>
             </w:rPr>
           </w:pPr>
-          <w:hyperlink w:anchor="_Toc241354287" w:history="1">
+          <w:hyperlink w:anchor="_Toc241361724" w:history="1">
             <w:r>
               <w:rPr>
                 <w:rStyle w:val="Hyperlink"/>
@@ -2196,7 +2196,7 @@
               <w:rPr>
                 <w:noProof/>
               </w:rPr>
-              <w:instrText xml:space="preserve"> PAGEREF _Toc241354287 \h </w:instrText>
+              <w:instrText xml:space="preserve"> PAGEREF _Toc241361724 \h </w:instrText>
             </w:r>
             <w:r>
               <w:rPr>
@@ -2238,7 +2238,7 @@
               <w14:ligatures w14:val="standardContextual"/>
             </w:rPr>
           </w:pPr>
-          <w:hyperlink w:anchor="_Toc241354288" w:history="1">
+          <w:hyperlink w:anchor="_Toc241361725" w:history="1">
             <w:r>
               <w:rPr>
                 <w:rStyle w:val="Hyperlink"/>
@@ -2262,7 +2262,7 @@
               <w:rPr>
                 <w:noProof/>
               </w:rPr>
-              <w:instrText xml:space="preserve"> PAGEREF _Toc241354288 \h </w:instrText>
+              <w:instrText xml:space="preserve"> PAGEREF _Toc241361725 \h </w:instrText>
             </w:r>
             <w:r>
               <w:rPr>
@@ -2304,7 +2304,7 @@
               <w14:ligatures w14:val="standardContextual"/>
             </w:rPr>
           </w:pPr>
-          <w:hyperlink w:anchor="_Toc241354289" w:history="1">
+          <w:hyperlink w:anchor="_Toc241361726" w:history="1">
             <w:r>
               <w:rPr>
                 <w:rStyle w:val="Hyperlink"/>
@@ -2328,7 +2328,7 @@
               <w:rPr>
                 <w:noProof/>
               </w:rPr>
-              <w:instrText xml:space="preserve"> PAGEREF _Toc241354289 \h </w:instrText>
+              <w:instrText xml:space="preserve"> PAGEREF _Toc241361726 \h </w:instrText>
             </w:r>
             <w:r>
               <w:rPr>
@@ -2370,7 +2370,7 @@
               <w14:ligatures w14:val="standardContextual"/>
             </w:rPr>
           </w:pPr>
-          <w:hyperlink w:anchor="_Toc241354290" w:history="1">
+          <w:hyperlink w:anchor="_Toc241361727" w:history="1">
             <w:r>
               <w:rPr>
                 <w:rStyle w:val="Hyperlink"/>
@@ -2394,7 +2394,7 @@
               <w:rPr>
                 <w:noProof/>
               </w:rPr>
-              <w:instrText xml:space="preserve"> PAGEREF _Toc241354290 \h </w:instrText>
+              <w:instrText xml:space="preserve"> PAGEREF _Toc241361727 \h </w:instrText>
             </w:r>
             <w:r>
               <w:rPr>
@@ -2436,7 +2436,7 @@
               <w14:ligatures w14:val="standardContextual"/>
             </w:rPr>
           </w:pPr>
-          <w:hyperlink w:anchor="_Toc241354291" w:history="1">
+          <w:hyperlink w:anchor="_Toc241361728" w:history="1">
             <w:r>
               <w:rPr>
                 <w:rStyle w:val="Hyperlink"/>
@@ -2460,7 +2460,7 @@
               <w:rPr>
                 <w:noProof/>
               </w:rPr>
-              <w:instrText xml:space="preserve"> PAGEREF _Toc241354291 \h </w:instrText>
+              <w:instrText xml:space="preserve"> PAGEREF _Toc241361728 \h </w:instrText>
             </w:r>
             <w:r>
               <w:rPr>
@@ -2502,7 +2502,7 @@
               <w14:ligatures w14:val="standardContextual"/>
             </w:rPr>
           </w:pPr>
-          <w:hyperlink w:anchor="_Toc241354292" w:history="1">
+          <w:hyperlink w:anchor="_Toc241361729" w:history="1">
             <w:r>
               <w:rPr>
                 <w:rStyle w:val="Hyperlink"/>
@@ -2526,7 +2526,7 @@
               <w:rPr>
                 <w:noProof/>
               </w:rPr>
-              <w:instrText xml:space="preserve"> PAGEREF _Toc241354292 \h </w:instrText>
+              <w:instrText xml:space="preserve"> PAGEREF _Toc241361729 \h </w:instrText>
             </w:r>
             <w:r>
               <w:rPr>
@@ -2568,7 +2568,7 @@
               <w14:ligatures w14:val="standardContextual"/>
             </w:rPr>
           </w:pPr>
-          <w:hyperlink w:anchor="_Toc241354293" w:history="1">
+          <w:hyperlink w:anchor="_Toc241361730" w:history="1">
             <w:r>
               <w:rPr>
                 <w:rStyle w:val="Hyperlink"/>
@@ -2592,7 +2592,7 @@
               <w:rPr>
                 <w:noProof/>
               </w:rPr>
-              <w:instrText xml:space="preserve"> PAGEREF _Toc241354293 \h </w:instrText>
+              <w:instrText xml:space="preserve"> PAGEREF _Toc241361730 \h </w:instrText>
             </w:r>
             <w:r>
               <w:rPr>
@@ -2634,7 +2634,7 @@
               <w14:ligatures w14:val="standardContextual"/>
             </w:rPr>
           </w:pPr>
-          <w:hyperlink w:anchor="_Toc241354294" w:history="1">
+          <w:hyperlink w:anchor="_Toc241361731" w:history="1">
             <w:r>
               <w:rPr>
                 <w:rStyle w:val="Hyperlink"/>
@@ -2658,7 +2658,7 @@
               <w:rPr>
                 <w:noProof/>
               </w:rPr>
-              <w:instrText xml:space="preserve"> PAGEREF _Toc241354294 \h </w:instrText>
+              <w:instrText xml:space="preserve"> PAGEREF _Toc241361731 \h </w:instrText>
             </w:r>
             <w:r>
               <w:rPr>
@@ -2700,7 +2700,7 @@
               <w14:ligatures w14:val="standardContextual"/>
             </w:rPr>
           </w:pPr>
-          <w:hyperlink w:anchor="_Toc241354295" w:history="1">
+          <w:hyperlink w:anchor="_Toc241361732" w:history="1">
             <w:r>
               <w:rPr>
                 <w:rStyle w:val="Hyperlink"/>
@@ -2724,7 +2724,7 @@
               <w:rPr>
                 <w:noProof/>
               </w:rPr>
-              <w:instrText xml:space="preserve"> PAGEREF _Toc241354295 \h </w:instrText>
+              <w:instrText xml:space="preserve"> PAGEREF _Toc241361732 \h </w:instrText>
             </w:r>
             <w:r>
               <w:rPr>
@@ -2766,7 +2766,7 @@
               <w14:ligatures w14:val="standardContextual"/>
             </w:rPr>
           </w:pPr>
-          <w:hyperlink w:anchor="_Toc241354296" w:history="1">
+          <w:hyperlink w:anchor="_Toc241361733" w:history="1">
             <w:r>
               <w:rPr>
                 <w:rStyle w:val="Hyperlink"/>
@@ -2790,7 +2790,7 @@
               <w:rPr>
                 <w:noProof/>
               </w:rPr>
-              <w:instrText xml:space="preserve"> PAGEREF _Toc241354296 \h </w:instrText>
+              <w:instrText xml:space="preserve"> PAGEREF _Toc241361733 \h </w:instrText>
             </w:r>
             <w:r>
               <w:rPr>
@@ -2832,7 +2832,7 @@
               <w14:ligatures w14:val="standardContextual"/>
             </w:rPr>
           </w:pPr>
-          <w:hyperlink w:anchor="_Toc241354297" w:history="1">
+          <w:hyperlink w:anchor="_Toc241361734" w:history="1">
             <w:r>
               <w:rPr>
                 <w:rStyle w:val="Hyperlink"/>
@@ -2856,7 +2856,7 @@
               <w:rPr>
                 <w:noProof/>
               </w:rPr>
-              <w:instrText xml:space="preserve"> PAGEREF _Toc241354297 \h </w:instrText>
+              <w:instrText xml:space="preserve"> PAGEREF _Toc241361734 \h </w:instrText>
             </w:r>
             <w:r>
               <w:rPr>
@@ -2898,7 +2898,7 @@
               <w14:ligatures w14:val="standardContextual"/>
             </w:rPr>
           </w:pPr>
-          <w:hyperlink w:anchor="_Toc241354298" w:history="1">
+          <w:hyperlink w:anchor="_Toc241361735" w:history="1">
             <w:r>
               <w:rPr>
                 <w:rStyle w:val="Hyperlink"/>
@@ -2922,7 +2922,7 @@
               <w:rPr>
                 <w:noProof/>
               </w:rPr>
-              <w:instrText xml:space="preserve"> PAGEREF _Toc241354298 \h </w:instrText>
+              <w:instrText xml:space="preserve"> PAGEREF _Toc241361735 \h </w:instrText>
             </w:r>
             <w:r>
               <w:rPr>
@@ -2964,7 +2964,7 @@
               <w14:ligatures w14:val="standardContextual"/>
             </w:rPr>
           </w:pPr>
-          <w:hyperlink w:anchor="_Toc241354299" w:history="1">
+          <w:hyperlink w:anchor="_Toc241361736" w:history="1">
             <w:r>
               <w:rPr>
                 <w:rStyle w:val="Hyperlink"/>
@@ -2988,7 +2988,7 @@
               <w:rPr>
                 <w:noProof/>
               </w:rPr>
-              <w:instrText xml:space="preserve"> PAGEREF _Toc241354299 \h </w:instrText>
+              <w:instrText xml:space="preserve"> PAGEREF _Toc241361736 \h </w:instrText>
             </w:r>
             <w:r>
               <w:rPr>
@@ -3030,7 +3030,7 @@
               <w14:ligatures w14:val="standardContextual"/>
             </w:rPr>
           </w:pPr>
-          <w:hyperlink w:anchor="_Toc241354300" w:history="1">
+          <w:hyperlink w:anchor="_Toc241361737" w:history="1">
             <w:r>
               <w:rPr>
                 <w:rStyle w:val="Hyperlink"/>
@@ -3054,7 +3054,7 @@
               <w:rPr>
                 <w:noProof/>
               </w:rPr>
-              <w:instrText xml:space="preserve"> PAGEREF _Toc241354300 \h </w:instrText>
+              <w:instrText xml:space="preserve"> PAGEREF _Toc241361737 \h </w:instrText>
             </w:r>
             <w:r>
               <w:rPr>
@@ -3096,7 +3096,7 @@
               <w14:ligatures w14:val="standardContextual"/>
             </w:rPr>
           </w:pPr>
-          <w:hyperlink w:anchor="_Toc241354301" w:history="1">
+          <w:hyperlink w:anchor="_Toc241361738" w:history="1">
             <w:r>
               <w:rPr>
                 <w:rStyle w:val="Hyperlink"/>
@@ -3120,7 +3120,7 @@
               <w:rPr>
                 <w:noProof/>
               </w:rPr>
-              <w:instrText xml:space="preserve"> PAGEREF _Toc241354301 \h </w:instrText>
+              <w:instrText xml:space="preserve"> PAGEREF _Toc241361738 \h </w:instrText>
             </w:r>
             <w:r>
               <w:rPr>
@@ -3162,7 +3162,7 @@
               <w14:ligatures w14:val="standardContextual"/>
             </w:rPr>
           </w:pPr>
-          <w:hyperlink w:anchor="_Toc241354302" w:history="1">
+          <w:hyperlink w:anchor="_Toc241361739" w:history="1">
             <w:r>
               <w:rPr>
                 <w:rStyle w:val="Hyperlink"/>
@@ -3186,7 +3186,7 @@
               <w:rPr>
                 <w:noProof/>
               </w:rPr>
-              <w:instrText xml:space="preserve"> PAGEREF _Toc241354302 \h </w:instrText>
+              <w:instrText xml:space="preserve"> PAGEREF _Toc241361739 \h </w:instrText>
             </w:r>
             <w:r>
               <w:rPr>
@@ -3228,7 +3228,7 @@
               <w14:ligatures w14:val="standardContextual"/>
             </w:rPr>
           </w:pPr>
-          <w:hyperlink w:anchor="_Toc241354303" w:history="1">
+          <w:hyperlink w:anchor="_Toc241361740" w:history="1">
             <w:r>
               <w:rPr>
                 <w:rStyle w:val="Hyperlink"/>
@@ -3252,7 +3252,7 @@
               <w:rPr>
                 <w:noProof/>
               </w:rPr>
-              <w:instrText xml:space="preserve"> PAGEREF _Toc241354303 \h </w:instrText>
+              <w:instrText xml:space="preserve"> PAGEREF _Toc241361740 \h </w:instrText>
             </w:r>
             <w:r>
               <w:rPr>
@@ -3294,7 +3294,7 @@
               <w14:ligatures w14:val="standardContextual"/>
             </w:rPr>
           </w:pPr>
-          <w:hyperlink w:anchor="_Toc241354304" w:history="1">
+          <w:hyperlink w:anchor="_Toc241361741" w:history="1">
             <w:r>
               <w:rPr>
                 <w:rStyle w:val="Hyperlink"/>
@@ -3318,7 +3318,7 @@
               <w:rPr>
                 <w:noProof/>
               </w:rPr>
-              <w:instrText xml:space="preserve"> PAGEREF _Toc241354304 \h </w:instrText>
+              <w:instrText xml:space="preserve"> PAGEREF _Toc241361741 \h </w:instrText>
             </w:r>
             <w:r>
               <w:rPr>
@@ -3360,7 +3360,7 @@
               <w14:ligatures w14:val="standardContextual"/>
             </w:rPr>
           </w:pPr>
-          <w:hyperlink w:anchor="_Toc241354305" w:history="1">
+          <w:hyperlink w:anchor="_Toc241361742" w:history="1">
             <w:r>
               <w:rPr>
                 <w:rStyle w:val="Hyperlink"/>
@@ -3384,7 +3384,7 @@
               <w:rPr>
                 <w:noProof/>
               </w:rPr>
-              <w:instrText xml:space="preserve"> PAGEREF _Toc241354305 \h </w:instrText>
+              <w:instrText xml:space="preserve"> PAGEREF _Toc241361742 \h </w:instrText>
             </w:r>
             <w:r>
               <w:rPr>
@@ -3426,7 +3426,7 @@
               <w14:ligatures w14:val="standardContextual"/>
             </w:rPr>
           </w:pPr>
-          <w:hyperlink w:anchor="_Toc241354306" w:history="1">
+          <w:hyperlink w:anchor="_Toc241361743" w:history="1">
             <w:r>
               <w:rPr>
                 <w:rStyle w:val="Hyperlink"/>
@@ -3450,7 +3450,7 @@
               <w:rPr>
                 <w:noProof/>
               </w:rPr>
-              <w:instrText xml:space="preserve"> PAGEREF _Toc241354306 \h </w:instrText>
+              <w:instrText xml:space="preserve"> PAGEREF _Toc241361743 \h </w:instrText>
             </w:r>
             <w:r>
               <w:rPr>
@@ -3492,7 +3492,7 @@
               <w14:ligatures w14:val="standardContextual"/>
             </w:rPr>
           </w:pPr>
-          <w:hyperlink w:anchor="_Toc241354307" w:history="1">
+          <w:hyperlink w:anchor="_Toc241361744" w:history="1">
             <w:r>
               <w:rPr>
                 <w:rStyle w:val="Hyperlink"/>
@@ -3516,7 +3516,7 @@
               <w:rPr>
                 <w:noProof/>
               </w:rPr>
-              <w:instrText xml:space="preserve"> PAGEREF _Toc241354307 \h </w:instrText>
+              <w:instrText xml:space="preserve"> PAGEREF _Toc241361744 \h </w:instrText>
             </w:r>
             <w:r>
               <w:rPr>
@@ -3558,7 +3558,7 @@
               <w14:ligatures w14:val="standardContextual"/>
             </w:rPr>
           </w:pPr>
-          <w:hyperlink w:anchor="_Toc241354308" w:history="1">
+          <w:hyperlink w:anchor="_Toc241361745" w:history="1">
             <w:r>
               <w:rPr>
                 <w:rStyle w:val="Hyperlink"/>
@@ -3582,7 +3582,7 @@
               <w:rPr>
                 <w:noProof/>
               </w:rPr>
-              <w:instrText xml:space="preserve"> PAGEREF _Toc241354308 \h </w:instrText>
+              <w:instrText xml:space="preserve"> PAGEREF _Toc241361745 \h </w:instrText>
             </w:r>
             <w:r>
               <w:rPr>
@@ -3624,7 +3624,7 @@
               <w14:ligatures w14:val="standardContextual"/>
             </w:rPr>
           </w:pPr>
-          <w:hyperlink w:anchor="_Toc241354309" w:history="1">
+          <w:hyperlink w:anchor="_Toc241361746" w:history="1">
             <w:r>
               <w:rPr>
                 <w:rStyle w:val="Hyperlink"/>
@@ -3648,7 +3648,7 @@
               <w:rPr>
                 <w:noProof/>
               </w:rPr>
-              <w:instrText xml:space="preserve"> PAGEREF _Toc241354309 \h </w:instrText>
+              <w:instrText xml:space="preserve"> PAGEREF _Toc241361746 \h </w:instrText>
             </w:r>
             <w:r>
               <w:rPr>
@@ -3690,7 +3690,7 @@
               <w14:ligatures w14:val="standardContextual"/>
             </w:rPr>
           </w:pPr>
-          <w:hyperlink w:anchor="_Toc241354310" w:history="1">
+          <w:hyperlink w:anchor="_Toc241361747" w:history="1">
             <w:r>
               <w:rPr>
                 <w:rStyle w:val="Hyperlink"/>
@@ -3714,7 +3714,7 @@
               <w:rPr>
                 <w:noProof/>
               </w:rPr>
-              <w:instrText xml:space="preserve"> PAGEREF _Toc241354310 \h </w:instrText>
+              <w:instrText xml:space="preserve"> PAGEREF _Toc241361747 \h </w:instrText>
             </w:r>
             <w:r>
               <w:rPr>
@@ -3756,7 +3756,7 @@
               <w14:ligatures w14:val="standardContextual"/>
             </w:rPr>
           </w:pPr>
-          <w:hyperlink w:anchor="_Toc241354311" w:history="1">
+          <w:hyperlink w:anchor="_Toc241361748" w:history="1">
             <w:r>
               <w:rPr>
                 <w:rStyle w:val="Hyperlink"/>
@@ -3780,7 +3780,7 @@
               <w:rPr>
                 <w:noProof/>
               </w:rPr>
-              <w:instrText xml:space="preserve"> PAGEREF _Toc241354311 \h </w:instrText>
+              <w:instrText xml:space="preserve"> PAGEREF _Toc241361748 \h </w:instrText>
             </w:r>
             <w:r>
               <w:rPr>
@@ -3822,7 +3822,7 @@
               <w14:ligatures w14:val="standardContextual"/>
             </w:rPr>
           </w:pPr>
-          <w:hyperlink w:anchor="_Toc241354312" w:history="1">
+          <w:hyperlink w:anchor="_Toc241361749" w:history="1">
             <w:r>
               <w:rPr>
                 <w:rStyle w:val="Hyperlink"/>
@@ -3846,7 +3846,7 @@
               <w:rPr>
                 <w:noProof/>
               </w:rPr>
-              <w:instrText xml:space="preserve"> PAGEREF _Toc241354312 \h </w:instrText>
+              <w:instrText xml:space="preserve"> PAGEREF _Toc241361749 \h </w:instrText>
             </w:r>
             <w:r>
               <w:rPr>
@@ -3888,7 +3888,7 @@
               <w14:ligatures w14:val="standardContextual"/>
             </w:rPr>
           </w:pPr>
-          <w:hyperlink w:anchor="_Toc241354313" w:history="1">
+          <w:hyperlink w:anchor="_Toc241361750" w:history="1">
             <w:r>
               <w:rPr>
                 <w:rStyle w:val="Hyperlink"/>
@@ -3912,7 +3912,7 @@
               <w:rPr>
                 <w:noProof/>
               </w:rPr>
-              <w:instrText xml:space="preserve"> PAGEREF _Toc241354313 \h </w:instrText>
+              <w:instrText xml:space="preserve"> PAGEREF _Toc241361750 \h </w:instrText>
             </w:r>
             <w:r>
               <w:rPr>
@@ -3954,7 +3954,7 @@
               <w14:ligatures w14:val="standardContextual"/>
             </w:rPr>
           </w:pPr>
-          <w:hyperlink w:anchor="_Toc241354314" w:history="1">
+          <w:hyperlink w:anchor="_Toc241361751" w:history="1">
             <w:r>
               <w:rPr>
                 <w:rStyle w:val="Hyperlink"/>
@@ -3978,7 +3978,7 @@
               <w:rPr>
                 <w:noProof/>
               </w:rPr>
-              <w:instrText xml:space="preserve"> PAGEREF _Toc241354314 \h </w:instrText>
+              <w:instrText xml:space="preserve"> PAGEREF _Toc241361751 \h </w:instrText>
             </w:r>
             <w:r>
               <w:rPr>
@@ -4020,7 +4020,7 @@
               <w14:ligatures w14:val="standardContextual"/>
             </w:rPr>
           </w:pPr>
-          <w:hyperlink w:anchor="_Toc241354315" w:history="1">
+          <w:hyperlink w:anchor="_Toc241361752" w:history="1">
             <w:r>
               <w:rPr>
                 <w:rStyle w:val="Hyperlink"/>
@@ -4044,7 +4044,7 @@
               <w:rPr>
                 <w:noProof/>
               </w:rPr>
-              <w:instrText xml:space="preserve"> PAGEREF _Toc241354315 \h </w:instrText>
+              <w:instrText xml:space="preserve"> PAGEREF _Toc241361752 \h </w:instrText>
             </w:r>
             <w:r>
               <w:rPr>
@@ -4086,7 +4086,7 @@
               <w14:ligatures w14:val="standardContextual"/>
             </w:rPr>
           </w:pPr>
-          <w:hyperlink w:anchor="_Toc241354316" w:history="1">
+          <w:hyperlink w:anchor="_Toc241361753" w:history="1">
             <w:r>
               <w:rPr>
                 <w:rStyle w:val="Hyperlink"/>
@@ -4110,7 +4110,7 @@
               <w:rPr>
                 <w:noProof/>
               </w:rPr>
-              <w:instrText xml:space="preserve"> PAGEREF _Toc241354316 \h </w:instrText>
+              <w:instrText xml:space="preserve"> PAGEREF _Toc241361753 \h </w:instrText>
             </w:r>
             <w:r>
               <w:rPr>
@@ -4152,7 +4152,7 @@
               <w14:ligatures w14:val="standardContextual"/>
             </w:rPr>
           </w:pPr>
-          <w:hyperlink w:anchor="_Toc241354317" w:history="1">
+          <w:hyperlink w:anchor="_Toc241361754" w:history="1">
             <w:r>
               <w:rPr>
                 <w:rStyle w:val="Hyperlink"/>
@@ -4176,7 +4176,7 @@
               <w:rPr>
                 <w:noProof/>
               </w:rPr>
-              <w:instrText xml:space="preserve"> PAGEREF _Toc241354317 \h </w:instrText>
+              <w:instrText xml:space="preserve"> PAGEREF _Toc241361754 \h </w:instrText>
             </w:r>
             <w:r>
               <w:rPr>
@@ -4218,7 +4218,7 @@
               <w14:ligatures w14:val="standardContextual"/>
             </w:rPr>
           </w:pPr>
-          <w:hyperlink w:anchor="_Toc241354318" w:history="1">
+          <w:hyperlink w:anchor="_Toc241361755" w:history="1">
             <w:r>
               <w:rPr>
                 <w:rStyle w:val="Hyperlink"/>
@@ -4242,7 +4242,7 @@
               <w:rPr>
                 <w:noProof/>
               </w:rPr>
-              <w:instrText xml:space="preserve"> PAGEREF _Toc241354318 \h </w:instrText>
+              <w:instrText xml:space="preserve"> PAGEREF _Toc241361755 \h </w:instrText>
             </w:r>
             <w:r>
               <w:rPr>
@@ -4284,7 +4284,7 @@
               <w14:ligatures w14:val="standardContextual"/>
             </w:rPr>
           </w:pPr>
-          <w:hyperlink w:anchor="_Toc241354319" w:history="1">
+          <w:hyperlink w:anchor="_Toc241361756" w:history="1">
             <w:r>
               <w:rPr>
                 <w:rStyle w:val="Hyperlink"/>
@@ -4308,7 +4308,7 @@
               <w:rPr>
                 <w:noProof/>
               </w:rPr>
-              <w:instrText xml:space="preserve"> PAGEREF _Toc241354319 \h </w:instrText>
+              <w:instrText xml:space="preserve"> PAGEREF _Toc241361756 \h </w:instrText>
             </w:r>
             <w:r>
               <w:rPr>
@@ -4350,7 +4350,7 @@
               <w14:ligatures w14:val="standardContextual"/>
             </w:rPr>
           </w:pPr>
-          <w:hyperlink w:anchor="_Toc241354320" w:history="1">
+          <w:hyperlink w:anchor="_Toc241361757" w:history="1">
             <w:r>
               <w:rPr>
                 <w:rStyle w:val="Hyperlink"/>
@@ -4374,7 +4374,7 @@
               <w:rPr>
                 <w:noProof/>
               </w:rPr>
-              <w:instrText xml:space="preserve"> PAGEREF _Toc241354320 \h </w:instrText>
+              <w:instrText xml:space="preserve"> PAGEREF _Toc241361757 \h </w:instrText>
             </w:r>
             <w:r>
               <w:rPr>
@@ -4416,7 +4416,7 @@
               <w14:ligatures w14:val="standardContextual"/>
             </w:rPr>
           </w:pPr>
-          <w:hyperlink w:anchor="_Toc241354321" w:history="1">
+          <w:hyperlink w:anchor="_Toc241361758" w:history="1">
             <w:r>
               <w:rPr>
                 <w:rStyle w:val="Hyperlink"/>
@@ -4440,7 +4440,7 @@
               <w:rPr>
                 <w:noProof/>
               </w:rPr>
-              <w:instrText xml:space="preserve"> PAGEREF _Toc241354321 \h </w:instrText>
+              <w:instrText xml:space="preserve"> PAGEREF _Toc241361758 \h </w:instrText>
             </w:r>
             <w:r>
               <w:rPr>
@@ -4482,7 +4482,7 @@
               <w14:ligatures w14:val="standardContextual"/>
             </w:rPr>
           </w:pPr>
-          <w:hyperlink w:anchor="_Toc241354322" w:history="1">
+          <w:hyperlink w:anchor="_Toc241361759" w:history="1">
             <w:r>
               <w:rPr>
                 <w:rStyle w:val="Hyperlink"/>
@@ -4506,7 +4506,7 @@
               <w:rPr>
                 <w:noProof/>
               </w:rPr>
-              <w:instrText xml:space="preserve"> PAGEREF _Toc241354322 \h </w:instrText>
+              <w:instrText xml:space="preserve"> PAGEREF _Toc241361759 \h </w:instrText>
             </w:r>
             <w:r>
               <w:rPr>
@@ -4548,7 +4548,7 @@
               <w14:ligatures w14:val="standardContextual"/>
             </w:rPr>
           </w:pPr>
-          <w:hyperlink w:anchor="_Toc241354323" w:history="1">
+          <w:hyperlink w:anchor="_Toc241361760" w:history="1">
             <w:r>
               <w:rPr>
                 <w:rStyle w:val="Hyperlink"/>
@@ -4572,7 +4572,7 @@
               <w:rPr>
                 <w:noProof/>
               </w:rPr>
-              <w:instrText xml:space="preserve"> PAGEREF _Toc241354323 \h </w:instrText>
+              <w:instrText xml:space="preserve"> PAGEREF _Toc241361760 \h </w:instrText>
             </w:r>
             <w:r>
               <w:rPr>
@@ -4614,7 +4614,7 @@
               <w14:ligatures w14:val="standardContextual"/>
             </w:rPr>
           </w:pPr>
-          <w:hyperlink w:anchor="_Toc241354324" w:history="1">
+          <w:hyperlink w:anchor="_Toc241361761" w:history="1">
             <w:r>
               <w:rPr>
                 <w:rStyle w:val="Hyperlink"/>
@@ -4638,7 +4638,7 @@
               <w:rPr>
                 <w:noProof/>
               </w:rPr>
-              <w:instrText xml:space="preserve"> PAGEREF _Toc241354324 \h </w:instrText>
+              <w:instrText xml:space="preserve"> PAGEREF _Toc241361761 \h </w:instrText>
             </w:r>
             <w:r>
               <w:rPr>
@@ -4680,7 +4680,7 @@
               <w14:ligatures w14:val="standardContextual"/>
             </w:rPr>
           </w:pPr>
-          <w:hyperlink w:anchor="_Toc241354325" w:history="1">
+          <w:hyperlink w:anchor="_Toc241361762" w:history="1">
             <w:r>
               <w:rPr>
                 <w:rStyle w:val="Hyperlink"/>
@@ -4704,7 +4704,7 @@
               <w:rPr>
                 <w:noProof/>
               </w:rPr>
-              <w:instrText xml:space="preserve"> PAGEREF _Toc241354325 \h </w:instrText>
+              <w:instrText xml:space="preserve"> PAGEREF _Toc241361762 \h </w:instrText>
             </w:r>
             <w:r>
               <w:rPr>
@@ -4746,7 +4746,7 @@
               <w14:ligatures w14:val="standardContextual"/>
             </w:rPr>
           </w:pPr>
-          <w:hyperlink w:anchor="_Toc241354326" w:history="1">
+          <w:hyperlink w:anchor="_Toc241361763" w:history="1">
             <w:r>
               <w:rPr>
                 <w:rStyle w:val="Hyperlink"/>
@@ -4770,7 +4770,7 @@
               <w:rPr>
                 <w:noProof/>
               </w:rPr>
-              <w:instrText xml:space="preserve"> PAGEREF _Toc241354326 \h </w:instrText>
+              <w:instrText xml:space="preserve"> PAGEREF _Toc241361763 \h </w:instrText>
             </w:r>
             <w:r>
               <w:rPr>
@@ -4812,7 +4812,7 @@
               <w14:ligatures w14:val="standardContextual"/>
             </w:rPr>
           </w:pPr>
-          <w:hyperlink w:anchor="_Toc241354327" w:history="1">
+          <w:hyperlink w:anchor="_Toc241361764" w:history="1">
             <w:r>
               <w:rPr>
                 <w:rStyle w:val="Hyperlink"/>
@@ -4836,7 +4836,7 @@
               <w:rPr>
                 <w:noProof/>
               </w:rPr>
-              <w:instrText xml:space="preserve"> PAGEREF _Toc241354327 \h </w:instrText>
+              <w:instrText xml:space="preserve"> PAGEREF _Toc241361764 \h </w:instrText>
             </w:r>
             <w:r>
               <w:rPr>
@@ -4878,7 +4878,7 @@
               <w14:ligatures w14:val="standardContextual"/>
             </w:rPr>
           </w:pPr>
-          <w:hyperlink w:anchor="_Toc241354328" w:history="1">
+          <w:hyperlink w:anchor="_Toc241361765" w:history="1">
             <w:r>
               <w:rPr>
                 <w:rStyle w:val="Hyperlink"/>
@@ -4902,7 +4902,7 @@
               <w:rPr>
                 <w:noProof/>
               </w:rPr>
-              <w:instrText xml:space="preserve"> PAGEREF _Toc241354328 \h </w:instrText>
+              <w:instrText xml:space="preserve"> PAGEREF _Toc241361765 \h </w:instrText>
             </w:r>
             <w:r>
               <w:rPr>
@@ -4944,7 +4944,7 @@
               <w14:ligatures w14:val="standardContextual"/>
             </w:rPr>
           </w:pPr>
-          <w:hyperlink w:anchor="_Toc241354329" w:history="1">
+          <w:hyperlink w:anchor="_Toc241361766" w:history="1">
             <w:r>
               <w:rPr>
                 <w:rStyle w:val="Hyperlink"/>
@@ -4968,7 +4968,7 @@
               <w:rPr>
                 <w:noProof/>
               </w:rPr>
-              <w:instrText xml:space="preserve"> PAGEREF _Toc241354329 \h </w:instrText>
+              <w:instrText xml:space="preserve"> PAGEREF _Toc241361766 \h </w:instrText>
             </w:r>
             <w:r>
               <w:rPr>
@@ -5010,7 +5010,7 @@
               <w14:ligatures w14:val="standardContextual"/>
             </w:rPr>
           </w:pPr>
-          <w:hyperlink w:anchor="_Toc241354330" w:history="1">
+          <w:hyperlink w:anchor="_Toc241361767" w:history="1">
             <w:r>
               <w:rPr>
                 <w:rStyle w:val="Hyperlink"/>
@@ -5034,7 +5034,7 @@
               <w:rPr>
                 <w:noProof/>
               </w:rPr>
-              <w:instrText xml:space="preserve"> PAGEREF _Toc241354330 \h </w:instrText>
+              <w:instrText xml:space="preserve"> PAGEREF _Toc241361767 \h </w:instrText>
             </w:r>
             <w:r>
               <w:rPr>
@@ -5076,7 +5076,7 @@
               <w14:ligatures w14:val="standardContextual"/>
             </w:rPr>
           </w:pPr>
-          <w:hyperlink w:anchor="_Toc241354331" w:history="1">
+          <w:hyperlink w:anchor="_Toc241361768" w:history="1">
             <w:r>
               <w:rPr>
                 <w:rStyle w:val="Hyperlink"/>
@@ -5100,7 +5100,7 @@
               <w:rPr>
                 <w:noProof/>
               </w:rPr>
-              <w:instrText xml:space="preserve"> PAGEREF _Toc241354331 \h </w:instrText>
+              <w:instrText xml:space="preserve"> PAGEREF _Toc241361768 \h </w:instrText>
             </w:r>
             <w:r>
               <w:rPr>
@@ -5142,7 +5142,7 @@
               <w14:ligatures w14:val="standardContextual"/>
             </w:rPr>
           </w:pPr>
-          <w:hyperlink w:anchor="_Toc241354332" w:history="1">
+          <w:hyperlink w:anchor="_Toc241361769" w:history="1">
             <w:r>
               <w:rPr>
                 <w:rStyle w:val="Hyperlink"/>
@@ -5166,7 +5166,7 @@
               <w:rPr>
                 <w:noProof/>
               </w:rPr>
-              <w:instrText xml:space="preserve"> PAGEREF _Toc241354332 \h </w:instrText>
+              <w:instrText xml:space="preserve"> PAGEREF _Toc241361769 \h </w:instrText>
             </w:r>
             <w:r>
               <w:rPr>
@@ -5208,7 +5208,7 @@
               <w14:ligatures w14:val="standardContextual"/>
             </w:rPr>
           </w:pPr>
-          <w:hyperlink w:anchor="_Toc241354333" w:history="1">
+          <w:hyperlink w:anchor="_Toc241361770" w:history="1">
             <w:r>
               <w:rPr>
                 <w:rStyle w:val="Hyperlink"/>
@@ -5232,7 +5232,7 @@
               <w:rPr>
                 <w:noProof/>
               </w:rPr>
-              <w:instrText xml:space="preserve"> PAGEREF _Toc241354333 \h </w:instrText>
+              <w:instrText xml:space="preserve"> PAGEREF _Toc241361770 \h </w:instrText>
             </w:r>
             <w:r>
               <w:rPr>
@@ -5274,7 +5274,7 @@
               <w14:ligatures w14:val="standardContextual"/>
             </w:rPr>
           </w:pPr>
-          <w:hyperlink w:anchor="_Toc241354334" w:history="1">
+          <w:hyperlink w:anchor="_Toc241361771" w:history="1">
             <w:r>
               <w:rPr>
                 <w:rStyle w:val="Hyperlink"/>
@@ -5298,7 +5298,7 @@
               <w:rPr>
                 <w:noProof/>
               </w:rPr>
-              <w:instrText xml:space="preserve"> PAGEREF _Toc241354334 \h </w:instrText>
+              <w:instrText xml:space="preserve"> PAGEREF _Toc241361771 \h </w:instrText>
             </w:r>
             <w:r>
               <w:rPr>
@@ -5340,7 +5340,7 @@
               <w14:ligatures w14:val="standardContextual"/>
             </w:rPr>
           </w:pPr>
-          <w:hyperlink w:anchor="_Toc241354335" w:history="1">
+          <w:hyperlink w:anchor="_Toc241361772" w:history="1">
             <w:r>
               <w:rPr>
                 <w:rStyle w:val="Hyperlink"/>
@@ -5364,7 +5364,7 @@
               <w:rPr>
                 <w:noProof/>
               </w:rPr>
-              <w:instrText xml:space="preserve"> PAGEREF _Toc241354335 \h </w:instrText>
+              <w:instrText xml:space="preserve"> PAGEREF _Toc241361772 \h </w:instrText>
             </w:r>
             <w:r>
               <w:rPr>
@@ -5406,7 +5406,7 @@
               <w14:ligatures w14:val="standardContextual"/>
             </w:rPr>
           </w:pPr>
-          <w:hyperlink w:anchor="_Toc241354336" w:history="1">
+          <w:hyperlink w:anchor="_Toc241361773" w:history="1">
             <w:r>
               <w:rPr>
                 <w:rStyle w:val="Hyperlink"/>
@@ -5430,7 +5430,7 @@
               <w:rPr>
                 <w:noProof/>
               </w:rPr>
-              <w:instrText xml:space="preserve"> PAGEREF _Toc241354336 \h </w:instrText>
+              <w:instrText xml:space="preserve"> PAGEREF _Toc241361773 \h </w:instrText>
             </w:r>
             <w:r>
               <w:rPr>
@@ -5472,7 +5472,7 @@
               <w14:ligatures w14:val="standardContextual"/>
             </w:rPr>
           </w:pPr>
-          <w:hyperlink w:anchor="_Toc241354337" w:history="1">
+          <w:hyperlink w:anchor="_Toc241361774" w:history="1">
             <w:r>
               <w:rPr>
                 <w:rStyle w:val="Hyperlink"/>
@@ -5496,7 +5496,7 @@
               <w:rPr>
                 <w:noProof/>
               </w:rPr>
-              <w:instrText xml:space="preserve"> PAGEREF _Toc241354337 \h </w:instrText>
+              <w:instrText xml:space="preserve"> PAGEREF _Toc241361774 \h </w:instrText>
             </w:r>
             <w:r>
               <w:rPr>
@@ -5538,7 +5538,7 @@
               <w14:ligatures w14:val="standardContextual"/>
             </w:rPr>
           </w:pPr>
-          <w:hyperlink w:anchor="_Toc241354338" w:history="1">
+          <w:hyperlink w:anchor="_Toc241361775" w:history="1">
             <w:r>
               <w:rPr>
                 <w:rStyle w:val="Hyperlink"/>
@@ -5562,7 +5562,7 @@
               <w:rPr>
                 <w:noProof/>
               </w:rPr>
-              <w:instrText xml:space="preserve"> PAGEREF _Toc241354338 \h </w:instrText>
+              <w:instrText xml:space="preserve"> PAGEREF _Toc241361775 \h </w:instrText>
             </w:r>
             <w:r>
               <w:rPr>
@@ -5604,7 +5604,7 @@
               <w14:ligatures w14:val="standardContextual"/>
             </w:rPr>
           </w:pPr>
-          <w:hyperlink w:anchor="_Toc241354339" w:history="1">
+          <w:hyperlink w:anchor="_Toc241361776" w:history="1">
             <w:r>
               <w:rPr>
                 <w:rStyle w:val="Hyperlink"/>
@@ -5628,7 +5628,7 @@
               <w:rPr>
                 <w:noProof/>
               </w:rPr>
-              <w:instrText xml:space="preserve"> PAGEREF _Toc241354339 \h </w:instrText>
+              <w:instrText xml:space="preserve"> PAGEREF _Toc241361776 \h </w:instrText>
             </w:r>
             <w:r>
               <w:rPr>
@@ -5670,7 +5670,7 @@
               <w14:ligatures w14:val="standardContextual"/>
             </w:rPr>
           </w:pPr>
-          <w:hyperlink w:anchor="_Toc241354340" w:history="1">
+          <w:hyperlink w:anchor="_Toc241361777" w:history="1">
             <w:r>
               <w:rPr>
                 <w:rStyle w:val="Hyperlink"/>
@@ -5694,7 +5694,7 @@
               <w:rPr>
                 <w:noProof/>
               </w:rPr>
-              <w:instrText xml:space="preserve"> PAGEREF _Toc241354340 \h </w:instrText>
+              <w:instrText xml:space="preserve"> PAGEREF _Toc241361777 \h </w:instrText>
             </w:r>
             <w:r>
               <w:rPr>
@@ -5736,7 +5736,7 @@
               <w14:ligatures w14:val="standardContextual"/>
             </w:rPr>
           </w:pPr>
-          <w:hyperlink w:anchor="_Toc241354341" w:history="1">
+          <w:hyperlink w:anchor="_Toc241361778" w:history="1">
             <w:r>
               <w:rPr>
                 <w:rStyle w:val="Hyperlink"/>
@@ -5760,7 +5760,7 @@
               <w:rPr>
                 <w:noProof/>
               </w:rPr>
-              <w:instrText xml:space="preserve"> PAGEREF _Toc241354341 \h </w:instrText>
+              <w:instrText xml:space="preserve"> PAGEREF _Toc241361778 \h </w:instrText>
             </w:r>
             <w:r>
               <w:rPr>
@@ -5802,7 +5802,7 @@
               <w14:ligatures w14:val="standardContextual"/>
             </w:rPr>
           </w:pPr>
-          <w:hyperlink w:anchor="_Toc241354342" w:history="1">
+          <w:hyperlink w:anchor="_Toc241361779" w:history="1">
             <w:r>
               <w:rPr>
                 <w:rStyle w:val="Hyperlink"/>
@@ -5826,7 +5826,7 @@
               <w:rPr>
                 <w:noProof/>
               </w:rPr>
-              <w:instrText xml:space="preserve"> PAGEREF _Toc241354342 \h </w:instrText>
+              <w:instrText xml:space="preserve"> PAGEREF _Toc241361779 \h </w:instrText>
             </w:r>
             <w:r>
               <w:rPr>
@@ -5868,7 +5868,7 @@
               <w14:ligatures w14:val="standardContextual"/>
             </w:rPr>
           </w:pPr>
-          <w:hyperlink w:anchor="_Toc241354343" w:history="1">
+          <w:hyperlink w:anchor="_Toc241361780" w:history="1">
             <w:r>
               <w:rPr>
                 <w:rStyle w:val="Hyperlink"/>
@@ -5892,7 +5892,7 @@
               <w:rPr>
                 <w:noProof/>
               </w:rPr>
-              <w:instrText xml:space="preserve"> PAGEREF _Toc241354343 \h </w:instrText>
+              <w:instrText xml:space="preserve"> PAGEREF _Toc241361780 \h </w:instrText>
             </w:r>
             <w:r>
               <w:rPr>
@@ -5934,7 +5934,7 @@
               <w14:ligatures w14:val="standardContextual"/>
             </w:rPr>
           </w:pPr>
-          <w:hyperlink w:anchor="_Toc241354344" w:history="1">
+          <w:hyperlink w:anchor="_Toc241361781" w:history="1">
             <w:r>
               <w:rPr>
                 <w:rStyle w:val="Hyperlink"/>
@@ -5958,7 +5958,7 @@
               <w:rPr>
                 <w:noProof/>
               </w:rPr>
-              <w:instrText xml:space="preserve"> PAGEREF _Toc241354344 \h </w:instrText>
+              <w:instrText xml:space="preserve"> PAGEREF _Toc241361781 \h </w:instrText>
             </w:r>
             <w:r>
               <w:rPr>
@@ -6000,7 +6000,7 @@
               <w14:ligatures w14:val="standardContextual"/>
             </w:rPr>
           </w:pPr>
-          <w:hyperlink w:anchor="_Toc241354345" w:history="1">
+          <w:hyperlink w:anchor="_Toc241361782" w:history="1">
             <w:r>
               <w:rPr>
                 <w:rStyle w:val="Hyperlink"/>
@@ -6024,7 +6024,7 @@
               <w:rPr>
                 <w:noProof/>
               </w:rPr>
-              <w:instrText xml:space="preserve"> PAGEREF _Toc241354345 \h </w:instrText>
+              <w:instrText xml:space="preserve"> PAGEREF _Toc241361782 \h </w:instrText>
             </w:r>
             <w:r>
               <w:rPr>
@@ -6066,7 +6066,7 @@
               <w14:ligatures w14:val="standardContextual"/>
             </w:rPr>
           </w:pPr>
-          <w:hyperlink w:anchor="_Toc241354346" w:history="1">
+          <w:hyperlink w:anchor="_Toc241361783" w:history="1">
             <w:r>
               <w:rPr>
                 <w:rStyle w:val="Hyperlink"/>
@@ -6090,7 +6090,7 @@
               <w:rPr>
                 <w:noProof/>
               </w:rPr>
-              <w:instrText xml:space="preserve"> PAGEREF _Toc241354346 \h </w:instrText>
+              <w:instrText xml:space="preserve"> PAGEREF _Toc241361783 \h </w:instrText>
             </w:r>
             <w:r>
               <w:rPr>
@@ -6132,7 +6132,7 @@
               <w14:ligatures w14:val="standardContextual"/>
             </w:rPr>
           </w:pPr>
-          <w:hyperlink w:anchor="_Toc241354347" w:history="1">
+          <w:hyperlink w:anchor="_Toc241361784" w:history="1">
             <w:r>
               <w:rPr>
                 <w:rStyle w:val="Hyperlink"/>
@@ -6156,7 +6156,7 @@
               <w:rPr>
                 <w:noProof/>
               </w:rPr>
-              <w:instrText xml:space="preserve"> PAGEREF _Toc241354347 \h </w:instrText>
+              <w:instrText xml:space="preserve"> PAGEREF _Toc241361784 \h </w:instrText>
             </w:r>
             <w:r>
               <w:rPr>
@@ -6198,7 +6198,7 @@
               <w14:ligatures w14:val="standardContextual"/>
             </w:rPr>
           </w:pPr>
-          <w:hyperlink w:anchor="_Toc241354348" w:history="1">
+          <w:hyperlink w:anchor="_Toc241361785" w:history="1">
             <w:r>
               <w:rPr>
                 <w:rStyle w:val="Hyperlink"/>
@@ -6222,7 +6222,7 @@
               <w:rPr>
                 <w:noProof/>
               </w:rPr>
-              <w:instrText xml:space="preserve"> PAGEREF _Toc241354348 \h </w:instrText>
+              <w:instrText xml:space="preserve"> PAGEREF _Toc241361785 \h </w:instrText>
             </w:r>
             <w:r>
               <w:rPr>
@@ -6264,7 +6264,7 @@
               <w14:ligatures w14:val="standardContextual"/>
             </w:rPr>
           </w:pPr>
-          <w:hyperlink w:anchor="_Toc241354349" w:history="1">
+          <w:hyperlink w:anchor="_Toc241361786" w:history="1">
             <w:r>
               <w:rPr>
                 <w:rStyle w:val="Hyperlink"/>
@@ -6288,7 +6288,7 @@
               <w:rPr>
                 <w:noProof/>
               </w:rPr>
-              <w:instrText xml:space="preserve"> PAGEREF _Toc241354349 \h </w:instrText>
+              <w:instrText xml:space="preserve"> PAGEREF _Toc241361786 \h </w:instrText>
             </w:r>
             <w:r>
               <w:rPr>
@@ -6330,7 +6330,7 @@
               <w14:ligatures w14:val="standardContextual"/>
             </w:rPr>
           </w:pPr>
-          <w:hyperlink w:anchor="_Toc241354350" w:history="1">
+          <w:hyperlink w:anchor="_Toc241361787" w:history="1">
             <w:r>
               <w:rPr>
                 <w:rStyle w:val="Hyperlink"/>
@@ -6354,7 +6354,7 @@
               <w:rPr>
                 <w:noProof/>
               </w:rPr>
-              <w:instrText xml:space="preserve"> PAGEREF _Toc241354350 \h </w:instrText>
+              <w:instrText xml:space="preserve"> PAGEREF _Toc241361787 \h </w:instrText>
             </w:r>
             <w:r>
               <w:rPr>
@@ -6396,7 +6396,7 @@
               <w14:ligatures w14:val="standardContextual"/>
             </w:rPr>
           </w:pPr>
-          <w:hyperlink w:anchor="_Toc241354351" w:history="1">
+          <w:hyperlink w:anchor="_Toc241361788" w:history="1">
             <w:r>
               <w:rPr>
                 <w:rStyle w:val="Hyperlink"/>
@@ -6420,7 +6420,7 @@
               <w:rPr>
                 <w:noProof/>
               </w:rPr>
-              <w:instrText xml:space="preserve"> PAGEREF _Toc241354351 \h </w:instrText>
+              <w:instrText xml:space="preserve"> PAGEREF _Toc241361788 \h </w:instrText>
             </w:r>
             <w:r>
               <w:rPr>
@@ -6462,7 +6462,7 @@
               <w14:ligatures w14:val="standardContextual"/>
             </w:rPr>
           </w:pPr>
-          <w:hyperlink w:anchor="_Toc241354352" w:history="1">
+          <w:hyperlink w:anchor="_Toc241361789" w:history="1">
             <w:r>
               <w:rPr>
                 <w:rStyle w:val="Hyperlink"/>
@@ -6486,7 +6486,7 @@
               <w:rPr>
                 <w:noProof/>
               </w:rPr>
-              <w:instrText xml:space="preserve"> PAGEREF _Toc241354352 \h </w:instrText>
+              <w:instrText xml:space="preserve"> PAGEREF _Toc241361789 \h </w:instrText>
             </w:r>
             <w:r>
               <w:rPr>
@@ -6528,7 +6528,7 @@
               <w14:ligatures w14:val="standardContextual"/>
             </w:rPr>
           </w:pPr>
-          <w:hyperlink w:anchor="_Toc241354353" w:history="1">
+          <w:hyperlink w:anchor="_Toc241361790" w:history="1">
             <w:r>
               <w:rPr>
                 <w:rStyle w:val="Hyperlink"/>
@@ -6552,7 +6552,7 @@
               <w:rPr>
                 <w:noProof/>
               </w:rPr>
-              <w:instrText xml:space="preserve"> PAGEREF _Toc241354353 \h </w:instrText>
+              <w:instrText xml:space="preserve"> PAGEREF _Toc241361790 \h </w:instrText>
             </w:r>
             <w:r>
               <w:rPr>
@@ -6594,7 +6594,7 @@
               <w14:ligatures w14:val="standardContextual"/>
             </w:rPr>
           </w:pPr>
-          <w:hyperlink w:anchor="_Toc241354354" w:history="1">
+          <w:hyperlink w:anchor="_Toc241361791" w:history="1">
             <w:r>
               <w:rPr>
                 <w:rStyle w:val="Hyperlink"/>
@@ -6618,7 +6618,7 @@
               <w:rPr>
                 <w:noProof/>
               </w:rPr>
-              <w:instrText xml:space="preserve"> PAGEREF _Toc241354354 \h </w:instrText>
+              <w:instrText xml:space="preserve"> PAGEREF _Toc241361791 \h </w:instrText>
             </w:r>
             <w:r>
               <w:rPr>
@@ -6660,7 +6660,7 @@
               <w14:ligatures w14:val="standardContextual"/>
             </w:rPr>
           </w:pPr>
-          <w:hyperlink w:anchor="_Toc241354355" w:history="1">
+          <w:hyperlink w:anchor="_Toc241361792" w:history="1">
             <w:r>
               <w:rPr>
                 <w:rStyle w:val="Hyperlink"/>
@@ -6684,7 +6684,7 @@
               <w:rPr>
                 <w:noProof/>
               </w:rPr>
-              <w:instrText xml:space="preserve"> PAGEREF _Toc241354355 \h </w:instrText>
+              <w:instrText xml:space="preserve"> PAGEREF _Toc241361792 \h </w:instrText>
             </w:r>
             <w:r>
               <w:rPr>
@@ -6726,7 +6726,7 @@
               <w14:ligatures w14:val="standardContextual"/>
             </w:rPr>
           </w:pPr>
-          <w:hyperlink w:anchor="_Toc241354356" w:history="1">
+          <w:hyperlink w:anchor="_Toc241361793" w:history="1">
             <w:r>
               <w:rPr>
                 <w:rStyle w:val="Hyperlink"/>
@@ -6750,7 +6750,7 @@
               <w:rPr>
                 <w:noProof/>
               </w:rPr>
-              <w:instrText xml:space="preserve"> PAGEREF _Toc241354356 \h </w:instrText>
+              <w:instrText xml:space="preserve"> PAGEREF _Toc241361793 \h </w:instrText>
             </w:r>
             <w:r>
               <w:rPr>
@@ -6792,7 +6792,7 @@
               <w14:ligatures w14:val="standardContextual"/>
             </w:rPr>
           </w:pPr>
-          <w:hyperlink w:anchor="_Toc241354357" w:history="1">
+          <w:hyperlink w:anchor="_Toc241361794" w:history="1">
             <w:r>
               <w:rPr>
                 <w:rStyle w:val="Hyperlink"/>
@@ -6816,7 +6816,7 @@
               <w:rPr>
                 <w:noProof/>
               </w:rPr>
-              <w:instrText xml:space="preserve"> PAGEREF _Toc241354357 \h </w:instrText>
+              <w:instrText xml:space="preserve"> PAGEREF _Toc241361794 \h </w:instrText>
             </w:r>
             <w:r>
               <w:rPr>
@@ -6858,7 +6858,7 @@
               <w14:ligatures w14:val="standardContextual"/>
             </w:rPr>
           </w:pPr>
-          <w:hyperlink w:anchor="_Toc241354358" w:history="1">
+          <w:hyperlink w:anchor="_Toc241361795" w:history="1">
             <w:r>
               <w:rPr>
                 <w:rStyle w:val="Hyperlink"/>
@@ -6882,7 +6882,7 @@
               <w:rPr>
                 <w:noProof/>
               </w:rPr>
-              <w:instrText xml:space="preserve"> PAGEREF _Toc241354358 \h </w:instrText>
+              <w:instrText xml:space="preserve"> PAGEREF _Toc241361795 \h </w:instrText>
             </w:r>
             <w:r>
               <w:rPr>
@@ -6924,7 +6924,7 @@
               <w14:ligatures w14:val="standardContextual"/>
             </w:rPr>
           </w:pPr>
-          <w:hyperlink w:anchor="_Toc241354359" w:history="1">
+          <w:hyperlink w:anchor="_Toc241361796" w:history="1">
             <w:r>
               <w:rPr>
                 <w:rStyle w:val="Hyperlink"/>
@@ -6948,7 +6948,7 @@
               <w:rPr>
                 <w:noProof/>
               </w:rPr>
-              <w:instrText xml:space="preserve"> PAGEREF _Toc241354359 \h </w:instrText>
+              <w:instrText xml:space="preserve"> PAGEREF _Toc241361796 \h </w:instrText>
             </w:r>
             <w:r>
               <w:rPr>
@@ -6990,7 +6990,7 @@
               <w14:ligatures w14:val="standardContextual"/>
             </w:rPr>
           </w:pPr>
-          <w:hyperlink w:anchor="_Toc241354360" w:history="1">
+          <w:hyperlink w:anchor="_Toc241361797" w:history="1">
             <w:r>
               <w:rPr>
                 <w:rStyle w:val="Hyperlink"/>
@@ -7014,7 +7014,7 @@
               <w:rPr>
                 <w:noProof/>
               </w:rPr>
-              <w:instrText xml:space="preserve"> PAGEREF _Toc241354360 \h </w:instrText>
+              <w:instrText xml:space="preserve"> PAGEREF _Toc241361797 \h </w:instrText>
             </w:r>
             <w:r>
               <w:rPr>
@@ -7056,7 +7056,7 @@
               <w14:ligatures w14:val="standardContextual"/>
             </w:rPr>
           </w:pPr>
-          <w:hyperlink w:anchor="_Toc241354361" w:history="1">
+          <w:hyperlink w:anchor="_Toc241361798" w:history="1">
             <w:r>
               <w:rPr>
                 <w:rStyle w:val="Hyperlink"/>
@@ -7080,7 +7080,7 @@
               <w:rPr>
                 <w:noProof/>
               </w:rPr>
-              <w:instrText xml:space="preserve"> PAGEREF _Toc241354361 \h </w:instrText>
+              <w:instrText xml:space="preserve"> PAGEREF _Toc241361798 \h </w:instrText>
             </w:r>
             <w:r>
               <w:rPr>
@@ -7122,7 +7122,7 @@
               <w14:ligatures w14:val="standardContextual"/>
             </w:rPr>
           </w:pPr>
-          <w:hyperlink w:anchor="_Toc241354362" w:history="1">
+          <w:hyperlink w:anchor="_Toc241361799" w:history="1">
             <w:r>
               <w:rPr>
                 <w:rStyle w:val="Hyperlink"/>
@@ -7146,7 +7146,7 @@
               <w:rPr>
                 <w:noProof/>
               </w:rPr>
-              <w:instrText xml:space="preserve"> PAGEREF _Toc241354362 \h </w:instrText>
+              <w:instrText xml:space="preserve"> PAGEREF _Toc241361799 \h </w:instrText>
             </w:r>
             <w:r>
               <w:rPr>
@@ -7188,7 +7188,7 @@
               <w14:ligatures w14:val="standardContextual"/>
             </w:rPr>
           </w:pPr>
-          <w:hyperlink w:anchor="_Toc241354363" w:history="1">
+          <w:hyperlink w:anchor="_Toc241361800" w:history="1">
             <w:r>
               <w:rPr>
                 <w:rStyle w:val="Hyperlink"/>
@@ -7212,7 +7212,7 @@
               <w:rPr>
                 <w:noProof/>
               </w:rPr>
-              <w:instrText xml:space="preserve"> PAGEREF _Toc241354363 \h </w:instrText>
+              <w:instrText xml:space="preserve"> PAGEREF _Toc241361800 \h </w:instrText>
             </w:r>
             <w:r>
               <w:rPr>
@@ -7254,7 +7254,7 @@
               <w14:ligatures w14:val="standardContextual"/>
             </w:rPr>
           </w:pPr>
-          <w:hyperlink w:anchor="_Toc241354364" w:history="1">
+          <w:hyperlink w:anchor="_Toc241361801" w:history="1">
             <w:r>
               <w:rPr>
                 <w:rStyle w:val="Hyperlink"/>
@@ -7278,7 +7278,7 @@
               <w:rPr>
                 <w:noProof/>
               </w:rPr>
-              <w:instrText xml:space="preserve"> PAGEREF _Toc241354364 \h </w:instrText>
+              <w:instrText xml:space="preserve"> PAGEREF _Toc241361801 \h </w:instrText>
             </w:r>
             <w:r>
               <w:rPr>
@@ -7320,7 +7320,7 @@
               <w14:ligatures w14:val="standardContextual"/>
             </w:rPr>
           </w:pPr>
-          <w:hyperlink w:anchor="_Toc241354365" w:history="1">
+          <w:hyperlink w:anchor="_Toc241361802" w:history="1">
             <w:r>
               <w:rPr>
                 <w:rStyle w:val="Hyperlink"/>
@@ -7344,7 +7344,7 @@
               <w:rPr>
                 <w:noProof/>
               </w:rPr>
-              <w:instrText xml:space="preserve"> PAGEREF _Toc241354365 \h </w:instrText>
+              <w:instrText xml:space="preserve"> PAGEREF _Toc241361802 \h </w:instrText>
             </w:r>
             <w:r>
               <w:rPr>
@@ -7386,7 +7386,7 @@
               <w14:ligatures w14:val="standardContextual"/>
             </w:rPr>
           </w:pPr>
-          <w:hyperlink w:anchor="_Toc241354366" w:history="1">
+          <w:hyperlink w:anchor="_Toc241361803" w:history="1">
             <w:r>
               <w:rPr>
                 <w:rStyle w:val="Hyperlink"/>
@@ -7410,7 +7410,7 @@
               <w:rPr>
                 <w:noProof/>
               </w:rPr>
-              <w:instrText xml:space="preserve"> PAGEREF _Toc241354366 \h </w:instrText>
+              <w:instrText xml:space="preserve"> PAGEREF _Toc241361803 \h </w:instrText>
             </w:r>
             <w:r>
               <w:rPr>
@@ -7463,7 +7463,7 @@
         <w:pStyle w:val="Kop1"/>
         <w:pageBreakBefore/>
       </w:pPr>
-      <w:bookmarkStart w:id="1" w:name="_Toc241354258"/>
+      <w:bookmarkStart w:id="1" w:name="_Toc241361695"/>
       <w:r>
         <w:lastRenderedPageBreak/>
         <w:t>Intended Use and Your Data</w:t>
@@ -7524,7 +7524,7 @@
       <w:pPr>
         <w:pStyle w:val="Kop2"/>
       </w:pPr>
-      <w:bookmarkStart w:id="2" w:name="_Toc241354259"/>
+      <w:bookmarkStart w:id="2" w:name="_Toc241361696"/>
       <w:r>
         <w:t>What the App Does Not Do</w:t>
       </w:r>
@@ -8065,7 +8065,7 @@
         <w:pStyle w:val="Kop1"/>
         <w:pageBreakBefore/>
       </w:pPr>
-      <w:bookmarkStart w:id="3" w:name="_Toc241354260"/>
+      <w:bookmarkStart w:id="3" w:name="_Toc241361697"/>
       <w:r>
         <w:lastRenderedPageBreak/>
         <w:t>Getting Started</w:t>
@@ -8076,7 +8076,7 @@
       <w:pPr>
         <w:pStyle w:val="Kop2"/>
       </w:pPr>
-      <w:bookmarkStart w:id="4" w:name="_Toc241354261"/>
+      <w:bookmarkStart w:id="4" w:name="_Toc241361698"/>
       <w:r>
         <w:t>Opening the Public App</w:t>
       </w:r>
@@ -8094,7 +8094,7 @@
       <w:pPr>
         <w:pStyle w:val="Kop2"/>
       </w:pPr>
-      <w:bookmarkStart w:id="5" w:name="_Toc241354262"/>
+      <w:bookmarkStart w:id="5" w:name="_Toc241361699"/>
       <w:r>
         <w:t>Installing the App on Your Own Computer</w:t>
       </w:r>
@@ -8174,7 +8174,7 @@
       <w:pPr>
         <w:pStyle w:val="Kop2"/>
       </w:pPr>
-      <w:bookmarkStart w:id="6" w:name="_Toc241354263"/>
+      <w:bookmarkStart w:id="6" w:name="_Toc241361700"/>
       <w:r>
         <w:t>The Hub Screen</w:t>
       </w:r>
@@ -8801,7 +8801,7 @@
       <w:pPr>
         <w:pStyle w:val="Kop2"/>
       </w:pPr>
-      <w:bookmarkStart w:id="7" w:name="_Toc241354264"/>
+      <w:bookmarkStart w:id="7" w:name="_Toc241361701"/>
       <w:r>
         <w:t>Getting Help Inside the App</w:t>
       </w:r>
@@ -8819,7 +8819,7 @@
       <w:pPr>
         <w:pStyle w:val="Kop2"/>
       </w:pPr>
-      <w:bookmarkStart w:id="8" w:name="_Toc241354265"/>
+      <w:bookmarkStart w:id="8" w:name="_Toc241361702"/>
       <w:r>
         <w:t>Saving Your Work</w:t>
       </w:r>
@@ -8838,7 +8838,7 @@
         <w:pStyle w:val="Kop1"/>
         <w:pageBreakBefore/>
       </w:pPr>
-      <w:bookmarkStart w:id="9" w:name="_Toc241354266"/>
+      <w:bookmarkStart w:id="9" w:name="_Toc241361703"/>
       <w:r>
         <w:lastRenderedPageBreak/>
         <w:t>Tutorials</w:t>
@@ -8857,7 +8857,7 @@
       <w:pPr>
         <w:pStyle w:val="Kop2"/>
       </w:pPr>
-      <w:bookmarkStart w:id="10" w:name="_Toc241354267"/>
+      <w:bookmarkStart w:id="10" w:name="_Toc241361704"/>
       <w:r>
         <w:t>Tutorial 1: A First Analysis Without a File</w:t>
       </w:r>
@@ -8996,7 +8996,7 @@
       <w:pPr>
         <w:pStyle w:val="Kop2"/>
       </w:pPr>
-      <w:bookmarkStart w:id="11" w:name="_Toc241354268"/>
+      <w:bookmarkStart w:id="11" w:name="_Toc241361705"/>
       <w:r>
         <w:t>Tutorial 2: Uploading Data with BLQ Results</w:t>
       </w:r>
@@ -9215,7 +9215,7 @@
       <w:pPr>
         <w:pStyle w:val="Kop2"/>
       </w:pPr>
-      <w:bookmarkStart w:id="12" w:name="_Toc241354269"/>
+      <w:bookmarkStart w:id="12" w:name="_Toc241361706"/>
       <w:r>
         <w:t>Tutorial 3: All Subjects at Once (Theophylline)</w:t>
       </w:r>
@@ -9383,7 +9383,7 @@
       <w:pPr>
         <w:pStyle w:val="Kop2"/>
       </w:pPr>
-      <w:bookmarkStart w:id="13" w:name="_Toc241354270"/>
+      <w:bookmarkStart w:id="13" w:name="_Toc241361707"/>
       <w:r>
         <w:t>Tutorial 4: Bioequivalence</w:t>
       </w:r>
@@ -9568,7 +9568,7 @@
       <w:pPr>
         <w:pStyle w:val="Kop2"/>
       </w:pPr>
-      <w:bookmarkStart w:id="14" w:name="_Toc241354271"/>
+      <w:bookmarkStart w:id="14" w:name="_Toc241361708"/>
       <w:r>
         <w:lastRenderedPageBreak/>
         <w:t>Tutorial 5: Planning a Study</w:t>
@@ -9728,7 +9728,7 @@
       <w:pPr>
         <w:pStyle w:val="Kop2"/>
       </w:pPr>
-      <w:bookmarkStart w:id="15" w:name="_Toc241354272"/>
+      <w:bookmarkStart w:id="15" w:name="_Toc241361709"/>
       <w:r>
         <w:t>Tutorial 6: Partial AUCs</w:t>
       </w:r>
@@ -9860,7 +9860,7 @@
       <w:pPr>
         <w:pStyle w:val="Kop2"/>
       </w:pPr>
-      <w:bookmarkStart w:id="16" w:name="_Toc241354273"/>
+      <w:bookmarkStart w:id="16" w:name="_Toc241361710"/>
       <w:r>
         <w:t>Tutorial 7: Figures</w:t>
       </w:r>
@@ -9966,7 +9966,7 @@
       <w:pPr>
         <w:pStyle w:val="Kop2"/>
       </w:pPr>
-      <w:bookmarkStart w:id="17" w:name="_Toc241354274"/>
+      <w:bookmarkStart w:id="17" w:name="_Toc241361711"/>
       <w:r>
         <w:t>Answer Key</w:t>
       </w:r>
@@ -10075,7 +10075,7 @@
         <w:pStyle w:val="Kop1"/>
         <w:pageBreakBefore/>
       </w:pPr>
-      <w:bookmarkStart w:id="18" w:name="_Toc241354275"/>
+      <w:bookmarkStart w:id="18" w:name="_Toc241361712"/>
       <w:r>
         <w:lastRenderedPageBreak/>
         <w:t>Preparing Your Data and Study Types</w:t>
@@ -10086,7 +10086,7 @@
       <w:pPr>
         <w:pStyle w:val="Kop2"/>
       </w:pPr>
-      <w:bookmarkStart w:id="19" w:name="_Toc241354276"/>
+      <w:bookmarkStart w:id="19" w:name="_Toc241361713"/>
       <w:r>
         <w:t>General Format Rules</w:t>
       </w:r>
@@ -10181,7 +10181,7 @@
       <w:pPr>
         <w:pStyle w:val="Kop2"/>
       </w:pPr>
-      <w:bookmarkStart w:id="20" w:name="_Toc241354277"/>
+      <w:bookmarkStart w:id="20" w:name="_Toc241361714"/>
       <w:r>
         <w:t>Scenario 1: Single Subject</w:t>
       </w:r>
@@ -10880,7 +10880,7 @@
       <w:pPr>
         <w:pStyle w:val="Kop2"/>
       </w:pPr>
-      <w:bookmarkStart w:id="21" w:name="_Toc241354278"/>
+      <w:bookmarkStart w:id="21" w:name="_Toc241361715"/>
       <w:r>
         <w:t>Scenario 2: Multiple Subjects, Same Dose</w:t>
       </w:r>
@@ -11490,7 +11490,7 @@
       <w:pPr>
         <w:pStyle w:val="Kop2"/>
       </w:pPr>
-      <w:bookmarkStart w:id="22" w:name="_Toc241354279"/>
+      <w:bookmarkStart w:id="22" w:name="_Toc241361716"/>
       <w:r>
         <w:t>Scenario 3: Multiple Subjects, Different Doses</w:t>
       </w:r>
@@ -11508,7 +11508,7 @@
       <w:pPr>
         <w:pStyle w:val="Kop2"/>
       </w:pPr>
-      <w:bookmarkStart w:id="23" w:name="_Toc241354280"/>
+      <w:bookmarkStart w:id="23" w:name="_Toc241361717"/>
       <w:r>
         <w:t>Scenario 4: Standard 2-Period Crossover (BE)</w:t>
       </w:r>
@@ -12380,7 +12380,7 @@
       <w:pPr>
         <w:pStyle w:val="Kop2"/>
       </w:pPr>
-      <w:bookmarkStart w:id="24" w:name="_Toc241354281"/>
+      <w:bookmarkStart w:id="24" w:name="_Toc241361718"/>
       <w:r>
         <w:t>Scenario 5: Replicate Designs and Paired Comparison</w:t>
       </w:r>
@@ -12398,7 +12398,7 @@
       <w:pPr>
         <w:pStyle w:val="Kop2"/>
       </w:pPr>
-      <w:bookmarkStart w:id="25" w:name="_Toc241354282"/>
+      <w:bookmarkStart w:id="25" w:name="_Toc241361719"/>
       <w:r>
         <w:t>Scenario 6: Parallel-Group BE</w:t>
       </w:r>
@@ -12416,7 +12416,7 @@
       <w:pPr>
         <w:pStyle w:val="Kop2"/>
       </w:pPr>
-      <w:bookmarkStart w:id="26" w:name="_Toc241354283"/>
+      <w:bookmarkStart w:id="26" w:name="_Toc241361720"/>
       <w:r>
         <w:t>Scenario 7: Steady-State PK</w:t>
       </w:r>
@@ -12450,7 +12450,7 @@
       <w:pPr>
         <w:pStyle w:val="Kop2"/>
       </w:pPr>
-      <w:bookmarkStart w:id="27" w:name="_Toc241354284"/>
+      <w:bookmarkStart w:id="27" w:name="_Toc241361721"/>
       <w:r>
         <w:t>Scenario 8: Drug–Drug Interaction Study</w:t>
       </w:r>
@@ -12476,7 +12476,7 @@
       <w:pPr>
         <w:pStyle w:val="Kop2"/>
       </w:pPr>
-      <w:bookmarkStart w:id="28" w:name="_Toc241354285"/>
+      <w:bookmarkStart w:id="28" w:name="_Toc241361722"/>
       <w:r>
         <w:lastRenderedPageBreak/>
         <w:t>Scenario 9: CDISC ADNCA Dataset</w:t>
@@ -12535,7 +12535,7 @@
       <w:pPr>
         <w:pStyle w:val="Kop2"/>
       </w:pPr>
-      <w:bookmarkStart w:id="29" w:name="_Toc241354286"/>
+      <w:bookmarkStart w:id="29" w:name="_Toc241361723"/>
       <w:r>
         <w:t>Scenario 10: IV Bolus and IV Infusion</w:t>
       </w:r>
@@ -12561,7 +12561,7 @@
       <w:pPr>
         <w:pStyle w:val="Kop2"/>
       </w:pPr>
-      <w:bookmarkStart w:id="30" w:name="_Toc241354287"/>
+      <w:bookmarkStart w:id="30" w:name="_Toc241361724"/>
       <w:r>
         <w:t>Scenario 11: Single Ascending Dose and Dose Proportionality</w:t>
       </w:r>
@@ -12579,7 +12579,7 @@
       <w:pPr>
         <w:pStyle w:val="Kop2"/>
       </w:pPr>
-      <w:bookmarkStart w:id="31" w:name="_Toc241354288"/>
+      <w:bookmarkStart w:id="31" w:name="_Toc241361725"/>
       <w:r>
         <w:t>Scenario 12: Multiple Dosing and Accumulation</w:t>
       </w:r>
@@ -12625,7 +12625,7 @@
       <w:pPr>
         <w:pStyle w:val="Kop2"/>
       </w:pPr>
-      <w:bookmarkStart w:id="32" w:name="_Toc241354289"/>
+      <w:bookmarkStart w:id="32" w:name="_Toc241361726"/>
       <w:r>
         <w:t>Scenario 13: Food Effect</w:t>
       </w:r>
@@ -12643,7 +12643,7 @@
       <w:pPr>
         <w:pStyle w:val="Kop2"/>
       </w:pPr>
-      <w:bookmarkStart w:id="33" w:name="_Toc241354290"/>
+      <w:bookmarkStart w:id="33" w:name="_Toc241361727"/>
       <w:r>
         <w:t>Scenario 14: Metabolites and Several Analytes</w:t>
       </w:r>
@@ -12661,7 +12661,7 @@
       <w:pPr>
         <w:pStyle w:val="Kop2"/>
       </w:pPr>
-      <w:bookmarkStart w:id="34" w:name="_Toc241354291"/>
+      <w:bookmarkStart w:id="34" w:name="_Toc241361728"/>
       <w:r>
         <w:t>Scenario 15: Absolute and Relative Bioavailability</w:t>
       </w:r>
@@ -12679,7 +12679,7 @@
       <w:pPr>
         <w:pStyle w:val="Kop2"/>
       </w:pPr>
-      <w:bookmarkStart w:id="35" w:name="_Toc241354292"/>
+      <w:bookmarkStart w:id="35" w:name="_Toc241361729"/>
       <w:r>
         <w:t>Studies with Three or More Treatments</w:t>
       </w:r>
@@ -12697,7 +12697,7 @@
       <w:pPr>
         <w:pStyle w:val="Kop2"/>
       </w:pPr>
-      <w:bookmarkStart w:id="36" w:name="_Toc241354293"/>
+      <w:bookmarkStart w:id="36" w:name="_Toc241361730"/>
       <w:r>
         <w:t>BLQ Handling</w:t>
       </w:r>
@@ -13527,7 +13527,7 @@
       <w:pPr>
         <w:pStyle w:val="Kop2"/>
       </w:pPr>
-      <w:bookmarkStart w:id="37" w:name="_Toc241354294"/>
+      <w:bookmarkStart w:id="37" w:name="_Toc241361731"/>
       <w:r>
         <w:t>Common Mistakes</w:t>
       </w:r>
@@ -13665,7 +13665,7 @@
         <w:pStyle w:val="Kop1"/>
         <w:pageBreakBefore/>
       </w:pPr>
-      <w:bookmarkStart w:id="38" w:name="_Toc241354295"/>
+      <w:bookmarkStart w:id="38" w:name="_Toc241361732"/>
       <w:r>
         <w:lastRenderedPageBreak/>
         <w:t>Using the App</w:t>
@@ -13684,7 +13684,7 @@
       <w:pPr>
         <w:pStyle w:val="Kop2"/>
       </w:pPr>
-      <w:bookmarkStart w:id="39" w:name="_Toc241354296"/>
+      <w:bookmarkStart w:id="39" w:name="_Toc241361733"/>
       <w:r>
         <w:t>Path 1: Plan a Study</w:t>
       </w:r>
@@ -14157,7 +14157,7 @@
       <w:pPr>
         <w:pStyle w:val="Kop2"/>
       </w:pPr>
-      <w:bookmarkStart w:id="40" w:name="_Toc241354297"/>
+      <w:bookmarkStart w:id="40" w:name="_Toc241361734"/>
       <w:r>
         <w:lastRenderedPageBreak/>
         <w:t>Path 2: Upload &amp; Check Data</w:t>
@@ -14230,7 +14230,7 @@
       <w:pPr>
         <w:pStyle w:val="Kop2"/>
       </w:pPr>
-      <w:bookmarkStart w:id="41" w:name="_Toc241354298"/>
+      <w:bookmarkStart w:id="41" w:name="_Toc241361735"/>
       <w:r>
         <w:t>Path 3: Visualize Data</w:t>
       </w:r>
@@ -14487,7 +14487,7 @@
       <w:pPr>
         <w:pStyle w:val="Kop2"/>
       </w:pPr>
-      <w:bookmarkStart w:id="42" w:name="_Toc241354299"/>
+      <w:bookmarkStart w:id="42" w:name="_Toc241361736"/>
       <w:r>
         <w:t>Path 4: One Subject at a Time</w:t>
       </w:r>
@@ -14663,7 +14663,7 @@
       <w:pPr>
         <w:pStyle w:val="Kop2"/>
       </w:pPr>
-      <w:bookmarkStart w:id="43" w:name="_Toc241354300"/>
+      <w:bookmarkStart w:id="43" w:name="_Toc241361737"/>
       <w:r>
         <w:t>Path 5: All Subjects (Batch)</w:t>
       </w:r>
@@ -14938,7 +14938,7 @@
       <w:pPr>
         <w:pStyle w:val="Kop2"/>
       </w:pPr>
-      <w:bookmarkStart w:id="44" w:name="_Toc241354301"/>
+      <w:bookmarkStart w:id="44" w:name="_Toc241361738"/>
       <w:r>
         <w:t>Path 6: Bioequivalence</w:t>
       </w:r>
@@ -15789,7 +15789,7 @@
       <w:pPr>
         <w:pStyle w:val="Kop2"/>
       </w:pPr>
-      <w:bookmarkStart w:id="45" w:name="_Toc241354302"/>
+      <w:bookmarkStart w:id="45" w:name="_Toc241361739"/>
       <w:r>
         <w:t>Analysing Drug–Drug Interaction Studies</w:t>
       </w:r>
@@ -15918,7 +15918,7 @@
       <w:pPr>
         <w:pStyle w:val="Kop2"/>
       </w:pPr>
-      <w:bookmarkStart w:id="46" w:name="_Toc241354303"/>
+      <w:bookmarkStart w:id="46" w:name="_Toc241361740"/>
       <w:r>
         <w:t>Complete Analysis Record</w:t>
       </w:r>
@@ -16333,7 +16333,7 @@
         <w:pStyle w:val="Kop1"/>
         <w:pageBreakBefore/>
       </w:pPr>
-      <w:bookmarkStart w:id="47" w:name="_Toc241354304"/>
+      <w:bookmarkStart w:id="47" w:name="_Toc241361741"/>
       <w:r>
         <w:lastRenderedPageBreak/>
         <w:t>Reading Your Results</w:t>
@@ -16344,7 +16344,7 @@
       <w:pPr>
         <w:pStyle w:val="Kop2"/>
       </w:pPr>
-      <w:bookmarkStart w:id="48" w:name="_Toc241354305"/>
+      <w:bookmarkStart w:id="48" w:name="_Toc241361742"/>
       <w:r>
         <w:t>The Data Quality Report</w:t>
       </w:r>
@@ -16729,7 +16729,7 @@
       <w:pPr>
         <w:pStyle w:val="Kop2"/>
       </w:pPr>
-      <w:bookmarkStart w:id="49" w:name="_Toc241354306"/>
+      <w:bookmarkStart w:id="49" w:name="_Toc241361743"/>
       <w:r>
         <w:t>The Parameter Table</w:t>
       </w:r>
@@ -16747,7 +16747,7 @@
       <w:pPr>
         <w:pStyle w:val="Kop2"/>
       </w:pPr>
-      <w:bookmarkStart w:id="50" w:name="_Toc241354307"/>
+      <w:bookmarkStart w:id="50" w:name="_Toc241361744"/>
       <w:r>
         <w:t>Summary Statistics</w:t>
       </w:r>
@@ -17187,7 +17187,7 @@
       <w:pPr>
         <w:pStyle w:val="Kop2"/>
       </w:pPr>
-      <w:bookmarkStart w:id="51" w:name="_Toc241354308"/>
+      <w:bookmarkStart w:id="51" w:name="_Toc241361745"/>
       <w:r>
         <w:t>The Bioequivalence Table and Forest Plot</w:t>
       </w:r>
@@ -17796,7 +17796,7 @@
       <w:pPr>
         <w:pStyle w:val="Kop2"/>
       </w:pPr>
-      <w:bookmarkStart w:id="52" w:name="_Toc241354309"/>
+      <w:bookmarkStart w:id="52" w:name="_Toc241361746"/>
       <w:r>
         <w:t>Judging the Terminal Phase</w:t>
       </w:r>
@@ -17891,7 +17891,7 @@
       <w:pPr>
         <w:pStyle w:val="Kop2"/>
       </w:pPr>
-      <w:bookmarkStart w:id="53" w:name="_Toc241354310"/>
+      <w:bookmarkStart w:id="53" w:name="_Toc241361747"/>
       <w:r>
         <w:t>Checking Plausibility</w:t>
       </w:r>
@@ -18021,7 +18021,7 @@
         <w:pStyle w:val="Kop1"/>
         <w:pageBreakBefore/>
       </w:pPr>
-      <w:bookmarkStart w:id="54" w:name="_Toc241354311"/>
+      <w:bookmarkStart w:id="54" w:name="_Toc241361748"/>
       <w:r>
         <w:lastRenderedPageBreak/>
         <w:t>Working on a Controlled Installation</w:t>
@@ -18040,7 +18040,7 @@
       <w:pPr>
         <w:pStyle w:val="Kop2"/>
       </w:pPr>
-      <w:bookmarkStart w:id="55" w:name="_Toc241354312"/>
+      <w:bookmarkStart w:id="55" w:name="_Toc241361749"/>
       <w:r>
         <w:t>What Is Different on a Controlled Installation</w:t>
       </w:r>
@@ -18661,7 +18661,7 @@
       <w:pPr>
         <w:pStyle w:val="Kop2"/>
       </w:pPr>
-      <w:bookmarkStart w:id="56" w:name="_Toc241354313"/>
+      <w:bookmarkStart w:id="56" w:name="_Toc241361750"/>
       <w:r>
         <w:t>Signing In for the First Time</w:t>
       </w:r>
@@ -18720,7 +18720,7 @@
       <w:pPr>
         <w:pStyle w:val="Kop2"/>
       </w:pPr>
-      <w:bookmarkStart w:id="57" w:name="_Toc241354314"/>
+      <w:bookmarkStart w:id="57" w:name="_Toc241361751"/>
       <w:r>
         <w:lastRenderedPageBreak/>
         <w:t>Changing Your Password</w:t>
@@ -18764,7 +18764,7 @@
       <w:pPr>
         <w:pStyle w:val="Kop2"/>
       </w:pPr>
-      <w:bookmarkStart w:id="58" w:name="_Toc241354315"/>
+      <w:bookmarkStart w:id="58" w:name="_Toc241361752"/>
       <w:r>
         <w:t>Staying Signed In</w:t>
       </w:r>
@@ -18808,7 +18808,7 @@
       <w:pPr>
         <w:pStyle w:val="Kop2"/>
       </w:pPr>
-      <w:bookmarkStart w:id="59" w:name="_Toc241354316"/>
+      <w:bookmarkStart w:id="59" w:name="_Toc241361753"/>
       <w:r>
         <w:t>Creating a Record for Review</w:t>
       </w:r>
@@ -18893,7 +18893,7 @@
       <w:pPr>
         <w:pStyle w:val="Kop2"/>
       </w:pPr>
-      <w:bookmarkStart w:id="60" w:name="_Toc241354317"/>
+      <w:bookmarkStart w:id="60" w:name="_Toc241361754"/>
       <w:r>
         <w:t>Reviewing and Signing a Record</w:t>
       </w:r>
@@ -19081,7 +19081,7 @@
       <w:pPr>
         <w:pStyle w:val="Kop2"/>
       </w:pPr>
-      <w:bookmarkStart w:id="61" w:name="_Toc241354318"/>
+      <w:bookmarkStart w:id="61" w:name="_Toc241361755"/>
       <w:r>
         <w:t>The Signature Sheet</w:t>
       </w:r>
@@ -19143,7 +19143,7 @@
       <w:pPr>
         <w:pStyle w:val="Kop2"/>
       </w:pPr>
-      <w:bookmarkStart w:id="62" w:name="_Toc241354319"/>
+      <w:bookmarkStart w:id="62" w:name="_Toc241361756"/>
       <w:r>
         <w:t>Reviewing the Audit Trail</w:t>
       </w:r>
@@ -19243,23 +19243,18 @@
         <w:t>Export CSV</w:t>
       </w:r>
       <w:r>
-        <w:t xml:space="preserve"> saves the entries of the current filter, for example one study, with the result of the check at the top. After a review, a reviewer clicks Sign trail review and signs with user ID and password; this records the period</w:t>
-      </w:r>
-      <w:r>
-        <w:rPr>
-          <w:b/>
-        </w:rPr>
-      </w:r>
-      <w:r/>
-      <w:r>
-        <w:t xml:space="preserve"> reviewed. How often to review, and what else triggers a review, is set by your organisation's procedure.</w:t>
+        <w:t xml:space="preserve"> saves the entries of the current filter, for example one study, with the result of the check at the top. After a review, a reviewer clicks Sign trail review and signs with user ID and </w:t>
+      </w:r>
+      <w:r>
+        <w:lastRenderedPageBreak/>
+        <w:t>password; this records the period reviewed. How often to review, and what else triggers a review, is set by your organisation's procedure.</w:t>
       </w:r>
     </w:p>
     <w:p>
       <w:pPr>
         <w:pStyle w:val="Kop2"/>
       </w:pPr>
-      <w:bookmarkStart w:id="63" w:name="_Toc241354320"/>
+      <w:bookmarkStart w:id="63" w:name="_Toc241361757"/>
       <w:r>
         <w:t>For Inspectors</w:t>
       </w:r>
@@ -19277,7 +19272,7 @@
       <w:pPr>
         <w:pStyle w:val="Kop2"/>
       </w:pPr>
-      <w:bookmarkStart w:id="64" w:name="_Toc241354321"/>
+      <w:bookmarkStart w:id="64" w:name="_Toc241361758"/>
       <w:r>
         <w:t>Tutorial 8: From Analysis to Approved Record</w:t>
       </w:r>
@@ -19446,7 +19441,7 @@
         <w:pStyle w:val="Kop1"/>
         <w:pageBreakBefore/>
       </w:pPr>
-      <w:bookmarkStart w:id="65" w:name="_Toc241354322"/>
+      <w:bookmarkStart w:id="65" w:name="_Toc241361759"/>
       <w:r>
         <w:lastRenderedPageBreak/>
         <w:t>Using NCA Assistant in a Regulated Environment</w:t>
@@ -19465,7 +19460,7 @@
       <w:pPr>
         <w:pStyle w:val="Kop2"/>
       </w:pPr>
-      <w:bookmarkStart w:id="66" w:name="_Toc241354323"/>
+      <w:bookmarkStart w:id="66" w:name="_Toc241361760"/>
       <w:r>
         <w:t>Status and Scope</w:t>
       </w:r>
@@ -19483,7 +19478,7 @@
       <w:pPr>
         <w:pStyle w:val="Kop2"/>
       </w:pPr>
-      <w:bookmarkStart w:id="67" w:name="_Toc241354324"/>
+      <w:bookmarkStart w:id="67" w:name="_Toc241361761"/>
       <w:r>
         <w:t>Which Rules Apply</w:t>
       </w:r>
@@ -19501,7 +19496,7 @@
       <w:pPr>
         <w:pStyle w:val="Kop2"/>
       </w:pPr>
-      <w:bookmarkStart w:id="68" w:name="_Toc241354325"/>
+      <w:bookmarkStart w:id="68" w:name="_Toc241361762"/>
       <w:r>
         <w:t>Installing a Qualified Instance</w:t>
       </w:r>
@@ -19519,7 +19514,7 @@
       <w:pPr>
         <w:pStyle w:val="Kop2"/>
       </w:pPr>
-      <w:bookmarkStart w:id="69" w:name="_Toc241354326"/>
+      <w:bookmarkStart w:id="69" w:name="_Toc241361763"/>
       <w:r>
         <w:t>Qualification</w:t>
       </w:r>
@@ -19577,7 +19572,7 @@
       <w:pPr>
         <w:pStyle w:val="Kop2"/>
       </w:pPr>
-      <w:bookmarkStart w:id="70" w:name="_Toc241354327"/>
+      <w:bookmarkStart w:id="70" w:name="_Toc241361764"/>
       <w:r>
         <w:lastRenderedPageBreak/>
         <w:t>Controls on a Controlled Installation, and Your Responsibilities</w:t>
@@ -19722,7 +19717,7 @@
       <w:pPr>
         <w:pStyle w:val="Kop2"/>
       </w:pPr>
-      <w:bookmarkStart w:id="71" w:name="_Toc241354328"/>
+      <w:bookmarkStart w:id="71" w:name="_Toc241361765"/>
       <w:r>
         <w:lastRenderedPageBreak/>
         <w:t>Before Each Analysis</w:t>
@@ -19741,7 +19736,7 @@
       <w:pPr>
         <w:pStyle w:val="Kop2"/>
       </w:pPr>
-      <w:bookmarkStart w:id="72" w:name="_Toc241354329"/>
+      <w:bookmarkStart w:id="72" w:name="_Toc241361766"/>
       <w:r>
         <w:t>Exclusions, Outliers and Deviations</w:t>
       </w:r>
@@ -19815,7 +19810,7 @@
       <w:pPr>
         <w:pStyle w:val="Kop2"/>
       </w:pPr>
-      <w:bookmarkStart w:id="73" w:name="_Toc241354330"/>
+      <w:bookmarkStart w:id="73" w:name="_Toc241361767"/>
       <w:r>
         <w:t>Reading Verdicts in a Regulated Context</w:t>
       </w:r>
@@ -19857,7 +19852,7 @@
       <w:pPr>
         <w:pStyle w:val="Kop2"/>
       </w:pPr>
-      <w:bookmarkStart w:id="74" w:name="_Toc241354331"/>
+      <w:bookmarkStart w:id="74" w:name="_Toc241361768"/>
       <w:r>
         <w:t>The Analysis Record in a Regulated Context</w:t>
       </w:r>
@@ -19876,7 +19871,7 @@
       <w:pPr>
         <w:pStyle w:val="Kop2"/>
       </w:pPr>
-      <w:bookmarkStart w:id="75" w:name="_Toc241354332"/>
+      <w:bookmarkStart w:id="75" w:name="_Toc241361769"/>
       <w:r>
         <w:t>Reporting and Citing</w:t>
       </w:r>
@@ -19894,7 +19889,7 @@
       <w:pPr>
         <w:pStyle w:val="Kop2"/>
       </w:pPr>
-      <w:bookmarkStart w:id="76" w:name="_Toc241354333"/>
+      <w:bookmarkStart w:id="76" w:name="_Toc241361770"/>
       <w:r>
         <w:t>Archiving and Retention</w:t>
       </w:r>
@@ -19912,7 +19907,7 @@
       <w:pPr>
         <w:pStyle w:val="Kop2"/>
       </w:pPr>
-      <w:bookmarkStart w:id="77" w:name="_Toc241354334"/>
+      <w:bookmarkStart w:id="77" w:name="_Toc241361771"/>
       <w:r>
         <w:t>Upgrades and Change Control</w:t>
       </w:r>
@@ -19930,7 +19925,7 @@
       <w:pPr>
         <w:pStyle w:val="Kop2"/>
       </w:pPr>
-      <w:bookmarkStart w:id="78" w:name="_Toc241354335"/>
+      <w:bookmarkStart w:id="78" w:name="_Toc241361772"/>
       <w:r>
         <w:t>Data Protection</w:t>
       </w:r>
@@ -19948,7 +19943,7 @@
       <w:pPr>
         <w:pStyle w:val="Kop2"/>
       </w:pPr>
-      <w:bookmarkStart w:id="79" w:name="_Toc241354336"/>
+      <w:bookmarkStart w:id="79" w:name="_Toc241361773"/>
       <w:r>
         <w:lastRenderedPageBreak/>
         <w:t>Reporting Problems</w:t>
@@ -19968,7 +19963,7 @@
         <w:pStyle w:val="Kop1"/>
         <w:pageBreakBefore/>
       </w:pPr>
-      <w:bookmarkStart w:id="80" w:name="_Toc241354337"/>
+      <w:bookmarkStart w:id="80" w:name="_Toc241361774"/>
       <w:r>
         <w:lastRenderedPageBreak/>
         <w:t>Introduction to Non-Compartmental Analysis</w:t>
@@ -19979,7 +19974,7 @@
       <w:pPr>
         <w:pStyle w:val="Kop2"/>
       </w:pPr>
-      <w:bookmarkStart w:id="81" w:name="_Toc241354338"/>
+      <w:bookmarkStart w:id="81" w:name="_Toc241361775"/>
       <w:r>
         <w:t>What Is Non-Compartmental Analysis?</w:t>
       </w:r>
@@ -20005,7 +20000,7 @@
       <w:pPr>
         <w:pStyle w:val="Kop2"/>
       </w:pPr>
-      <w:bookmarkStart w:id="82" w:name="_Toc241354339"/>
+      <w:bookmarkStart w:id="82" w:name="_Toc241361776"/>
       <w:r>
         <w:t>The Concentration–Time Curve</w:t>
       </w:r>
@@ -20023,7 +20018,7 @@
       <w:pPr>
         <w:pStyle w:val="Kop2"/>
       </w:pPr>
-      <w:bookmarkStart w:id="83" w:name="_Toc241354340"/>
+      <w:bookmarkStart w:id="83" w:name="_Toc241361777"/>
       <w:r>
         <w:t>Key Pharmacokinetic Parameters</w:t>
       </w:r>
@@ -21122,7 +21117,7 @@
       <w:pPr>
         <w:pStyle w:val="Kop2"/>
       </w:pPr>
-      <w:bookmarkStart w:id="84" w:name="_Toc241354341"/>
+      <w:bookmarkStart w:id="84" w:name="_Toc241361778"/>
       <w:r>
         <w:t>Why NCA Is Used So Widely</w:t>
       </w:r>
@@ -21157,7 +21152,7 @@
       <w:pPr>
         <w:pStyle w:val="Kop2"/>
       </w:pPr>
-      <w:bookmarkStart w:id="85" w:name="_Toc241354342"/>
+      <w:bookmarkStart w:id="85" w:name="_Toc241361779"/>
       <w:r>
         <w:t>When to Use NCA vs. Compartmental Modelling</w:t>
       </w:r>
@@ -21176,7 +21171,7 @@
         <w:pStyle w:val="Kop1"/>
         <w:pageBreakBefore/>
       </w:pPr>
-      <w:bookmarkStart w:id="86" w:name="_Toc241354343"/>
+      <w:bookmarkStart w:id="86" w:name="_Toc241361780"/>
       <w:r>
         <w:lastRenderedPageBreak/>
         <w:t>Theoretical Background</w:t>
@@ -21187,7 +21182,7 @@
       <w:pPr>
         <w:pStyle w:val="Kop2"/>
       </w:pPr>
-      <w:bookmarkStart w:id="87" w:name="_Toc241354344"/>
+      <w:bookmarkStart w:id="87" w:name="_Toc241361781"/>
       <w:r>
         <w:t>Trapezoidal Methods for AUC Calculation</w:t>
       </w:r>
@@ -21337,7 +21332,7 @@
       <w:pPr>
         <w:pStyle w:val="Kop2"/>
       </w:pPr>
-      <w:bookmarkStart w:id="88" w:name="_Toc241354345"/>
+      <w:bookmarkStart w:id="88" w:name="_Toc241361782"/>
       <w:r>
         <w:t>Terminal Phase Characterisation and Half-Life Estimation</w:t>
       </w:r>
@@ -21496,7 +21491,7 @@
       <w:pPr>
         <w:pStyle w:val="Kop2"/>
       </w:pPr>
-      <w:bookmarkStart w:id="89" w:name="_Toc241354346"/>
+      <w:bookmarkStart w:id="89" w:name="_Toc241361783"/>
       <w:r>
         <w:t>BLQ Handling: Pharmacological Rationale</w:t>
       </w:r>
@@ -21518,7 +21513,7 @@
       <w:pPr>
         <w:pStyle w:val="Kop2"/>
       </w:pPr>
-      <w:bookmarkStart w:id="90" w:name="_Toc241354347"/>
+      <w:bookmarkStart w:id="90" w:name="_Toc241361784"/>
       <w:r>
         <w:t>Steady-State Considerations</w:t>
       </w:r>
@@ -21536,7 +21531,7 @@
       <w:pPr>
         <w:pStyle w:val="Kop2"/>
       </w:pPr>
-      <w:bookmarkStart w:id="91" w:name="_Toc241354348"/>
+      <w:bookmarkStart w:id="91" w:name="_Toc241361785"/>
       <w:r>
         <w:t>Partial AUCs: Interpolation and the End of the Interval</w:t>
       </w:r>
@@ -21579,7 +21574,7 @@
         <w:pStyle w:val="Kop1"/>
         <w:pageBreakBefore/>
       </w:pPr>
-      <w:bookmarkStart w:id="92" w:name="_Toc241354349"/>
+      <w:bookmarkStart w:id="92" w:name="_Toc241361786"/>
       <w:r>
         <w:lastRenderedPageBreak/>
         <w:t>Statistical Methods</w:t>
@@ -21590,7 +21585,7 @@
       <w:pPr>
         <w:pStyle w:val="Kop2"/>
       </w:pPr>
-      <w:bookmarkStart w:id="93" w:name="_Toc241354350"/>
+      <w:bookmarkStart w:id="93" w:name="_Toc241361787"/>
       <w:r>
         <w:t>The Two One-Sided Tests (TOST) Procedure</w:t>
       </w:r>
@@ -21659,7 +21654,7 @@
       <w:pPr>
         <w:pStyle w:val="Kop2"/>
       </w:pPr>
-      <w:bookmarkStart w:id="94" w:name="_Toc241354351"/>
+      <w:bookmarkStart w:id="94" w:name="_Toc241361788"/>
       <w:r>
         <w:t>The ANOVA Model for Crossover Designs</w:t>
       </w:r>
@@ -21693,7 +21688,7 @@
       <w:pPr>
         <w:pStyle w:val="Kop2"/>
       </w:pPr>
-      <w:bookmarkStart w:id="95" w:name="_Toc241354352"/>
+      <w:bookmarkStart w:id="95" w:name="_Toc241361789"/>
       <w:r>
         <w:t>Fixed-Effects vs. Mixed-Effects Models</w:t>
       </w:r>
@@ -21719,7 +21714,7 @@
       <w:pPr>
         <w:pStyle w:val="Kop2"/>
       </w:pPr>
-      <w:bookmarkStart w:id="96" w:name="_Toc241354353"/>
+      <w:bookmarkStart w:id="96" w:name="_Toc241361790"/>
       <w:r>
         <w:t>Confidence Interval Construction</w:t>
       </w:r>
@@ -21749,7 +21744,7 @@
       <w:pPr>
         <w:pStyle w:val="Kop2"/>
       </w:pPr>
-      <w:bookmarkStart w:id="97" w:name="_Toc241354354"/>
+      <w:bookmarkStart w:id="97" w:name="_Toc241361791"/>
       <w:r>
         <w:t>Design-Specific Models</w:t>
       </w:r>
@@ -21833,7 +21828,7 @@
       <w:pPr>
         <w:pStyle w:val="Kop2"/>
       </w:pPr>
-      <w:bookmarkStart w:id="98" w:name="_Toc241354355"/>
+      <w:bookmarkStart w:id="98" w:name="_Toc241361792"/>
       <w:r>
         <w:t>Drug–Drug Interaction Analysis</w:t>
       </w:r>
@@ -21859,7 +21854,7 @@
       <w:pPr>
         <w:pStyle w:val="Kop2"/>
       </w:pPr>
-      <w:bookmarkStart w:id="99" w:name="_Toc241354356"/>
+      <w:bookmarkStart w:id="99" w:name="_Toc241361793"/>
       <w:r>
         <w:t>Power and Sample Size for Bioequivalence</w:t>
       </w:r>
@@ -21889,7 +21884,7 @@
       <w:pPr>
         <w:pStyle w:val="Kop2"/>
       </w:pPr>
-      <w:bookmarkStart w:id="100" w:name="_Toc241354357"/>
+      <w:bookmarkStart w:id="100" w:name="_Toc241361794"/>
       <w:r>
         <w:t>Partial AUCs in Bioequivalence</w:t>
       </w:r>
@@ -21955,7 +21950,7 @@
       <w:pPr>
         <w:pStyle w:val="Kop2"/>
       </w:pPr>
-      <w:bookmarkStart w:id="101" w:name="_Toc241354358"/>
+      <w:bookmarkStart w:id="101" w:name="_Toc241361795"/>
       <w:r>
         <w:t>Regulatory Guidelines</w:t>
       </w:r>
@@ -22148,7 +22143,7 @@
         <w:pStyle w:val="Kop1"/>
         <w:pageBreakBefore/>
       </w:pPr>
-      <w:bookmarkStart w:id="102" w:name="_Toc241354359"/>
+      <w:bookmarkStart w:id="102" w:name="_Toc241361796"/>
       <w:r>
         <w:lastRenderedPageBreak/>
         <w:t>Appendices</w:t>
@@ -22159,7 +22154,7 @@
       <w:pPr>
         <w:pStyle w:val="Kop2"/>
       </w:pPr>
-      <w:bookmarkStart w:id="103" w:name="_Toc241354360"/>
+      <w:bookmarkStart w:id="103" w:name="_Toc241361797"/>
       <w:r>
         <w:t>Appendix A: Output Parameters</w:t>
       </w:r>
@@ -30150,7 +30145,7 @@
       <w:pPr>
         <w:pStyle w:val="Kop2"/>
       </w:pPr>
-      <w:bookmarkStart w:id="104" w:name="_Toc241354361"/>
+      <w:bookmarkStart w:id="104" w:name="_Toc241361798"/>
       <w:r>
         <w:lastRenderedPageBreak/>
         <w:t>Appendix B: Glossary</w:t>
@@ -33338,7 +33333,7 @@
       <w:pPr>
         <w:pStyle w:val="Kop2"/>
       </w:pPr>
-      <w:bookmarkStart w:id="105" w:name="_Toc241354362"/>
+      <w:bookmarkStart w:id="105" w:name="_Toc241361799"/>
       <w:r>
         <w:t>Appendix C: Recognised Column Names</w:t>
       </w:r>
@@ -33823,7 +33818,7 @@
       <w:pPr>
         <w:pStyle w:val="Kop2"/>
       </w:pPr>
-      <w:bookmarkStart w:id="106" w:name="_Toc241354363"/>
+      <w:bookmarkStart w:id="106" w:name="_Toc241361800"/>
       <w:r>
         <w:t>Appendix D: Troubleshooting</w:t>
       </w:r>
@@ -34368,7 +34363,7 @@
       <w:pPr>
         <w:pStyle w:val="Kop2"/>
       </w:pPr>
-      <w:bookmarkStart w:id="107" w:name="_Toc241354364"/>
+      <w:bookmarkStart w:id="107" w:name="_Toc241361801"/>
       <w:r>
         <w:t>Appendix E: Setting Up and Administering a Controlled Installation</w:t>
       </w:r>
@@ -34467,6 +34462,7 @@
         <w:spacing w:after="120" w:line="276" w:lineRule="auto"/>
       </w:pPr>
       <w:r>
+        <w:lastRenderedPageBreak/>
         <w:t>10. Make sure the server can only be reached through your two-factor sign-in, from managed devices whose browsers do not save passwords, and that the system log is monitored: security alerts are logged under the tag nca-assistant.</w:t>
       </w:r>
     </w:p>
@@ -34475,7 +34471,6 @@
         <w:pStyle w:val="Kop3"/>
       </w:pPr>
       <w:r>
-        <w:lastRenderedPageBreak/>
         <w:t>Example Configuration</w:t>
       </w:r>
     </w:p>
@@ -34865,6 +34860,7 @@
         <w:spacing w:after="120" w:line="276" w:lineRule="auto"/>
       </w:pPr>
       <w:r>
+        <w:lastRenderedPageBreak/>
         <w:t>After a change to these files, restart Shiny Server and reload nginx. Then check that the app starts in controlled mode: the audit trail's first app_started entry names the controlled directory, and a file of 5 MB or more uploads without an error.</w:t>
       </w:r>
     </w:p>
@@ -34881,7 +34877,6 @@
         <w:spacing w:after="120" w:line="276" w:lineRule="auto"/>
       </w:pPr>
       <w:r>
-        <w:lastRenderedPageBreak/>
         <w:t>The system owner runs every command as: sudo -H -u shiny Rscript /srv/shiny-server/nca/gxp/manage_users.R command. Every change is logged under the system owner's own name, with the reason given. There is no delete: a user ID is never used again.</w:t>
       </w:r>
     </w:p>
@@ -35443,7 +35438,11 @@
         <w:spacing w:after="120" w:line="276" w:lineRule="auto"/>
       </w:pPr>
       <w:r>
-        <w:t>If verify, or Verify chain in the app, reports that the trail is not intact, stop using the installation for regulated work, keep the server as it is, and start an investigation under your procedure. Compare the trail with the heads you filed and with the backups to find out what changed. If the app says an action could not be recorded in the audit trail, check the disk space and the permissions of the controlled directory.</w:t>
+        <w:t xml:space="preserve">If verify, or Verify chain in the app, reports that the trail is not intact, stop using the installation for regulated work, keep the server as it is, and start an investigation under your procedure. Compare the trail with the heads you filed and with the backups to find out what </w:t>
+      </w:r>
+      <w:r>
+        <w:lastRenderedPageBreak/>
+        <w:t>changed. If the app says an action could not be recorded in the audit trail, check the disk space and the permissions of the controlled directory.</w:t>
       </w:r>
     </w:p>
     <w:p>
@@ -35467,7 +35466,6 @@
         <w:spacing w:after="120" w:line="276" w:lineRule="auto"/>
       </w:pPr>
       <w:r>
-        <w:lastRenderedPageBreak/>
         <w:t>On macOS and Linux:</w:t>
       </w:r>
     </w:p>
@@ -35607,7 +35605,7 @@
       <w:pPr>
         <w:pStyle w:val="Kop2"/>
       </w:pPr>
-      <w:bookmarkStart w:id="108" w:name="_Toc241354365"/>
+      <w:bookmarkStart w:id="108" w:name="_Toc241361802"/>
       <w:r>
         <w:t>Appendix F: References</w:t>
       </w:r>
@@ -35643,6 +35641,7 @@
         <w:spacing w:after="120" w:line="276" w:lineRule="auto"/>
       </w:pPr>
       <w:r>
+        <w:lastRenderedPageBreak/>
         <w:t>European Medicines Agency. Guideline on the investigation of bioequivalence. CPMP/EWP/QWP/1401/98 Rev. 1, 2010.</w:t>
       </w:r>
     </w:p>
@@ -35667,7 +35666,6 @@
         <w:spacing w:after="120" w:line="276" w:lineRule="auto"/>
       </w:pPr>
       <w:r>
-        <w:lastRenderedPageBreak/>
         <w:t xml:space="preserve">Hopefl R, et al. A 2024 update on US FDA implementation of partial area under the curve into bioavailability and bioequivalence assessments. </w:t>
       </w:r>
       <w:r>
@@ -35834,7 +35832,7 @@
       <w:pPr>
         <w:pStyle w:val="Kop2"/>
       </w:pPr>
-      <w:bookmarkStart w:id="109" w:name="_Toc241354366"/>
+      <w:bookmarkStart w:id="109" w:name="_Toc241361803"/>
       <w:r>
         <w:t>Appendix G: Document Control</w:t>
       </w:r>
@@ -36118,6 +36116,7 @@
                 <w:sz w:val="20"/>
                 <w:szCs w:val="20"/>
               </w:rPr>
+              <w:lastRenderedPageBreak/>
               <w:t>1.1</w:t>
             </w:r>
           </w:p>
@@ -36294,15 +36293,7 @@
                 <w:sz w:val="20"/>
                 <w:szCs w:val="20"/>
               </w:rPr>
-              <w:t xml:space="preserve">Quick Start data preparation callout, grid plot fix documentation, single-subject Analysis Record, DDI </w:t>
-            </w:r>
-            <w:r>
-              <w:rPr>
-                <w:sz w:val="20"/>
-                <w:szCs w:val="20"/>
-              </w:rPr>
-              <w:lastRenderedPageBreak/>
-              <w:t>interpretation thresholds, regulatory DDI guideline links, troubleshooting updates</w:t>
+              <w:t>Quick Start data preparation callout, grid plot fix documentation, single-subject Analysis Record, DDI interpretation thresholds, regulatory DDI guideline links, troubleshooting updates</w:t>
             </w:r>
           </w:p>
         </w:tc>
@@ -36330,7 +36321,6 @@
                 <w:sz w:val="20"/>
                 <w:szCs w:val="20"/>
               </w:rPr>
-              <w:lastRenderedPageBreak/>
               <w:t>1.3</w:t>
             </w:r>
           </w:p>
@@ -36711,7 +36701,15 @@
                 <w:sz w:val="20"/>
                 <w:szCs w:val="20"/>
               </w:rPr>
-              <w:t>Updated for NCA Assistant v1.5.0: partial AUCs in Paths 4, 5 and 6, with intervals ending at a time or at the last measurable concentration, Cmax and Tmax within an interval, pivotal and supportive metrics in bioequivalence, and interval shading in Visualize Data. New Exercise 4, new sections in Parts V and VI, and new glossary, troubleshooting and reference entries.</w:t>
+              <w:t xml:space="preserve">Updated for NCA Assistant v1.5.0: partial AUCs in Paths 4, 5 and 6, with intervals ending at a time or at the last measurable concentration, Cmax and Tmax within an interval, pivotal and supportive metrics in bioequivalence, and interval shading in Visualize Data. New Exercise 4, new sections in Parts V and VI, and </w:t>
+            </w:r>
+            <w:r>
+              <w:rPr>
+                <w:sz w:val="20"/>
+                <w:szCs w:val="20"/>
+              </w:rPr>
+              <w:lastRenderedPageBreak/>
+              <w:t>new glossary, troubleshooting and reference entries.</w:t>
             </w:r>
           </w:p>
         </w:tc>
@@ -36739,6 +36737,7 @@
                 <w:sz w:val="20"/>
                 <w:szCs w:val="20"/>
               </w:rPr>
+              <w:lastRenderedPageBreak/>
               <w:t>1.7</w:t>
             </w:r>
           </w:p>
@@ -36813,15 +36812,7 @@
                 <w:sz w:val="20"/>
                 <w:szCs w:val="20"/>
               </w:rPr>
-              <w:t xml:space="preserve">Updated for NCA Assistant v1.6.0, after a review of the whole app. New: intended use and data notice; ICH M13A (Cmax and AUC to last point compared by default, BLQ values kept out of the half-life, checks listed with the results, </w:t>
-            </w:r>
-            <w:r>
-              <w:rPr>
-                <w:sz w:val="20"/>
-                <w:szCs w:val="20"/>
-              </w:rPr>
-              <w:lastRenderedPageBreak/>
-              <w:t>no verdict where the guideline excludes one); widened limits for Cmax only; Rules 4 and 6 changed; IV bolus samples at time 0 set aside; thousands separators in decimal-comma files; unique subject IDs; units taken from the data; settings kept and results cleared; file integrity in the reproduction check; the Welch interval; excluding subjects. Exercise answers checked against v1.6.0.</w:t>
+              <w:t>Updated for NCA Assistant v1.6.0, after a review of the whole app. New: intended use and data notice; ICH M13A (Cmax and AUC to last point compared by default, BLQ values kept out of the half-life, checks listed with the results, no verdict where the guideline excludes one); widened limits for Cmax only; Rules 4 and 6 changed; IV bolus samples at time 0 set aside; thousands separators in decimal-comma files; unique subject IDs; units taken from the data; settings kept and results cleared; file integrity in the reproduction check; the Welch interval; excluding subjects. Exercise answers checked against v1.6.0.</w:t>
             </w:r>
           </w:p>
         </w:tc>
@@ -36849,7 +36840,6 @@
                 <w:sz w:val="20"/>
                 <w:szCs w:val="20"/>
               </w:rPr>
-              <w:lastRenderedPageBreak/>
               <w:t>1.8</w:t>
             </w:r>
           </w:p>

</xml_diff>

<commit_message>
Release files refreshed: manual (controlled-installation data notice), manifest, protocol
Green run: 482 automated tests pass (62 manual), URS 89/89; protocol
section 3.20 lists 47 controlled-mode tests.

Co-Authored-By: Claude Opus 5.5 <noreply@anthropic.com>
</commit_message>
<xml_diff>
--- a/NCA_Assistant_User_Manual_v1.9.docx
+++ b/NCA_Assistant_User_Manual_v1.9.docx
@@ -154,7 +154,7 @@
       <w:pPr>
         <w:pStyle w:val="Kop1"/>
       </w:pPr>
-      <w:bookmarkStart w:id="0" w:name="_Toc241361694"/>
+      <w:bookmarkStart w:id="0" w:name="_Toc241392032"/>
       <w:r>
         <w:lastRenderedPageBreak/>
         <w:t>Table of Contents</w:t>
@@ -192,7 +192,7 @@
           <w:r>
             <w:fldChar w:fldCharType="separate"/>
           </w:r>
-          <w:hyperlink w:anchor="_Toc241361694" w:history="1">
+          <w:hyperlink w:anchor="_Toc241392032" w:history="1">
             <w:r>
               <w:rPr>
                 <w:rStyle w:val="Hyperlink"/>
@@ -216,7 +216,7 @@
               <w:rPr>
                 <w:noProof/>
               </w:rPr>
-              <w:instrText xml:space="preserve"> PAGEREF _Toc241361694 \h </w:instrText>
+              <w:instrText xml:space="preserve"> PAGEREF _Toc241392032 \h </w:instrText>
             </w:r>
             <w:r>
               <w:rPr>
@@ -258,7 +258,7 @@
               <w14:ligatures w14:val="standardContextual"/>
             </w:rPr>
           </w:pPr>
-          <w:hyperlink w:anchor="_Toc241361695" w:history="1">
+          <w:hyperlink w:anchor="_Toc241392033" w:history="1">
             <w:r>
               <w:rPr>
                 <w:rStyle w:val="Hyperlink"/>
@@ -282,7 +282,7 @@
               <w:rPr>
                 <w:noProof/>
               </w:rPr>
-              <w:instrText xml:space="preserve"> PAGEREF _Toc241361695 \h </w:instrText>
+              <w:instrText xml:space="preserve"> PAGEREF _Toc241392033 \h </w:instrText>
             </w:r>
             <w:r>
               <w:rPr>
@@ -324,7 +324,7 @@
               <w14:ligatures w14:val="standardContextual"/>
             </w:rPr>
           </w:pPr>
-          <w:hyperlink w:anchor="_Toc241361696" w:history="1">
+          <w:hyperlink w:anchor="_Toc241392034" w:history="1">
             <w:r>
               <w:rPr>
                 <w:rStyle w:val="Hyperlink"/>
@@ -348,7 +348,7 @@
               <w:rPr>
                 <w:noProof/>
               </w:rPr>
-              <w:instrText xml:space="preserve"> PAGEREF _Toc241361696 \h </w:instrText>
+              <w:instrText xml:space="preserve"> PAGEREF _Toc241392034 \h </w:instrText>
             </w:r>
             <w:r>
               <w:rPr>
@@ -390,7 +390,7 @@
               <w14:ligatures w14:val="standardContextual"/>
             </w:rPr>
           </w:pPr>
-          <w:hyperlink w:anchor="_Toc241361697" w:history="1">
+          <w:hyperlink w:anchor="_Toc241392035" w:history="1">
             <w:r>
               <w:rPr>
                 <w:rStyle w:val="Hyperlink"/>
@@ -414,7 +414,7 @@
               <w:rPr>
                 <w:noProof/>
               </w:rPr>
-              <w:instrText xml:space="preserve"> PAGEREF _Toc241361697 \h </w:instrText>
+              <w:instrText xml:space="preserve"> PAGEREF _Toc241392035 \h </w:instrText>
             </w:r>
             <w:r>
               <w:rPr>
@@ -456,7 +456,7 @@
               <w14:ligatures w14:val="standardContextual"/>
             </w:rPr>
           </w:pPr>
-          <w:hyperlink w:anchor="_Toc241361698" w:history="1">
+          <w:hyperlink w:anchor="_Toc241392036" w:history="1">
             <w:r>
               <w:rPr>
                 <w:rStyle w:val="Hyperlink"/>
@@ -480,7 +480,7 @@
               <w:rPr>
                 <w:noProof/>
               </w:rPr>
-              <w:instrText xml:space="preserve"> PAGEREF _Toc241361698 \h </w:instrText>
+              <w:instrText xml:space="preserve"> PAGEREF _Toc241392036 \h </w:instrText>
             </w:r>
             <w:r>
               <w:rPr>
@@ -522,7 +522,7 @@
               <w14:ligatures w14:val="standardContextual"/>
             </w:rPr>
           </w:pPr>
-          <w:hyperlink w:anchor="_Toc241361699" w:history="1">
+          <w:hyperlink w:anchor="_Toc241392037" w:history="1">
             <w:r>
               <w:rPr>
                 <w:rStyle w:val="Hyperlink"/>
@@ -546,7 +546,7 @@
               <w:rPr>
                 <w:noProof/>
               </w:rPr>
-              <w:instrText xml:space="preserve"> PAGEREF _Toc241361699 \h </w:instrText>
+              <w:instrText xml:space="preserve"> PAGEREF _Toc241392037 \h </w:instrText>
             </w:r>
             <w:r>
               <w:rPr>
@@ -588,7 +588,7 @@
               <w14:ligatures w14:val="standardContextual"/>
             </w:rPr>
           </w:pPr>
-          <w:hyperlink w:anchor="_Toc241361700" w:history="1">
+          <w:hyperlink w:anchor="_Toc241392038" w:history="1">
             <w:r>
               <w:rPr>
                 <w:rStyle w:val="Hyperlink"/>
@@ -612,7 +612,7 @@
               <w:rPr>
                 <w:noProof/>
               </w:rPr>
-              <w:instrText xml:space="preserve"> PAGEREF _Toc241361700 \h </w:instrText>
+              <w:instrText xml:space="preserve"> PAGEREF _Toc241392038 \h </w:instrText>
             </w:r>
             <w:r>
               <w:rPr>
@@ -654,7 +654,7 @@
               <w14:ligatures w14:val="standardContextual"/>
             </w:rPr>
           </w:pPr>
-          <w:hyperlink w:anchor="_Toc241361701" w:history="1">
+          <w:hyperlink w:anchor="_Toc241392039" w:history="1">
             <w:r>
               <w:rPr>
                 <w:rStyle w:val="Hyperlink"/>
@@ -678,7 +678,7 @@
               <w:rPr>
                 <w:noProof/>
               </w:rPr>
-              <w:instrText xml:space="preserve"> PAGEREF _Toc241361701 \h </w:instrText>
+              <w:instrText xml:space="preserve"> PAGEREF _Toc241392039 \h </w:instrText>
             </w:r>
             <w:r>
               <w:rPr>
@@ -720,7 +720,7 @@
               <w14:ligatures w14:val="standardContextual"/>
             </w:rPr>
           </w:pPr>
-          <w:hyperlink w:anchor="_Toc241361702" w:history="1">
+          <w:hyperlink w:anchor="_Toc241392040" w:history="1">
             <w:r>
               <w:rPr>
                 <w:rStyle w:val="Hyperlink"/>
@@ -744,7 +744,7 @@
               <w:rPr>
                 <w:noProof/>
               </w:rPr>
-              <w:instrText xml:space="preserve"> PAGEREF _Toc241361702 \h </w:instrText>
+              <w:instrText xml:space="preserve"> PAGEREF _Toc241392040 \h </w:instrText>
             </w:r>
             <w:r>
               <w:rPr>
@@ -786,7 +786,7 @@
               <w14:ligatures w14:val="standardContextual"/>
             </w:rPr>
           </w:pPr>
-          <w:hyperlink w:anchor="_Toc241361703" w:history="1">
+          <w:hyperlink w:anchor="_Toc241392041" w:history="1">
             <w:r>
               <w:rPr>
                 <w:rStyle w:val="Hyperlink"/>
@@ -810,7 +810,7 @@
               <w:rPr>
                 <w:noProof/>
               </w:rPr>
-              <w:instrText xml:space="preserve"> PAGEREF _Toc241361703 \h </w:instrText>
+              <w:instrText xml:space="preserve"> PAGEREF _Toc241392041 \h </w:instrText>
             </w:r>
             <w:r>
               <w:rPr>
@@ -852,7 +852,7 @@
               <w14:ligatures w14:val="standardContextual"/>
             </w:rPr>
           </w:pPr>
-          <w:hyperlink w:anchor="_Toc241361704" w:history="1">
+          <w:hyperlink w:anchor="_Toc241392042" w:history="1">
             <w:r>
               <w:rPr>
                 <w:rStyle w:val="Hyperlink"/>
@@ -876,7 +876,7 @@
               <w:rPr>
                 <w:noProof/>
               </w:rPr>
-              <w:instrText xml:space="preserve"> PAGEREF _Toc241361704 \h </w:instrText>
+              <w:instrText xml:space="preserve"> PAGEREF _Toc241392042 \h </w:instrText>
             </w:r>
             <w:r>
               <w:rPr>
@@ -918,7 +918,7 @@
               <w14:ligatures w14:val="standardContextual"/>
             </w:rPr>
           </w:pPr>
-          <w:hyperlink w:anchor="_Toc241361705" w:history="1">
+          <w:hyperlink w:anchor="_Toc241392043" w:history="1">
             <w:r>
               <w:rPr>
                 <w:rStyle w:val="Hyperlink"/>
@@ -942,7 +942,7 @@
               <w:rPr>
                 <w:noProof/>
               </w:rPr>
-              <w:instrText xml:space="preserve"> PAGEREF _Toc241361705 \h </w:instrText>
+              <w:instrText xml:space="preserve"> PAGEREF _Toc241392043 \h </w:instrText>
             </w:r>
             <w:r>
               <w:rPr>
@@ -984,7 +984,7 @@
               <w14:ligatures w14:val="standardContextual"/>
             </w:rPr>
           </w:pPr>
-          <w:hyperlink w:anchor="_Toc241361706" w:history="1">
+          <w:hyperlink w:anchor="_Toc241392044" w:history="1">
             <w:r>
               <w:rPr>
                 <w:rStyle w:val="Hyperlink"/>
@@ -1008,7 +1008,7 @@
               <w:rPr>
                 <w:noProof/>
               </w:rPr>
-              <w:instrText xml:space="preserve"> PAGEREF _Toc241361706 \h </w:instrText>
+              <w:instrText xml:space="preserve"> PAGEREF _Toc241392044 \h </w:instrText>
             </w:r>
             <w:r>
               <w:rPr>
@@ -1050,7 +1050,7 @@
               <w14:ligatures w14:val="standardContextual"/>
             </w:rPr>
           </w:pPr>
-          <w:hyperlink w:anchor="_Toc241361707" w:history="1">
+          <w:hyperlink w:anchor="_Toc241392045" w:history="1">
             <w:r>
               <w:rPr>
                 <w:rStyle w:val="Hyperlink"/>
@@ -1074,7 +1074,7 @@
               <w:rPr>
                 <w:noProof/>
               </w:rPr>
-              <w:instrText xml:space="preserve"> PAGEREF _Toc241361707 \h </w:instrText>
+              <w:instrText xml:space="preserve"> PAGEREF _Toc241392045 \h </w:instrText>
             </w:r>
             <w:r>
               <w:rPr>
@@ -1116,7 +1116,7 @@
               <w14:ligatures w14:val="standardContextual"/>
             </w:rPr>
           </w:pPr>
-          <w:hyperlink w:anchor="_Toc241361708" w:history="1">
+          <w:hyperlink w:anchor="_Toc241392046" w:history="1">
             <w:r>
               <w:rPr>
                 <w:rStyle w:val="Hyperlink"/>
@@ -1140,7 +1140,7 @@
               <w:rPr>
                 <w:noProof/>
               </w:rPr>
-              <w:instrText xml:space="preserve"> PAGEREF _Toc241361708 \h </w:instrText>
+              <w:instrText xml:space="preserve"> PAGEREF _Toc241392046 \h </w:instrText>
             </w:r>
             <w:r>
               <w:rPr>
@@ -1182,7 +1182,7 @@
               <w14:ligatures w14:val="standardContextual"/>
             </w:rPr>
           </w:pPr>
-          <w:hyperlink w:anchor="_Toc241361709" w:history="1">
+          <w:hyperlink w:anchor="_Toc241392047" w:history="1">
             <w:r>
               <w:rPr>
                 <w:rStyle w:val="Hyperlink"/>
@@ -1206,7 +1206,7 @@
               <w:rPr>
                 <w:noProof/>
               </w:rPr>
-              <w:instrText xml:space="preserve"> PAGEREF _Toc241361709 \h </w:instrText>
+              <w:instrText xml:space="preserve"> PAGEREF _Toc241392047 \h </w:instrText>
             </w:r>
             <w:r>
               <w:rPr>
@@ -1248,7 +1248,7 @@
               <w14:ligatures w14:val="standardContextual"/>
             </w:rPr>
           </w:pPr>
-          <w:hyperlink w:anchor="_Toc241361710" w:history="1">
+          <w:hyperlink w:anchor="_Toc241392048" w:history="1">
             <w:r>
               <w:rPr>
                 <w:rStyle w:val="Hyperlink"/>
@@ -1272,7 +1272,7 @@
               <w:rPr>
                 <w:noProof/>
               </w:rPr>
-              <w:instrText xml:space="preserve"> PAGEREF _Toc241361710 \h </w:instrText>
+              <w:instrText xml:space="preserve"> PAGEREF _Toc241392048 \h </w:instrText>
             </w:r>
             <w:r>
               <w:rPr>
@@ -1314,7 +1314,7 @@
               <w14:ligatures w14:val="standardContextual"/>
             </w:rPr>
           </w:pPr>
-          <w:hyperlink w:anchor="_Toc241361711" w:history="1">
+          <w:hyperlink w:anchor="_Toc241392049" w:history="1">
             <w:r>
               <w:rPr>
                 <w:rStyle w:val="Hyperlink"/>
@@ -1338,7 +1338,7 @@
               <w:rPr>
                 <w:noProof/>
               </w:rPr>
-              <w:instrText xml:space="preserve"> PAGEREF _Toc241361711 \h </w:instrText>
+              <w:instrText xml:space="preserve"> PAGEREF _Toc241392049 \h </w:instrText>
             </w:r>
             <w:r>
               <w:rPr>
@@ -1380,7 +1380,7 @@
               <w14:ligatures w14:val="standardContextual"/>
             </w:rPr>
           </w:pPr>
-          <w:hyperlink w:anchor="_Toc241361712" w:history="1">
+          <w:hyperlink w:anchor="_Toc241392050" w:history="1">
             <w:r>
               <w:rPr>
                 <w:rStyle w:val="Hyperlink"/>
@@ -1404,7 +1404,7 @@
               <w:rPr>
                 <w:noProof/>
               </w:rPr>
-              <w:instrText xml:space="preserve"> PAGEREF _Toc241361712 \h </w:instrText>
+              <w:instrText xml:space="preserve"> PAGEREF _Toc241392050 \h </w:instrText>
             </w:r>
             <w:r>
               <w:rPr>
@@ -1446,7 +1446,7 @@
               <w14:ligatures w14:val="standardContextual"/>
             </w:rPr>
           </w:pPr>
-          <w:hyperlink w:anchor="_Toc241361713" w:history="1">
+          <w:hyperlink w:anchor="_Toc241392051" w:history="1">
             <w:r>
               <w:rPr>
                 <w:rStyle w:val="Hyperlink"/>
@@ -1470,7 +1470,7 @@
               <w:rPr>
                 <w:noProof/>
               </w:rPr>
-              <w:instrText xml:space="preserve"> PAGEREF _Toc241361713 \h </w:instrText>
+              <w:instrText xml:space="preserve"> PAGEREF _Toc241392051 \h </w:instrText>
             </w:r>
             <w:r>
               <w:rPr>
@@ -1512,7 +1512,7 @@
               <w14:ligatures w14:val="standardContextual"/>
             </w:rPr>
           </w:pPr>
-          <w:hyperlink w:anchor="_Toc241361714" w:history="1">
+          <w:hyperlink w:anchor="_Toc241392052" w:history="1">
             <w:r>
               <w:rPr>
                 <w:rStyle w:val="Hyperlink"/>
@@ -1536,7 +1536,7 @@
               <w:rPr>
                 <w:noProof/>
               </w:rPr>
-              <w:instrText xml:space="preserve"> PAGEREF _Toc241361714 \h </w:instrText>
+              <w:instrText xml:space="preserve"> PAGEREF _Toc241392052 \h </w:instrText>
             </w:r>
             <w:r>
               <w:rPr>
@@ -1578,7 +1578,7 @@
               <w14:ligatures w14:val="standardContextual"/>
             </w:rPr>
           </w:pPr>
-          <w:hyperlink w:anchor="_Toc241361715" w:history="1">
+          <w:hyperlink w:anchor="_Toc241392053" w:history="1">
             <w:r>
               <w:rPr>
                 <w:rStyle w:val="Hyperlink"/>
@@ -1602,7 +1602,7 @@
               <w:rPr>
                 <w:noProof/>
               </w:rPr>
-              <w:instrText xml:space="preserve"> PAGEREF _Toc241361715 \h </w:instrText>
+              <w:instrText xml:space="preserve"> PAGEREF _Toc241392053 \h </w:instrText>
             </w:r>
             <w:r>
               <w:rPr>
@@ -1644,7 +1644,7 @@
               <w14:ligatures w14:val="standardContextual"/>
             </w:rPr>
           </w:pPr>
-          <w:hyperlink w:anchor="_Toc241361716" w:history="1">
+          <w:hyperlink w:anchor="_Toc241392054" w:history="1">
             <w:r>
               <w:rPr>
                 <w:rStyle w:val="Hyperlink"/>
@@ -1668,7 +1668,7 @@
               <w:rPr>
                 <w:noProof/>
               </w:rPr>
-              <w:instrText xml:space="preserve"> PAGEREF _Toc241361716 \h </w:instrText>
+              <w:instrText xml:space="preserve"> PAGEREF _Toc241392054 \h </w:instrText>
             </w:r>
             <w:r>
               <w:rPr>
@@ -1710,7 +1710,7 @@
               <w14:ligatures w14:val="standardContextual"/>
             </w:rPr>
           </w:pPr>
-          <w:hyperlink w:anchor="_Toc241361717" w:history="1">
+          <w:hyperlink w:anchor="_Toc241392055" w:history="1">
             <w:r>
               <w:rPr>
                 <w:rStyle w:val="Hyperlink"/>
@@ -1734,7 +1734,7 @@
               <w:rPr>
                 <w:noProof/>
               </w:rPr>
-              <w:instrText xml:space="preserve"> PAGEREF _Toc241361717 \h </w:instrText>
+              <w:instrText xml:space="preserve"> PAGEREF _Toc241392055 \h </w:instrText>
             </w:r>
             <w:r>
               <w:rPr>
@@ -1776,7 +1776,7 @@
               <w14:ligatures w14:val="standardContextual"/>
             </w:rPr>
           </w:pPr>
-          <w:hyperlink w:anchor="_Toc241361718" w:history="1">
+          <w:hyperlink w:anchor="_Toc241392056" w:history="1">
             <w:r>
               <w:rPr>
                 <w:rStyle w:val="Hyperlink"/>
@@ -1800,7 +1800,7 @@
               <w:rPr>
                 <w:noProof/>
               </w:rPr>
-              <w:instrText xml:space="preserve"> PAGEREF _Toc241361718 \h </w:instrText>
+              <w:instrText xml:space="preserve"> PAGEREF _Toc241392056 \h </w:instrText>
             </w:r>
             <w:r>
               <w:rPr>
@@ -1842,7 +1842,7 @@
               <w14:ligatures w14:val="standardContextual"/>
             </w:rPr>
           </w:pPr>
-          <w:hyperlink w:anchor="_Toc241361719" w:history="1">
+          <w:hyperlink w:anchor="_Toc241392057" w:history="1">
             <w:r>
               <w:rPr>
                 <w:rStyle w:val="Hyperlink"/>
@@ -1866,7 +1866,7 @@
               <w:rPr>
                 <w:noProof/>
               </w:rPr>
-              <w:instrText xml:space="preserve"> PAGEREF _Toc241361719 \h </w:instrText>
+              <w:instrText xml:space="preserve"> PAGEREF _Toc241392057 \h </w:instrText>
             </w:r>
             <w:r>
               <w:rPr>
@@ -1908,7 +1908,7 @@
               <w14:ligatures w14:val="standardContextual"/>
             </w:rPr>
           </w:pPr>
-          <w:hyperlink w:anchor="_Toc241361720" w:history="1">
+          <w:hyperlink w:anchor="_Toc241392058" w:history="1">
             <w:r>
               <w:rPr>
                 <w:rStyle w:val="Hyperlink"/>
@@ -1932,7 +1932,7 @@
               <w:rPr>
                 <w:noProof/>
               </w:rPr>
-              <w:instrText xml:space="preserve"> PAGEREF _Toc241361720 \h </w:instrText>
+              <w:instrText xml:space="preserve"> PAGEREF _Toc241392058 \h </w:instrText>
             </w:r>
             <w:r>
               <w:rPr>
@@ -1974,7 +1974,7 @@
               <w14:ligatures w14:val="standardContextual"/>
             </w:rPr>
           </w:pPr>
-          <w:hyperlink w:anchor="_Toc241361721" w:history="1">
+          <w:hyperlink w:anchor="_Toc241392059" w:history="1">
             <w:r>
               <w:rPr>
                 <w:rStyle w:val="Hyperlink"/>
@@ -1998,7 +1998,7 @@
               <w:rPr>
                 <w:noProof/>
               </w:rPr>
-              <w:instrText xml:space="preserve"> PAGEREF _Toc241361721 \h </w:instrText>
+              <w:instrText xml:space="preserve"> PAGEREF _Toc241392059 \h </w:instrText>
             </w:r>
             <w:r>
               <w:rPr>
@@ -2040,7 +2040,7 @@
               <w14:ligatures w14:val="standardContextual"/>
             </w:rPr>
           </w:pPr>
-          <w:hyperlink w:anchor="_Toc241361722" w:history="1">
+          <w:hyperlink w:anchor="_Toc241392060" w:history="1">
             <w:r>
               <w:rPr>
                 <w:rStyle w:val="Hyperlink"/>
@@ -2064,7 +2064,7 @@
               <w:rPr>
                 <w:noProof/>
               </w:rPr>
-              <w:instrText xml:space="preserve"> PAGEREF _Toc241361722 \h </w:instrText>
+              <w:instrText xml:space="preserve"> PAGEREF _Toc241392060 \h </w:instrText>
             </w:r>
             <w:r>
               <w:rPr>
@@ -2106,7 +2106,7 @@
               <w14:ligatures w14:val="standardContextual"/>
             </w:rPr>
           </w:pPr>
-          <w:hyperlink w:anchor="_Toc241361723" w:history="1">
+          <w:hyperlink w:anchor="_Toc241392061" w:history="1">
             <w:r>
               <w:rPr>
                 <w:rStyle w:val="Hyperlink"/>
@@ -2130,7 +2130,7 @@
               <w:rPr>
                 <w:noProof/>
               </w:rPr>
-              <w:instrText xml:space="preserve"> PAGEREF _Toc241361723 \h </w:instrText>
+              <w:instrText xml:space="preserve"> PAGEREF _Toc241392061 \h </w:instrText>
             </w:r>
             <w:r>
               <w:rPr>
@@ -2172,7 +2172,7 @@
               <w14:ligatures w14:val="standardContextual"/>
             </w:rPr>
           </w:pPr>
-          <w:hyperlink w:anchor="_Toc241361724" w:history="1">
+          <w:hyperlink w:anchor="_Toc241392062" w:history="1">
             <w:r>
               <w:rPr>
                 <w:rStyle w:val="Hyperlink"/>
@@ -2196,7 +2196,7 @@
               <w:rPr>
                 <w:noProof/>
               </w:rPr>
-              <w:instrText xml:space="preserve"> PAGEREF _Toc241361724 \h </w:instrText>
+              <w:instrText xml:space="preserve"> PAGEREF _Toc241392062 \h </w:instrText>
             </w:r>
             <w:r>
               <w:rPr>
@@ -2238,7 +2238,7 @@
               <w14:ligatures w14:val="standardContextual"/>
             </w:rPr>
           </w:pPr>
-          <w:hyperlink w:anchor="_Toc241361725" w:history="1">
+          <w:hyperlink w:anchor="_Toc241392063" w:history="1">
             <w:r>
               <w:rPr>
                 <w:rStyle w:val="Hyperlink"/>
@@ -2262,7 +2262,7 @@
               <w:rPr>
                 <w:noProof/>
               </w:rPr>
-              <w:instrText xml:space="preserve"> PAGEREF _Toc241361725 \h </w:instrText>
+              <w:instrText xml:space="preserve"> PAGEREF _Toc241392063 \h </w:instrText>
             </w:r>
             <w:r>
               <w:rPr>
@@ -2304,7 +2304,7 @@
               <w14:ligatures w14:val="standardContextual"/>
             </w:rPr>
           </w:pPr>
-          <w:hyperlink w:anchor="_Toc241361726" w:history="1">
+          <w:hyperlink w:anchor="_Toc241392064" w:history="1">
             <w:r>
               <w:rPr>
                 <w:rStyle w:val="Hyperlink"/>
@@ -2328,7 +2328,7 @@
               <w:rPr>
                 <w:noProof/>
               </w:rPr>
-              <w:instrText xml:space="preserve"> PAGEREF _Toc241361726 \h </w:instrText>
+              <w:instrText xml:space="preserve"> PAGEREF _Toc241392064 \h </w:instrText>
             </w:r>
             <w:r>
               <w:rPr>
@@ -2370,7 +2370,7 @@
               <w14:ligatures w14:val="standardContextual"/>
             </w:rPr>
           </w:pPr>
-          <w:hyperlink w:anchor="_Toc241361727" w:history="1">
+          <w:hyperlink w:anchor="_Toc241392065" w:history="1">
             <w:r>
               <w:rPr>
                 <w:rStyle w:val="Hyperlink"/>
@@ -2394,7 +2394,7 @@
               <w:rPr>
                 <w:noProof/>
               </w:rPr>
-              <w:instrText xml:space="preserve"> PAGEREF _Toc241361727 \h </w:instrText>
+              <w:instrText xml:space="preserve"> PAGEREF _Toc241392065 \h </w:instrText>
             </w:r>
             <w:r>
               <w:rPr>
@@ -2436,7 +2436,7 @@
               <w14:ligatures w14:val="standardContextual"/>
             </w:rPr>
           </w:pPr>
-          <w:hyperlink w:anchor="_Toc241361728" w:history="1">
+          <w:hyperlink w:anchor="_Toc241392066" w:history="1">
             <w:r>
               <w:rPr>
                 <w:rStyle w:val="Hyperlink"/>
@@ -2460,7 +2460,7 @@
               <w:rPr>
                 <w:noProof/>
               </w:rPr>
-              <w:instrText xml:space="preserve"> PAGEREF _Toc241361728 \h </w:instrText>
+              <w:instrText xml:space="preserve"> PAGEREF _Toc241392066 \h </w:instrText>
             </w:r>
             <w:r>
               <w:rPr>
@@ -2502,7 +2502,7 @@
               <w14:ligatures w14:val="standardContextual"/>
             </w:rPr>
           </w:pPr>
-          <w:hyperlink w:anchor="_Toc241361729" w:history="1">
+          <w:hyperlink w:anchor="_Toc241392067" w:history="1">
             <w:r>
               <w:rPr>
                 <w:rStyle w:val="Hyperlink"/>
@@ -2526,7 +2526,7 @@
               <w:rPr>
                 <w:noProof/>
               </w:rPr>
-              <w:instrText xml:space="preserve"> PAGEREF _Toc241361729 \h </w:instrText>
+              <w:instrText xml:space="preserve"> PAGEREF _Toc241392067 \h </w:instrText>
             </w:r>
             <w:r>
               <w:rPr>
@@ -2568,7 +2568,7 @@
               <w14:ligatures w14:val="standardContextual"/>
             </w:rPr>
           </w:pPr>
-          <w:hyperlink w:anchor="_Toc241361730" w:history="1">
+          <w:hyperlink w:anchor="_Toc241392068" w:history="1">
             <w:r>
               <w:rPr>
                 <w:rStyle w:val="Hyperlink"/>
@@ -2592,7 +2592,7 @@
               <w:rPr>
                 <w:noProof/>
               </w:rPr>
-              <w:instrText xml:space="preserve"> PAGEREF _Toc241361730 \h </w:instrText>
+              <w:instrText xml:space="preserve"> PAGEREF _Toc241392068 \h </w:instrText>
             </w:r>
             <w:r>
               <w:rPr>
@@ -2634,7 +2634,7 @@
               <w14:ligatures w14:val="standardContextual"/>
             </w:rPr>
           </w:pPr>
-          <w:hyperlink w:anchor="_Toc241361731" w:history="1">
+          <w:hyperlink w:anchor="_Toc241392069" w:history="1">
             <w:r>
               <w:rPr>
                 <w:rStyle w:val="Hyperlink"/>
@@ -2658,7 +2658,7 @@
               <w:rPr>
                 <w:noProof/>
               </w:rPr>
-              <w:instrText xml:space="preserve"> PAGEREF _Toc241361731 \h </w:instrText>
+              <w:instrText xml:space="preserve"> PAGEREF _Toc241392069 \h </w:instrText>
             </w:r>
             <w:r>
               <w:rPr>
@@ -2700,7 +2700,7 @@
               <w14:ligatures w14:val="standardContextual"/>
             </w:rPr>
           </w:pPr>
-          <w:hyperlink w:anchor="_Toc241361732" w:history="1">
+          <w:hyperlink w:anchor="_Toc241392070" w:history="1">
             <w:r>
               <w:rPr>
                 <w:rStyle w:val="Hyperlink"/>
@@ -2724,7 +2724,7 @@
               <w:rPr>
                 <w:noProof/>
               </w:rPr>
-              <w:instrText xml:space="preserve"> PAGEREF _Toc241361732 \h </w:instrText>
+              <w:instrText xml:space="preserve"> PAGEREF _Toc241392070 \h </w:instrText>
             </w:r>
             <w:r>
               <w:rPr>
@@ -2766,7 +2766,7 @@
               <w14:ligatures w14:val="standardContextual"/>
             </w:rPr>
           </w:pPr>
-          <w:hyperlink w:anchor="_Toc241361733" w:history="1">
+          <w:hyperlink w:anchor="_Toc241392071" w:history="1">
             <w:r>
               <w:rPr>
                 <w:rStyle w:val="Hyperlink"/>
@@ -2790,7 +2790,7 @@
               <w:rPr>
                 <w:noProof/>
               </w:rPr>
-              <w:instrText xml:space="preserve"> PAGEREF _Toc241361733 \h </w:instrText>
+              <w:instrText xml:space="preserve"> PAGEREF _Toc241392071 \h </w:instrText>
             </w:r>
             <w:r>
               <w:rPr>
@@ -2832,7 +2832,7 @@
               <w14:ligatures w14:val="standardContextual"/>
             </w:rPr>
           </w:pPr>
-          <w:hyperlink w:anchor="_Toc241361734" w:history="1">
+          <w:hyperlink w:anchor="_Toc241392072" w:history="1">
             <w:r>
               <w:rPr>
                 <w:rStyle w:val="Hyperlink"/>
@@ -2856,7 +2856,7 @@
               <w:rPr>
                 <w:noProof/>
               </w:rPr>
-              <w:instrText xml:space="preserve"> PAGEREF _Toc241361734 \h </w:instrText>
+              <w:instrText xml:space="preserve"> PAGEREF _Toc241392072 \h </w:instrText>
             </w:r>
             <w:r>
               <w:rPr>
@@ -2898,7 +2898,7 @@
               <w14:ligatures w14:val="standardContextual"/>
             </w:rPr>
           </w:pPr>
-          <w:hyperlink w:anchor="_Toc241361735" w:history="1">
+          <w:hyperlink w:anchor="_Toc241392073" w:history="1">
             <w:r>
               <w:rPr>
                 <w:rStyle w:val="Hyperlink"/>
@@ -2922,7 +2922,7 @@
               <w:rPr>
                 <w:noProof/>
               </w:rPr>
-              <w:instrText xml:space="preserve"> PAGEREF _Toc241361735 \h </w:instrText>
+              <w:instrText xml:space="preserve"> PAGEREF _Toc241392073 \h </w:instrText>
             </w:r>
             <w:r>
               <w:rPr>
@@ -2964,7 +2964,7 @@
               <w14:ligatures w14:val="standardContextual"/>
             </w:rPr>
           </w:pPr>
-          <w:hyperlink w:anchor="_Toc241361736" w:history="1">
+          <w:hyperlink w:anchor="_Toc241392074" w:history="1">
             <w:r>
               <w:rPr>
                 <w:rStyle w:val="Hyperlink"/>
@@ -2988,7 +2988,7 @@
               <w:rPr>
                 <w:noProof/>
               </w:rPr>
-              <w:instrText xml:space="preserve"> PAGEREF _Toc241361736 \h </w:instrText>
+              <w:instrText xml:space="preserve"> PAGEREF _Toc241392074 \h </w:instrText>
             </w:r>
             <w:r>
               <w:rPr>
@@ -3030,7 +3030,7 @@
               <w14:ligatures w14:val="standardContextual"/>
             </w:rPr>
           </w:pPr>
-          <w:hyperlink w:anchor="_Toc241361737" w:history="1">
+          <w:hyperlink w:anchor="_Toc241392075" w:history="1">
             <w:r>
               <w:rPr>
                 <w:rStyle w:val="Hyperlink"/>
@@ -3054,7 +3054,7 @@
               <w:rPr>
                 <w:noProof/>
               </w:rPr>
-              <w:instrText xml:space="preserve"> PAGEREF _Toc241361737 \h </w:instrText>
+              <w:instrText xml:space="preserve"> PAGEREF _Toc241392075 \h </w:instrText>
             </w:r>
             <w:r>
               <w:rPr>
@@ -3096,7 +3096,7 @@
               <w14:ligatures w14:val="standardContextual"/>
             </w:rPr>
           </w:pPr>
-          <w:hyperlink w:anchor="_Toc241361738" w:history="1">
+          <w:hyperlink w:anchor="_Toc241392076" w:history="1">
             <w:r>
               <w:rPr>
                 <w:rStyle w:val="Hyperlink"/>
@@ -3120,7 +3120,7 @@
               <w:rPr>
                 <w:noProof/>
               </w:rPr>
-              <w:instrText xml:space="preserve"> PAGEREF _Toc241361738 \h </w:instrText>
+              <w:instrText xml:space="preserve"> PAGEREF _Toc241392076 \h </w:instrText>
             </w:r>
             <w:r>
               <w:rPr>
@@ -3162,7 +3162,7 @@
               <w14:ligatures w14:val="standardContextual"/>
             </w:rPr>
           </w:pPr>
-          <w:hyperlink w:anchor="_Toc241361739" w:history="1">
+          <w:hyperlink w:anchor="_Toc241392077" w:history="1">
             <w:r>
               <w:rPr>
                 <w:rStyle w:val="Hyperlink"/>
@@ -3186,7 +3186,7 @@
               <w:rPr>
                 <w:noProof/>
               </w:rPr>
-              <w:instrText xml:space="preserve"> PAGEREF _Toc241361739 \h </w:instrText>
+              <w:instrText xml:space="preserve"> PAGEREF _Toc241392077 \h </w:instrText>
             </w:r>
             <w:r>
               <w:rPr>
@@ -3228,7 +3228,7 @@
               <w14:ligatures w14:val="standardContextual"/>
             </w:rPr>
           </w:pPr>
-          <w:hyperlink w:anchor="_Toc241361740" w:history="1">
+          <w:hyperlink w:anchor="_Toc241392078" w:history="1">
             <w:r>
               <w:rPr>
                 <w:rStyle w:val="Hyperlink"/>
@@ -3252,7 +3252,7 @@
               <w:rPr>
                 <w:noProof/>
               </w:rPr>
-              <w:instrText xml:space="preserve"> PAGEREF _Toc241361740 \h </w:instrText>
+              <w:instrText xml:space="preserve"> PAGEREF _Toc241392078 \h </w:instrText>
             </w:r>
             <w:r>
               <w:rPr>
@@ -3294,7 +3294,7 @@
               <w14:ligatures w14:val="standardContextual"/>
             </w:rPr>
           </w:pPr>
-          <w:hyperlink w:anchor="_Toc241361741" w:history="1">
+          <w:hyperlink w:anchor="_Toc241392079" w:history="1">
             <w:r>
               <w:rPr>
                 <w:rStyle w:val="Hyperlink"/>
@@ -3318,7 +3318,7 @@
               <w:rPr>
                 <w:noProof/>
               </w:rPr>
-              <w:instrText xml:space="preserve"> PAGEREF _Toc241361741 \h </w:instrText>
+              <w:instrText xml:space="preserve"> PAGEREF _Toc241392079 \h </w:instrText>
             </w:r>
             <w:r>
               <w:rPr>
@@ -3360,7 +3360,7 @@
               <w14:ligatures w14:val="standardContextual"/>
             </w:rPr>
           </w:pPr>
-          <w:hyperlink w:anchor="_Toc241361742" w:history="1">
+          <w:hyperlink w:anchor="_Toc241392080" w:history="1">
             <w:r>
               <w:rPr>
                 <w:rStyle w:val="Hyperlink"/>
@@ -3384,7 +3384,7 @@
               <w:rPr>
                 <w:noProof/>
               </w:rPr>
-              <w:instrText xml:space="preserve"> PAGEREF _Toc241361742 \h </w:instrText>
+              <w:instrText xml:space="preserve"> PAGEREF _Toc241392080 \h </w:instrText>
             </w:r>
             <w:r>
               <w:rPr>
@@ -3426,7 +3426,7 @@
               <w14:ligatures w14:val="standardContextual"/>
             </w:rPr>
           </w:pPr>
-          <w:hyperlink w:anchor="_Toc241361743" w:history="1">
+          <w:hyperlink w:anchor="_Toc241392081" w:history="1">
             <w:r>
               <w:rPr>
                 <w:rStyle w:val="Hyperlink"/>
@@ -3450,7 +3450,7 @@
               <w:rPr>
                 <w:noProof/>
               </w:rPr>
-              <w:instrText xml:space="preserve"> PAGEREF _Toc241361743 \h </w:instrText>
+              <w:instrText xml:space="preserve"> PAGEREF _Toc241392081 \h </w:instrText>
             </w:r>
             <w:r>
               <w:rPr>
@@ -3492,7 +3492,7 @@
               <w14:ligatures w14:val="standardContextual"/>
             </w:rPr>
           </w:pPr>
-          <w:hyperlink w:anchor="_Toc241361744" w:history="1">
+          <w:hyperlink w:anchor="_Toc241392082" w:history="1">
             <w:r>
               <w:rPr>
                 <w:rStyle w:val="Hyperlink"/>
@@ -3516,7 +3516,7 @@
               <w:rPr>
                 <w:noProof/>
               </w:rPr>
-              <w:instrText xml:space="preserve"> PAGEREF _Toc241361744 \h </w:instrText>
+              <w:instrText xml:space="preserve"> PAGEREF _Toc241392082 \h </w:instrText>
             </w:r>
             <w:r>
               <w:rPr>
@@ -3558,7 +3558,7 @@
               <w14:ligatures w14:val="standardContextual"/>
             </w:rPr>
           </w:pPr>
-          <w:hyperlink w:anchor="_Toc241361745" w:history="1">
+          <w:hyperlink w:anchor="_Toc241392083" w:history="1">
             <w:r>
               <w:rPr>
                 <w:rStyle w:val="Hyperlink"/>
@@ -3582,7 +3582,7 @@
               <w:rPr>
                 <w:noProof/>
               </w:rPr>
-              <w:instrText xml:space="preserve"> PAGEREF _Toc241361745 \h </w:instrText>
+              <w:instrText xml:space="preserve"> PAGEREF _Toc241392083 \h </w:instrText>
             </w:r>
             <w:r>
               <w:rPr>
@@ -3624,7 +3624,7 @@
               <w14:ligatures w14:val="standardContextual"/>
             </w:rPr>
           </w:pPr>
-          <w:hyperlink w:anchor="_Toc241361746" w:history="1">
+          <w:hyperlink w:anchor="_Toc241392084" w:history="1">
             <w:r>
               <w:rPr>
                 <w:rStyle w:val="Hyperlink"/>
@@ -3648,7 +3648,7 @@
               <w:rPr>
                 <w:noProof/>
               </w:rPr>
-              <w:instrText xml:space="preserve"> PAGEREF _Toc241361746 \h </w:instrText>
+              <w:instrText xml:space="preserve"> PAGEREF _Toc241392084 \h </w:instrText>
             </w:r>
             <w:r>
               <w:rPr>
@@ -3690,7 +3690,7 @@
               <w14:ligatures w14:val="standardContextual"/>
             </w:rPr>
           </w:pPr>
-          <w:hyperlink w:anchor="_Toc241361747" w:history="1">
+          <w:hyperlink w:anchor="_Toc241392085" w:history="1">
             <w:r>
               <w:rPr>
                 <w:rStyle w:val="Hyperlink"/>
@@ -3714,7 +3714,7 @@
               <w:rPr>
                 <w:noProof/>
               </w:rPr>
-              <w:instrText xml:space="preserve"> PAGEREF _Toc241361747 \h </w:instrText>
+              <w:instrText xml:space="preserve"> PAGEREF _Toc241392085 \h </w:instrText>
             </w:r>
             <w:r>
               <w:rPr>
@@ -3756,7 +3756,7 @@
               <w14:ligatures w14:val="standardContextual"/>
             </w:rPr>
           </w:pPr>
-          <w:hyperlink w:anchor="_Toc241361748" w:history="1">
+          <w:hyperlink w:anchor="_Toc241392086" w:history="1">
             <w:r>
               <w:rPr>
                 <w:rStyle w:val="Hyperlink"/>
@@ -3780,7 +3780,7 @@
               <w:rPr>
                 <w:noProof/>
               </w:rPr>
-              <w:instrText xml:space="preserve"> PAGEREF _Toc241361748 \h </w:instrText>
+              <w:instrText xml:space="preserve"> PAGEREF _Toc241392086 \h </w:instrText>
             </w:r>
             <w:r>
               <w:rPr>
@@ -3822,7 +3822,7 @@
               <w14:ligatures w14:val="standardContextual"/>
             </w:rPr>
           </w:pPr>
-          <w:hyperlink w:anchor="_Toc241361749" w:history="1">
+          <w:hyperlink w:anchor="_Toc241392087" w:history="1">
             <w:r>
               <w:rPr>
                 <w:rStyle w:val="Hyperlink"/>
@@ -3846,7 +3846,7 @@
               <w:rPr>
                 <w:noProof/>
               </w:rPr>
-              <w:instrText xml:space="preserve"> PAGEREF _Toc241361749 \h </w:instrText>
+              <w:instrText xml:space="preserve"> PAGEREF _Toc241392087 \h </w:instrText>
             </w:r>
             <w:r>
               <w:rPr>
@@ -3888,7 +3888,7 @@
               <w14:ligatures w14:val="standardContextual"/>
             </w:rPr>
           </w:pPr>
-          <w:hyperlink w:anchor="_Toc241361750" w:history="1">
+          <w:hyperlink w:anchor="_Toc241392088" w:history="1">
             <w:r>
               <w:rPr>
                 <w:rStyle w:val="Hyperlink"/>
@@ -3912,7 +3912,7 @@
               <w:rPr>
                 <w:noProof/>
               </w:rPr>
-              <w:instrText xml:space="preserve"> PAGEREF _Toc241361750 \h </w:instrText>
+              <w:instrText xml:space="preserve"> PAGEREF _Toc241392088 \h </w:instrText>
             </w:r>
             <w:r>
               <w:rPr>
@@ -3954,7 +3954,7 @@
               <w14:ligatures w14:val="standardContextual"/>
             </w:rPr>
           </w:pPr>
-          <w:hyperlink w:anchor="_Toc241361751" w:history="1">
+          <w:hyperlink w:anchor="_Toc241392089" w:history="1">
             <w:r>
               <w:rPr>
                 <w:rStyle w:val="Hyperlink"/>
@@ -3978,7 +3978,7 @@
               <w:rPr>
                 <w:noProof/>
               </w:rPr>
-              <w:instrText xml:space="preserve"> PAGEREF _Toc241361751 \h </w:instrText>
+              <w:instrText xml:space="preserve"> PAGEREF _Toc241392089 \h </w:instrText>
             </w:r>
             <w:r>
               <w:rPr>
@@ -4020,7 +4020,7 @@
               <w14:ligatures w14:val="standardContextual"/>
             </w:rPr>
           </w:pPr>
-          <w:hyperlink w:anchor="_Toc241361752" w:history="1">
+          <w:hyperlink w:anchor="_Toc241392090" w:history="1">
             <w:r>
               <w:rPr>
                 <w:rStyle w:val="Hyperlink"/>
@@ -4044,7 +4044,7 @@
               <w:rPr>
                 <w:noProof/>
               </w:rPr>
-              <w:instrText xml:space="preserve"> PAGEREF _Toc241361752 \h </w:instrText>
+              <w:instrText xml:space="preserve"> PAGEREF _Toc241392090 \h </w:instrText>
             </w:r>
             <w:r>
               <w:rPr>
@@ -4086,7 +4086,7 @@
               <w14:ligatures w14:val="standardContextual"/>
             </w:rPr>
           </w:pPr>
-          <w:hyperlink w:anchor="_Toc241361753" w:history="1">
+          <w:hyperlink w:anchor="_Toc241392091" w:history="1">
             <w:r>
               <w:rPr>
                 <w:rStyle w:val="Hyperlink"/>
@@ -4110,7 +4110,7 @@
               <w:rPr>
                 <w:noProof/>
               </w:rPr>
-              <w:instrText xml:space="preserve"> PAGEREF _Toc241361753 \h </w:instrText>
+              <w:instrText xml:space="preserve"> PAGEREF _Toc241392091 \h </w:instrText>
             </w:r>
             <w:r>
               <w:rPr>
@@ -4152,7 +4152,7 @@
               <w14:ligatures w14:val="standardContextual"/>
             </w:rPr>
           </w:pPr>
-          <w:hyperlink w:anchor="_Toc241361754" w:history="1">
+          <w:hyperlink w:anchor="_Toc241392092" w:history="1">
             <w:r>
               <w:rPr>
                 <w:rStyle w:val="Hyperlink"/>
@@ -4176,7 +4176,7 @@
               <w:rPr>
                 <w:noProof/>
               </w:rPr>
-              <w:instrText xml:space="preserve"> PAGEREF _Toc241361754 \h </w:instrText>
+              <w:instrText xml:space="preserve"> PAGEREF _Toc241392092 \h </w:instrText>
             </w:r>
             <w:r>
               <w:rPr>
@@ -4218,7 +4218,7 @@
               <w14:ligatures w14:val="standardContextual"/>
             </w:rPr>
           </w:pPr>
-          <w:hyperlink w:anchor="_Toc241361755" w:history="1">
+          <w:hyperlink w:anchor="_Toc241392093" w:history="1">
             <w:r>
               <w:rPr>
                 <w:rStyle w:val="Hyperlink"/>
@@ -4242,7 +4242,7 @@
               <w:rPr>
                 <w:noProof/>
               </w:rPr>
-              <w:instrText xml:space="preserve"> PAGEREF _Toc241361755 \h </w:instrText>
+              <w:instrText xml:space="preserve"> PAGEREF _Toc241392093 \h </w:instrText>
             </w:r>
             <w:r>
               <w:rPr>
@@ -4284,7 +4284,7 @@
               <w14:ligatures w14:val="standardContextual"/>
             </w:rPr>
           </w:pPr>
-          <w:hyperlink w:anchor="_Toc241361756" w:history="1">
+          <w:hyperlink w:anchor="_Toc241392094" w:history="1">
             <w:r>
               <w:rPr>
                 <w:rStyle w:val="Hyperlink"/>
@@ -4308,7 +4308,7 @@
               <w:rPr>
                 <w:noProof/>
               </w:rPr>
-              <w:instrText xml:space="preserve"> PAGEREF _Toc241361756 \h </w:instrText>
+              <w:instrText xml:space="preserve"> PAGEREF _Toc241392094 \h </w:instrText>
             </w:r>
             <w:r>
               <w:rPr>
@@ -4350,7 +4350,7 @@
               <w14:ligatures w14:val="standardContextual"/>
             </w:rPr>
           </w:pPr>
-          <w:hyperlink w:anchor="_Toc241361757" w:history="1">
+          <w:hyperlink w:anchor="_Toc241392095" w:history="1">
             <w:r>
               <w:rPr>
                 <w:rStyle w:val="Hyperlink"/>
@@ -4374,7 +4374,7 @@
               <w:rPr>
                 <w:noProof/>
               </w:rPr>
-              <w:instrText xml:space="preserve"> PAGEREF _Toc241361757 \h </w:instrText>
+              <w:instrText xml:space="preserve"> PAGEREF _Toc241392095 \h </w:instrText>
             </w:r>
             <w:r>
               <w:rPr>
@@ -4416,7 +4416,7 @@
               <w14:ligatures w14:val="standardContextual"/>
             </w:rPr>
           </w:pPr>
-          <w:hyperlink w:anchor="_Toc241361758" w:history="1">
+          <w:hyperlink w:anchor="_Toc241392096" w:history="1">
             <w:r>
               <w:rPr>
                 <w:rStyle w:val="Hyperlink"/>
@@ -4440,7 +4440,7 @@
               <w:rPr>
                 <w:noProof/>
               </w:rPr>
-              <w:instrText xml:space="preserve"> PAGEREF _Toc241361758 \h </w:instrText>
+              <w:instrText xml:space="preserve"> PAGEREF _Toc241392096 \h </w:instrText>
             </w:r>
             <w:r>
               <w:rPr>
@@ -4482,7 +4482,7 @@
               <w14:ligatures w14:val="standardContextual"/>
             </w:rPr>
           </w:pPr>
-          <w:hyperlink w:anchor="_Toc241361759" w:history="1">
+          <w:hyperlink w:anchor="_Toc241392097" w:history="1">
             <w:r>
               <w:rPr>
                 <w:rStyle w:val="Hyperlink"/>
@@ -4506,7 +4506,7 @@
               <w:rPr>
                 <w:noProof/>
               </w:rPr>
-              <w:instrText xml:space="preserve"> PAGEREF _Toc241361759 \h </w:instrText>
+              <w:instrText xml:space="preserve"> PAGEREF _Toc241392097 \h </w:instrText>
             </w:r>
             <w:r>
               <w:rPr>
@@ -4548,7 +4548,7 @@
               <w14:ligatures w14:val="standardContextual"/>
             </w:rPr>
           </w:pPr>
-          <w:hyperlink w:anchor="_Toc241361760" w:history="1">
+          <w:hyperlink w:anchor="_Toc241392098" w:history="1">
             <w:r>
               <w:rPr>
                 <w:rStyle w:val="Hyperlink"/>
@@ -4572,7 +4572,7 @@
               <w:rPr>
                 <w:noProof/>
               </w:rPr>
-              <w:instrText xml:space="preserve"> PAGEREF _Toc241361760 \h </w:instrText>
+              <w:instrText xml:space="preserve"> PAGEREF _Toc241392098 \h </w:instrText>
             </w:r>
             <w:r>
               <w:rPr>
@@ -4614,7 +4614,7 @@
               <w14:ligatures w14:val="standardContextual"/>
             </w:rPr>
           </w:pPr>
-          <w:hyperlink w:anchor="_Toc241361761" w:history="1">
+          <w:hyperlink w:anchor="_Toc241392099" w:history="1">
             <w:r>
               <w:rPr>
                 <w:rStyle w:val="Hyperlink"/>
@@ -4638,7 +4638,7 @@
               <w:rPr>
                 <w:noProof/>
               </w:rPr>
-              <w:instrText xml:space="preserve"> PAGEREF _Toc241361761 \h </w:instrText>
+              <w:instrText xml:space="preserve"> PAGEREF _Toc241392099 \h </w:instrText>
             </w:r>
             <w:r>
               <w:rPr>
@@ -4680,7 +4680,7 @@
               <w14:ligatures w14:val="standardContextual"/>
             </w:rPr>
           </w:pPr>
-          <w:hyperlink w:anchor="_Toc241361762" w:history="1">
+          <w:hyperlink w:anchor="_Toc241392100" w:history="1">
             <w:r>
               <w:rPr>
                 <w:rStyle w:val="Hyperlink"/>
@@ -4704,7 +4704,7 @@
               <w:rPr>
                 <w:noProof/>
               </w:rPr>
-              <w:instrText xml:space="preserve"> PAGEREF _Toc241361762 \h </w:instrText>
+              <w:instrText xml:space="preserve"> PAGEREF _Toc241392100 \h </w:instrText>
             </w:r>
             <w:r>
               <w:rPr>
@@ -4746,7 +4746,7 @@
               <w14:ligatures w14:val="standardContextual"/>
             </w:rPr>
           </w:pPr>
-          <w:hyperlink w:anchor="_Toc241361763" w:history="1">
+          <w:hyperlink w:anchor="_Toc241392101" w:history="1">
             <w:r>
               <w:rPr>
                 <w:rStyle w:val="Hyperlink"/>
@@ -4770,7 +4770,7 @@
               <w:rPr>
                 <w:noProof/>
               </w:rPr>
-              <w:instrText xml:space="preserve"> PAGEREF _Toc241361763 \h </w:instrText>
+              <w:instrText xml:space="preserve"> PAGEREF _Toc241392101 \h </w:instrText>
             </w:r>
             <w:r>
               <w:rPr>
@@ -4812,7 +4812,7 @@
               <w14:ligatures w14:val="standardContextual"/>
             </w:rPr>
           </w:pPr>
-          <w:hyperlink w:anchor="_Toc241361764" w:history="1">
+          <w:hyperlink w:anchor="_Toc241392102" w:history="1">
             <w:r>
               <w:rPr>
                 <w:rStyle w:val="Hyperlink"/>
@@ -4836,7 +4836,7 @@
               <w:rPr>
                 <w:noProof/>
               </w:rPr>
-              <w:instrText xml:space="preserve"> PAGEREF _Toc241361764 \h </w:instrText>
+              <w:instrText xml:space="preserve"> PAGEREF _Toc241392102 \h </w:instrText>
             </w:r>
             <w:r>
               <w:rPr>
@@ -4878,7 +4878,7 @@
               <w14:ligatures w14:val="standardContextual"/>
             </w:rPr>
           </w:pPr>
-          <w:hyperlink w:anchor="_Toc241361765" w:history="1">
+          <w:hyperlink w:anchor="_Toc241392103" w:history="1">
             <w:r>
               <w:rPr>
                 <w:rStyle w:val="Hyperlink"/>
@@ -4902,7 +4902,7 @@
               <w:rPr>
                 <w:noProof/>
               </w:rPr>
-              <w:instrText xml:space="preserve"> PAGEREF _Toc241361765 \h </w:instrText>
+              <w:instrText xml:space="preserve"> PAGEREF _Toc241392103 \h </w:instrText>
             </w:r>
             <w:r>
               <w:rPr>
@@ -4944,7 +4944,7 @@
               <w14:ligatures w14:val="standardContextual"/>
             </w:rPr>
           </w:pPr>
-          <w:hyperlink w:anchor="_Toc241361766" w:history="1">
+          <w:hyperlink w:anchor="_Toc241392104" w:history="1">
             <w:r>
               <w:rPr>
                 <w:rStyle w:val="Hyperlink"/>
@@ -4968,7 +4968,7 @@
               <w:rPr>
                 <w:noProof/>
               </w:rPr>
-              <w:instrText xml:space="preserve"> PAGEREF _Toc241361766 \h </w:instrText>
+              <w:instrText xml:space="preserve"> PAGEREF _Toc241392104 \h </w:instrText>
             </w:r>
             <w:r>
               <w:rPr>
@@ -5010,7 +5010,7 @@
               <w14:ligatures w14:val="standardContextual"/>
             </w:rPr>
           </w:pPr>
-          <w:hyperlink w:anchor="_Toc241361767" w:history="1">
+          <w:hyperlink w:anchor="_Toc241392105" w:history="1">
             <w:r>
               <w:rPr>
                 <w:rStyle w:val="Hyperlink"/>
@@ -5034,7 +5034,7 @@
               <w:rPr>
                 <w:noProof/>
               </w:rPr>
-              <w:instrText xml:space="preserve"> PAGEREF _Toc241361767 \h </w:instrText>
+              <w:instrText xml:space="preserve"> PAGEREF _Toc241392105 \h </w:instrText>
             </w:r>
             <w:r>
               <w:rPr>
@@ -5076,7 +5076,7 @@
               <w14:ligatures w14:val="standardContextual"/>
             </w:rPr>
           </w:pPr>
-          <w:hyperlink w:anchor="_Toc241361768" w:history="1">
+          <w:hyperlink w:anchor="_Toc241392106" w:history="1">
             <w:r>
               <w:rPr>
                 <w:rStyle w:val="Hyperlink"/>
@@ -5100,7 +5100,7 @@
               <w:rPr>
                 <w:noProof/>
               </w:rPr>
-              <w:instrText xml:space="preserve"> PAGEREF _Toc241361768 \h </w:instrText>
+              <w:instrText xml:space="preserve"> PAGEREF _Toc241392106 \h </w:instrText>
             </w:r>
             <w:r>
               <w:rPr>
@@ -5142,7 +5142,7 @@
               <w14:ligatures w14:val="standardContextual"/>
             </w:rPr>
           </w:pPr>
-          <w:hyperlink w:anchor="_Toc241361769" w:history="1">
+          <w:hyperlink w:anchor="_Toc241392107" w:history="1">
             <w:r>
               <w:rPr>
                 <w:rStyle w:val="Hyperlink"/>
@@ -5166,7 +5166,7 @@
               <w:rPr>
                 <w:noProof/>
               </w:rPr>
-              <w:instrText xml:space="preserve"> PAGEREF _Toc241361769 \h </w:instrText>
+              <w:instrText xml:space="preserve"> PAGEREF _Toc241392107 \h </w:instrText>
             </w:r>
             <w:r>
               <w:rPr>
@@ -5208,7 +5208,7 @@
               <w14:ligatures w14:val="standardContextual"/>
             </w:rPr>
           </w:pPr>
-          <w:hyperlink w:anchor="_Toc241361770" w:history="1">
+          <w:hyperlink w:anchor="_Toc241392108" w:history="1">
             <w:r>
               <w:rPr>
                 <w:rStyle w:val="Hyperlink"/>
@@ -5232,7 +5232,7 @@
               <w:rPr>
                 <w:noProof/>
               </w:rPr>
-              <w:instrText xml:space="preserve"> PAGEREF _Toc241361770 \h </w:instrText>
+              <w:instrText xml:space="preserve"> PAGEREF _Toc241392108 \h </w:instrText>
             </w:r>
             <w:r>
               <w:rPr>
@@ -5274,7 +5274,7 @@
               <w14:ligatures w14:val="standardContextual"/>
             </w:rPr>
           </w:pPr>
-          <w:hyperlink w:anchor="_Toc241361771" w:history="1">
+          <w:hyperlink w:anchor="_Toc241392109" w:history="1">
             <w:r>
               <w:rPr>
                 <w:rStyle w:val="Hyperlink"/>
@@ -5298,7 +5298,7 @@
               <w:rPr>
                 <w:noProof/>
               </w:rPr>
-              <w:instrText xml:space="preserve"> PAGEREF _Toc241361771 \h </w:instrText>
+              <w:instrText xml:space="preserve"> PAGEREF _Toc241392109 \h </w:instrText>
             </w:r>
             <w:r>
               <w:rPr>
@@ -5340,7 +5340,7 @@
               <w14:ligatures w14:val="standardContextual"/>
             </w:rPr>
           </w:pPr>
-          <w:hyperlink w:anchor="_Toc241361772" w:history="1">
+          <w:hyperlink w:anchor="_Toc241392110" w:history="1">
             <w:r>
               <w:rPr>
                 <w:rStyle w:val="Hyperlink"/>
@@ -5364,7 +5364,7 @@
               <w:rPr>
                 <w:noProof/>
               </w:rPr>
-              <w:instrText xml:space="preserve"> PAGEREF _Toc241361772 \h </w:instrText>
+              <w:instrText xml:space="preserve"> PAGEREF _Toc241392110 \h </w:instrText>
             </w:r>
             <w:r>
               <w:rPr>
@@ -5406,7 +5406,7 @@
               <w14:ligatures w14:val="standardContextual"/>
             </w:rPr>
           </w:pPr>
-          <w:hyperlink w:anchor="_Toc241361773" w:history="1">
+          <w:hyperlink w:anchor="_Toc241392111" w:history="1">
             <w:r>
               <w:rPr>
                 <w:rStyle w:val="Hyperlink"/>
@@ -5430,7 +5430,7 @@
               <w:rPr>
                 <w:noProof/>
               </w:rPr>
-              <w:instrText xml:space="preserve"> PAGEREF _Toc241361773 \h </w:instrText>
+              <w:instrText xml:space="preserve"> PAGEREF _Toc241392111 \h </w:instrText>
             </w:r>
             <w:r>
               <w:rPr>
@@ -5472,7 +5472,7 @@
               <w14:ligatures w14:val="standardContextual"/>
             </w:rPr>
           </w:pPr>
-          <w:hyperlink w:anchor="_Toc241361774" w:history="1">
+          <w:hyperlink w:anchor="_Toc241392112" w:history="1">
             <w:r>
               <w:rPr>
                 <w:rStyle w:val="Hyperlink"/>
@@ -5496,7 +5496,7 @@
               <w:rPr>
                 <w:noProof/>
               </w:rPr>
-              <w:instrText xml:space="preserve"> PAGEREF _Toc241361774 \h </w:instrText>
+              <w:instrText xml:space="preserve"> PAGEREF _Toc241392112 \h </w:instrText>
             </w:r>
             <w:r>
               <w:rPr>
@@ -5538,7 +5538,7 @@
               <w14:ligatures w14:val="standardContextual"/>
             </w:rPr>
           </w:pPr>
-          <w:hyperlink w:anchor="_Toc241361775" w:history="1">
+          <w:hyperlink w:anchor="_Toc241392113" w:history="1">
             <w:r>
               <w:rPr>
                 <w:rStyle w:val="Hyperlink"/>
@@ -5562,7 +5562,7 @@
               <w:rPr>
                 <w:noProof/>
               </w:rPr>
-              <w:instrText xml:space="preserve"> PAGEREF _Toc241361775 \h </w:instrText>
+              <w:instrText xml:space="preserve"> PAGEREF _Toc241392113 \h </w:instrText>
             </w:r>
             <w:r>
               <w:rPr>
@@ -5604,7 +5604,7 @@
               <w14:ligatures w14:val="standardContextual"/>
             </w:rPr>
           </w:pPr>
-          <w:hyperlink w:anchor="_Toc241361776" w:history="1">
+          <w:hyperlink w:anchor="_Toc241392114" w:history="1">
             <w:r>
               <w:rPr>
                 <w:rStyle w:val="Hyperlink"/>
@@ -5628,7 +5628,7 @@
               <w:rPr>
                 <w:noProof/>
               </w:rPr>
-              <w:instrText xml:space="preserve"> PAGEREF _Toc241361776 \h </w:instrText>
+              <w:instrText xml:space="preserve"> PAGEREF _Toc241392114 \h </w:instrText>
             </w:r>
             <w:r>
               <w:rPr>
@@ -5670,7 +5670,7 @@
               <w14:ligatures w14:val="standardContextual"/>
             </w:rPr>
           </w:pPr>
-          <w:hyperlink w:anchor="_Toc241361777" w:history="1">
+          <w:hyperlink w:anchor="_Toc241392115" w:history="1">
             <w:r>
               <w:rPr>
                 <w:rStyle w:val="Hyperlink"/>
@@ -5694,7 +5694,7 @@
               <w:rPr>
                 <w:noProof/>
               </w:rPr>
-              <w:instrText xml:space="preserve"> PAGEREF _Toc241361777 \h </w:instrText>
+              <w:instrText xml:space="preserve"> PAGEREF _Toc241392115 \h </w:instrText>
             </w:r>
             <w:r>
               <w:rPr>
@@ -5736,7 +5736,7 @@
               <w14:ligatures w14:val="standardContextual"/>
             </w:rPr>
           </w:pPr>
-          <w:hyperlink w:anchor="_Toc241361778" w:history="1">
+          <w:hyperlink w:anchor="_Toc241392116" w:history="1">
             <w:r>
               <w:rPr>
                 <w:rStyle w:val="Hyperlink"/>
@@ -5760,7 +5760,7 @@
               <w:rPr>
                 <w:noProof/>
               </w:rPr>
-              <w:instrText xml:space="preserve"> PAGEREF _Toc241361778 \h </w:instrText>
+              <w:instrText xml:space="preserve"> PAGEREF _Toc241392116 \h </w:instrText>
             </w:r>
             <w:r>
               <w:rPr>
@@ -5802,7 +5802,7 @@
               <w14:ligatures w14:val="standardContextual"/>
             </w:rPr>
           </w:pPr>
-          <w:hyperlink w:anchor="_Toc241361779" w:history="1">
+          <w:hyperlink w:anchor="_Toc241392117" w:history="1">
             <w:r>
               <w:rPr>
                 <w:rStyle w:val="Hyperlink"/>
@@ -5826,7 +5826,7 @@
               <w:rPr>
                 <w:noProof/>
               </w:rPr>
-              <w:instrText xml:space="preserve"> PAGEREF _Toc241361779 \h </w:instrText>
+              <w:instrText xml:space="preserve"> PAGEREF _Toc241392117 \h </w:instrText>
             </w:r>
             <w:r>
               <w:rPr>
@@ -5868,7 +5868,7 @@
               <w14:ligatures w14:val="standardContextual"/>
             </w:rPr>
           </w:pPr>
-          <w:hyperlink w:anchor="_Toc241361780" w:history="1">
+          <w:hyperlink w:anchor="_Toc241392118" w:history="1">
             <w:r>
               <w:rPr>
                 <w:rStyle w:val="Hyperlink"/>
@@ -5892,7 +5892,7 @@
               <w:rPr>
                 <w:noProof/>
               </w:rPr>
-              <w:instrText xml:space="preserve"> PAGEREF _Toc241361780 \h </w:instrText>
+              <w:instrText xml:space="preserve"> PAGEREF _Toc241392118 \h </w:instrText>
             </w:r>
             <w:r>
               <w:rPr>
@@ -5934,7 +5934,7 @@
               <w14:ligatures w14:val="standardContextual"/>
             </w:rPr>
           </w:pPr>
-          <w:hyperlink w:anchor="_Toc241361781" w:history="1">
+          <w:hyperlink w:anchor="_Toc241392119" w:history="1">
             <w:r>
               <w:rPr>
                 <w:rStyle w:val="Hyperlink"/>
@@ -5958,7 +5958,7 @@
               <w:rPr>
                 <w:noProof/>
               </w:rPr>
-              <w:instrText xml:space="preserve"> PAGEREF _Toc241361781 \h </w:instrText>
+              <w:instrText xml:space="preserve"> PAGEREF _Toc241392119 \h </w:instrText>
             </w:r>
             <w:r>
               <w:rPr>
@@ -6000,7 +6000,7 @@
               <w14:ligatures w14:val="standardContextual"/>
             </w:rPr>
           </w:pPr>
-          <w:hyperlink w:anchor="_Toc241361782" w:history="1">
+          <w:hyperlink w:anchor="_Toc241392120" w:history="1">
             <w:r>
               <w:rPr>
                 <w:rStyle w:val="Hyperlink"/>
@@ -6024,7 +6024,7 @@
               <w:rPr>
                 <w:noProof/>
               </w:rPr>
-              <w:instrText xml:space="preserve"> PAGEREF _Toc241361782 \h </w:instrText>
+              <w:instrText xml:space="preserve"> PAGEREF _Toc241392120 \h </w:instrText>
             </w:r>
             <w:r>
               <w:rPr>
@@ -6066,7 +6066,7 @@
               <w14:ligatures w14:val="standardContextual"/>
             </w:rPr>
           </w:pPr>
-          <w:hyperlink w:anchor="_Toc241361783" w:history="1">
+          <w:hyperlink w:anchor="_Toc241392121" w:history="1">
             <w:r>
               <w:rPr>
                 <w:rStyle w:val="Hyperlink"/>
@@ -6090,7 +6090,7 @@
               <w:rPr>
                 <w:noProof/>
               </w:rPr>
-              <w:instrText xml:space="preserve"> PAGEREF _Toc241361783 \h </w:instrText>
+              <w:instrText xml:space="preserve"> PAGEREF _Toc241392121 \h </w:instrText>
             </w:r>
             <w:r>
               <w:rPr>
@@ -6132,7 +6132,7 @@
               <w14:ligatures w14:val="standardContextual"/>
             </w:rPr>
           </w:pPr>
-          <w:hyperlink w:anchor="_Toc241361784" w:history="1">
+          <w:hyperlink w:anchor="_Toc241392122" w:history="1">
             <w:r>
               <w:rPr>
                 <w:rStyle w:val="Hyperlink"/>
@@ -6156,7 +6156,7 @@
               <w:rPr>
                 <w:noProof/>
               </w:rPr>
-              <w:instrText xml:space="preserve"> PAGEREF _Toc241361784 \h </w:instrText>
+              <w:instrText xml:space="preserve"> PAGEREF _Toc241392122 \h </w:instrText>
             </w:r>
             <w:r>
               <w:rPr>
@@ -6198,7 +6198,7 @@
               <w14:ligatures w14:val="standardContextual"/>
             </w:rPr>
           </w:pPr>
-          <w:hyperlink w:anchor="_Toc241361785" w:history="1">
+          <w:hyperlink w:anchor="_Toc241392123" w:history="1">
             <w:r>
               <w:rPr>
                 <w:rStyle w:val="Hyperlink"/>
@@ -6222,7 +6222,7 @@
               <w:rPr>
                 <w:noProof/>
               </w:rPr>
-              <w:instrText xml:space="preserve"> PAGEREF _Toc241361785 \h </w:instrText>
+              <w:instrText xml:space="preserve"> PAGEREF _Toc241392123 \h </w:instrText>
             </w:r>
             <w:r>
               <w:rPr>
@@ -6264,7 +6264,7 @@
               <w14:ligatures w14:val="standardContextual"/>
             </w:rPr>
           </w:pPr>
-          <w:hyperlink w:anchor="_Toc241361786" w:history="1">
+          <w:hyperlink w:anchor="_Toc241392124" w:history="1">
             <w:r>
               <w:rPr>
                 <w:rStyle w:val="Hyperlink"/>
@@ -6288,7 +6288,7 @@
               <w:rPr>
                 <w:noProof/>
               </w:rPr>
-              <w:instrText xml:space="preserve"> PAGEREF _Toc241361786 \h </w:instrText>
+              <w:instrText xml:space="preserve"> PAGEREF _Toc241392124 \h </w:instrText>
             </w:r>
             <w:r>
               <w:rPr>
@@ -6330,7 +6330,7 @@
               <w14:ligatures w14:val="standardContextual"/>
             </w:rPr>
           </w:pPr>
-          <w:hyperlink w:anchor="_Toc241361787" w:history="1">
+          <w:hyperlink w:anchor="_Toc241392125" w:history="1">
             <w:r>
               <w:rPr>
                 <w:rStyle w:val="Hyperlink"/>
@@ -6354,7 +6354,7 @@
               <w:rPr>
                 <w:noProof/>
               </w:rPr>
-              <w:instrText xml:space="preserve"> PAGEREF _Toc241361787 \h </w:instrText>
+              <w:instrText xml:space="preserve"> PAGEREF _Toc241392125 \h </w:instrText>
             </w:r>
             <w:r>
               <w:rPr>
@@ -6396,7 +6396,7 @@
               <w14:ligatures w14:val="standardContextual"/>
             </w:rPr>
           </w:pPr>
-          <w:hyperlink w:anchor="_Toc241361788" w:history="1">
+          <w:hyperlink w:anchor="_Toc241392126" w:history="1">
             <w:r>
               <w:rPr>
                 <w:rStyle w:val="Hyperlink"/>
@@ -6420,7 +6420,7 @@
               <w:rPr>
                 <w:noProof/>
               </w:rPr>
-              <w:instrText xml:space="preserve"> PAGEREF _Toc241361788 \h </w:instrText>
+              <w:instrText xml:space="preserve"> PAGEREF _Toc241392126 \h </w:instrText>
             </w:r>
             <w:r>
               <w:rPr>
@@ -6462,7 +6462,7 @@
               <w14:ligatures w14:val="standardContextual"/>
             </w:rPr>
           </w:pPr>
-          <w:hyperlink w:anchor="_Toc241361789" w:history="1">
+          <w:hyperlink w:anchor="_Toc241392127" w:history="1">
             <w:r>
               <w:rPr>
                 <w:rStyle w:val="Hyperlink"/>
@@ -6486,7 +6486,7 @@
               <w:rPr>
                 <w:noProof/>
               </w:rPr>
-              <w:instrText xml:space="preserve"> PAGEREF _Toc241361789 \h </w:instrText>
+              <w:instrText xml:space="preserve"> PAGEREF _Toc241392127 \h </w:instrText>
             </w:r>
             <w:r>
               <w:rPr>
@@ -6528,7 +6528,7 @@
               <w14:ligatures w14:val="standardContextual"/>
             </w:rPr>
           </w:pPr>
-          <w:hyperlink w:anchor="_Toc241361790" w:history="1">
+          <w:hyperlink w:anchor="_Toc241392128" w:history="1">
             <w:r>
               <w:rPr>
                 <w:rStyle w:val="Hyperlink"/>
@@ -6552,7 +6552,7 @@
               <w:rPr>
                 <w:noProof/>
               </w:rPr>
-              <w:instrText xml:space="preserve"> PAGEREF _Toc241361790 \h </w:instrText>
+              <w:instrText xml:space="preserve"> PAGEREF _Toc241392128 \h </w:instrText>
             </w:r>
             <w:r>
               <w:rPr>
@@ -6594,7 +6594,7 @@
               <w14:ligatures w14:val="standardContextual"/>
             </w:rPr>
           </w:pPr>
-          <w:hyperlink w:anchor="_Toc241361791" w:history="1">
+          <w:hyperlink w:anchor="_Toc241392129" w:history="1">
             <w:r>
               <w:rPr>
                 <w:rStyle w:val="Hyperlink"/>
@@ -6618,7 +6618,7 @@
               <w:rPr>
                 <w:noProof/>
               </w:rPr>
-              <w:instrText xml:space="preserve"> PAGEREF _Toc241361791 \h </w:instrText>
+              <w:instrText xml:space="preserve"> PAGEREF _Toc241392129 \h </w:instrText>
             </w:r>
             <w:r>
               <w:rPr>
@@ -6660,7 +6660,7 @@
               <w14:ligatures w14:val="standardContextual"/>
             </w:rPr>
           </w:pPr>
-          <w:hyperlink w:anchor="_Toc241361792" w:history="1">
+          <w:hyperlink w:anchor="_Toc241392130" w:history="1">
             <w:r>
               <w:rPr>
                 <w:rStyle w:val="Hyperlink"/>
@@ -6684,7 +6684,7 @@
               <w:rPr>
                 <w:noProof/>
               </w:rPr>
-              <w:instrText xml:space="preserve"> PAGEREF _Toc241361792 \h </w:instrText>
+              <w:instrText xml:space="preserve"> PAGEREF _Toc241392130 \h </w:instrText>
             </w:r>
             <w:r>
               <w:rPr>
@@ -6726,7 +6726,7 @@
               <w14:ligatures w14:val="standardContextual"/>
             </w:rPr>
           </w:pPr>
-          <w:hyperlink w:anchor="_Toc241361793" w:history="1">
+          <w:hyperlink w:anchor="_Toc241392131" w:history="1">
             <w:r>
               <w:rPr>
                 <w:rStyle w:val="Hyperlink"/>
@@ -6750,7 +6750,7 @@
               <w:rPr>
                 <w:noProof/>
               </w:rPr>
-              <w:instrText xml:space="preserve"> PAGEREF _Toc241361793 \h </w:instrText>
+              <w:instrText xml:space="preserve"> PAGEREF _Toc241392131 \h </w:instrText>
             </w:r>
             <w:r>
               <w:rPr>
@@ -6792,7 +6792,7 @@
               <w14:ligatures w14:val="standardContextual"/>
             </w:rPr>
           </w:pPr>
-          <w:hyperlink w:anchor="_Toc241361794" w:history="1">
+          <w:hyperlink w:anchor="_Toc241392132" w:history="1">
             <w:r>
               <w:rPr>
                 <w:rStyle w:val="Hyperlink"/>
@@ -6816,7 +6816,7 @@
               <w:rPr>
                 <w:noProof/>
               </w:rPr>
-              <w:instrText xml:space="preserve"> PAGEREF _Toc241361794 \h </w:instrText>
+              <w:instrText xml:space="preserve"> PAGEREF _Toc241392132 \h </w:instrText>
             </w:r>
             <w:r>
               <w:rPr>
@@ -6858,7 +6858,7 @@
               <w14:ligatures w14:val="standardContextual"/>
             </w:rPr>
           </w:pPr>
-          <w:hyperlink w:anchor="_Toc241361795" w:history="1">
+          <w:hyperlink w:anchor="_Toc241392133" w:history="1">
             <w:r>
               <w:rPr>
                 <w:rStyle w:val="Hyperlink"/>
@@ -6882,7 +6882,7 @@
               <w:rPr>
                 <w:noProof/>
               </w:rPr>
-              <w:instrText xml:space="preserve"> PAGEREF _Toc241361795 \h </w:instrText>
+              <w:instrText xml:space="preserve"> PAGEREF _Toc241392133 \h </w:instrText>
             </w:r>
             <w:r>
               <w:rPr>
@@ -6924,7 +6924,7 @@
               <w14:ligatures w14:val="standardContextual"/>
             </w:rPr>
           </w:pPr>
-          <w:hyperlink w:anchor="_Toc241361796" w:history="1">
+          <w:hyperlink w:anchor="_Toc241392134" w:history="1">
             <w:r>
               <w:rPr>
                 <w:rStyle w:val="Hyperlink"/>
@@ -6948,7 +6948,7 @@
               <w:rPr>
                 <w:noProof/>
               </w:rPr>
-              <w:instrText xml:space="preserve"> PAGEREF _Toc241361796 \h </w:instrText>
+              <w:instrText xml:space="preserve"> PAGEREF _Toc241392134 \h </w:instrText>
             </w:r>
             <w:r>
               <w:rPr>
@@ -6990,7 +6990,7 @@
               <w14:ligatures w14:val="standardContextual"/>
             </w:rPr>
           </w:pPr>
-          <w:hyperlink w:anchor="_Toc241361797" w:history="1">
+          <w:hyperlink w:anchor="_Toc241392135" w:history="1">
             <w:r>
               <w:rPr>
                 <w:rStyle w:val="Hyperlink"/>
@@ -7014,7 +7014,7 @@
               <w:rPr>
                 <w:noProof/>
               </w:rPr>
-              <w:instrText xml:space="preserve"> PAGEREF _Toc241361797 \h </w:instrText>
+              <w:instrText xml:space="preserve"> PAGEREF _Toc241392135 \h </w:instrText>
             </w:r>
             <w:r>
               <w:rPr>
@@ -7056,7 +7056,7 @@
               <w14:ligatures w14:val="standardContextual"/>
             </w:rPr>
           </w:pPr>
-          <w:hyperlink w:anchor="_Toc241361798" w:history="1">
+          <w:hyperlink w:anchor="_Toc241392136" w:history="1">
             <w:r>
               <w:rPr>
                 <w:rStyle w:val="Hyperlink"/>
@@ -7080,7 +7080,7 @@
               <w:rPr>
                 <w:noProof/>
               </w:rPr>
-              <w:instrText xml:space="preserve"> PAGEREF _Toc241361798 \h </w:instrText>
+              <w:instrText xml:space="preserve"> PAGEREF _Toc241392136 \h </w:instrText>
             </w:r>
             <w:r>
               <w:rPr>
@@ -7122,7 +7122,7 @@
               <w14:ligatures w14:val="standardContextual"/>
             </w:rPr>
           </w:pPr>
-          <w:hyperlink w:anchor="_Toc241361799" w:history="1">
+          <w:hyperlink w:anchor="_Toc241392137" w:history="1">
             <w:r>
               <w:rPr>
                 <w:rStyle w:val="Hyperlink"/>
@@ -7146,7 +7146,7 @@
               <w:rPr>
                 <w:noProof/>
               </w:rPr>
-              <w:instrText xml:space="preserve"> PAGEREF _Toc241361799 \h </w:instrText>
+              <w:instrText xml:space="preserve"> PAGEREF _Toc241392137 \h </w:instrText>
             </w:r>
             <w:r>
               <w:rPr>
@@ -7188,7 +7188,7 @@
               <w14:ligatures w14:val="standardContextual"/>
             </w:rPr>
           </w:pPr>
-          <w:hyperlink w:anchor="_Toc241361800" w:history="1">
+          <w:hyperlink w:anchor="_Toc241392138" w:history="1">
             <w:r>
               <w:rPr>
                 <w:rStyle w:val="Hyperlink"/>
@@ -7212,7 +7212,7 @@
               <w:rPr>
                 <w:noProof/>
               </w:rPr>
-              <w:instrText xml:space="preserve"> PAGEREF _Toc241361800 \h </w:instrText>
+              <w:instrText xml:space="preserve"> PAGEREF _Toc241392138 \h </w:instrText>
             </w:r>
             <w:r>
               <w:rPr>
@@ -7254,7 +7254,7 @@
               <w14:ligatures w14:val="standardContextual"/>
             </w:rPr>
           </w:pPr>
-          <w:hyperlink w:anchor="_Toc241361801" w:history="1">
+          <w:hyperlink w:anchor="_Toc241392139" w:history="1">
             <w:r>
               <w:rPr>
                 <w:rStyle w:val="Hyperlink"/>
@@ -7278,7 +7278,7 @@
               <w:rPr>
                 <w:noProof/>
               </w:rPr>
-              <w:instrText xml:space="preserve"> PAGEREF _Toc241361801 \h </w:instrText>
+              <w:instrText xml:space="preserve"> PAGEREF _Toc241392139 \h </w:instrText>
             </w:r>
             <w:r>
               <w:rPr>
@@ -7320,7 +7320,7 @@
               <w14:ligatures w14:val="standardContextual"/>
             </w:rPr>
           </w:pPr>
-          <w:hyperlink w:anchor="_Toc241361802" w:history="1">
+          <w:hyperlink w:anchor="_Toc241392140" w:history="1">
             <w:r>
               <w:rPr>
                 <w:rStyle w:val="Hyperlink"/>
@@ -7344,7 +7344,7 @@
               <w:rPr>
                 <w:noProof/>
               </w:rPr>
-              <w:instrText xml:space="preserve"> PAGEREF _Toc241361802 \h </w:instrText>
+              <w:instrText xml:space="preserve"> PAGEREF _Toc241392140 \h </w:instrText>
             </w:r>
             <w:r>
               <w:rPr>
@@ -7386,7 +7386,7 @@
               <w14:ligatures w14:val="standardContextual"/>
             </w:rPr>
           </w:pPr>
-          <w:hyperlink w:anchor="_Toc241361803" w:history="1">
+          <w:hyperlink w:anchor="_Toc241392141" w:history="1">
             <w:r>
               <w:rPr>
                 <w:rStyle w:val="Hyperlink"/>
@@ -7410,7 +7410,7 @@
               <w:rPr>
                 <w:noProof/>
               </w:rPr>
-              <w:instrText xml:space="preserve"> PAGEREF _Toc241361803 \h </w:instrText>
+              <w:instrText xml:space="preserve"> PAGEREF _Toc241392141 \h </w:instrText>
             </w:r>
             <w:r>
               <w:rPr>
@@ -7463,7 +7463,7 @@
         <w:pStyle w:val="Kop1"/>
         <w:pageBreakBefore/>
       </w:pPr>
-      <w:bookmarkStart w:id="1" w:name="_Toc241361695"/>
+      <w:bookmarkStart w:id="1" w:name="_Toc241392033"/>
       <w:r>
         <w:lastRenderedPageBreak/>
         <w:t>Intended Use and Your Data</w:t>
@@ -7489,7 +7489,7 @@
         <w:t>Your data.</w:t>
       </w:r>
       <w:r>
-        <w:t xml:space="preserve"> On the public instance, uploads are processed on shinyapps.io servers run by Posit PBC (USA). Upload only synthetic, example or anonymised data there. Pseudonymised trial data are still personal data under the GDPR. Sending them to a third-party host needs agreements your organisation must have in place, and may breach sponsor confidentiality. For real study data, run the app on your own computer.</w:t>
+        <w:t xml:space="preserve"> On the public instance, uploads are processed on shinyapps.io servers run by Posit PBC (USA). Upload only synthetic, example or anonymised data there. Pseudonymised trial data are still personal data under the GDPR. Sending them to a third-party host needs agreements your organisation must have in place, and may breach sponsor confidentiality. For real study data, run the app on your own computer. A controlled installation shows its own notice instead: there, uploads stay on your organisation's server.</w:t>
       </w:r>
     </w:p>
     <w:p>
@@ -7524,7 +7524,7 @@
       <w:pPr>
         <w:pStyle w:val="Kop2"/>
       </w:pPr>
-      <w:bookmarkStart w:id="2" w:name="_Toc241361696"/>
+      <w:bookmarkStart w:id="2" w:name="_Toc241392034"/>
       <w:r>
         <w:t>What the App Does Not Do</w:t>
       </w:r>
@@ -8065,7 +8065,7 @@
         <w:pStyle w:val="Kop1"/>
         <w:pageBreakBefore/>
       </w:pPr>
-      <w:bookmarkStart w:id="3" w:name="_Toc241361697"/>
+      <w:bookmarkStart w:id="3" w:name="_Toc241392035"/>
       <w:r>
         <w:lastRenderedPageBreak/>
         <w:t>Getting Started</w:t>
@@ -8076,7 +8076,7 @@
       <w:pPr>
         <w:pStyle w:val="Kop2"/>
       </w:pPr>
-      <w:bookmarkStart w:id="4" w:name="_Toc241361698"/>
+      <w:bookmarkStart w:id="4" w:name="_Toc241392036"/>
       <w:r>
         <w:t>Opening the Public App</w:t>
       </w:r>
@@ -8094,7 +8094,7 @@
       <w:pPr>
         <w:pStyle w:val="Kop2"/>
       </w:pPr>
-      <w:bookmarkStart w:id="5" w:name="_Toc241361699"/>
+      <w:bookmarkStart w:id="5" w:name="_Toc241392037"/>
       <w:r>
         <w:t>Installing the App on Your Own Computer</w:t>
       </w:r>
@@ -8174,7 +8174,7 @@
       <w:pPr>
         <w:pStyle w:val="Kop2"/>
       </w:pPr>
-      <w:bookmarkStart w:id="6" w:name="_Toc241361700"/>
+      <w:bookmarkStart w:id="6" w:name="_Toc241392038"/>
       <w:r>
         <w:t>The Hub Screen</w:t>
       </w:r>
@@ -8801,7 +8801,7 @@
       <w:pPr>
         <w:pStyle w:val="Kop2"/>
       </w:pPr>
-      <w:bookmarkStart w:id="7" w:name="_Toc241361701"/>
+      <w:bookmarkStart w:id="7" w:name="_Toc241392039"/>
       <w:r>
         <w:t>Getting Help Inside the App</w:t>
       </w:r>
@@ -8819,7 +8819,7 @@
       <w:pPr>
         <w:pStyle w:val="Kop2"/>
       </w:pPr>
-      <w:bookmarkStart w:id="8" w:name="_Toc241361702"/>
+      <w:bookmarkStart w:id="8" w:name="_Toc241392040"/>
       <w:r>
         <w:t>Saving Your Work</w:t>
       </w:r>
@@ -8838,7 +8838,7 @@
         <w:pStyle w:val="Kop1"/>
         <w:pageBreakBefore/>
       </w:pPr>
-      <w:bookmarkStart w:id="9" w:name="_Toc241361703"/>
+      <w:bookmarkStart w:id="9" w:name="_Toc241392041"/>
       <w:r>
         <w:lastRenderedPageBreak/>
         <w:t>Tutorials</w:t>
@@ -8857,7 +8857,7 @@
       <w:pPr>
         <w:pStyle w:val="Kop2"/>
       </w:pPr>
-      <w:bookmarkStart w:id="10" w:name="_Toc241361704"/>
+      <w:bookmarkStart w:id="10" w:name="_Toc241392042"/>
       <w:r>
         <w:t>Tutorial 1: A First Analysis Without a File</w:t>
       </w:r>
@@ -8996,7 +8996,7 @@
       <w:pPr>
         <w:pStyle w:val="Kop2"/>
       </w:pPr>
-      <w:bookmarkStart w:id="11" w:name="_Toc241361705"/>
+      <w:bookmarkStart w:id="11" w:name="_Toc241392043"/>
       <w:r>
         <w:t>Tutorial 2: Uploading Data with BLQ Results</w:t>
       </w:r>
@@ -9215,7 +9215,7 @@
       <w:pPr>
         <w:pStyle w:val="Kop2"/>
       </w:pPr>
-      <w:bookmarkStart w:id="12" w:name="_Toc241361706"/>
+      <w:bookmarkStart w:id="12" w:name="_Toc241392044"/>
       <w:r>
         <w:t>Tutorial 3: All Subjects at Once (Theophylline)</w:t>
       </w:r>
@@ -9383,7 +9383,7 @@
       <w:pPr>
         <w:pStyle w:val="Kop2"/>
       </w:pPr>
-      <w:bookmarkStart w:id="13" w:name="_Toc241361707"/>
+      <w:bookmarkStart w:id="13" w:name="_Toc241392045"/>
       <w:r>
         <w:t>Tutorial 4: Bioequivalence</w:t>
       </w:r>
@@ -9568,7 +9568,7 @@
       <w:pPr>
         <w:pStyle w:val="Kop2"/>
       </w:pPr>
-      <w:bookmarkStart w:id="14" w:name="_Toc241361708"/>
+      <w:bookmarkStart w:id="14" w:name="_Toc241392046"/>
       <w:r>
         <w:lastRenderedPageBreak/>
         <w:t>Tutorial 5: Planning a Study</w:t>
@@ -9728,7 +9728,7 @@
       <w:pPr>
         <w:pStyle w:val="Kop2"/>
       </w:pPr>
-      <w:bookmarkStart w:id="15" w:name="_Toc241361709"/>
+      <w:bookmarkStart w:id="15" w:name="_Toc241392047"/>
       <w:r>
         <w:t>Tutorial 6: Partial AUCs</w:t>
       </w:r>
@@ -9860,7 +9860,7 @@
       <w:pPr>
         <w:pStyle w:val="Kop2"/>
       </w:pPr>
-      <w:bookmarkStart w:id="16" w:name="_Toc241361710"/>
+      <w:bookmarkStart w:id="16" w:name="_Toc241392048"/>
       <w:r>
         <w:t>Tutorial 7: Figures</w:t>
       </w:r>
@@ -9966,7 +9966,7 @@
       <w:pPr>
         <w:pStyle w:val="Kop2"/>
       </w:pPr>
-      <w:bookmarkStart w:id="17" w:name="_Toc241361711"/>
+      <w:bookmarkStart w:id="17" w:name="_Toc241392049"/>
       <w:r>
         <w:t>Answer Key</w:t>
       </w:r>
@@ -10075,7 +10075,7 @@
         <w:pStyle w:val="Kop1"/>
         <w:pageBreakBefore/>
       </w:pPr>
-      <w:bookmarkStart w:id="18" w:name="_Toc241361712"/>
+      <w:bookmarkStart w:id="18" w:name="_Toc241392050"/>
       <w:r>
         <w:lastRenderedPageBreak/>
         <w:t>Preparing Your Data and Study Types</w:t>
@@ -10086,7 +10086,7 @@
       <w:pPr>
         <w:pStyle w:val="Kop2"/>
       </w:pPr>
-      <w:bookmarkStart w:id="19" w:name="_Toc241361713"/>
+      <w:bookmarkStart w:id="19" w:name="_Toc241392051"/>
       <w:r>
         <w:t>General Format Rules</w:t>
       </w:r>
@@ -10181,7 +10181,7 @@
       <w:pPr>
         <w:pStyle w:val="Kop2"/>
       </w:pPr>
-      <w:bookmarkStart w:id="20" w:name="_Toc241361714"/>
+      <w:bookmarkStart w:id="20" w:name="_Toc241392052"/>
       <w:r>
         <w:t>Scenario 1: Single Subject</w:t>
       </w:r>
@@ -10880,7 +10880,7 @@
       <w:pPr>
         <w:pStyle w:val="Kop2"/>
       </w:pPr>
-      <w:bookmarkStart w:id="21" w:name="_Toc241361715"/>
+      <w:bookmarkStart w:id="21" w:name="_Toc241392053"/>
       <w:r>
         <w:t>Scenario 2: Multiple Subjects, Same Dose</w:t>
       </w:r>
@@ -11490,7 +11490,7 @@
       <w:pPr>
         <w:pStyle w:val="Kop2"/>
       </w:pPr>
-      <w:bookmarkStart w:id="22" w:name="_Toc241361716"/>
+      <w:bookmarkStart w:id="22" w:name="_Toc241392054"/>
       <w:r>
         <w:t>Scenario 3: Multiple Subjects, Different Doses</w:t>
       </w:r>
@@ -11508,7 +11508,7 @@
       <w:pPr>
         <w:pStyle w:val="Kop2"/>
       </w:pPr>
-      <w:bookmarkStart w:id="23" w:name="_Toc241361717"/>
+      <w:bookmarkStart w:id="23" w:name="_Toc241392055"/>
       <w:r>
         <w:t>Scenario 4: Standard 2-Period Crossover (BE)</w:t>
       </w:r>
@@ -12380,7 +12380,7 @@
       <w:pPr>
         <w:pStyle w:val="Kop2"/>
       </w:pPr>
-      <w:bookmarkStart w:id="24" w:name="_Toc241361718"/>
+      <w:bookmarkStart w:id="24" w:name="_Toc241392056"/>
       <w:r>
         <w:t>Scenario 5: Replicate Designs and Paired Comparison</w:t>
       </w:r>
@@ -12398,7 +12398,7 @@
       <w:pPr>
         <w:pStyle w:val="Kop2"/>
       </w:pPr>
-      <w:bookmarkStart w:id="25" w:name="_Toc241361719"/>
+      <w:bookmarkStart w:id="25" w:name="_Toc241392057"/>
       <w:r>
         <w:t>Scenario 6: Parallel-Group BE</w:t>
       </w:r>
@@ -12416,7 +12416,7 @@
       <w:pPr>
         <w:pStyle w:val="Kop2"/>
       </w:pPr>
-      <w:bookmarkStart w:id="26" w:name="_Toc241361720"/>
+      <w:bookmarkStart w:id="26" w:name="_Toc241392058"/>
       <w:r>
         <w:t>Scenario 7: Steady-State PK</w:t>
       </w:r>
@@ -12450,7 +12450,7 @@
       <w:pPr>
         <w:pStyle w:val="Kop2"/>
       </w:pPr>
-      <w:bookmarkStart w:id="27" w:name="_Toc241361721"/>
+      <w:bookmarkStart w:id="27" w:name="_Toc241392059"/>
       <w:r>
         <w:t>Scenario 8: Drug–Drug Interaction Study</w:t>
       </w:r>
@@ -12476,7 +12476,7 @@
       <w:pPr>
         <w:pStyle w:val="Kop2"/>
       </w:pPr>
-      <w:bookmarkStart w:id="28" w:name="_Toc241361722"/>
+      <w:bookmarkStart w:id="28" w:name="_Toc241392060"/>
       <w:r>
         <w:lastRenderedPageBreak/>
         <w:t>Scenario 9: CDISC ADNCA Dataset</w:t>
@@ -12535,7 +12535,7 @@
       <w:pPr>
         <w:pStyle w:val="Kop2"/>
       </w:pPr>
-      <w:bookmarkStart w:id="29" w:name="_Toc241361723"/>
+      <w:bookmarkStart w:id="29" w:name="_Toc241392061"/>
       <w:r>
         <w:t>Scenario 10: IV Bolus and IV Infusion</w:t>
       </w:r>
@@ -12561,7 +12561,7 @@
       <w:pPr>
         <w:pStyle w:val="Kop2"/>
       </w:pPr>
-      <w:bookmarkStart w:id="30" w:name="_Toc241361724"/>
+      <w:bookmarkStart w:id="30" w:name="_Toc241392062"/>
       <w:r>
         <w:t>Scenario 11: Single Ascending Dose and Dose Proportionality</w:t>
       </w:r>
@@ -12579,7 +12579,7 @@
       <w:pPr>
         <w:pStyle w:val="Kop2"/>
       </w:pPr>
-      <w:bookmarkStart w:id="31" w:name="_Toc241361725"/>
+      <w:bookmarkStart w:id="31" w:name="_Toc241392063"/>
       <w:r>
         <w:t>Scenario 12: Multiple Dosing and Accumulation</w:t>
       </w:r>
@@ -12625,7 +12625,7 @@
       <w:pPr>
         <w:pStyle w:val="Kop2"/>
       </w:pPr>
-      <w:bookmarkStart w:id="32" w:name="_Toc241361726"/>
+      <w:bookmarkStart w:id="32" w:name="_Toc241392064"/>
       <w:r>
         <w:t>Scenario 13: Food Effect</w:t>
       </w:r>
@@ -12643,7 +12643,7 @@
       <w:pPr>
         <w:pStyle w:val="Kop2"/>
       </w:pPr>
-      <w:bookmarkStart w:id="33" w:name="_Toc241361727"/>
+      <w:bookmarkStart w:id="33" w:name="_Toc241392065"/>
       <w:r>
         <w:t>Scenario 14: Metabolites and Several Analytes</w:t>
       </w:r>
@@ -12661,7 +12661,7 @@
       <w:pPr>
         <w:pStyle w:val="Kop2"/>
       </w:pPr>
-      <w:bookmarkStart w:id="34" w:name="_Toc241361728"/>
+      <w:bookmarkStart w:id="34" w:name="_Toc241392066"/>
       <w:r>
         <w:t>Scenario 15: Absolute and Relative Bioavailability</w:t>
       </w:r>
@@ -12679,7 +12679,7 @@
       <w:pPr>
         <w:pStyle w:val="Kop2"/>
       </w:pPr>
-      <w:bookmarkStart w:id="35" w:name="_Toc241361729"/>
+      <w:bookmarkStart w:id="35" w:name="_Toc241392067"/>
       <w:r>
         <w:t>Studies with Three or More Treatments</w:t>
       </w:r>
@@ -12697,7 +12697,7 @@
       <w:pPr>
         <w:pStyle w:val="Kop2"/>
       </w:pPr>
-      <w:bookmarkStart w:id="36" w:name="_Toc241361730"/>
+      <w:bookmarkStart w:id="36" w:name="_Toc241392068"/>
       <w:r>
         <w:t>BLQ Handling</w:t>
       </w:r>
@@ -13527,7 +13527,7 @@
       <w:pPr>
         <w:pStyle w:val="Kop2"/>
       </w:pPr>
-      <w:bookmarkStart w:id="37" w:name="_Toc241361731"/>
+      <w:bookmarkStart w:id="37" w:name="_Toc241392069"/>
       <w:r>
         <w:t>Common Mistakes</w:t>
       </w:r>
@@ -13665,7 +13665,7 @@
         <w:pStyle w:val="Kop1"/>
         <w:pageBreakBefore/>
       </w:pPr>
-      <w:bookmarkStart w:id="38" w:name="_Toc241361732"/>
+      <w:bookmarkStart w:id="38" w:name="_Toc241392070"/>
       <w:r>
         <w:lastRenderedPageBreak/>
         <w:t>Using the App</w:t>
@@ -13684,7 +13684,7 @@
       <w:pPr>
         <w:pStyle w:val="Kop2"/>
       </w:pPr>
-      <w:bookmarkStart w:id="39" w:name="_Toc241361733"/>
+      <w:bookmarkStart w:id="39" w:name="_Toc241392071"/>
       <w:r>
         <w:t>Path 1: Plan a Study</w:t>
       </w:r>
@@ -14157,7 +14157,7 @@
       <w:pPr>
         <w:pStyle w:val="Kop2"/>
       </w:pPr>
-      <w:bookmarkStart w:id="40" w:name="_Toc241361734"/>
+      <w:bookmarkStart w:id="40" w:name="_Toc241392072"/>
       <w:r>
         <w:lastRenderedPageBreak/>
         <w:t>Path 2: Upload &amp; Check Data</w:t>
@@ -14230,7 +14230,7 @@
       <w:pPr>
         <w:pStyle w:val="Kop2"/>
       </w:pPr>
-      <w:bookmarkStart w:id="41" w:name="_Toc241361735"/>
+      <w:bookmarkStart w:id="41" w:name="_Toc241392073"/>
       <w:r>
         <w:t>Path 3: Visualize Data</w:t>
       </w:r>
@@ -14487,7 +14487,7 @@
       <w:pPr>
         <w:pStyle w:val="Kop2"/>
       </w:pPr>
-      <w:bookmarkStart w:id="42" w:name="_Toc241361736"/>
+      <w:bookmarkStart w:id="42" w:name="_Toc241392074"/>
       <w:r>
         <w:t>Path 4: One Subject at a Time</w:t>
       </w:r>
@@ -14663,7 +14663,7 @@
       <w:pPr>
         <w:pStyle w:val="Kop2"/>
       </w:pPr>
-      <w:bookmarkStart w:id="43" w:name="_Toc241361737"/>
+      <w:bookmarkStart w:id="43" w:name="_Toc241392075"/>
       <w:r>
         <w:t>Path 5: All Subjects (Batch)</w:t>
       </w:r>
@@ -14938,7 +14938,7 @@
       <w:pPr>
         <w:pStyle w:val="Kop2"/>
       </w:pPr>
-      <w:bookmarkStart w:id="44" w:name="_Toc241361738"/>
+      <w:bookmarkStart w:id="44" w:name="_Toc241392076"/>
       <w:r>
         <w:t>Path 6: Bioequivalence</w:t>
       </w:r>
@@ -15789,7 +15789,7 @@
       <w:pPr>
         <w:pStyle w:val="Kop2"/>
       </w:pPr>
-      <w:bookmarkStart w:id="45" w:name="_Toc241361739"/>
+      <w:bookmarkStart w:id="45" w:name="_Toc241392077"/>
       <w:r>
         <w:t>Analysing Drug–Drug Interaction Studies</w:t>
       </w:r>
@@ -15918,7 +15918,7 @@
       <w:pPr>
         <w:pStyle w:val="Kop2"/>
       </w:pPr>
-      <w:bookmarkStart w:id="46" w:name="_Toc241361740"/>
+      <w:bookmarkStart w:id="46" w:name="_Toc241392078"/>
       <w:r>
         <w:t>Complete Analysis Record</w:t>
       </w:r>
@@ -16333,7 +16333,7 @@
         <w:pStyle w:val="Kop1"/>
         <w:pageBreakBefore/>
       </w:pPr>
-      <w:bookmarkStart w:id="47" w:name="_Toc241361741"/>
+      <w:bookmarkStart w:id="47" w:name="_Toc241392079"/>
       <w:r>
         <w:lastRenderedPageBreak/>
         <w:t>Reading Your Results</w:t>
@@ -16344,7 +16344,7 @@
       <w:pPr>
         <w:pStyle w:val="Kop2"/>
       </w:pPr>
-      <w:bookmarkStart w:id="48" w:name="_Toc241361742"/>
+      <w:bookmarkStart w:id="48" w:name="_Toc241392080"/>
       <w:r>
         <w:t>The Data Quality Report</w:t>
       </w:r>
@@ -16729,7 +16729,7 @@
       <w:pPr>
         <w:pStyle w:val="Kop2"/>
       </w:pPr>
-      <w:bookmarkStart w:id="49" w:name="_Toc241361743"/>
+      <w:bookmarkStart w:id="49" w:name="_Toc241392081"/>
       <w:r>
         <w:t>The Parameter Table</w:t>
       </w:r>
@@ -16747,7 +16747,7 @@
       <w:pPr>
         <w:pStyle w:val="Kop2"/>
       </w:pPr>
-      <w:bookmarkStart w:id="50" w:name="_Toc241361744"/>
+      <w:bookmarkStart w:id="50" w:name="_Toc241392082"/>
       <w:r>
         <w:t>Summary Statistics</w:t>
       </w:r>
@@ -17187,7 +17187,7 @@
       <w:pPr>
         <w:pStyle w:val="Kop2"/>
       </w:pPr>
-      <w:bookmarkStart w:id="51" w:name="_Toc241361745"/>
+      <w:bookmarkStart w:id="51" w:name="_Toc241392083"/>
       <w:r>
         <w:t>The Bioequivalence Table and Forest Plot</w:t>
       </w:r>
@@ -17796,7 +17796,7 @@
       <w:pPr>
         <w:pStyle w:val="Kop2"/>
       </w:pPr>
-      <w:bookmarkStart w:id="52" w:name="_Toc241361746"/>
+      <w:bookmarkStart w:id="52" w:name="_Toc241392084"/>
       <w:r>
         <w:t>Judging the Terminal Phase</w:t>
       </w:r>
@@ -17891,7 +17891,7 @@
       <w:pPr>
         <w:pStyle w:val="Kop2"/>
       </w:pPr>
-      <w:bookmarkStart w:id="53" w:name="_Toc241361747"/>
+      <w:bookmarkStart w:id="53" w:name="_Toc241392085"/>
       <w:r>
         <w:t>Checking Plausibility</w:t>
       </w:r>
@@ -18021,7 +18021,7 @@
         <w:pStyle w:val="Kop1"/>
         <w:pageBreakBefore/>
       </w:pPr>
-      <w:bookmarkStart w:id="54" w:name="_Toc241361748"/>
+      <w:bookmarkStart w:id="54" w:name="_Toc241392086"/>
       <w:r>
         <w:lastRenderedPageBreak/>
         <w:t>Working on a Controlled Installation</w:t>
@@ -18040,7 +18040,7 @@
       <w:pPr>
         <w:pStyle w:val="Kop2"/>
       </w:pPr>
-      <w:bookmarkStart w:id="55" w:name="_Toc241361749"/>
+      <w:bookmarkStart w:id="55" w:name="_Toc241392087"/>
       <w:r>
         <w:t>What Is Different on a Controlled Installation</w:t>
       </w:r>
@@ -18661,7 +18661,7 @@
       <w:pPr>
         <w:pStyle w:val="Kop2"/>
       </w:pPr>
-      <w:bookmarkStart w:id="56" w:name="_Toc241361750"/>
+      <w:bookmarkStart w:id="56" w:name="_Toc241392088"/>
       <w:r>
         <w:t>Signing In for the First Time</w:t>
       </w:r>
@@ -18720,7 +18720,7 @@
       <w:pPr>
         <w:pStyle w:val="Kop2"/>
       </w:pPr>
-      <w:bookmarkStart w:id="57" w:name="_Toc241361751"/>
+      <w:bookmarkStart w:id="57" w:name="_Toc241392089"/>
       <w:r>
         <w:lastRenderedPageBreak/>
         <w:t>Changing Your Password</w:t>
@@ -18764,7 +18764,7 @@
       <w:pPr>
         <w:pStyle w:val="Kop2"/>
       </w:pPr>
-      <w:bookmarkStart w:id="58" w:name="_Toc241361752"/>
+      <w:bookmarkStart w:id="58" w:name="_Toc241392090"/>
       <w:r>
         <w:t>Staying Signed In</w:t>
       </w:r>
@@ -18808,7 +18808,7 @@
       <w:pPr>
         <w:pStyle w:val="Kop2"/>
       </w:pPr>
-      <w:bookmarkStart w:id="59" w:name="_Toc241361753"/>
+      <w:bookmarkStart w:id="59" w:name="_Toc241392091"/>
       <w:r>
         <w:t>Creating a Record for Review</w:t>
       </w:r>
@@ -18893,7 +18893,7 @@
       <w:pPr>
         <w:pStyle w:val="Kop2"/>
       </w:pPr>
-      <w:bookmarkStart w:id="60" w:name="_Toc241361754"/>
+      <w:bookmarkStart w:id="60" w:name="_Toc241392092"/>
       <w:r>
         <w:t>Reviewing and Signing a Record</w:t>
       </w:r>
@@ -19081,7 +19081,7 @@
       <w:pPr>
         <w:pStyle w:val="Kop2"/>
       </w:pPr>
-      <w:bookmarkStart w:id="61" w:name="_Toc241361755"/>
+      <w:bookmarkStart w:id="61" w:name="_Toc241392093"/>
       <w:r>
         <w:t>The Signature Sheet</w:t>
       </w:r>
@@ -19143,7 +19143,7 @@
       <w:pPr>
         <w:pStyle w:val="Kop2"/>
       </w:pPr>
-      <w:bookmarkStart w:id="62" w:name="_Toc241361756"/>
+      <w:bookmarkStart w:id="62" w:name="_Toc241392094"/>
       <w:r>
         <w:t>Reviewing the Audit Trail</w:t>
       </w:r>
@@ -19254,7 +19254,7 @@
       <w:pPr>
         <w:pStyle w:val="Kop2"/>
       </w:pPr>
-      <w:bookmarkStart w:id="63" w:name="_Toc241361757"/>
+      <w:bookmarkStart w:id="63" w:name="_Toc241392095"/>
       <w:r>
         <w:t>For Inspectors</w:t>
       </w:r>
@@ -19272,7 +19272,7 @@
       <w:pPr>
         <w:pStyle w:val="Kop2"/>
       </w:pPr>
-      <w:bookmarkStart w:id="64" w:name="_Toc241361758"/>
+      <w:bookmarkStart w:id="64" w:name="_Toc241392096"/>
       <w:r>
         <w:t>Tutorial 8: From Analysis to Approved Record</w:t>
       </w:r>
@@ -19441,7 +19441,7 @@
         <w:pStyle w:val="Kop1"/>
         <w:pageBreakBefore/>
       </w:pPr>
-      <w:bookmarkStart w:id="65" w:name="_Toc241361759"/>
+      <w:bookmarkStart w:id="65" w:name="_Toc241392097"/>
       <w:r>
         <w:lastRenderedPageBreak/>
         <w:t>Using NCA Assistant in a Regulated Environment</w:t>
@@ -19460,7 +19460,7 @@
       <w:pPr>
         <w:pStyle w:val="Kop2"/>
       </w:pPr>
-      <w:bookmarkStart w:id="66" w:name="_Toc241361760"/>
+      <w:bookmarkStart w:id="66" w:name="_Toc241392098"/>
       <w:r>
         <w:t>Status and Scope</w:t>
       </w:r>
@@ -19478,7 +19478,7 @@
       <w:pPr>
         <w:pStyle w:val="Kop2"/>
       </w:pPr>
-      <w:bookmarkStart w:id="67" w:name="_Toc241361761"/>
+      <w:bookmarkStart w:id="67" w:name="_Toc241392099"/>
       <w:r>
         <w:t>Which Rules Apply</w:t>
       </w:r>
@@ -19496,7 +19496,7 @@
       <w:pPr>
         <w:pStyle w:val="Kop2"/>
       </w:pPr>
-      <w:bookmarkStart w:id="68" w:name="_Toc241361762"/>
+      <w:bookmarkStart w:id="68" w:name="_Toc241392100"/>
       <w:r>
         <w:t>Installing a Qualified Instance</w:t>
       </w:r>
@@ -19514,7 +19514,7 @@
       <w:pPr>
         <w:pStyle w:val="Kop2"/>
       </w:pPr>
-      <w:bookmarkStart w:id="69" w:name="_Toc241361763"/>
+      <w:bookmarkStart w:id="69" w:name="_Toc241392101"/>
       <w:r>
         <w:t>Qualification</w:t>
       </w:r>
@@ -19572,7 +19572,7 @@
       <w:pPr>
         <w:pStyle w:val="Kop2"/>
       </w:pPr>
-      <w:bookmarkStart w:id="70" w:name="_Toc241361764"/>
+      <w:bookmarkStart w:id="70" w:name="_Toc241392102"/>
       <w:r>
         <w:lastRenderedPageBreak/>
         <w:t>Controls on a Controlled Installation, and Your Responsibilities</w:t>
@@ -19717,7 +19717,7 @@
       <w:pPr>
         <w:pStyle w:val="Kop2"/>
       </w:pPr>
-      <w:bookmarkStart w:id="71" w:name="_Toc241361765"/>
+      <w:bookmarkStart w:id="71" w:name="_Toc241392103"/>
       <w:r>
         <w:lastRenderedPageBreak/>
         <w:t>Before Each Analysis</w:t>
@@ -19736,7 +19736,7 @@
       <w:pPr>
         <w:pStyle w:val="Kop2"/>
       </w:pPr>
-      <w:bookmarkStart w:id="72" w:name="_Toc241361766"/>
+      <w:bookmarkStart w:id="72" w:name="_Toc241392104"/>
       <w:r>
         <w:t>Exclusions, Outliers and Deviations</w:t>
       </w:r>
@@ -19810,7 +19810,7 @@
       <w:pPr>
         <w:pStyle w:val="Kop2"/>
       </w:pPr>
-      <w:bookmarkStart w:id="73" w:name="_Toc241361767"/>
+      <w:bookmarkStart w:id="73" w:name="_Toc241392105"/>
       <w:r>
         <w:t>Reading Verdicts in a Regulated Context</w:t>
       </w:r>
@@ -19852,7 +19852,7 @@
       <w:pPr>
         <w:pStyle w:val="Kop2"/>
       </w:pPr>
-      <w:bookmarkStart w:id="74" w:name="_Toc241361768"/>
+      <w:bookmarkStart w:id="74" w:name="_Toc241392106"/>
       <w:r>
         <w:t>The Analysis Record in a Regulated Context</w:t>
       </w:r>
@@ -19871,7 +19871,7 @@
       <w:pPr>
         <w:pStyle w:val="Kop2"/>
       </w:pPr>
-      <w:bookmarkStart w:id="75" w:name="_Toc241361769"/>
+      <w:bookmarkStart w:id="75" w:name="_Toc241392107"/>
       <w:r>
         <w:t>Reporting and Citing</w:t>
       </w:r>
@@ -19889,7 +19889,7 @@
       <w:pPr>
         <w:pStyle w:val="Kop2"/>
       </w:pPr>
-      <w:bookmarkStart w:id="76" w:name="_Toc241361770"/>
+      <w:bookmarkStart w:id="76" w:name="_Toc241392108"/>
       <w:r>
         <w:t>Archiving and Retention</w:t>
       </w:r>
@@ -19907,7 +19907,7 @@
       <w:pPr>
         <w:pStyle w:val="Kop2"/>
       </w:pPr>
-      <w:bookmarkStart w:id="77" w:name="_Toc241361771"/>
+      <w:bookmarkStart w:id="77" w:name="_Toc241392109"/>
       <w:r>
         <w:t>Upgrades and Change Control</w:t>
       </w:r>
@@ -19925,7 +19925,7 @@
       <w:pPr>
         <w:pStyle w:val="Kop2"/>
       </w:pPr>
-      <w:bookmarkStart w:id="78" w:name="_Toc241361772"/>
+      <w:bookmarkStart w:id="78" w:name="_Toc241392110"/>
       <w:r>
         <w:t>Data Protection</w:t>
       </w:r>
@@ -19943,7 +19943,7 @@
       <w:pPr>
         <w:pStyle w:val="Kop2"/>
       </w:pPr>
-      <w:bookmarkStart w:id="79" w:name="_Toc241361773"/>
+      <w:bookmarkStart w:id="79" w:name="_Toc241392111"/>
       <w:r>
         <w:lastRenderedPageBreak/>
         <w:t>Reporting Problems</w:t>
@@ -19963,7 +19963,7 @@
         <w:pStyle w:val="Kop1"/>
         <w:pageBreakBefore/>
       </w:pPr>
-      <w:bookmarkStart w:id="80" w:name="_Toc241361774"/>
+      <w:bookmarkStart w:id="80" w:name="_Toc241392112"/>
       <w:r>
         <w:lastRenderedPageBreak/>
         <w:t>Introduction to Non-Compartmental Analysis</w:t>
@@ -19974,7 +19974,7 @@
       <w:pPr>
         <w:pStyle w:val="Kop2"/>
       </w:pPr>
-      <w:bookmarkStart w:id="81" w:name="_Toc241361775"/>
+      <w:bookmarkStart w:id="81" w:name="_Toc241392113"/>
       <w:r>
         <w:t>What Is Non-Compartmental Analysis?</w:t>
       </w:r>
@@ -20000,7 +20000,7 @@
       <w:pPr>
         <w:pStyle w:val="Kop2"/>
       </w:pPr>
-      <w:bookmarkStart w:id="82" w:name="_Toc241361776"/>
+      <w:bookmarkStart w:id="82" w:name="_Toc241392114"/>
       <w:r>
         <w:t>The Concentration–Time Curve</w:t>
       </w:r>
@@ -20018,7 +20018,7 @@
       <w:pPr>
         <w:pStyle w:val="Kop2"/>
       </w:pPr>
-      <w:bookmarkStart w:id="83" w:name="_Toc241361777"/>
+      <w:bookmarkStart w:id="83" w:name="_Toc241392115"/>
       <w:r>
         <w:t>Key Pharmacokinetic Parameters</w:t>
       </w:r>
@@ -21117,7 +21117,7 @@
       <w:pPr>
         <w:pStyle w:val="Kop2"/>
       </w:pPr>
-      <w:bookmarkStart w:id="84" w:name="_Toc241361778"/>
+      <w:bookmarkStart w:id="84" w:name="_Toc241392116"/>
       <w:r>
         <w:t>Why NCA Is Used So Widely</w:t>
       </w:r>
@@ -21152,7 +21152,7 @@
       <w:pPr>
         <w:pStyle w:val="Kop2"/>
       </w:pPr>
-      <w:bookmarkStart w:id="85" w:name="_Toc241361779"/>
+      <w:bookmarkStart w:id="85" w:name="_Toc241392117"/>
       <w:r>
         <w:t>When to Use NCA vs. Compartmental Modelling</w:t>
       </w:r>
@@ -21171,7 +21171,7 @@
         <w:pStyle w:val="Kop1"/>
         <w:pageBreakBefore/>
       </w:pPr>
-      <w:bookmarkStart w:id="86" w:name="_Toc241361780"/>
+      <w:bookmarkStart w:id="86" w:name="_Toc241392118"/>
       <w:r>
         <w:lastRenderedPageBreak/>
         <w:t>Theoretical Background</w:t>
@@ -21182,7 +21182,7 @@
       <w:pPr>
         <w:pStyle w:val="Kop2"/>
       </w:pPr>
-      <w:bookmarkStart w:id="87" w:name="_Toc241361781"/>
+      <w:bookmarkStart w:id="87" w:name="_Toc241392119"/>
       <w:r>
         <w:t>Trapezoidal Methods for AUC Calculation</w:t>
       </w:r>
@@ -21332,7 +21332,7 @@
       <w:pPr>
         <w:pStyle w:val="Kop2"/>
       </w:pPr>
-      <w:bookmarkStart w:id="88" w:name="_Toc241361782"/>
+      <w:bookmarkStart w:id="88" w:name="_Toc241392120"/>
       <w:r>
         <w:t>Terminal Phase Characterisation and Half-Life Estimation</w:t>
       </w:r>
@@ -21491,7 +21491,7 @@
       <w:pPr>
         <w:pStyle w:val="Kop2"/>
       </w:pPr>
-      <w:bookmarkStart w:id="89" w:name="_Toc241361783"/>
+      <w:bookmarkStart w:id="89" w:name="_Toc241392121"/>
       <w:r>
         <w:t>BLQ Handling: Pharmacological Rationale</w:t>
       </w:r>
@@ -21513,7 +21513,7 @@
       <w:pPr>
         <w:pStyle w:val="Kop2"/>
       </w:pPr>
-      <w:bookmarkStart w:id="90" w:name="_Toc241361784"/>
+      <w:bookmarkStart w:id="90" w:name="_Toc241392122"/>
       <w:r>
         <w:t>Steady-State Considerations</w:t>
       </w:r>
@@ -21531,7 +21531,7 @@
       <w:pPr>
         <w:pStyle w:val="Kop2"/>
       </w:pPr>
-      <w:bookmarkStart w:id="91" w:name="_Toc241361785"/>
+      <w:bookmarkStart w:id="91" w:name="_Toc241392123"/>
       <w:r>
         <w:t>Partial AUCs: Interpolation and the End of the Interval</w:t>
       </w:r>
@@ -21574,7 +21574,7 @@
         <w:pStyle w:val="Kop1"/>
         <w:pageBreakBefore/>
       </w:pPr>
-      <w:bookmarkStart w:id="92" w:name="_Toc241361786"/>
+      <w:bookmarkStart w:id="92" w:name="_Toc241392124"/>
       <w:r>
         <w:lastRenderedPageBreak/>
         <w:t>Statistical Methods</w:t>
@@ -21585,7 +21585,7 @@
       <w:pPr>
         <w:pStyle w:val="Kop2"/>
       </w:pPr>
-      <w:bookmarkStart w:id="93" w:name="_Toc241361787"/>
+      <w:bookmarkStart w:id="93" w:name="_Toc241392125"/>
       <w:r>
         <w:t>The Two One-Sided Tests (TOST) Procedure</w:t>
       </w:r>
@@ -21654,7 +21654,7 @@
       <w:pPr>
         <w:pStyle w:val="Kop2"/>
       </w:pPr>
-      <w:bookmarkStart w:id="94" w:name="_Toc241361788"/>
+      <w:bookmarkStart w:id="94" w:name="_Toc241392126"/>
       <w:r>
         <w:t>The ANOVA Model for Crossover Designs</w:t>
       </w:r>
@@ -21688,7 +21688,7 @@
       <w:pPr>
         <w:pStyle w:val="Kop2"/>
       </w:pPr>
-      <w:bookmarkStart w:id="95" w:name="_Toc241361789"/>
+      <w:bookmarkStart w:id="95" w:name="_Toc241392127"/>
       <w:r>
         <w:t>Fixed-Effects vs. Mixed-Effects Models</w:t>
       </w:r>
@@ -21714,7 +21714,7 @@
       <w:pPr>
         <w:pStyle w:val="Kop2"/>
       </w:pPr>
-      <w:bookmarkStart w:id="96" w:name="_Toc241361790"/>
+      <w:bookmarkStart w:id="96" w:name="_Toc241392128"/>
       <w:r>
         <w:t>Confidence Interval Construction</w:t>
       </w:r>
@@ -21744,7 +21744,7 @@
       <w:pPr>
         <w:pStyle w:val="Kop2"/>
       </w:pPr>
-      <w:bookmarkStart w:id="97" w:name="_Toc241361791"/>
+      <w:bookmarkStart w:id="97" w:name="_Toc241392129"/>
       <w:r>
         <w:t>Design-Specific Models</w:t>
       </w:r>
@@ -21828,7 +21828,7 @@
       <w:pPr>
         <w:pStyle w:val="Kop2"/>
       </w:pPr>
-      <w:bookmarkStart w:id="98" w:name="_Toc241361792"/>
+      <w:bookmarkStart w:id="98" w:name="_Toc241392130"/>
       <w:r>
         <w:t>Drug–Drug Interaction Analysis</w:t>
       </w:r>
@@ -21854,7 +21854,7 @@
       <w:pPr>
         <w:pStyle w:val="Kop2"/>
       </w:pPr>
-      <w:bookmarkStart w:id="99" w:name="_Toc241361793"/>
+      <w:bookmarkStart w:id="99" w:name="_Toc241392131"/>
       <w:r>
         <w:t>Power and Sample Size for Bioequivalence</w:t>
       </w:r>
@@ -21884,7 +21884,7 @@
       <w:pPr>
         <w:pStyle w:val="Kop2"/>
       </w:pPr>
-      <w:bookmarkStart w:id="100" w:name="_Toc241361794"/>
+      <w:bookmarkStart w:id="100" w:name="_Toc241392132"/>
       <w:r>
         <w:t>Partial AUCs in Bioequivalence</w:t>
       </w:r>
@@ -21950,7 +21950,7 @@
       <w:pPr>
         <w:pStyle w:val="Kop2"/>
       </w:pPr>
-      <w:bookmarkStart w:id="101" w:name="_Toc241361795"/>
+      <w:bookmarkStart w:id="101" w:name="_Toc241392133"/>
       <w:r>
         <w:t>Regulatory Guidelines</w:t>
       </w:r>
@@ -22143,7 +22143,7 @@
         <w:pStyle w:val="Kop1"/>
         <w:pageBreakBefore/>
       </w:pPr>
-      <w:bookmarkStart w:id="102" w:name="_Toc241361796"/>
+      <w:bookmarkStart w:id="102" w:name="_Toc241392134"/>
       <w:r>
         <w:lastRenderedPageBreak/>
         <w:t>Appendices</w:t>
@@ -22154,7 +22154,7 @@
       <w:pPr>
         <w:pStyle w:val="Kop2"/>
       </w:pPr>
-      <w:bookmarkStart w:id="103" w:name="_Toc241361797"/>
+      <w:bookmarkStart w:id="103" w:name="_Toc241392135"/>
       <w:r>
         <w:t>Appendix A: Output Parameters</w:t>
       </w:r>
@@ -30145,7 +30145,7 @@
       <w:pPr>
         <w:pStyle w:val="Kop2"/>
       </w:pPr>
-      <w:bookmarkStart w:id="104" w:name="_Toc241361798"/>
+      <w:bookmarkStart w:id="104" w:name="_Toc241392136"/>
       <w:r>
         <w:lastRenderedPageBreak/>
         <w:t>Appendix B: Glossary</w:t>
@@ -33333,7 +33333,7 @@
       <w:pPr>
         <w:pStyle w:val="Kop2"/>
       </w:pPr>
-      <w:bookmarkStart w:id="105" w:name="_Toc241361799"/>
+      <w:bookmarkStart w:id="105" w:name="_Toc241392137"/>
       <w:r>
         <w:t>Appendix C: Recognised Column Names</w:t>
       </w:r>
@@ -33818,7 +33818,7 @@
       <w:pPr>
         <w:pStyle w:val="Kop2"/>
       </w:pPr>
-      <w:bookmarkStart w:id="106" w:name="_Toc241361800"/>
+      <w:bookmarkStart w:id="106" w:name="_Toc241392138"/>
       <w:r>
         <w:t>Appendix D: Troubleshooting</w:t>
       </w:r>
@@ -34363,7 +34363,7 @@
       <w:pPr>
         <w:pStyle w:val="Kop2"/>
       </w:pPr>
-      <w:bookmarkStart w:id="107" w:name="_Toc241361801"/>
+      <w:bookmarkStart w:id="107" w:name="_Toc241392139"/>
       <w:r>
         <w:t>Appendix E: Setting Up and Administering a Controlled Installation</w:t>
       </w:r>
@@ -35605,7 +35605,7 @@
       <w:pPr>
         <w:pStyle w:val="Kop2"/>
       </w:pPr>
-      <w:bookmarkStart w:id="108" w:name="_Toc241361802"/>
+      <w:bookmarkStart w:id="108" w:name="_Toc241392140"/>
       <w:r>
         <w:t>Appendix F: References</w:t>
       </w:r>
@@ -35832,7 +35832,7 @@
       <w:pPr>
         <w:pStyle w:val="Kop2"/>
       </w:pPr>
-      <w:bookmarkStart w:id="109" w:name="_Toc241361803"/>
+      <w:bookmarkStart w:id="109" w:name="_Toc241392141"/>
       <w:r>
         <w:t>Appendix G: Document Control</w:t>
       </w:r>

</xml_diff>

<commit_message>
Release files refreshed after the account-state change
Green run: 482 automated tests pass (62 manual), URS 89/89.

Co-Authored-By: Claude Opus 5.5 <noreply@anthropic.com>
</commit_message>
<xml_diff>
--- a/NCA_Assistant_User_Manual_v1.9.docx
+++ b/NCA_Assistant_User_Manual_v1.9.docx
@@ -154,7 +154,7 @@
       <w:pPr>
         <w:pStyle w:val="Kop1"/>
       </w:pPr>
-      <w:bookmarkStart w:id="0" w:name="_Toc241392032"/>
+      <w:bookmarkStart w:id="0" w:name="_Toc241395666"/>
       <w:r>
         <w:lastRenderedPageBreak/>
         <w:t>Table of Contents</w:t>
@@ -192,7 +192,7 @@
           <w:r>
             <w:fldChar w:fldCharType="separate"/>
           </w:r>
-          <w:hyperlink w:anchor="_Toc241392032" w:history="1">
+          <w:hyperlink w:anchor="_Toc241395666" w:history="1">
             <w:r>
               <w:rPr>
                 <w:rStyle w:val="Hyperlink"/>
@@ -216,7 +216,7 @@
               <w:rPr>
                 <w:noProof/>
               </w:rPr>
-              <w:instrText xml:space="preserve"> PAGEREF _Toc241392032 \h </w:instrText>
+              <w:instrText xml:space="preserve"> PAGEREF _Toc241395666 \h </w:instrText>
             </w:r>
             <w:r>
               <w:rPr>
@@ -258,7 +258,7 @@
               <w14:ligatures w14:val="standardContextual"/>
             </w:rPr>
           </w:pPr>
-          <w:hyperlink w:anchor="_Toc241392033" w:history="1">
+          <w:hyperlink w:anchor="_Toc241395667" w:history="1">
             <w:r>
               <w:rPr>
                 <w:rStyle w:val="Hyperlink"/>
@@ -282,7 +282,7 @@
               <w:rPr>
                 <w:noProof/>
               </w:rPr>
-              <w:instrText xml:space="preserve"> PAGEREF _Toc241392033 \h </w:instrText>
+              <w:instrText xml:space="preserve"> PAGEREF _Toc241395667 \h </w:instrText>
             </w:r>
             <w:r>
               <w:rPr>
@@ -324,7 +324,7 @@
               <w14:ligatures w14:val="standardContextual"/>
             </w:rPr>
           </w:pPr>
-          <w:hyperlink w:anchor="_Toc241392034" w:history="1">
+          <w:hyperlink w:anchor="_Toc241395668" w:history="1">
             <w:r>
               <w:rPr>
                 <w:rStyle w:val="Hyperlink"/>
@@ -348,7 +348,7 @@
               <w:rPr>
                 <w:noProof/>
               </w:rPr>
-              <w:instrText xml:space="preserve"> PAGEREF _Toc241392034 \h </w:instrText>
+              <w:instrText xml:space="preserve"> PAGEREF _Toc241395668 \h </w:instrText>
             </w:r>
             <w:r>
               <w:rPr>
@@ -390,7 +390,7 @@
               <w14:ligatures w14:val="standardContextual"/>
             </w:rPr>
           </w:pPr>
-          <w:hyperlink w:anchor="_Toc241392035" w:history="1">
+          <w:hyperlink w:anchor="_Toc241395669" w:history="1">
             <w:r>
               <w:rPr>
                 <w:rStyle w:val="Hyperlink"/>
@@ -414,7 +414,7 @@
               <w:rPr>
                 <w:noProof/>
               </w:rPr>
-              <w:instrText xml:space="preserve"> PAGEREF _Toc241392035 \h </w:instrText>
+              <w:instrText xml:space="preserve"> PAGEREF _Toc241395669 \h </w:instrText>
             </w:r>
             <w:r>
               <w:rPr>
@@ -456,7 +456,7 @@
               <w14:ligatures w14:val="standardContextual"/>
             </w:rPr>
           </w:pPr>
-          <w:hyperlink w:anchor="_Toc241392036" w:history="1">
+          <w:hyperlink w:anchor="_Toc241395670" w:history="1">
             <w:r>
               <w:rPr>
                 <w:rStyle w:val="Hyperlink"/>
@@ -480,7 +480,7 @@
               <w:rPr>
                 <w:noProof/>
               </w:rPr>
-              <w:instrText xml:space="preserve"> PAGEREF _Toc241392036 \h </w:instrText>
+              <w:instrText xml:space="preserve"> PAGEREF _Toc241395670 \h </w:instrText>
             </w:r>
             <w:r>
               <w:rPr>
@@ -522,7 +522,7 @@
               <w14:ligatures w14:val="standardContextual"/>
             </w:rPr>
           </w:pPr>
-          <w:hyperlink w:anchor="_Toc241392037" w:history="1">
+          <w:hyperlink w:anchor="_Toc241395671" w:history="1">
             <w:r>
               <w:rPr>
                 <w:rStyle w:val="Hyperlink"/>
@@ -546,7 +546,7 @@
               <w:rPr>
                 <w:noProof/>
               </w:rPr>
-              <w:instrText xml:space="preserve"> PAGEREF _Toc241392037 \h </w:instrText>
+              <w:instrText xml:space="preserve"> PAGEREF _Toc241395671 \h </w:instrText>
             </w:r>
             <w:r>
               <w:rPr>
@@ -588,7 +588,7 @@
               <w14:ligatures w14:val="standardContextual"/>
             </w:rPr>
           </w:pPr>
-          <w:hyperlink w:anchor="_Toc241392038" w:history="1">
+          <w:hyperlink w:anchor="_Toc241395672" w:history="1">
             <w:r>
               <w:rPr>
                 <w:rStyle w:val="Hyperlink"/>
@@ -612,7 +612,7 @@
               <w:rPr>
                 <w:noProof/>
               </w:rPr>
-              <w:instrText xml:space="preserve"> PAGEREF _Toc241392038 \h </w:instrText>
+              <w:instrText xml:space="preserve"> PAGEREF _Toc241395672 \h </w:instrText>
             </w:r>
             <w:r>
               <w:rPr>
@@ -654,7 +654,7 @@
               <w14:ligatures w14:val="standardContextual"/>
             </w:rPr>
           </w:pPr>
-          <w:hyperlink w:anchor="_Toc241392039" w:history="1">
+          <w:hyperlink w:anchor="_Toc241395673" w:history="1">
             <w:r>
               <w:rPr>
                 <w:rStyle w:val="Hyperlink"/>
@@ -678,7 +678,7 @@
               <w:rPr>
                 <w:noProof/>
               </w:rPr>
-              <w:instrText xml:space="preserve"> PAGEREF _Toc241392039 \h </w:instrText>
+              <w:instrText xml:space="preserve"> PAGEREF _Toc241395673 \h </w:instrText>
             </w:r>
             <w:r>
               <w:rPr>
@@ -720,7 +720,7 @@
               <w14:ligatures w14:val="standardContextual"/>
             </w:rPr>
           </w:pPr>
-          <w:hyperlink w:anchor="_Toc241392040" w:history="1">
+          <w:hyperlink w:anchor="_Toc241395674" w:history="1">
             <w:r>
               <w:rPr>
                 <w:rStyle w:val="Hyperlink"/>
@@ -744,7 +744,7 @@
               <w:rPr>
                 <w:noProof/>
               </w:rPr>
-              <w:instrText xml:space="preserve"> PAGEREF _Toc241392040 \h </w:instrText>
+              <w:instrText xml:space="preserve"> PAGEREF _Toc241395674 \h </w:instrText>
             </w:r>
             <w:r>
               <w:rPr>
@@ -786,7 +786,7 @@
               <w14:ligatures w14:val="standardContextual"/>
             </w:rPr>
           </w:pPr>
-          <w:hyperlink w:anchor="_Toc241392041" w:history="1">
+          <w:hyperlink w:anchor="_Toc241395675" w:history="1">
             <w:r>
               <w:rPr>
                 <w:rStyle w:val="Hyperlink"/>
@@ -810,7 +810,7 @@
               <w:rPr>
                 <w:noProof/>
               </w:rPr>
-              <w:instrText xml:space="preserve"> PAGEREF _Toc241392041 \h </w:instrText>
+              <w:instrText xml:space="preserve"> PAGEREF _Toc241395675 \h </w:instrText>
             </w:r>
             <w:r>
               <w:rPr>
@@ -852,7 +852,7 @@
               <w14:ligatures w14:val="standardContextual"/>
             </w:rPr>
           </w:pPr>
-          <w:hyperlink w:anchor="_Toc241392042" w:history="1">
+          <w:hyperlink w:anchor="_Toc241395676" w:history="1">
             <w:r>
               <w:rPr>
                 <w:rStyle w:val="Hyperlink"/>
@@ -876,7 +876,7 @@
               <w:rPr>
                 <w:noProof/>
               </w:rPr>
-              <w:instrText xml:space="preserve"> PAGEREF _Toc241392042 \h </w:instrText>
+              <w:instrText xml:space="preserve"> PAGEREF _Toc241395676 \h </w:instrText>
             </w:r>
             <w:r>
               <w:rPr>
@@ -918,7 +918,7 @@
               <w14:ligatures w14:val="standardContextual"/>
             </w:rPr>
           </w:pPr>
-          <w:hyperlink w:anchor="_Toc241392043" w:history="1">
+          <w:hyperlink w:anchor="_Toc241395677" w:history="1">
             <w:r>
               <w:rPr>
                 <w:rStyle w:val="Hyperlink"/>
@@ -942,7 +942,7 @@
               <w:rPr>
                 <w:noProof/>
               </w:rPr>
-              <w:instrText xml:space="preserve"> PAGEREF _Toc241392043 \h </w:instrText>
+              <w:instrText xml:space="preserve"> PAGEREF _Toc241395677 \h </w:instrText>
             </w:r>
             <w:r>
               <w:rPr>
@@ -984,7 +984,7 @@
               <w14:ligatures w14:val="standardContextual"/>
             </w:rPr>
           </w:pPr>
-          <w:hyperlink w:anchor="_Toc241392044" w:history="1">
+          <w:hyperlink w:anchor="_Toc241395678" w:history="1">
             <w:r>
               <w:rPr>
                 <w:rStyle w:val="Hyperlink"/>
@@ -1008,7 +1008,7 @@
               <w:rPr>
                 <w:noProof/>
               </w:rPr>
-              <w:instrText xml:space="preserve"> PAGEREF _Toc241392044 \h </w:instrText>
+              <w:instrText xml:space="preserve"> PAGEREF _Toc241395678 \h </w:instrText>
             </w:r>
             <w:r>
               <w:rPr>
@@ -1050,7 +1050,7 @@
               <w14:ligatures w14:val="standardContextual"/>
             </w:rPr>
           </w:pPr>
-          <w:hyperlink w:anchor="_Toc241392045" w:history="1">
+          <w:hyperlink w:anchor="_Toc241395679" w:history="1">
             <w:r>
               <w:rPr>
                 <w:rStyle w:val="Hyperlink"/>
@@ -1074,7 +1074,7 @@
               <w:rPr>
                 <w:noProof/>
               </w:rPr>
-              <w:instrText xml:space="preserve"> PAGEREF _Toc241392045 \h </w:instrText>
+              <w:instrText xml:space="preserve"> PAGEREF _Toc241395679 \h </w:instrText>
             </w:r>
             <w:r>
               <w:rPr>
@@ -1116,7 +1116,7 @@
               <w14:ligatures w14:val="standardContextual"/>
             </w:rPr>
           </w:pPr>
-          <w:hyperlink w:anchor="_Toc241392046" w:history="1">
+          <w:hyperlink w:anchor="_Toc241395680" w:history="1">
             <w:r>
               <w:rPr>
                 <w:rStyle w:val="Hyperlink"/>
@@ -1140,7 +1140,7 @@
               <w:rPr>
                 <w:noProof/>
               </w:rPr>
-              <w:instrText xml:space="preserve"> PAGEREF _Toc241392046 \h </w:instrText>
+              <w:instrText xml:space="preserve"> PAGEREF _Toc241395680 \h </w:instrText>
             </w:r>
             <w:r>
               <w:rPr>
@@ -1182,7 +1182,7 @@
               <w14:ligatures w14:val="standardContextual"/>
             </w:rPr>
           </w:pPr>
-          <w:hyperlink w:anchor="_Toc241392047" w:history="1">
+          <w:hyperlink w:anchor="_Toc241395681" w:history="1">
             <w:r>
               <w:rPr>
                 <w:rStyle w:val="Hyperlink"/>
@@ -1206,7 +1206,7 @@
               <w:rPr>
                 <w:noProof/>
               </w:rPr>
-              <w:instrText xml:space="preserve"> PAGEREF _Toc241392047 \h </w:instrText>
+              <w:instrText xml:space="preserve"> PAGEREF _Toc241395681 \h </w:instrText>
             </w:r>
             <w:r>
               <w:rPr>
@@ -1248,7 +1248,7 @@
               <w14:ligatures w14:val="standardContextual"/>
             </w:rPr>
           </w:pPr>
-          <w:hyperlink w:anchor="_Toc241392048" w:history="1">
+          <w:hyperlink w:anchor="_Toc241395682" w:history="1">
             <w:r>
               <w:rPr>
                 <w:rStyle w:val="Hyperlink"/>
@@ -1272,7 +1272,7 @@
               <w:rPr>
                 <w:noProof/>
               </w:rPr>
-              <w:instrText xml:space="preserve"> PAGEREF _Toc241392048 \h </w:instrText>
+              <w:instrText xml:space="preserve"> PAGEREF _Toc241395682 \h </w:instrText>
             </w:r>
             <w:r>
               <w:rPr>
@@ -1314,7 +1314,7 @@
               <w14:ligatures w14:val="standardContextual"/>
             </w:rPr>
           </w:pPr>
-          <w:hyperlink w:anchor="_Toc241392049" w:history="1">
+          <w:hyperlink w:anchor="_Toc241395683" w:history="1">
             <w:r>
               <w:rPr>
                 <w:rStyle w:val="Hyperlink"/>
@@ -1338,7 +1338,7 @@
               <w:rPr>
                 <w:noProof/>
               </w:rPr>
-              <w:instrText xml:space="preserve"> PAGEREF _Toc241392049 \h </w:instrText>
+              <w:instrText xml:space="preserve"> PAGEREF _Toc241395683 \h </w:instrText>
             </w:r>
             <w:r>
               <w:rPr>
@@ -1380,7 +1380,7 @@
               <w14:ligatures w14:val="standardContextual"/>
             </w:rPr>
           </w:pPr>
-          <w:hyperlink w:anchor="_Toc241392050" w:history="1">
+          <w:hyperlink w:anchor="_Toc241395684" w:history="1">
             <w:r>
               <w:rPr>
                 <w:rStyle w:val="Hyperlink"/>
@@ -1404,7 +1404,7 @@
               <w:rPr>
                 <w:noProof/>
               </w:rPr>
-              <w:instrText xml:space="preserve"> PAGEREF _Toc241392050 \h </w:instrText>
+              <w:instrText xml:space="preserve"> PAGEREF _Toc241395684 \h </w:instrText>
             </w:r>
             <w:r>
               <w:rPr>
@@ -1446,7 +1446,7 @@
               <w14:ligatures w14:val="standardContextual"/>
             </w:rPr>
           </w:pPr>
-          <w:hyperlink w:anchor="_Toc241392051" w:history="1">
+          <w:hyperlink w:anchor="_Toc241395685" w:history="1">
             <w:r>
               <w:rPr>
                 <w:rStyle w:val="Hyperlink"/>
@@ -1470,7 +1470,7 @@
               <w:rPr>
                 <w:noProof/>
               </w:rPr>
-              <w:instrText xml:space="preserve"> PAGEREF _Toc241392051 \h </w:instrText>
+              <w:instrText xml:space="preserve"> PAGEREF _Toc241395685 \h </w:instrText>
             </w:r>
             <w:r>
               <w:rPr>
@@ -1512,7 +1512,7 @@
               <w14:ligatures w14:val="standardContextual"/>
             </w:rPr>
           </w:pPr>
-          <w:hyperlink w:anchor="_Toc241392052" w:history="1">
+          <w:hyperlink w:anchor="_Toc241395686" w:history="1">
             <w:r>
               <w:rPr>
                 <w:rStyle w:val="Hyperlink"/>
@@ -1536,7 +1536,7 @@
               <w:rPr>
                 <w:noProof/>
               </w:rPr>
-              <w:instrText xml:space="preserve"> PAGEREF _Toc241392052 \h </w:instrText>
+              <w:instrText xml:space="preserve"> PAGEREF _Toc241395686 \h </w:instrText>
             </w:r>
             <w:r>
               <w:rPr>
@@ -1578,7 +1578,7 @@
               <w14:ligatures w14:val="standardContextual"/>
             </w:rPr>
           </w:pPr>
-          <w:hyperlink w:anchor="_Toc241392053" w:history="1">
+          <w:hyperlink w:anchor="_Toc241395687" w:history="1">
             <w:r>
               <w:rPr>
                 <w:rStyle w:val="Hyperlink"/>
@@ -1602,7 +1602,7 @@
               <w:rPr>
                 <w:noProof/>
               </w:rPr>
-              <w:instrText xml:space="preserve"> PAGEREF _Toc241392053 \h </w:instrText>
+              <w:instrText xml:space="preserve"> PAGEREF _Toc241395687 \h </w:instrText>
             </w:r>
             <w:r>
               <w:rPr>
@@ -1644,7 +1644,7 @@
               <w14:ligatures w14:val="standardContextual"/>
             </w:rPr>
           </w:pPr>
-          <w:hyperlink w:anchor="_Toc241392054" w:history="1">
+          <w:hyperlink w:anchor="_Toc241395688" w:history="1">
             <w:r>
               <w:rPr>
                 <w:rStyle w:val="Hyperlink"/>
@@ -1668,7 +1668,7 @@
               <w:rPr>
                 <w:noProof/>
               </w:rPr>
-              <w:instrText xml:space="preserve"> PAGEREF _Toc241392054 \h </w:instrText>
+              <w:instrText xml:space="preserve"> PAGEREF _Toc241395688 \h </w:instrText>
             </w:r>
             <w:r>
               <w:rPr>
@@ -1710,7 +1710,7 @@
               <w14:ligatures w14:val="standardContextual"/>
             </w:rPr>
           </w:pPr>
-          <w:hyperlink w:anchor="_Toc241392055" w:history="1">
+          <w:hyperlink w:anchor="_Toc241395689" w:history="1">
             <w:r>
               <w:rPr>
                 <w:rStyle w:val="Hyperlink"/>
@@ -1734,7 +1734,7 @@
               <w:rPr>
                 <w:noProof/>
               </w:rPr>
-              <w:instrText xml:space="preserve"> PAGEREF _Toc241392055 \h </w:instrText>
+              <w:instrText xml:space="preserve"> PAGEREF _Toc241395689 \h </w:instrText>
             </w:r>
             <w:r>
               <w:rPr>
@@ -1776,7 +1776,7 @@
               <w14:ligatures w14:val="standardContextual"/>
             </w:rPr>
           </w:pPr>
-          <w:hyperlink w:anchor="_Toc241392056" w:history="1">
+          <w:hyperlink w:anchor="_Toc241395690" w:history="1">
             <w:r>
               <w:rPr>
                 <w:rStyle w:val="Hyperlink"/>
@@ -1800,7 +1800,7 @@
               <w:rPr>
                 <w:noProof/>
               </w:rPr>
-              <w:instrText xml:space="preserve"> PAGEREF _Toc241392056 \h </w:instrText>
+              <w:instrText xml:space="preserve"> PAGEREF _Toc241395690 \h </w:instrText>
             </w:r>
             <w:r>
               <w:rPr>
@@ -1842,7 +1842,7 @@
               <w14:ligatures w14:val="standardContextual"/>
             </w:rPr>
           </w:pPr>
-          <w:hyperlink w:anchor="_Toc241392057" w:history="1">
+          <w:hyperlink w:anchor="_Toc241395691" w:history="1">
             <w:r>
               <w:rPr>
                 <w:rStyle w:val="Hyperlink"/>
@@ -1866,7 +1866,7 @@
               <w:rPr>
                 <w:noProof/>
               </w:rPr>
-              <w:instrText xml:space="preserve"> PAGEREF _Toc241392057 \h </w:instrText>
+              <w:instrText xml:space="preserve"> PAGEREF _Toc241395691 \h </w:instrText>
             </w:r>
             <w:r>
               <w:rPr>
@@ -1908,7 +1908,7 @@
               <w14:ligatures w14:val="standardContextual"/>
             </w:rPr>
           </w:pPr>
-          <w:hyperlink w:anchor="_Toc241392058" w:history="1">
+          <w:hyperlink w:anchor="_Toc241395692" w:history="1">
             <w:r>
               <w:rPr>
                 <w:rStyle w:val="Hyperlink"/>
@@ -1932,7 +1932,7 @@
               <w:rPr>
                 <w:noProof/>
               </w:rPr>
-              <w:instrText xml:space="preserve"> PAGEREF _Toc241392058 \h </w:instrText>
+              <w:instrText xml:space="preserve"> PAGEREF _Toc241395692 \h </w:instrText>
             </w:r>
             <w:r>
               <w:rPr>
@@ -1974,7 +1974,7 @@
               <w14:ligatures w14:val="standardContextual"/>
             </w:rPr>
           </w:pPr>
-          <w:hyperlink w:anchor="_Toc241392059" w:history="1">
+          <w:hyperlink w:anchor="_Toc241395693" w:history="1">
             <w:r>
               <w:rPr>
                 <w:rStyle w:val="Hyperlink"/>
@@ -1998,7 +1998,7 @@
               <w:rPr>
                 <w:noProof/>
               </w:rPr>
-              <w:instrText xml:space="preserve"> PAGEREF _Toc241392059 \h </w:instrText>
+              <w:instrText xml:space="preserve"> PAGEREF _Toc241395693 \h </w:instrText>
             </w:r>
             <w:r>
               <w:rPr>
@@ -2040,7 +2040,7 @@
               <w14:ligatures w14:val="standardContextual"/>
             </w:rPr>
           </w:pPr>
-          <w:hyperlink w:anchor="_Toc241392060" w:history="1">
+          <w:hyperlink w:anchor="_Toc241395694" w:history="1">
             <w:r>
               <w:rPr>
                 <w:rStyle w:val="Hyperlink"/>
@@ -2064,7 +2064,7 @@
               <w:rPr>
                 <w:noProof/>
               </w:rPr>
-              <w:instrText xml:space="preserve"> PAGEREF _Toc241392060 \h </w:instrText>
+              <w:instrText xml:space="preserve"> PAGEREF _Toc241395694 \h </w:instrText>
             </w:r>
             <w:r>
               <w:rPr>
@@ -2106,7 +2106,7 @@
               <w14:ligatures w14:val="standardContextual"/>
             </w:rPr>
           </w:pPr>
-          <w:hyperlink w:anchor="_Toc241392061" w:history="1">
+          <w:hyperlink w:anchor="_Toc241395695" w:history="1">
             <w:r>
               <w:rPr>
                 <w:rStyle w:val="Hyperlink"/>
@@ -2130,7 +2130,7 @@
               <w:rPr>
                 <w:noProof/>
               </w:rPr>
-              <w:instrText xml:space="preserve"> PAGEREF _Toc241392061 \h </w:instrText>
+              <w:instrText xml:space="preserve"> PAGEREF _Toc241395695 \h </w:instrText>
             </w:r>
             <w:r>
               <w:rPr>
@@ -2172,7 +2172,7 @@
               <w14:ligatures w14:val="standardContextual"/>
             </w:rPr>
           </w:pPr>
-          <w:hyperlink w:anchor="_Toc241392062" w:history="1">
+          <w:hyperlink w:anchor="_Toc241395696" w:history="1">
             <w:r>
               <w:rPr>
                 <w:rStyle w:val="Hyperlink"/>
@@ -2196,7 +2196,7 @@
               <w:rPr>
                 <w:noProof/>
               </w:rPr>
-              <w:instrText xml:space="preserve"> PAGEREF _Toc241392062 \h </w:instrText>
+              <w:instrText xml:space="preserve"> PAGEREF _Toc241395696 \h </w:instrText>
             </w:r>
             <w:r>
               <w:rPr>
@@ -2238,7 +2238,7 @@
               <w14:ligatures w14:val="standardContextual"/>
             </w:rPr>
           </w:pPr>
-          <w:hyperlink w:anchor="_Toc241392063" w:history="1">
+          <w:hyperlink w:anchor="_Toc241395697" w:history="1">
             <w:r>
               <w:rPr>
                 <w:rStyle w:val="Hyperlink"/>
@@ -2262,7 +2262,7 @@
               <w:rPr>
                 <w:noProof/>
               </w:rPr>
-              <w:instrText xml:space="preserve"> PAGEREF _Toc241392063 \h </w:instrText>
+              <w:instrText xml:space="preserve"> PAGEREF _Toc241395697 \h </w:instrText>
             </w:r>
             <w:r>
               <w:rPr>
@@ -2304,7 +2304,7 @@
               <w14:ligatures w14:val="standardContextual"/>
             </w:rPr>
           </w:pPr>
-          <w:hyperlink w:anchor="_Toc241392064" w:history="1">
+          <w:hyperlink w:anchor="_Toc241395698" w:history="1">
             <w:r>
               <w:rPr>
                 <w:rStyle w:val="Hyperlink"/>
@@ -2328,7 +2328,7 @@
               <w:rPr>
                 <w:noProof/>
               </w:rPr>
-              <w:instrText xml:space="preserve"> PAGEREF _Toc241392064 \h </w:instrText>
+              <w:instrText xml:space="preserve"> PAGEREF _Toc241395698 \h </w:instrText>
             </w:r>
             <w:r>
               <w:rPr>
@@ -2370,7 +2370,7 @@
               <w14:ligatures w14:val="standardContextual"/>
             </w:rPr>
           </w:pPr>
-          <w:hyperlink w:anchor="_Toc241392065" w:history="1">
+          <w:hyperlink w:anchor="_Toc241395699" w:history="1">
             <w:r>
               <w:rPr>
                 <w:rStyle w:val="Hyperlink"/>
@@ -2394,7 +2394,7 @@
               <w:rPr>
                 <w:noProof/>
               </w:rPr>
-              <w:instrText xml:space="preserve"> PAGEREF _Toc241392065 \h </w:instrText>
+              <w:instrText xml:space="preserve"> PAGEREF _Toc241395699 \h </w:instrText>
             </w:r>
             <w:r>
               <w:rPr>
@@ -2436,7 +2436,7 @@
               <w14:ligatures w14:val="standardContextual"/>
             </w:rPr>
           </w:pPr>
-          <w:hyperlink w:anchor="_Toc241392066" w:history="1">
+          <w:hyperlink w:anchor="_Toc241395700" w:history="1">
             <w:r>
               <w:rPr>
                 <w:rStyle w:val="Hyperlink"/>
@@ -2460,7 +2460,7 @@
               <w:rPr>
                 <w:noProof/>
               </w:rPr>
-              <w:instrText xml:space="preserve"> PAGEREF _Toc241392066 \h </w:instrText>
+              <w:instrText xml:space="preserve"> PAGEREF _Toc241395700 \h </w:instrText>
             </w:r>
             <w:r>
               <w:rPr>
@@ -2502,7 +2502,7 @@
               <w14:ligatures w14:val="standardContextual"/>
             </w:rPr>
           </w:pPr>
-          <w:hyperlink w:anchor="_Toc241392067" w:history="1">
+          <w:hyperlink w:anchor="_Toc241395701" w:history="1">
             <w:r>
               <w:rPr>
                 <w:rStyle w:val="Hyperlink"/>
@@ -2526,7 +2526,7 @@
               <w:rPr>
                 <w:noProof/>
               </w:rPr>
-              <w:instrText xml:space="preserve"> PAGEREF _Toc241392067 \h </w:instrText>
+              <w:instrText xml:space="preserve"> PAGEREF _Toc241395701 \h </w:instrText>
             </w:r>
             <w:r>
               <w:rPr>
@@ -2568,7 +2568,7 @@
               <w14:ligatures w14:val="standardContextual"/>
             </w:rPr>
           </w:pPr>
-          <w:hyperlink w:anchor="_Toc241392068" w:history="1">
+          <w:hyperlink w:anchor="_Toc241395702" w:history="1">
             <w:r>
               <w:rPr>
                 <w:rStyle w:val="Hyperlink"/>
@@ -2592,7 +2592,7 @@
               <w:rPr>
                 <w:noProof/>
               </w:rPr>
-              <w:instrText xml:space="preserve"> PAGEREF _Toc241392068 \h </w:instrText>
+              <w:instrText xml:space="preserve"> PAGEREF _Toc241395702 \h </w:instrText>
             </w:r>
             <w:r>
               <w:rPr>
@@ -2634,7 +2634,7 @@
               <w14:ligatures w14:val="standardContextual"/>
             </w:rPr>
           </w:pPr>
-          <w:hyperlink w:anchor="_Toc241392069" w:history="1">
+          <w:hyperlink w:anchor="_Toc241395703" w:history="1">
             <w:r>
               <w:rPr>
                 <w:rStyle w:val="Hyperlink"/>
@@ -2658,7 +2658,7 @@
               <w:rPr>
                 <w:noProof/>
               </w:rPr>
-              <w:instrText xml:space="preserve"> PAGEREF _Toc241392069 \h </w:instrText>
+              <w:instrText xml:space="preserve"> PAGEREF _Toc241395703 \h </w:instrText>
             </w:r>
             <w:r>
               <w:rPr>
@@ -2700,7 +2700,7 @@
               <w14:ligatures w14:val="standardContextual"/>
             </w:rPr>
           </w:pPr>
-          <w:hyperlink w:anchor="_Toc241392070" w:history="1">
+          <w:hyperlink w:anchor="_Toc241395704" w:history="1">
             <w:r>
               <w:rPr>
                 <w:rStyle w:val="Hyperlink"/>
@@ -2724,7 +2724,7 @@
               <w:rPr>
                 <w:noProof/>
               </w:rPr>
-              <w:instrText xml:space="preserve"> PAGEREF _Toc241392070 \h </w:instrText>
+              <w:instrText xml:space="preserve"> PAGEREF _Toc241395704 \h </w:instrText>
             </w:r>
             <w:r>
               <w:rPr>
@@ -2766,7 +2766,7 @@
               <w14:ligatures w14:val="standardContextual"/>
             </w:rPr>
           </w:pPr>
-          <w:hyperlink w:anchor="_Toc241392071" w:history="1">
+          <w:hyperlink w:anchor="_Toc241395705" w:history="1">
             <w:r>
               <w:rPr>
                 <w:rStyle w:val="Hyperlink"/>
@@ -2790,7 +2790,7 @@
               <w:rPr>
                 <w:noProof/>
               </w:rPr>
-              <w:instrText xml:space="preserve"> PAGEREF _Toc241392071 \h </w:instrText>
+              <w:instrText xml:space="preserve"> PAGEREF _Toc241395705 \h </w:instrText>
             </w:r>
             <w:r>
               <w:rPr>
@@ -2832,7 +2832,7 @@
               <w14:ligatures w14:val="standardContextual"/>
             </w:rPr>
           </w:pPr>
-          <w:hyperlink w:anchor="_Toc241392072" w:history="1">
+          <w:hyperlink w:anchor="_Toc241395706" w:history="1">
             <w:r>
               <w:rPr>
                 <w:rStyle w:val="Hyperlink"/>
@@ -2856,7 +2856,7 @@
               <w:rPr>
                 <w:noProof/>
               </w:rPr>
-              <w:instrText xml:space="preserve"> PAGEREF _Toc241392072 \h </w:instrText>
+              <w:instrText xml:space="preserve"> PAGEREF _Toc241395706 \h </w:instrText>
             </w:r>
             <w:r>
               <w:rPr>
@@ -2898,7 +2898,7 @@
               <w14:ligatures w14:val="standardContextual"/>
             </w:rPr>
           </w:pPr>
-          <w:hyperlink w:anchor="_Toc241392073" w:history="1">
+          <w:hyperlink w:anchor="_Toc241395707" w:history="1">
             <w:r>
               <w:rPr>
                 <w:rStyle w:val="Hyperlink"/>
@@ -2922,7 +2922,7 @@
               <w:rPr>
                 <w:noProof/>
               </w:rPr>
-              <w:instrText xml:space="preserve"> PAGEREF _Toc241392073 \h </w:instrText>
+              <w:instrText xml:space="preserve"> PAGEREF _Toc241395707 \h </w:instrText>
             </w:r>
             <w:r>
               <w:rPr>
@@ -2964,7 +2964,7 @@
               <w14:ligatures w14:val="standardContextual"/>
             </w:rPr>
           </w:pPr>
-          <w:hyperlink w:anchor="_Toc241392074" w:history="1">
+          <w:hyperlink w:anchor="_Toc241395708" w:history="1">
             <w:r>
               <w:rPr>
                 <w:rStyle w:val="Hyperlink"/>
@@ -2988,7 +2988,7 @@
               <w:rPr>
                 <w:noProof/>
               </w:rPr>
-              <w:instrText xml:space="preserve"> PAGEREF _Toc241392074 \h </w:instrText>
+              <w:instrText xml:space="preserve"> PAGEREF _Toc241395708 \h </w:instrText>
             </w:r>
             <w:r>
               <w:rPr>
@@ -3030,7 +3030,7 @@
               <w14:ligatures w14:val="standardContextual"/>
             </w:rPr>
           </w:pPr>
-          <w:hyperlink w:anchor="_Toc241392075" w:history="1">
+          <w:hyperlink w:anchor="_Toc241395709" w:history="1">
             <w:r>
               <w:rPr>
                 <w:rStyle w:val="Hyperlink"/>
@@ -3054,7 +3054,7 @@
               <w:rPr>
                 <w:noProof/>
               </w:rPr>
-              <w:instrText xml:space="preserve"> PAGEREF _Toc241392075 \h </w:instrText>
+              <w:instrText xml:space="preserve"> PAGEREF _Toc241395709 \h </w:instrText>
             </w:r>
             <w:r>
               <w:rPr>
@@ -3096,7 +3096,7 @@
               <w14:ligatures w14:val="standardContextual"/>
             </w:rPr>
           </w:pPr>
-          <w:hyperlink w:anchor="_Toc241392076" w:history="1">
+          <w:hyperlink w:anchor="_Toc241395710" w:history="1">
             <w:r>
               <w:rPr>
                 <w:rStyle w:val="Hyperlink"/>
@@ -3120,7 +3120,7 @@
               <w:rPr>
                 <w:noProof/>
               </w:rPr>
-              <w:instrText xml:space="preserve"> PAGEREF _Toc241392076 \h </w:instrText>
+              <w:instrText xml:space="preserve"> PAGEREF _Toc241395710 \h </w:instrText>
             </w:r>
             <w:r>
               <w:rPr>
@@ -3162,7 +3162,7 @@
               <w14:ligatures w14:val="standardContextual"/>
             </w:rPr>
           </w:pPr>
-          <w:hyperlink w:anchor="_Toc241392077" w:history="1">
+          <w:hyperlink w:anchor="_Toc241395711" w:history="1">
             <w:r>
               <w:rPr>
                 <w:rStyle w:val="Hyperlink"/>
@@ -3186,7 +3186,7 @@
               <w:rPr>
                 <w:noProof/>
               </w:rPr>
-              <w:instrText xml:space="preserve"> PAGEREF _Toc241392077 \h </w:instrText>
+              <w:instrText xml:space="preserve"> PAGEREF _Toc241395711 \h </w:instrText>
             </w:r>
             <w:r>
               <w:rPr>
@@ -3228,7 +3228,7 @@
               <w14:ligatures w14:val="standardContextual"/>
             </w:rPr>
           </w:pPr>
-          <w:hyperlink w:anchor="_Toc241392078" w:history="1">
+          <w:hyperlink w:anchor="_Toc241395712" w:history="1">
             <w:r>
               <w:rPr>
                 <w:rStyle w:val="Hyperlink"/>
@@ -3252,7 +3252,7 @@
               <w:rPr>
                 <w:noProof/>
               </w:rPr>
-              <w:instrText xml:space="preserve"> PAGEREF _Toc241392078 \h </w:instrText>
+              <w:instrText xml:space="preserve"> PAGEREF _Toc241395712 \h </w:instrText>
             </w:r>
             <w:r>
               <w:rPr>
@@ -3294,7 +3294,7 @@
               <w14:ligatures w14:val="standardContextual"/>
             </w:rPr>
           </w:pPr>
-          <w:hyperlink w:anchor="_Toc241392079" w:history="1">
+          <w:hyperlink w:anchor="_Toc241395713" w:history="1">
             <w:r>
               <w:rPr>
                 <w:rStyle w:val="Hyperlink"/>
@@ -3318,7 +3318,7 @@
               <w:rPr>
                 <w:noProof/>
               </w:rPr>
-              <w:instrText xml:space="preserve"> PAGEREF _Toc241392079 \h </w:instrText>
+              <w:instrText xml:space="preserve"> PAGEREF _Toc241395713 \h </w:instrText>
             </w:r>
             <w:r>
               <w:rPr>
@@ -3360,7 +3360,7 @@
               <w14:ligatures w14:val="standardContextual"/>
             </w:rPr>
           </w:pPr>
-          <w:hyperlink w:anchor="_Toc241392080" w:history="1">
+          <w:hyperlink w:anchor="_Toc241395714" w:history="1">
             <w:r>
               <w:rPr>
                 <w:rStyle w:val="Hyperlink"/>
@@ -3384,7 +3384,7 @@
               <w:rPr>
                 <w:noProof/>
               </w:rPr>
-              <w:instrText xml:space="preserve"> PAGEREF _Toc241392080 \h </w:instrText>
+              <w:instrText xml:space="preserve"> PAGEREF _Toc241395714 \h </w:instrText>
             </w:r>
             <w:r>
               <w:rPr>
@@ -3426,7 +3426,7 @@
               <w14:ligatures w14:val="standardContextual"/>
             </w:rPr>
           </w:pPr>
-          <w:hyperlink w:anchor="_Toc241392081" w:history="1">
+          <w:hyperlink w:anchor="_Toc241395715" w:history="1">
             <w:r>
               <w:rPr>
                 <w:rStyle w:val="Hyperlink"/>
@@ -3450,7 +3450,7 @@
               <w:rPr>
                 <w:noProof/>
               </w:rPr>
-              <w:instrText xml:space="preserve"> PAGEREF _Toc241392081 \h </w:instrText>
+              <w:instrText xml:space="preserve"> PAGEREF _Toc241395715 \h </w:instrText>
             </w:r>
             <w:r>
               <w:rPr>
@@ -3492,7 +3492,7 @@
               <w14:ligatures w14:val="standardContextual"/>
             </w:rPr>
           </w:pPr>
-          <w:hyperlink w:anchor="_Toc241392082" w:history="1">
+          <w:hyperlink w:anchor="_Toc241395716" w:history="1">
             <w:r>
               <w:rPr>
                 <w:rStyle w:val="Hyperlink"/>
@@ -3516,7 +3516,7 @@
               <w:rPr>
                 <w:noProof/>
               </w:rPr>
-              <w:instrText xml:space="preserve"> PAGEREF _Toc241392082 \h </w:instrText>
+              <w:instrText xml:space="preserve"> PAGEREF _Toc241395716 \h </w:instrText>
             </w:r>
             <w:r>
               <w:rPr>
@@ -3558,7 +3558,7 @@
               <w14:ligatures w14:val="standardContextual"/>
             </w:rPr>
           </w:pPr>
-          <w:hyperlink w:anchor="_Toc241392083" w:history="1">
+          <w:hyperlink w:anchor="_Toc241395717" w:history="1">
             <w:r>
               <w:rPr>
                 <w:rStyle w:val="Hyperlink"/>
@@ -3582,7 +3582,7 @@
               <w:rPr>
                 <w:noProof/>
               </w:rPr>
-              <w:instrText xml:space="preserve"> PAGEREF _Toc241392083 \h </w:instrText>
+              <w:instrText xml:space="preserve"> PAGEREF _Toc241395717 \h </w:instrText>
             </w:r>
             <w:r>
               <w:rPr>
@@ -3624,7 +3624,7 @@
               <w14:ligatures w14:val="standardContextual"/>
             </w:rPr>
           </w:pPr>
-          <w:hyperlink w:anchor="_Toc241392084" w:history="1">
+          <w:hyperlink w:anchor="_Toc241395718" w:history="1">
             <w:r>
               <w:rPr>
                 <w:rStyle w:val="Hyperlink"/>
@@ -3648,7 +3648,7 @@
               <w:rPr>
                 <w:noProof/>
               </w:rPr>
-              <w:instrText xml:space="preserve"> PAGEREF _Toc241392084 \h </w:instrText>
+              <w:instrText xml:space="preserve"> PAGEREF _Toc241395718 \h </w:instrText>
             </w:r>
             <w:r>
               <w:rPr>
@@ -3690,7 +3690,7 @@
               <w14:ligatures w14:val="standardContextual"/>
             </w:rPr>
           </w:pPr>
-          <w:hyperlink w:anchor="_Toc241392085" w:history="1">
+          <w:hyperlink w:anchor="_Toc241395719" w:history="1">
             <w:r>
               <w:rPr>
                 <w:rStyle w:val="Hyperlink"/>
@@ -3714,7 +3714,7 @@
               <w:rPr>
                 <w:noProof/>
               </w:rPr>
-              <w:instrText xml:space="preserve"> PAGEREF _Toc241392085 \h </w:instrText>
+              <w:instrText xml:space="preserve"> PAGEREF _Toc241395719 \h </w:instrText>
             </w:r>
             <w:r>
               <w:rPr>
@@ -3756,7 +3756,7 @@
               <w14:ligatures w14:val="standardContextual"/>
             </w:rPr>
           </w:pPr>
-          <w:hyperlink w:anchor="_Toc241392086" w:history="1">
+          <w:hyperlink w:anchor="_Toc241395720" w:history="1">
             <w:r>
               <w:rPr>
                 <w:rStyle w:val="Hyperlink"/>
@@ -3780,7 +3780,7 @@
               <w:rPr>
                 <w:noProof/>
               </w:rPr>
-              <w:instrText xml:space="preserve"> PAGEREF _Toc241392086 \h </w:instrText>
+              <w:instrText xml:space="preserve"> PAGEREF _Toc241395720 \h </w:instrText>
             </w:r>
             <w:r>
               <w:rPr>
@@ -3822,7 +3822,7 @@
               <w14:ligatures w14:val="standardContextual"/>
             </w:rPr>
           </w:pPr>
-          <w:hyperlink w:anchor="_Toc241392087" w:history="1">
+          <w:hyperlink w:anchor="_Toc241395721" w:history="1">
             <w:r>
               <w:rPr>
                 <w:rStyle w:val="Hyperlink"/>
@@ -3846,7 +3846,7 @@
               <w:rPr>
                 <w:noProof/>
               </w:rPr>
-              <w:instrText xml:space="preserve"> PAGEREF _Toc241392087 \h </w:instrText>
+              <w:instrText xml:space="preserve"> PAGEREF _Toc241395721 \h </w:instrText>
             </w:r>
             <w:r>
               <w:rPr>
@@ -3888,7 +3888,7 @@
               <w14:ligatures w14:val="standardContextual"/>
             </w:rPr>
           </w:pPr>
-          <w:hyperlink w:anchor="_Toc241392088" w:history="1">
+          <w:hyperlink w:anchor="_Toc241395722" w:history="1">
             <w:r>
               <w:rPr>
                 <w:rStyle w:val="Hyperlink"/>
@@ -3912,7 +3912,7 @@
               <w:rPr>
                 <w:noProof/>
               </w:rPr>
-              <w:instrText xml:space="preserve"> PAGEREF _Toc241392088 \h </w:instrText>
+              <w:instrText xml:space="preserve"> PAGEREF _Toc241395722 \h </w:instrText>
             </w:r>
             <w:r>
               <w:rPr>
@@ -3954,7 +3954,7 @@
               <w14:ligatures w14:val="standardContextual"/>
             </w:rPr>
           </w:pPr>
-          <w:hyperlink w:anchor="_Toc241392089" w:history="1">
+          <w:hyperlink w:anchor="_Toc241395723" w:history="1">
             <w:r>
               <w:rPr>
                 <w:rStyle w:val="Hyperlink"/>
@@ -3978,7 +3978,7 @@
               <w:rPr>
                 <w:noProof/>
               </w:rPr>
-              <w:instrText xml:space="preserve"> PAGEREF _Toc241392089 \h </w:instrText>
+              <w:instrText xml:space="preserve"> PAGEREF _Toc241395723 \h </w:instrText>
             </w:r>
             <w:r>
               <w:rPr>
@@ -4020,7 +4020,7 @@
               <w14:ligatures w14:val="standardContextual"/>
             </w:rPr>
           </w:pPr>
-          <w:hyperlink w:anchor="_Toc241392090" w:history="1">
+          <w:hyperlink w:anchor="_Toc241395724" w:history="1">
             <w:r>
               <w:rPr>
                 <w:rStyle w:val="Hyperlink"/>
@@ -4044,7 +4044,7 @@
               <w:rPr>
                 <w:noProof/>
               </w:rPr>
-              <w:instrText xml:space="preserve"> PAGEREF _Toc241392090 \h </w:instrText>
+              <w:instrText xml:space="preserve"> PAGEREF _Toc241395724 \h </w:instrText>
             </w:r>
             <w:r>
               <w:rPr>
@@ -4086,7 +4086,7 @@
               <w14:ligatures w14:val="standardContextual"/>
             </w:rPr>
           </w:pPr>
-          <w:hyperlink w:anchor="_Toc241392091" w:history="1">
+          <w:hyperlink w:anchor="_Toc241395725" w:history="1">
             <w:r>
               <w:rPr>
                 <w:rStyle w:val="Hyperlink"/>
@@ -4110,7 +4110,7 @@
               <w:rPr>
                 <w:noProof/>
               </w:rPr>
-              <w:instrText xml:space="preserve"> PAGEREF _Toc241392091 \h </w:instrText>
+              <w:instrText xml:space="preserve"> PAGEREF _Toc241395725 \h </w:instrText>
             </w:r>
             <w:r>
               <w:rPr>
@@ -4152,7 +4152,7 @@
               <w14:ligatures w14:val="standardContextual"/>
             </w:rPr>
           </w:pPr>
-          <w:hyperlink w:anchor="_Toc241392092" w:history="1">
+          <w:hyperlink w:anchor="_Toc241395726" w:history="1">
             <w:r>
               <w:rPr>
                 <w:rStyle w:val="Hyperlink"/>
@@ -4176,7 +4176,7 @@
               <w:rPr>
                 <w:noProof/>
               </w:rPr>
-              <w:instrText xml:space="preserve"> PAGEREF _Toc241392092 \h </w:instrText>
+              <w:instrText xml:space="preserve"> PAGEREF _Toc241395726 \h </w:instrText>
             </w:r>
             <w:r>
               <w:rPr>
@@ -4218,7 +4218,7 @@
               <w14:ligatures w14:val="standardContextual"/>
             </w:rPr>
           </w:pPr>
-          <w:hyperlink w:anchor="_Toc241392093" w:history="1">
+          <w:hyperlink w:anchor="_Toc241395727" w:history="1">
             <w:r>
               <w:rPr>
                 <w:rStyle w:val="Hyperlink"/>
@@ -4242,7 +4242,7 @@
               <w:rPr>
                 <w:noProof/>
               </w:rPr>
-              <w:instrText xml:space="preserve"> PAGEREF _Toc241392093 \h </w:instrText>
+              <w:instrText xml:space="preserve"> PAGEREF _Toc241395727 \h </w:instrText>
             </w:r>
             <w:r>
               <w:rPr>
@@ -4284,7 +4284,7 @@
               <w14:ligatures w14:val="standardContextual"/>
             </w:rPr>
           </w:pPr>
-          <w:hyperlink w:anchor="_Toc241392094" w:history="1">
+          <w:hyperlink w:anchor="_Toc241395728" w:history="1">
             <w:r>
               <w:rPr>
                 <w:rStyle w:val="Hyperlink"/>
@@ -4308,7 +4308,7 @@
               <w:rPr>
                 <w:noProof/>
               </w:rPr>
-              <w:instrText xml:space="preserve"> PAGEREF _Toc241392094 \h </w:instrText>
+              <w:instrText xml:space="preserve"> PAGEREF _Toc241395728 \h </w:instrText>
             </w:r>
             <w:r>
               <w:rPr>
@@ -4350,7 +4350,7 @@
               <w14:ligatures w14:val="standardContextual"/>
             </w:rPr>
           </w:pPr>
-          <w:hyperlink w:anchor="_Toc241392095" w:history="1">
+          <w:hyperlink w:anchor="_Toc241395729" w:history="1">
             <w:r>
               <w:rPr>
                 <w:rStyle w:val="Hyperlink"/>
@@ -4374,7 +4374,7 @@
               <w:rPr>
                 <w:noProof/>
               </w:rPr>
-              <w:instrText xml:space="preserve"> PAGEREF _Toc241392095 \h </w:instrText>
+              <w:instrText xml:space="preserve"> PAGEREF _Toc241395729 \h </w:instrText>
             </w:r>
             <w:r>
               <w:rPr>
@@ -4416,7 +4416,7 @@
               <w14:ligatures w14:val="standardContextual"/>
             </w:rPr>
           </w:pPr>
-          <w:hyperlink w:anchor="_Toc241392096" w:history="1">
+          <w:hyperlink w:anchor="_Toc241395730" w:history="1">
             <w:r>
               <w:rPr>
                 <w:rStyle w:val="Hyperlink"/>
@@ -4440,7 +4440,7 @@
               <w:rPr>
                 <w:noProof/>
               </w:rPr>
-              <w:instrText xml:space="preserve"> PAGEREF _Toc241392096 \h </w:instrText>
+              <w:instrText xml:space="preserve"> PAGEREF _Toc241395730 \h </w:instrText>
             </w:r>
             <w:r>
               <w:rPr>
@@ -4482,7 +4482,7 @@
               <w14:ligatures w14:val="standardContextual"/>
             </w:rPr>
           </w:pPr>
-          <w:hyperlink w:anchor="_Toc241392097" w:history="1">
+          <w:hyperlink w:anchor="_Toc241395731" w:history="1">
             <w:r>
               <w:rPr>
                 <w:rStyle w:val="Hyperlink"/>
@@ -4506,7 +4506,7 @@
               <w:rPr>
                 <w:noProof/>
               </w:rPr>
-              <w:instrText xml:space="preserve"> PAGEREF _Toc241392097 \h </w:instrText>
+              <w:instrText xml:space="preserve"> PAGEREF _Toc241395731 \h </w:instrText>
             </w:r>
             <w:r>
               <w:rPr>
@@ -4548,7 +4548,7 @@
               <w14:ligatures w14:val="standardContextual"/>
             </w:rPr>
           </w:pPr>
-          <w:hyperlink w:anchor="_Toc241392098" w:history="1">
+          <w:hyperlink w:anchor="_Toc241395732" w:history="1">
             <w:r>
               <w:rPr>
                 <w:rStyle w:val="Hyperlink"/>
@@ -4572,7 +4572,7 @@
               <w:rPr>
                 <w:noProof/>
               </w:rPr>
-              <w:instrText xml:space="preserve"> PAGEREF _Toc241392098 \h </w:instrText>
+              <w:instrText xml:space="preserve"> PAGEREF _Toc241395732 \h </w:instrText>
             </w:r>
             <w:r>
               <w:rPr>
@@ -4614,7 +4614,7 @@
               <w14:ligatures w14:val="standardContextual"/>
             </w:rPr>
           </w:pPr>
-          <w:hyperlink w:anchor="_Toc241392099" w:history="1">
+          <w:hyperlink w:anchor="_Toc241395733" w:history="1">
             <w:r>
               <w:rPr>
                 <w:rStyle w:val="Hyperlink"/>
@@ -4638,7 +4638,7 @@
               <w:rPr>
                 <w:noProof/>
               </w:rPr>
-              <w:instrText xml:space="preserve"> PAGEREF _Toc241392099 \h </w:instrText>
+              <w:instrText xml:space="preserve"> PAGEREF _Toc241395733 \h </w:instrText>
             </w:r>
             <w:r>
               <w:rPr>
@@ -4680,7 +4680,7 @@
               <w14:ligatures w14:val="standardContextual"/>
             </w:rPr>
           </w:pPr>
-          <w:hyperlink w:anchor="_Toc241392100" w:history="1">
+          <w:hyperlink w:anchor="_Toc241395734" w:history="1">
             <w:r>
               <w:rPr>
                 <w:rStyle w:val="Hyperlink"/>
@@ -4704,7 +4704,7 @@
               <w:rPr>
                 <w:noProof/>
               </w:rPr>
-              <w:instrText xml:space="preserve"> PAGEREF _Toc241392100 \h </w:instrText>
+              <w:instrText xml:space="preserve"> PAGEREF _Toc241395734 \h </w:instrText>
             </w:r>
             <w:r>
               <w:rPr>
@@ -4746,7 +4746,7 @@
               <w14:ligatures w14:val="standardContextual"/>
             </w:rPr>
           </w:pPr>
-          <w:hyperlink w:anchor="_Toc241392101" w:history="1">
+          <w:hyperlink w:anchor="_Toc241395735" w:history="1">
             <w:r>
               <w:rPr>
                 <w:rStyle w:val="Hyperlink"/>
@@ -4770,7 +4770,7 @@
               <w:rPr>
                 <w:noProof/>
               </w:rPr>
-              <w:instrText xml:space="preserve"> PAGEREF _Toc241392101 \h </w:instrText>
+              <w:instrText xml:space="preserve"> PAGEREF _Toc241395735 \h </w:instrText>
             </w:r>
             <w:r>
               <w:rPr>
@@ -4812,7 +4812,7 @@
               <w14:ligatures w14:val="standardContextual"/>
             </w:rPr>
           </w:pPr>
-          <w:hyperlink w:anchor="_Toc241392102" w:history="1">
+          <w:hyperlink w:anchor="_Toc241395736" w:history="1">
             <w:r>
               <w:rPr>
                 <w:rStyle w:val="Hyperlink"/>
@@ -4836,7 +4836,7 @@
               <w:rPr>
                 <w:noProof/>
               </w:rPr>
-              <w:instrText xml:space="preserve"> PAGEREF _Toc241392102 \h </w:instrText>
+              <w:instrText xml:space="preserve"> PAGEREF _Toc241395736 \h </w:instrText>
             </w:r>
             <w:r>
               <w:rPr>
@@ -4878,7 +4878,7 @@
               <w14:ligatures w14:val="standardContextual"/>
             </w:rPr>
           </w:pPr>
-          <w:hyperlink w:anchor="_Toc241392103" w:history="1">
+          <w:hyperlink w:anchor="_Toc241395737" w:history="1">
             <w:r>
               <w:rPr>
                 <w:rStyle w:val="Hyperlink"/>
@@ -4902,7 +4902,7 @@
               <w:rPr>
                 <w:noProof/>
               </w:rPr>
-              <w:instrText xml:space="preserve"> PAGEREF _Toc241392103 \h </w:instrText>
+              <w:instrText xml:space="preserve"> PAGEREF _Toc241395737 \h </w:instrText>
             </w:r>
             <w:r>
               <w:rPr>
@@ -4944,7 +4944,7 @@
               <w14:ligatures w14:val="standardContextual"/>
             </w:rPr>
           </w:pPr>
-          <w:hyperlink w:anchor="_Toc241392104" w:history="1">
+          <w:hyperlink w:anchor="_Toc241395738" w:history="1">
             <w:r>
               <w:rPr>
                 <w:rStyle w:val="Hyperlink"/>
@@ -4968,7 +4968,7 @@
               <w:rPr>
                 <w:noProof/>
               </w:rPr>
-              <w:instrText xml:space="preserve"> PAGEREF _Toc241392104 \h </w:instrText>
+              <w:instrText xml:space="preserve"> PAGEREF _Toc241395738 \h </w:instrText>
             </w:r>
             <w:r>
               <w:rPr>
@@ -5010,7 +5010,7 @@
               <w14:ligatures w14:val="standardContextual"/>
             </w:rPr>
           </w:pPr>
-          <w:hyperlink w:anchor="_Toc241392105" w:history="1">
+          <w:hyperlink w:anchor="_Toc241395739" w:history="1">
             <w:r>
               <w:rPr>
                 <w:rStyle w:val="Hyperlink"/>
@@ -5034,7 +5034,7 @@
               <w:rPr>
                 <w:noProof/>
               </w:rPr>
-              <w:instrText xml:space="preserve"> PAGEREF _Toc241392105 \h </w:instrText>
+              <w:instrText xml:space="preserve"> PAGEREF _Toc241395739 \h </w:instrText>
             </w:r>
             <w:r>
               <w:rPr>
@@ -5076,7 +5076,7 @@
               <w14:ligatures w14:val="standardContextual"/>
             </w:rPr>
           </w:pPr>
-          <w:hyperlink w:anchor="_Toc241392106" w:history="1">
+          <w:hyperlink w:anchor="_Toc241395740" w:history="1">
             <w:r>
               <w:rPr>
                 <w:rStyle w:val="Hyperlink"/>
@@ -5100,7 +5100,7 @@
               <w:rPr>
                 <w:noProof/>
               </w:rPr>
-              <w:instrText xml:space="preserve"> PAGEREF _Toc241392106 \h </w:instrText>
+              <w:instrText xml:space="preserve"> PAGEREF _Toc241395740 \h </w:instrText>
             </w:r>
             <w:r>
               <w:rPr>
@@ -5142,7 +5142,7 @@
               <w14:ligatures w14:val="standardContextual"/>
             </w:rPr>
           </w:pPr>
-          <w:hyperlink w:anchor="_Toc241392107" w:history="1">
+          <w:hyperlink w:anchor="_Toc241395741" w:history="1">
             <w:r>
               <w:rPr>
                 <w:rStyle w:val="Hyperlink"/>
@@ -5166,7 +5166,7 @@
               <w:rPr>
                 <w:noProof/>
               </w:rPr>
-              <w:instrText xml:space="preserve"> PAGEREF _Toc241392107 \h </w:instrText>
+              <w:instrText xml:space="preserve"> PAGEREF _Toc241395741 \h </w:instrText>
             </w:r>
             <w:r>
               <w:rPr>
@@ -5208,7 +5208,7 @@
               <w14:ligatures w14:val="standardContextual"/>
             </w:rPr>
           </w:pPr>
-          <w:hyperlink w:anchor="_Toc241392108" w:history="1">
+          <w:hyperlink w:anchor="_Toc241395742" w:history="1">
             <w:r>
               <w:rPr>
                 <w:rStyle w:val="Hyperlink"/>
@@ -5232,7 +5232,7 @@
               <w:rPr>
                 <w:noProof/>
               </w:rPr>
-              <w:instrText xml:space="preserve"> PAGEREF _Toc241392108 \h </w:instrText>
+              <w:instrText xml:space="preserve"> PAGEREF _Toc241395742 \h </w:instrText>
             </w:r>
             <w:r>
               <w:rPr>
@@ -5274,7 +5274,7 @@
               <w14:ligatures w14:val="standardContextual"/>
             </w:rPr>
           </w:pPr>
-          <w:hyperlink w:anchor="_Toc241392109" w:history="1">
+          <w:hyperlink w:anchor="_Toc241395743" w:history="1">
             <w:r>
               <w:rPr>
                 <w:rStyle w:val="Hyperlink"/>
@@ -5298,7 +5298,7 @@
               <w:rPr>
                 <w:noProof/>
               </w:rPr>
-              <w:instrText xml:space="preserve"> PAGEREF _Toc241392109 \h </w:instrText>
+              <w:instrText xml:space="preserve"> PAGEREF _Toc241395743 \h </w:instrText>
             </w:r>
             <w:r>
               <w:rPr>
@@ -5340,7 +5340,7 @@
               <w14:ligatures w14:val="standardContextual"/>
             </w:rPr>
           </w:pPr>
-          <w:hyperlink w:anchor="_Toc241392110" w:history="1">
+          <w:hyperlink w:anchor="_Toc241395744" w:history="1">
             <w:r>
               <w:rPr>
                 <w:rStyle w:val="Hyperlink"/>
@@ -5364,7 +5364,7 @@
               <w:rPr>
                 <w:noProof/>
               </w:rPr>
-              <w:instrText xml:space="preserve"> PAGEREF _Toc241392110 \h </w:instrText>
+              <w:instrText xml:space="preserve"> PAGEREF _Toc241395744 \h </w:instrText>
             </w:r>
             <w:r>
               <w:rPr>
@@ -5406,7 +5406,7 @@
               <w14:ligatures w14:val="standardContextual"/>
             </w:rPr>
           </w:pPr>
-          <w:hyperlink w:anchor="_Toc241392111" w:history="1">
+          <w:hyperlink w:anchor="_Toc241395745" w:history="1">
             <w:r>
               <w:rPr>
                 <w:rStyle w:val="Hyperlink"/>
@@ -5430,7 +5430,7 @@
               <w:rPr>
                 <w:noProof/>
               </w:rPr>
-              <w:instrText xml:space="preserve"> PAGEREF _Toc241392111 \h </w:instrText>
+              <w:instrText xml:space="preserve"> PAGEREF _Toc241395745 \h </w:instrText>
             </w:r>
             <w:r>
               <w:rPr>
@@ -5472,7 +5472,7 @@
               <w14:ligatures w14:val="standardContextual"/>
             </w:rPr>
           </w:pPr>
-          <w:hyperlink w:anchor="_Toc241392112" w:history="1">
+          <w:hyperlink w:anchor="_Toc241395746" w:history="1">
             <w:r>
               <w:rPr>
                 <w:rStyle w:val="Hyperlink"/>
@@ -5496,7 +5496,7 @@
               <w:rPr>
                 <w:noProof/>
               </w:rPr>
-              <w:instrText xml:space="preserve"> PAGEREF _Toc241392112 \h </w:instrText>
+              <w:instrText xml:space="preserve"> PAGEREF _Toc241395746 \h </w:instrText>
             </w:r>
             <w:r>
               <w:rPr>
@@ -5538,7 +5538,7 @@
               <w14:ligatures w14:val="standardContextual"/>
             </w:rPr>
           </w:pPr>
-          <w:hyperlink w:anchor="_Toc241392113" w:history="1">
+          <w:hyperlink w:anchor="_Toc241395747" w:history="1">
             <w:r>
               <w:rPr>
                 <w:rStyle w:val="Hyperlink"/>
@@ -5562,7 +5562,7 @@
               <w:rPr>
                 <w:noProof/>
               </w:rPr>
-              <w:instrText xml:space="preserve"> PAGEREF _Toc241392113 \h </w:instrText>
+              <w:instrText xml:space="preserve"> PAGEREF _Toc241395747 \h </w:instrText>
             </w:r>
             <w:r>
               <w:rPr>
@@ -5604,7 +5604,7 @@
               <w14:ligatures w14:val="standardContextual"/>
             </w:rPr>
           </w:pPr>
-          <w:hyperlink w:anchor="_Toc241392114" w:history="1">
+          <w:hyperlink w:anchor="_Toc241395748" w:history="1">
             <w:r>
               <w:rPr>
                 <w:rStyle w:val="Hyperlink"/>
@@ -5628,7 +5628,7 @@
               <w:rPr>
                 <w:noProof/>
               </w:rPr>
-              <w:instrText xml:space="preserve"> PAGEREF _Toc241392114 \h </w:instrText>
+              <w:instrText xml:space="preserve"> PAGEREF _Toc241395748 \h </w:instrText>
             </w:r>
             <w:r>
               <w:rPr>
@@ -5670,7 +5670,7 @@
               <w14:ligatures w14:val="standardContextual"/>
             </w:rPr>
           </w:pPr>
-          <w:hyperlink w:anchor="_Toc241392115" w:history="1">
+          <w:hyperlink w:anchor="_Toc241395749" w:history="1">
             <w:r>
               <w:rPr>
                 <w:rStyle w:val="Hyperlink"/>
@@ -5694,7 +5694,7 @@
               <w:rPr>
                 <w:noProof/>
               </w:rPr>
-              <w:instrText xml:space="preserve"> PAGEREF _Toc241392115 \h </w:instrText>
+              <w:instrText xml:space="preserve"> PAGEREF _Toc241395749 \h </w:instrText>
             </w:r>
             <w:r>
               <w:rPr>
@@ -5736,7 +5736,7 @@
               <w14:ligatures w14:val="standardContextual"/>
             </w:rPr>
           </w:pPr>
-          <w:hyperlink w:anchor="_Toc241392116" w:history="1">
+          <w:hyperlink w:anchor="_Toc241395750" w:history="1">
             <w:r>
               <w:rPr>
                 <w:rStyle w:val="Hyperlink"/>
@@ -5760,7 +5760,7 @@
               <w:rPr>
                 <w:noProof/>
               </w:rPr>
-              <w:instrText xml:space="preserve"> PAGEREF _Toc241392116 \h </w:instrText>
+              <w:instrText xml:space="preserve"> PAGEREF _Toc241395750 \h </w:instrText>
             </w:r>
             <w:r>
               <w:rPr>
@@ -5802,7 +5802,7 @@
               <w14:ligatures w14:val="standardContextual"/>
             </w:rPr>
           </w:pPr>
-          <w:hyperlink w:anchor="_Toc241392117" w:history="1">
+          <w:hyperlink w:anchor="_Toc241395751" w:history="1">
             <w:r>
               <w:rPr>
                 <w:rStyle w:val="Hyperlink"/>
@@ -5826,7 +5826,7 @@
               <w:rPr>
                 <w:noProof/>
               </w:rPr>
-              <w:instrText xml:space="preserve"> PAGEREF _Toc241392117 \h </w:instrText>
+              <w:instrText xml:space="preserve"> PAGEREF _Toc241395751 \h </w:instrText>
             </w:r>
             <w:r>
               <w:rPr>
@@ -5868,7 +5868,7 @@
               <w14:ligatures w14:val="standardContextual"/>
             </w:rPr>
           </w:pPr>
-          <w:hyperlink w:anchor="_Toc241392118" w:history="1">
+          <w:hyperlink w:anchor="_Toc241395752" w:history="1">
             <w:r>
               <w:rPr>
                 <w:rStyle w:val="Hyperlink"/>
@@ -5892,7 +5892,7 @@
               <w:rPr>
                 <w:noProof/>
               </w:rPr>
-              <w:instrText xml:space="preserve"> PAGEREF _Toc241392118 \h </w:instrText>
+              <w:instrText xml:space="preserve"> PAGEREF _Toc241395752 \h </w:instrText>
             </w:r>
             <w:r>
               <w:rPr>
@@ -5934,7 +5934,7 @@
               <w14:ligatures w14:val="standardContextual"/>
             </w:rPr>
           </w:pPr>
-          <w:hyperlink w:anchor="_Toc241392119" w:history="1">
+          <w:hyperlink w:anchor="_Toc241395753" w:history="1">
             <w:r>
               <w:rPr>
                 <w:rStyle w:val="Hyperlink"/>
@@ -5958,7 +5958,7 @@
               <w:rPr>
                 <w:noProof/>
               </w:rPr>
-              <w:instrText xml:space="preserve"> PAGEREF _Toc241392119 \h </w:instrText>
+              <w:instrText xml:space="preserve"> PAGEREF _Toc241395753 \h </w:instrText>
             </w:r>
             <w:r>
               <w:rPr>
@@ -6000,7 +6000,7 @@
               <w14:ligatures w14:val="standardContextual"/>
             </w:rPr>
           </w:pPr>
-          <w:hyperlink w:anchor="_Toc241392120" w:history="1">
+          <w:hyperlink w:anchor="_Toc241395754" w:history="1">
             <w:r>
               <w:rPr>
                 <w:rStyle w:val="Hyperlink"/>
@@ -6024,7 +6024,7 @@
               <w:rPr>
                 <w:noProof/>
               </w:rPr>
-              <w:instrText xml:space="preserve"> PAGEREF _Toc241392120 \h </w:instrText>
+              <w:instrText xml:space="preserve"> PAGEREF _Toc241395754 \h </w:instrText>
             </w:r>
             <w:r>
               <w:rPr>
@@ -6066,7 +6066,7 @@
               <w14:ligatures w14:val="standardContextual"/>
             </w:rPr>
           </w:pPr>
-          <w:hyperlink w:anchor="_Toc241392121" w:history="1">
+          <w:hyperlink w:anchor="_Toc241395755" w:history="1">
             <w:r>
               <w:rPr>
                 <w:rStyle w:val="Hyperlink"/>
@@ -6090,7 +6090,7 @@
               <w:rPr>
                 <w:noProof/>
               </w:rPr>
-              <w:instrText xml:space="preserve"> PAGEREF _Toc241392121 \h </w:instrText>
+              <w:instrText xml:space="preserve"> PAGEREF _Toc241395755 \h </w:instrText>
             </w:r>
             <w:r>
               <w:rPr>
@@ -6132,7 +6132,7 @@
               <w14:ligatures w14:val="standardContextual"/>
             </w:rPr>
           </w:pPr>
-          <w:hyperlink w:anchor="_Toc241392122" w:history="1">
+          <w:hyperlink w:anchor="_Toc241395756" w:history="1">
             <w:r>
               <w:rPr>
                 <w:rStyle w:val="Hyperlink"/>
@@ -6156,7 +6156,7 @@
               <w:rPr>
                 <w:noProof/>
               </w:rPr>
-              <w:instrText xml:space="preserve"> PAGEREF _Toc241392122 \h </w:instrText>
+              <w:instrText xml:space="preserve"> PAGEREF _Toc241395756 \h </w:instrText>
             </w:r>
             <w:r>
               <w:rPr>
@@ -6198,7 +6198,7 @@
               <w14:ligatures w14:val="standardContextual"/>
             </w:rPr>
           </w:pPr>
-          <w:hyperlink w:anchor="_Toc241392123" w:history="1">
+          <w:hyperlink w:anchor="_Toc241395757" w:history="1">
             <w:r>
               <w:rPr>
                 <w:rStyle w:val="Hyperlink"/>
@@ -6222,7 +6222,7 @@
               <w:rPr>
                 <w:noProof/>
               </w:rPr>
-              <w:instrText xml:space="preserve"> PAGEREF _Toc241392123 \h </w:instrText>
+              <w:instrText xml:space="preserve"> PAGEREF _Toc241395757 \h </w:instrText>
             </w:r>
             <w:r>
               <w:rPr>
@@ -6264,7 +6264,7 @@
               <w14:ligatures w14:val="standardContextual"/>
             </w:rPr>
           </w:pPr>
-          <w:hyperlink w:anchor="_Toc241392124" w:history="1">
+          <w:hyperlink w:anchor="_Toc241395758" w:history="1">
             <w:r>
               <w:rPr>
                 <w:rStyle w:val="Hyperlink"/>
@@ -6288,7 +6288,7 @@
               <w:rPr>
                 <w:noProof/>
               </w:rPr>
-              <w:instrText xml:space="preserve"> PAGEREF _Toc241392124 \h </w:instrText>
+              <w:instrText xml:space="preserve"> PAGEREF _Toc241395758 \h </w:instrText>
             </w:r>
             <w:r>
               <w:rPr>
@@ -6330,7 +6330,7 @@
               <w14:ligatures w14:val="standardContextual"/>
             </w:rPr>
           </w:pPr>
-          <w:hyperlink w:anchor="_Toc241392125" w:history="1">
+          <w:hyperlink w:anchor="_Toc241395759" w:history="1">
             <w:r>
               <w:rPr>
                 <w:rStyle w:val="Hyperlink"/>
@@ -6354,7 +6354,7 @@
               <w:rPr>
                 <w:noProof/>
               </w:rPr>
-              <w:instrText xml:space="preserve"> PAGEREF _Toc241392125 \h </w:instrText>
+              <w:instrText xml:space="preserve"> PAGEREF _Toc241395759 \h </w:instrText>
             </w:r>
             <w:r>
               <w:rPr>
@@ -6396,7 +6396,7 @@
               <w14:ligatures w14:val="standardContextual"/>
             </w:rPr>
           </w:pPr>
-          <w:hyperlink w:anchor="_Toc241392126" w:history="1">
+          <w:hyperlink w:anchor="_Toc241395760" w:history="1">
             <w:r>
               <w:rPr>
                 <w:rStyle w:val="Hyperlink"/>
@@ -6420,7 +6420,7 @@
               <w:rPr>
                 <w:noProof/>
               </w:rPr>
-              <w:instrText xml:space="preserve"> PAGEREF _Toc241392126 \h </w:instrText>
+              <w:instrText xml:space="preserve"> PAGEREF _Toc241395760 \h </w:instrText>
             </w:r>
             <w:r>
               <w:rPr>
@@ -6462,7 +6462,7 @@
               <w14:ligatures w14:val="standardContextual"/>
             </w:rPr>
           </w:pPr>
-          <w:hyperlink w:anchor="_Toc241392127" w:history="1">
+          <w:hyperlink w:anchor="_Toc241395761" w:history="1">
             <w:r>
               <w:rPr>
                 <w:rStyle w:val="Hyperlink"/>
@@ -6486,7 +6486,7 @@
               <w:rPr>
                 <w:noProof/>
               </w:rPr>
-              <w:instrText xml:space="preserve"> PAGEREF _Toc241392127 \h </w:instrText>
+              <w:instrText xml:space="preserve"> PAGEREF _Toc241395761 \h </w:instrText>
             </w:r>
             <w:r>
               <w:rPr>
@@ -6528,7 +6528,7 @@
               <w14:ligatures w14:val="standardContextual"/>
             </w:rPr>
           </w:pPr>
-          <w:hyperlink w:anchor="_Toc241392128" w:history="1">
+          <w:hyperlink w:anchor="_Toc241395762" w:history="1">
             <w:r>
               <w:rPr>
                 <w:rStyle w:val="Hyperlink"/>
@@ -6552,7 +6552,7 @@
               <w:rPr>
                 <w:noProof/>
               </w:rPr>
-              <w:instrText xml:space="preserve"> PAGEREF _Toc241392128 \h </w:instrText>
+              <w:instrText xml:space="preserve"> PAGEREF _Toc241395762 \h </w:instrText>
             </w:r>
             <w:r>
               <w:rPr>
@@ -6594,7 +6594,7 @@
               <w14:ligatures w14:val="standardContextual"/>
             </w:rPr>
           </w:pPr>
-          <w:hyperlink w:anchor="_Toc241392129" w:history="1">
+          <w:hyperlink w:anchor="_Toc241395763" w:history="1">
             <w:r>
               <w:rPr>
                 <w:rStyle w:val="Hyperlink"/>
@@ -6618,7 +6618,7 @@
               <w:rPr>
                 <w:noProof/>
               </w:rPr>
-              <w:instrText xml:space="preserve"> PAGEREF _Toc241392129 \h </w:instrText>
+              <w:instrText xml:space="preserve"> PAGEREF _Toc241395763 \h </w:instrText>
             </w:r>
             <w:r>
               <w:rPr>
@@ -6660,7 +6660,7 @@
               <w14:ligatures w14:val="standardContextual"/>
             </w:rPr>
           </w:pPr>
-          <w:hyperlink w:anchor="_Toc241392130" w:history="1">
+          <w:hyperlink w:anchor="_Toc241395764" w:history="1">
             <w:r>
               <w:rPr>
                 <w:rStyle w:val="Hyperlink"/>
@@ -6684,7 +6684,7 @@
               <w:rPr>
                 <w:noProof/>
               </w:rPr>
-              <w:instrText xml:space="preserve"> PAGEREF _Toc241392130 \h </w:instrText>
+              <w:instrText xml:space="preserve"> PAGEREF _Toc241395764 \h </w:instrText>
             </w:r>
             <w:r>
               <w:rPr>
@@ -6726,7 +6726,7 @@
               <w14:ligatures w14:val="standardContextual"/>
             </w:rPr>
           </w:pPr>
-          <w:hyperlink w:anchor="_Toc241392131" w:history="1">
+          <w:hyperlink w:anchor="_Toc241395765" w:history="1">
             <w:r>
               <w:rPr>
                 <w:rStyle w:val="Hyperlink"/>
@@ -6750,7 +6750,7 @@
               <w:rPr>
                 <w:noProof/>
               </w:rPr>
-              <w:instrText xml:space="preserve"> PAGEREF _Toc241392131 \h </w:instrText>
+              <w:instrText xml:space="preserve"> PAGEREF _Toc241395765 \h </w:instrText>
             </w:r>
             <w:r>
               <w:rPr>
@@ -6792,7 +6792,7 @@
               <w14:ligatures w14:val="standardContextual"/>
             </w:rPr>
           </w:pPr>
-          <w:hyperlink w:anchor="_Toc241392132" w:history="1">
+          <w:hyperlink w:anchor="_Toc241395766" w:history="1">
             <w:r>
               <w:rPr>
                 <w:rStyle w:val="Hyperlink"/>
@@ -6816,7 +6816,7 @@
               <w:rPr>
                 <w:noProof/>
               </w:rPr>
-              <w:instrText xml:space="preserve"> PAGEREF _Toc241392132 \h </w:instrText>
+              <w:instrText xml:space="preserve"> PAGEREF _Toc241395766 \h </w:instrText>
             </w:r>
             <w:r>
               <w:rPr>
@@ -6858,7 +6858,7 @@
               <w14:ligatures w14:val="standardContextual"/>
             </w:rPr>
           </w:pPr>
-          <w:hyperlink w:anchor="_Toc241392133" w:history="1">
+          <w:hyperlink w:anchor="_Toc241395767" w:history="1">
             <w:r>
               <w:rPr>
                 <w:rStyle w:val="Hyperlink"/>
@@ -6882,7 +6882,7 @@
               <w:rPr>
                 <w:noProof/>
               </w:rPr>
-              <w:instrText xml:space="preserve"> PAGEREF _Toc241392133 \h </w:instrText>
+              <w:instrText xml:space="preserve"> PAGEREF _Toc241395767 \h </w:instrText>
             </w:r>
             <w:r>
               <w:rPr>
@@ -6924,7 +6924,7 @@
               <w14:ligatures w14:val="standardContextual"/>
             </w:rPr>
           </w:pPr>
-          <w:hyperlink w:anchor="_Toc241392134" w:history="1">
+          <w:hyperlink w:anchor="_Toc241395768" w:history="1">
             <w:r>
               <w:rPr>
                 <w:rStyle w:val="Hyperlink"/>
@@ -6948,7 +6948,7 @@
               <w:rPr>
                 <w:noProof/>
               </w:rPr>
-              <w:instrText xml:space="preserve"> PAGEREF _Toc241392134 \h </w:instrText>
+              <w:instrText xml:space="preserve"> PAGEREF _Toc241395768 \h </w:instrText>
             </w:r>
             <w:r>
               <w:rPr>
@@ -6990,7 +6990,7 @@
               <w14:ligatures w14:val="standardContextual"/>
             </w:rPr>
           </w:pPr>
-          <w:hyperlink w:anchor="_Toc241392135" w:history="1">
+          <w:hyperlink w:anchor="_Toc241395769" w:history="1">
             <w:r>
               <w:rPr>
                 <w:rStyle w:val="Hyperlink"/>
@@ -7014,7 +7014,7 @@
               <w:rPr>
                 <w:noProof/>
               </w:rPr>
-              <w:instrText xml:space="preserve"> PAGEREF _Toc241392135 \h </w:instrText>
+              <w:instrText xml:space="preserve"> PAGEREF _Toc241395769 \h </w:instrText>
             </w:r>
             <w:r>
               <w:rPr>
@@ -7056,7 +7056,7 @@
               <w14:ligatures w14:val="standardContextual"/>
             </w:rPr>
           </w:pPr>
-          <w:hyperlink w:anchor="_Toc241392136" w:history="1">
+          <w:hyperlink w:anchor="_Toc241395770" w:history="1">
             <w:r>
               <w:rPr>
                 <w:rStyle w:val="Hyperlink"/>
@@ -7080,7 +7080,7 @@
               <w:rPr>
                 <w:noProof/>
               </w:rPr>
-              <w:instrText xml:space="preserve"> PAGEREF _Toc241392136 \h </w:instrText>
+              <w:instrText xml:space="preserve"> PAGEREF _Toc241395770 \h </w:instrText>
             </w:r>
             <w:r>
               <w:rPr>
@@ -7122,7 +7122,7 @@
               <w14:ligatures w14:val="standardContextual"/>
             </w:rPr>
           </w:pPr>
-          <w:hyperlink w:anchor="_Toc241392137" w:history="1">
+          <w:hyperlink w:anchor="_Toc241395771" w:history="1">
             <w:r>
               <w:rPr>
                 <w:rStyle w:val="Hyperlink"/>
@@ -7146,7 +7146,7 @@
               <w:rPr>
                 <w:noProof/>
               </w:rPr>
-              <w:instrText xml:space="preserve"> PAGEREF _Toc241392137 \h </w:instrText>
+              <w:instrText xml:space="preserve"> PAGEREF _Toc241395771 \h </w:instrText>
             </w:r>
             <w:r>
               <w:rPr>
@@ -7188,7 +7188,7 @@
               <w14:ligatures w14:val="standardContextual"/>
             </w:rPr>
           </w:pPr>
-          <w:hyperlink w:anchor="_Toc241392138" w:history="1">
+          <w:hyperlink w:anchor="_Toc241395772" w:history="1">
             <w:r>
               <w:rPr>
                 <w:rStyle w:val="Hyperlink"/>
@@ -7212,7 +7212,7 @@
               <w:rPr>
                 <w:noProof/>
               </w:rPr>
-              <w:instrText xml:space="preserve"> PAGEREF _Toc241392138 \h </w:instrText>
+              <w:instrText xml:space="preserve"> PAGEREF _Toc241395772 \h </w:instrText>
             </w:r>
             <w:r>
               <w:rPr>
@@ -7254,7 +7254,7 @@
               <w14:ligatures w14:val="standardContextual"/>
             </w:rPr>
           </w:pPr>
-          <w:hyperlink w:anchor="_Toc241392139" w:history="1">
+          <w:hyperlink w:anchor="_Toc241395773" w:history="1">
             <w:r>
               <w:rPr>
                 <w:rStyle w:val="Hyperlink"/>
@@ -7278,7 +7278,7 @@
               <w:rPr>
                 <w:noProof/>
               </w:rPr>
-              <w:instrText xml:space="preserve"> PAGEREF _Toc241392139 \h </w:instrText>
+              <w:instrText xml:space="preserve"> PAGEREF _Toc241395773 \h </w:instrText>
             </w:r>
             <w:r>
               <w:rPr>
@@ -7320,7 +7320,7 @@
               <w14:ligatures w14:val="standardContextual"/>
             </w:rPr>
           </w:pPr>
-          <w:hyperlink w:anchor="_Toc241392140" w:history="1">
+          <w:hyperlink w:anchor="_Toc241395774" w:history="1">
             <w:r>
               <w:rPr>
                 <w:rStyle w:val="Hyperlink"/>
@@ -7344,7 +7344,7 @@
               <w:rPr>
                 <w:noProof/>
               </w:rPr>
-              <w:instrText xml:space="preserve"> PAGEREF _Toc241392140 \h </w:instrText>
+              <w:instrText xml:space="preserve"> PAGEREF _Toc241395774 \h </w:instrText>
             </w:r>
             <w:r>
               <w:rPr>
@@ -7386,7 +7386,7 @@
               <w14:ligatures w14:val="standardContextual"/>
             </w:rPr>
           </w:pPr>
-          <w:hyperlink w:anchor="_Toc241392141" w:history="1">
+          <w:hyperlink w:anchor="_Toc241395775" w:history="1">
             <w:r>
               <w:rPr>
                 <w:rStyle w:val="Hyperlink"/>
@@ -7410,7 +7410,7 @@
               <w:rPr>
                 <w:noProof/>
               </w:rPr>
-              <w:instrText xml:space="preserve"> PAGEREF _Toc241392141 \h </w:instrText>
+              <w:instrText xml:space="preserve"> PAGEREF _Toc241395775 \h </w:instrText>
             </w:r>
             <w:r>
               <w:rPr>
@@ -7463,7 +7463,7 @@
         <w:pStyle w:val="Kop1"/>
         <w:pageBreakBefore/>
       </w:pPr>
-      <w:bookmarkStart w:id="1" w:name="_Toc241392033"/>
+      <w:bookmarkStart w:id="1" w:name="_Toc241395667"/>
       <w:r>
         <w:lastRenderedPageBreak/>
         <w:t>Intended Use and Your Data</w:t>
@@ -7524,7 +7524,7 @@
       <w:pPr>
         <w:pStyle w:val="Kop2"/>
       </w:pPr>
-      <w:bookmarkStart w:id="2" w:name="_Toc241392034"/>
+      <w:bookmarkStart w:id="2" w:name="_Toc241395668"/>
       <w:r>
         <w:t>What the App Does Not Do</w:t>
       </w:r>
@@ -8065,7 +8065,7 @@
         <w:pStyle w:val="Kop1"/>
         <w:pageBreakBefore/>
       </w:pPr>
-      <w:bookmarkStart w:id="3" w:name="_Toc241392035"/>
+      <w:bookmarkStart w:id="3" w:name="_Toc241395669"/>
       <w:r>
         <w:lastRenderedPageBreak/>
         <w:t>Getting Started</w:t>
@@ -8076,7 +8076,7 @@
       <w:pPr>
         <w:pStyle w:val="Kop2"/>
       </w:pPr>
-      <w:bookmarkStart w:id="4" w:name="_Toc241392036"/>
+      <w:bookmarkStart w:id="4" w:name="_Toc241395670"/>
       <w:r>
         <w:t>Opening the Public App</w:t>
       </w:r>
@@ -8094,7 +8094,7 @@
       <w:pPr>
         <w:pStyle w:val="Kop2"/>
       </w:pPr>
-      <w:bookmarkStart w:id="5" w:name="_Toc241392037"/>
+      <w:bookmarkStart w:id="5" w:name="_Toc241395671"/>
       <w:r>
         <w:t>Installing the App on Your Own Computer</w:t>
       </w:r>
@@ -8174,7 +8174,7 @@
       <w:pPr>
         <w:pStyle w:val="Kop2"/>
       </w:pPr>
-      <w:bookmarkStart w:id="6" w:name="_Toc241392038"/>
+      <w:bookmarkStart w:id="6" w:name="_Toc241395672"/>
       <w:r>
         <w:t>The Hub Screen</w:t>
       </w:r>
@@ -8801,7 +8801,7 @@
       <w:pPr>
         <w:pStyle w:val="Kop2"/>
       </w:pPr>
-      <w:bookmarkStart w:id="7" w:name="_Toc241392039"/>
+      <w:bookmarkStart w:id="7" w:name="_Toc241395673"/>
       <w:r>
         <w:t>Getting Help Inside the App</w:t>
       </w:r>
@@ -8819,7 +8819,7 @@
       <w:pPr>
         <w:pStyle w:val="Kop2"/>
       </w:pPr>
-      <w:bookmarkStart w:id="8" w:name="_Toc241392040"/>
+      <w:bookmarkStart w:id="8" w:name="_Toc241395674"/>
       <w:r>
         <w:t>Saving Your Work</w:t>
       </w:r>
@@ -8838,7 +8838,7 @@
         <w:pStyle w:val="Kop1"/>
         <w:pageBreakBefore/>
       </w:pPr>
-      <w:bookmarkStart w:id="9" w:name="_Toc241392041"/>
+      <w:bookmarkStart w:id="9" w:name="_Toc241395675"/>
       <w:r>
         <w:lastRenderedPageBreak/>
         <w:t>Tutorials</w:t>
@@ -8857,7 +8857,7 @@
       <w:pPr>
         <w:pStyle w:val="Kop2"/>
       </w:pPr>
-      <w:bookmarkStart w:id="10" w:name="_Toc241392042"/>
+      <w:bookmarkStart w:id="10" w:name="_Toc241395676"/>
       <w:r>
         <w:t>Tutorial 1: A First Analysis Without a File</w:t>
       </w:r>
@@ -8996,7 +8996,7 @@
       <w:pPr>
         <w:pStyle w:val="Kop2"/>
       </w:pPr>
-      <w:bookmarkStart w:id="11" w:name="_Toc241392043"/>
+      <w:bookmarkStart w:id="11" w:name="_Toc241395677"/>
       <w:r>
         <w:t>Tutorial 2: Uploading Data with BLQ Results</w:t>
       </w:r>
@@ -9215,7 +9215,7 @@
       <w:pPr>
         <w:pStyle w:val="Kop2"/>
       </w:pPr>
-      <w:bookmarkStart w:id="12" w:name="_Toc241392044"/>
+      <w:bookmarkStart w:id="12" w:name="_Toc241395678"/>
       <w:r>
         <w:t>Tutorial 3: All Subjects at Once (Theophylline)</w:t>
       </w:r>
@@ -9383,7 +9383,7 @@
       <w:pPr>
         <w:pStyle w:val="Kop2"/>
       </w:pPr>
-      <w:bookmarkStart w:id="13" w:name="_Toc241392045"/>
+      <w:bookmarkStart w:id="13" w:name="_Toc241395679"/>
       <w:r>
         <w:t>Tutorial 4: Bioequivalence</w:t>
       </w:r>
@@ -9568,7 +9568,7 @@
       <w:pPr>
         <w:pStyle w:val="Kop2"/>
       </w:pPr>
-      <w:bookmarkStart w:id="14" w:name="_Toc241392046"/>
+      <w:bookmarkStart w:id="14" w:name="_Toc241395680"/>
       <w:r>
         <w:lastRenderedPageBreak/>
         <w:t>Tutorial 5: Planning a Study</w:t>
@@ -9728,7 +9728,7 @@
       <w:pPr>
         <w:pStyle w:val="Kop2"/>
       </w:pPr>
-      <w:bookmarkStart w:id="15" w:name="_Toc241392047"/>
+      <w:bookmarkStart w:id="15" w:name="_Toc241395681"/>
       <w:r>
         <w:t>Tutorial 6: Partial AUCs</w:t>
       </w:r>
@@ -9860,7 +9860,7 @@
       <w:pPr>
         <w:pStyle w:val="Kop2"/>
       </w:pPr>
-      <w:bookmarkStart w:id="16" w:name="_Toc241392048"/>
+      <w:bookmarkStart w:id="16" w:name="_Toc241395682"/>
       <w:r>
         <w:t>Tutorial 7: Figures</w:t>
       </w:r>
@@ -9966,7 +9966,7 @@
       <w:pPr>
         <w:pStyle w:val="Kop2"/>
       </w:pPr>
-      <w:bookmarkStart w:id="17" w:name="_Toc241392049"/>
+      <w:bookmarkStart w:id="17" w:name="_Toc241395683"/>
       <w:r>
         <w:t>Answer Key</w:t>
       </w:r>
@@ -10075,7 +10075,7 @@
         <w:pStyle w:val="Kop1"/>
         <w:pageBreakBefore/>
       </w:pPr>
-      <w:bookmarkStart w:id="18" w:name="_Toc241392050"/>
+      <w:bookmarkStart w:id="18" w:name="_Toc241395684"/>
       <w:r>
         <w:lastRenderedPageBreak/>
         <w:t>Preparing Your Data and Study Types</w:t>
@@ -10086,7 +10086,7 @@
       <w:pPr>
         <w:pStyle w:val="Kop2"/>
       </w:pPr>
-      <w:bookmarkStart w:id="19" w:name="_Toc241392051"/>
+      <w:bookmarkStart w:id="19" w:name="_Toc241395685"/>
       <w:r>
         <w:t>General Format Rules</w:t>
       </w:r>
@@ -10181,7 +10181,7 @@
       <w:pPr>
         <w:pStyle w:val="Kop2"/>
       </w:pPr>
-      <w:bookmarkStart w:id="20" w:name="_Toc241392052"/>
+      <w:bookmarkStart w:id="20" w:name="_Toc241395686"/>
       <w:r>
         <w:t>Scenario 1: Single Subject</w:t>
       </w:r>
@@ -10880,7 +10880,7 @@
       <w:pPr>
         <w:pStyle w:val="Kop2"/>
       </w:pPr>
-      <w:bookmarkStart w:id="21" w:name="_Toc241392053"/>
+      <w:bookmarkStart w:id="21" w:name="_Toc241395687"/>
       <w:r>
         <w:t>Scenario 2: Multiple Subjects, Same Dose</w:t>
       </w:r>
@@ -11490,7 +11490,7 @@
       <w:pPr>
         <w:pStyle w:val="Kop2"/>
       </w:pPr>
-      <w:bookmarkStart w:id="22" w:name="_Toc241392054"/>
+      <w:bookmarkStart w:id="22" w:name="_Toc241395688"/>
       <w:r>
         <w:t>Scenario 3: Multiple Subjects, Different Doses</w:t>
       </w:r>
@@ -11508,7 +11508,7 @@
       <w:pPr>
         <w:pStyle w:val="Kop2"/>
       </w:pPr>
-      <w:bookmarkStart w:id="23" w:name="_Toc241392055"/>
+      <w:bookmarkStart w:id="23" w:name="_Toc241395689"/>
       <w:r>
         <w:t>Scenario 4: Standard 2-Period Crossover (BE)</w:t>
       </w:r>
@@ -12380,7 +12380,7 @@
       <w:pPr>
         <w:pStyle w:val="Kop2"/>
       </w:pPr>
-      <w:bookmarkStart w:id="24" w:name="_Toc241392056"/>
+      <w:bookmarkStart w:id="24" w:name="_Toc241395690"/>
       <w:r>
         <w:t>Scenario 5: Replicate Designs and Paired Comparison</w:t>
       </w:r>
@@ -12398,7 +12398,7 @@
       <w:pPr>
         <w:pStyle w:val="Kop2"/>
       </w:pPr>
-      <w:bookmarkStart w:id="25" w:name="_Toc241392057"/>
+      <w:bookmarkStart w:id="25" w:name="_Toc241395691"/>
       <w:r>
         <w:t>Scenario 6: Parallel-Group BE</w:t>
       </w:r>
@@ -12416,7 +12416,7 @@
       <w:pPr>
         <w:pStyle w:val="Kop2"/>
       </w:pPr>
-      <w:bookmarkStart w:id="26" w:name="_Toc241392058"/>
+      <w:bookmarkStart w:id="26" w:name="_Toc241395692"/>
       <w:r>
         <w:t>Scenario 7: Steady-State PK</w:t>
       </w:r>
@@ -12450,7 +12450,7 @@
       <w:pPr>
         <w:pStyle w:val="Kop2"/>
       </w:pPr>
-      <w:bookmarkStart w:id="27" w:name="_Toc241392059"/>
+      <w:bookmarkStart w:id="27" w:name="_Toc241395693"/>
       <w:r>
         <w:t>Scenario 8: Drug–Drug Interaction Study</w:t>
       </w:r>
@@ -12476,7 +12476,7 @@
       <w:pPr>
         <w:pStyle w:val="Kop2"/>
       </w:pPr>
-      <w:bookmarkStart w:id="28" w:name="_Toc241392060"/>
+      <w:bookmarkStart w:id="28" w:name="_Toc241395694"/>
       <w:r>
         <w:lastRenderedPageBreak/>
         <w:t>Scenario 9: CDISC ADNCA Dataset</w:t>
@@ -12535,7 +12535,7 @@
       <w:pPr>
         <w:pStyle w:val="Kop2"/>
       </w:pPr>
-      <w:bookmarkStart w:id="29" w:name="_Toc241392061"/>
+      <w:bookmarkStart w:id="29" w:name="_Toc241395695"/>
       <w:r>
         <w:t>Scenario 10: IV Bolus and IV Infusion</w:t>
       </w:r>
@@ -12561,7 +12561,7 @@
       <w:pPr>
         <w:pStyle w:val="Kop2"/>
       </w:pPr>
-      <w:bookmarkStart w:id="30" w:name="_Toc241392062"/>
+      <w:bookmarkStart w:id="30" w:name="_Toc241395696"/>
       <w:r>
         <w:t>Scenario 11: Single Ascending Dose and Dose Proportionality</w:t>
       </w:r>
@@ -12579,7 +12579,7 @@
       <w:pPr>
         <w:pStyle w:val="Kop2"/>
       </w:pPr>
-      <w:bookmarkStart w:id="31" w:name="_Toc241392063"/>
+      <w:bookmarkStart w:id="31" w:name="_Toc241395697"/>
       <w:r>
         <w:t>Scenario 12: Multiple Dosing and Accumulation</w:t>
       </w:r>
@@ -12625,7 +12625,7 @@
       <w:pPr>
         <w:pStyle w:val="Kop2"/>
       </w:pPr>
-      <w:bookmarkStart w:id="32" w:name="_Toc241392064"/>
+      <w:bookmarkStart w:id="32" w:name="_Toc241395698"/>
       <w:r>
         <w:t>Scenario 13: Food Effect</w:t>
       </w:r>
@@ -12643,7 +12643,7 @@
       <w:pPr>
         <w:pStyle w:val="Kop2"/>
       </w:pPr>
-      <w:bookmarkStart w:id="33" w:name="_Toc241392065"/>
+      <w:bookmarkStart w:id="33" w:name="_Toc241395699"/>
       <w:r>
         <w:t>Scenario 14: Metabolites and Several Analytes</w:t>
       </w:r>
@@ -12661,7 +12661,7 @@
       <w:pPr>
         <w:pStyle w:val="Kop2"/>
       </w:pPr>
-      <w:bookmarkStart w:id="34" w:name="_Toc241392066"/>
+      <w:bookmarkStart w:id="34" w:name="_Toc241395700"/>
       <w:r>
         <w:t>Scenario 15: Absolute and Relative Bioavailability</w:t>
       </w:r>
@@ -12679,7 +12679,7 @@
       <w:pPr>
         <w:pStyle w:val="Kop2"/>
       </w:pPr>
-      <w:bookmarkStart w:id="35" w:name="_Toc241392067"/>
+      <w:bookmarkStart w:id="35" w:name="_Toc241395701"/>
       <w:r>
         <w:t>Studies with Three or More Treatments</w:t>
       </w:r>
@@ -12697,7 +12697,7 @@
       <w:pPr>
         <w:pStyle w:val="Kop2"/>
       </w:pPr>
-      <w:bookmarkStart w:id="36" w:name="_Toc241392068"/>
+      <w:bookmarkStart w:id="36" w:name="_Toc241395702"/>
       <w:r>
         <w:t>BLQ Handling</w:t>
       </w:r>
@@ -13527,7 +13527,7 @@
       <w:pPr>
         <w:pStyle w:val="Kop2"/>
       </w:pPr>
-      <w:bookmarkStart w:id="37" w:name="_Toc241392069"/>
+      <w:bookmarkStart w:id="37" w:name="_Toc241395703"/>
       <w:r>
         <w:t>Common Mistakes</w:t>
       </w:r>
@@ -13665,7 +13665,7 @@
         <w:pStyle w:val="Kop1"/>
         <w:pageBreakBefore/>
       </w:pPr>
-      <w:bookmarkStart w:id="38" w:name="_Toc241392070"/>
+      <w:bookmarkStart w:id="38" w:name="_Toc241395704"/>
       <w:r>
         <w:lastRenderedPageBreak/>
         <w:t>Using the App</w:t>
@@ -13684,7 +13684,7 @@
       <w:pPr>
         <w:pStyle w:val="Kop2"/>
       </w:pPr>
-      <w:bookmarkStart w:id="39" w:name="_Toc241392071"/>
+      <w:bookmarkStart w:id="39" w:name="_Toc241395705"/>
       <w:r>
         <w:t>Path 1: Plan a Study</w:t>
       </w:r>
@@ -14157,7 +14157,7 @@
       <w:pPr>
         <w:pStyle w:val="Kop2"/>
       </w:pPr>
-      <w:bookmarkStart w:id="40" w:name="_Toc241392072"/>
+      <w:bookmarkStart w:id="40" w:name="_Toc241395706"/>
       <w:r>
         <w:lastRenderedPageBreak/>
         <w:t>Path 2: Upload &amp; Check Data</w:t>
@@ -14230,7 +14230,7 @@
       <w:pPr>
         <w:pStyle w:val="Kop2"/>
       </w:pPr>
-      <w:bookmarkStart w:id="41" w:name="_Toc241392073"/>
+      <w:bookmarkStart w:id="41" w:name="_Toc241395707"/>
       <w:r>
         <w:t>Path 3: Visualize Data</w:t>
       </w:r>
@@ -14487,7 +14487,7 @@
       <w:pPr>
         <w:pStyle w:val="Kop2"/>
       </w:pPr>
-      <w:bookmarkStart w:id="42" w:name="_Toc241392074"/>
+      <w:bookmarkStart w:id="42" w:name="_Toc241395708"/>
       <w:r>
         <w:t>Path 4: One Subject at a Time</w:t>
       </w:r>
@@ -14663,7 +14663,7 @@
       <w:pPr>
         <w:pStyle w:val="Kop2"/>
       </w:pPr>
-      <w:bookmarkStart w:id="43" w:name="_Toc241392075"/>
+      <w:bookmarkStart w:id="43" w:name="_Toc241395709"/>
       <w:r>
         <w:t>Path 5: All Subjects (Batch)</w:t>
       </w:r>
@@ -14938,7 +14938,7 @@
       <w:pPr>
         <w:pStyle w:val="Kop2"/>
       </w:pPr>
-      <w:bookmarkStart w:id="44" w:name="_Toc241392076"/>
+      <w:bookmarkStart w:id="44" w:name="_Toc241395710"/>
       <w:r>
         <w:t>Path 6: Bioequivalence</w:t>
       </w:r>
@@ -15789,7 +15789,7 @@
       <w:pPr>
         <w:pStyle w:val="Kop2"/>
       </w:pPr>
-      <w:bookmarkStart w:id="45" w:name="_Toc241392077"/>
+      <w:bookmarkStart w:id="45" w:name="_Toc241395711"/>
       <w:r>
         <w:t>Analysing Drug–Drug Interaction Studies</w:t>
       </w:r>
@@ -15918,7 +15918,7 @@
       <w:pPr>
         <w:pStyle w:val="Kop2"/>
       </w:pPr>
-      <w:bookmarkStart w:id="46" w:name="_Toc241392078"/>
+      <w:bookmarkStart w:id="46" w:name="_Toc241395712"/>
       <w:r>
         <w:t>Complete Analysis Record</w:t>
       </w:r>
@@ -16333,7 +16333,7 @@
         <w:pStyle w:val="Kop1"/>
         <w:pageBreakBefore/>
       </w:pPr>
-      <w:bookmarkStart w:id="47" w:name="_Toc241392079"/>
+      <w:bookmarkStart w:id="47" w:name="_Toc241395713"/>
       <w:r>
         <w:lastRenderedPageBreak/>
         <w:t>Reading Your Results</w:t>
@@ -16344,7 +16344,7 @@
       <w:pPr>
         <w:pStyle w:val="Kop2"/>
       </w:pPr>
-      <w:bookmarkStart w:id="48" w:name="_Toc241392080"/>
+      <w:bookmarkStart w:id="48" w:name="_Toc241395714"/>
       <w:r>
         <w:t>The Data Quality Report</w:t>
       </w:r>
@@ -16729,7 +16729,7 @@
       <w:pPr>
         <w:pStyle w:val="Kop2"/>
       </w:pPr>
-      <w:bookmarkStart w:id="49" w:name="_Toc241392081"/>
+      <w:bookmarkStart w:id="49" w:name="_Toc241395715"/>
       <w:r>
         <w:t>The Parameter Table</w:t>
       </w:r>
@@ -16747,7 +16747,7 @@
       <w:pPr>
         <w:pStyle w:val="Kop2"/>
       </w:pPr>
-      <w:bookmarkStart w:id="50" w:name="_Toc241392082"/>
+      <w:bookmarkStart w:id="50" w:name="_Toc241395716"/>
       <w:r>
         <w:t>Summary Statistics</w:t>
       </w:r>
@@ -17187,7 +17187,7 @@
       <w:pPr>
         <w:pStyle w:val="Kop2"/>
       </w:pPr>
-      <w:bookmarkStart w:id="51" w:name="_Toc241392083"/>
+      <w:bookmarkStart w:id="51" w:name="_Toc241395717"/>
       <w:r>
         <w:t>The Bioequivalence Table and Forest Plot</w:t>
       </w:r>
@@ -17796,7 +17796,7 @@
       <w:pPr>
         <w:pStyle w:val="Kop2"/>
       </w:pPr>
-      <w:bookmarkStart w:id="52" w:name="_Toc241392084"/>
+      <w:bookmarkStart w:id="52" w:name="_Toc241395718"/>
       <w:r>
         <w:t>Judging the Terminal Phase</w:t>
       </w:r>
@@ -17891,7 +17891,7 @@
       <w:pPr>
         <w:pStyle w:val="Kop2"/>
       </w:pPr>
-      <w:bookmarkStart w:id="53" w:name="_Toc241392085"/>
+      <w:bookmarkStart w:id="53" w:name="_Toc241395719"/>
       <w:r>
         <w:t>Checking Plausibility</w:t>
       </w:r>
@@ -18021,7 +18021,7 @@
         <w:pStyle w:val="Kop1"/>
         <w:pageBreakBefore/>
       </w:pPr>
-      <w:bookmarkStart w:id="54" w:name="_Toc241392086"/>
+      <w:bookmarkStart w:id="54" w:name="_Toc241395720"/>
       <w:r>
         <w:lastRenderedPageBreak/>
         <w:t>Working on a Controlled Installation</w:t>
@@ -18040,7 +18040,7 @@
       <w:pPr>
         <w:pStyle w:val="Kop2"/>
       </w:pPr>
-      <w:bookmarkStart w:id="55" w:name="_Toc241392087"/>
+      <w:bookmarkStart w:id="55" w:name="_Toc241395721"/>
       <w:r>
         <w:t>What Is Different on a Controlled Installation</w:t>
       </w:r>
@@ -18661,7 +18661,7 @@
       <w:pPr>
         <w:pStyle w:val="Kop2"/>
       </w:pPr>
-      <w:bookmarkStart w:id="56" w:name="_Toc241392088"/>
+      <w:bookmarkStart w:id="56" w:name="_Toc241395722"/>
       <w:r>
         <w:t>Signing In for the First Time</w:t>
       </w:r>
@@ -18720,7 +18720,7 @@
       <w:pPr>
         <w:pStyle w:val="Kop2"/>
       </w:pPr>
-      <w:bookmarkStart w:id="57" w:name="_Toc241392089"/>
+      <w:bookmarkStart w:id="57" w:name="_Toc241395723"/>
       <w:r>
         <w:lastRenderedPageBreak/>
         <w:t>Changing Your Password</w:t>
@@ -18764,7 +18764,7 @@
       <w:pPr>
         <w:pStyle w:val="Kop2"/>
       </w:pPr>
-      <w:bookmarkStart w:id="58" w:name="_Toc241392090"/>
+      <w:bookmarkStart w:id="58" w:name="_Toc241395724"/>
       <w:r>
         <w:t>Staying Signed In</w:t>
       </w:r>
@@ -18808,7 +18808,7 @@
       <w:pPr>
         <w:pStyle w:val="Kop2"/>
       </w:pPr>
-      <w:bookmarkStart w:id="59" w:name="_Toc241392091"/>
+      <w:bookmarkStart w:id="59" w:name="_Toc241395725"/>
       <w:r>
         <w:t>Creating a Record for Review</w:t>
       </w:r>
@@ -18893,7 +18893,7 @@
       <w:pPr>
         <w:pStyle w:val="Kop2"/>
       </w:pPr>
-      <w:bookmarkStart w:id="60" w:name="_Toc241392092"/>
+      <w:bookmarkStart w:id="60" w:name="_Toc241395726"/>
       <w:r>
         <w:t>Reviewing and Signing a Record</w:t>
       </w:r>
@@ -19081,7 +19081,7 @@
       <w:pPr>
         <w:pStyle w:val="Kop2"/>
       </w:pPr>
-      <w:bookmarkStart w:id="61" w:name="_Toc241392093"/>
+      <w:bookmarkStart w:id="61" w:name="_Toc241395727"/>
       <w:r>
         <w:t>The Signature Sheet</w:t>
       </w:r>
@@ -19143,7 +19143,7 @@
       <w:pPr>
         <w:pStyle w:val="Kop2"/>
       </w:pPr>
-      <w:bookmarkStart w:id="62" w:name="_Toc241392094"/>
+      <w:bookmarkStart w:id="62" w:name="_Toc241395728"/>
       <w:r>
         <w:t>Reviewing the Audit Trail</w:t>
       </w:r>
@@ -19254,7 +19254,7 @@
       <w:pPr>
         <w:pStyle w:val="Kop2"/>
       </w:pPr>
-      <w:bookmarkStart w:id="63" w:name="_Toc241392095"/>
+      <w:bookmarkStart w:id="63" w:name="_Toc241395729"/>
       <w:r>
         <w:t>For Inspectors</w:t>
       </w:r>
@@ -19272,7 +19272,7 @@
       <w:pPr>
         <w:pStyle w:val="Kop2"/>
       </w:pPr>
-      <w:bookmarkStart w:id="64" w:name="_Toc241392096"/>
+      <w:bookmarkStart w:id="64" w:name="_Toc241395730"/>
       <w:r>
         <w:t>Tutorial 8: From Analysis to Approved Record</w:t>
       </w:r>
@@ -19441,7 +19441,7 @@
         <w:pStyle w:val="Kop1"/>
         <w:pageBreakBefore/>
       </w:pPr>
-      <w:bookmarkStart w:id="65" w:name="_Toc241392097"/>
+      <w:bookmarkStart w:id="65" w:name="_Toc241395731"/>
       <w:r>
         <w:lastRenderedPageBreak/>
         <w:t>Using NCA Assistant in a Regulated Environment</w:t>
@@ -19460,7 +19460,7 @@
       <w:pPr>
         <w:pStyle w:val="Kop2"/>
       </w:pPr>
-      <w:bookmarkStart w:id="66" w:name="_Toc241392098"/>
+      <w:bookmarkStart w:id="66" w:name="_Toc241395732"/>
       <w:r>
         <w:t>Status and Scope</w:t>
       </w:r>
@@ -19478,7 +19478,7 @@
       <w:pPr>
         <w:pStyle w:val="Kop2"/>
       </w:pPr>
-      <w:bookmarkStart w:id="67" w:name="_Toc241392099"/>
+      <w:bookmarkStart w:id="67" w:name="_Toc241395733"/>
       <w:r>
         <w:t>Which Rules Apply</w:t>
       </w:r>
@@ -19496,7 +19496,7 @@
       <w:pPr>
         <w:pStyle w:val="Kop2"/>
       </w:pPr>
-      <w:bookmarkStart w:id="68" w:name="_Toc241392100"/>
+      <w:bookmarkStart w:id="68" w:name="_Toc241395734"/>
       <w:r>
         <w:t>Installing a Qualified Instance</w:t>
       </w:r>
@@ -19514,7 +19514,7 @@
       <w:pPr>
         <w:pStyle w:val="Kop2"/>
       </w:pPr>
-      <w:bookmarkStart w:id="69" w:name="_Toc241392101"/>
+      <w:bookmarkStart w:id="69" w:name="_Toc241395735"/>
       <w:r>
         <w:t>Qualification</w:t>
       </w:r>
@@ -19572,7 +19572,7 @@
       <w:pPr>
         <w:pStyle w:val="Kop2"/>
       </w:pPr>
-      <w:bookmarkStart w:id="70" w:name="_Toc241392102"/>
+      <w:bookmarkStart w:id="70" w:name="_Toc241395736"/>
       <w:r>
         <w:lastRenderedPageBreak/>
         <w:t>Controls on a Controlled Installation, and Your Responsibilities</w:t>
@@ -19717,7 +19717,7 @@
       <w:pPr>
         <w:pStyle w:val="Kop2"/>
       </w:pPr>
-      <w:bookmarkStart w:id="71" w:name="_Toc241392103"/>
+      <w:bookmarkStart w:id="71" w:name="_Toc241395737"/>
       <w:r>
         <w:lastRenderedPageBreak/>
         <w:t>Before Each Analysis</w:t>
@@ -19736,7 +19736,7 @@
       <w:pPr>
         <w:pStyle w:val="Kop2"/>
       </w:pPr>
-      <w:bookmarkStart w:id="72" w:name="_Toc241392104"/>
+      <w:bookmarkStart w:id="72" w:name="_Toc241395738"/>
       <w:r>
         <w:t>Exclusions, Outliers and Deviations</w:t>
       </w:r>
@@ -19810,7 +19810,7 @@
       <w:pPr>
         <w:pStyle w:val="Kop2"/>
       </w:pPr>
-      <w:bookmarkStart w:id="73" w:name="_Toc241392105"/>
+      <w:bookmarkStart w:id="73" w:name="_Toc241395739"/>
       <w:r>
         <w:t>Reading Verdicts in a Regulated Context</w:t>
       </w:r>
@@ -19852,7 +19852,7 @@
       <w:pPr>
         <w:pStyle w:val="Kop2"/>
       </w:pPr>
-      <w:bookmarkStart w:id="74" w:name="_Toc241392106"/>
+      <w:bookmarkStart w:id="74" w:name="_Toc241395740"/>
       <w:r>
         <w:t>The Analysis Record in a Regulated Context</w:t>
       </w:r>
@@ -19871,7 +19871,7 @@
       <w:pPr>
         <w:pStyle w:val="Kop2"/>
       </w:pPr>
-      <w:bookmarkStart w:id="75" w:name="_Toc241392107"/>
+      <w:bookmarkStart w:id="75" w:name="_Toc241395741"/>
       <w:r>
         <w:t>Reporting and Citing</w:t>
       </w:r>
@@ -19889,7 +19889,7 @@
       <w:pPr>
         <w:pStyle w:val="Kop2"/>
       </w:pPr>
-      <w:bookmarkStart w:id="76" w:name="_Toc241392108"/>
+      <w:bookmarkStart w:id="76" w:name="_Toc241395742"/>
       <w:r>
         <w:t>Archiving and Retention</w:t>
       </w:r>
@@ -19907,7 +19907,7 @@
       <w:pPr>
         <w:pStyle w:val="Kop2"/>
       </w:pPr>
-      <w:bookmarkStart w:id="77" w:name="_Toc241392109"/>
+      <w:bookmarkStart w:id="77" w:name="_Toc241395743"/>
       <w:r>
         <w:t>Upgrades and Change Control</w:t>
       </w:r>
@@ -19925,7 +19925,7 @@
       <w:pPr>
         <w:pStyle w:val="Kop2"/>
       </w:pPr>
-      <w:bookmarkStart w:id="78" w:name="_Toc241392110"/>
+      <w:bookmarkStart w:id="78" w:name="_Toc241395744"/>
       <w:r>
         <w:t>Data Protection</w:t>
       </w:r>
@@ -19943,7 +19943,7 @@
       <w:pPr>
         <w:pStyle w:val="Kop2"/>
       </w:pPr>
-      <w:bookmarkStart w:id="79" w:name="_Toc241392111"/>
+      <w:bookmarkStart w:id="79" w:name="_Toc241395745"/>
       <w:r>
         <w:lastRenderedPageBreak/>
         <w:t>Reporting Problems</w:t>
@@ -19963,7 +19963,7 @@
         <w:pStyle w:val="Kop1"/>
         <w:pageBreakBefore/>
       </w:pPr>
-      <w:bookmarkStart w:id="80" w:name="_Toc241392112"/>
+      <w:bookmarkStart w:id="80" w:name="_Toc241395746"/>
       <w:r>
         <w:lastRenderedPageBreak/>
         <w:t>Introduction to Non-Compartmental Analysis</w:t>
@@ -19974,7 +19974,7 @@
       <w:pPr>
         <w:pStyle w:val="Kop2"/>
       </w:pPr>
-      <w:bookmarkStart w:id="81" w:name="_Toc241392113"/>
+      <w:bookmarkStart w:id="81" w:name="_Toc241395747"/>
       <w:r>
         <w:t>What Is Non-Compartmental Analysis?</w:t>
       </w:r>
@@ -20000,7 +20000,7 @@
       <w:pPr>
         <w:pStyle w:val="Kop2"/>
       </w:pPr>
-      <w:bookmarkStart w:id="82" w:name="_Toc241392114"/>
+      <w:bookmarkStart w:id="82" w:name="_Toc241395748"/>
       <w:r>
         <w:t>The Concentration–Time Curve</w:t>
       </w:r>
@@ -20018,7 +20018,7 @@
       <w:pPr>
         <w:pStyle w:val="Kop2"/>
       </w:pPr>
-      <w:bookmarkStart w:id="83" w:name="_Toc241392115"/>
+      <w:bookmarkStart w:id="83" w:name="_Toc241395749"/>
       <w:r>
         <w:t>Key Pharmacokinetic Parameters</w:t>
       </w:r>
@@ -21117,7 +21117,7 @@
       <w:pPr>
         <w:pStyle w:val="Kop2"/>
       </w:pPr>
-      <w:bookmarkStart w:id="84" w:name="_Toc241392116"/>
+      <w:bookmarkStart w:id="84" w:name="_Toc241395750"/>
       <w:r>
         <w:t>Why NCA Is Used So Widely</w:t>
       </w:r>
@@ -21152,7 +21152,7 @@
       <w:pPr>
         <w:pStyle w:val="Kop2"/>
       </w:pPr>
-      <w:bookmarkStart w:id="85" w:name="_Toc241392117"/>
+      <w:bookmarkStart w:id="85" w:name="_Toc241395751"/>
       <w:r>
         <w:t>When to Use NCA vs. Compartmental Modelling</w:t>
       </w:r>
@@ -21171,7 +21171,7 @@
         <w:pStyle w:val="Kop1"/>
         <w:pageBreakBefore/>
       </w:pPr>
-      <w:bookmarkStart w:id="86" w:name="_Toc241392118"/>
+      <w:bookmarkStart w:id="86" w:name="_Toc241395752"/>
       <w:r>
         <w:lastRenderedPageBreak/>
         <w:t>Theoretical Background</w:t>
@@ -21182,7 +21182,7 @@
       <w:pPr>
         <w:pStyle w:val="Kop2"/>
       </w:pPr>
-      <w:bookmarkStart w:id="87" w:name="_Toc241392119"/>
+      <w:bookmarkStart w:id="87" w:name="_Toc241395753"/>
       <w:r>
         <w:t>Trapezoidal Methods for AUC Calculation</w:t>
       </w:r>
@@ -21332,7 +21332,7 @@
       <w:pPr>
         <w:pStyle w:val="Kop2"/>
       </w:pPr>
-      <w:bookmarkStart w:id="88" w:name="_Toc241392120"/>
+      <w:bookmarkStart w:id="88" w:name="_Toc241395754"/>
       <w:r>
         <w:t>Terminal Phase Characterisation and Half-Life Estimation</w:t>
       </w:r>
@@ -21491,7 +21491,7 @@
       <w:pPr>
         <w:pStyle w:val="Kop2"/>
       </w:pPr>
-      <w:bookmarkStart w:id="89" w:name="_Toc241392121"/>
+      <w:bookmarkStart w:id="89" w:name="_Toc241395755"/>
       <w:r>
         <w:t>BLQ Handling: Pharmacological Rationale</w:t>
       </w:r>
@@ -21513,7 +21513,7 @@
       <w:pPr>
         <w:pStyle w:val="Kop2"/>
       </w:pPr>
-      <w:bookmarkStart w:id="90" w:name="_Toc241392122"/>
+      <w:bookmarkStart w:id="90" w:name="_Toc241395756"/>
       <w:r>
         <w:t>Steady-State Considerations</w:t>
       </w:r>
@@ -21531,7 +21531,7 @@
       <w:pPr>
         <w:pStyle w:val="Kop2"/>
       </w:pPr>
-      <w:bookmarkStart w:id="91" w:name="_Toc241392123"/>
+      <w:bookmarkStart w:id="91" w:name="_Toc241395757"/>
       <w:r>
         <w:t>Partial AUCs: Interpolation and the End of the Interval</w:t>
       </w:r>
@@ -21574,7 +21574,7 @@
         <w:pStyle w:val="Kop1"/>
         <w:pageBreakBefore/>
       </w:pPr>
-      <w:bookmarkStart w:id="92" w:name="_Toc241392124"/>
+      <w:bookmarkStart w:id="92" w:name="_Toc241395758"/>
       <w:r>
         <w:lastRenderedPageBreak/>
         <w:t>Statistical Methods</w:t>
@@ -21585,7 +21585,7 @@
       <w:pPr>
         <w:pStyle w:val="Kop2"/>
       </w:pPr>
-      <w:bookmarkStart w:id="93" w:name="_Toc241392125"/>
+      <w:bookmarkStart w:id="93" w:name="_Toc241395759"/>
       <w:r>
         <w:t>The Two One-Sided Tests (TOST) Procedure</w:t>
       </w:r>
@@ -21654,7 +21654,7 @@
       <w:pPr>
         <w:pStyle w:val="Kop2"/>
       </w:pPr>
-      <w:bookmarkStart w:id="94" w:name="_Toc241392126"/>
+      <w:bookmarkStart w:id="94" w:name="_Toc241395760"/>
       <w:r>
         <w:t>The ANOVA Model for Crossover Designs</w:t>
       </w:r>
@@ -21688,7 +21688,7 @@
       <w:pPr>
         <w:pStyle w:val="Kop2"/>
       </w:pPr>
-      <w:bookmarkStart w:id="95" w:name="_Toc241392127"/>
+      <w:bookmarkStart w:id="95" w:name="_Toc241395761"/>
       <w:r>
         <w:t>Fixed-Effects vs. Mixed-Effects Models</w:t>
       </w:r>
@@ -21714,7 +21714,7 @@
       <w:pPr>
         <w:pStyle w:val="Kop2"/>
       </w:pPr>
-      <w:bookmarkStart w:id="96" w:name="_Toc241392128"/>
+      <w:bookmarkStart w:id="96" w:name="_Toc241395762"/>
       <w:r>
         <w:t>Confidence Interval Construction</w:t>
       </w:r>
@@ -21744,7 +21744,7 @@
       <w:pPr>
         <w:pStyle w:val="Kop2"/>
       </w:pPr>
-      <w:bookmarkStart w:id="97" w:name="_Toc241392129"/>
+      <w:bookmarkStart w:id="97" w:name="_Toc241395763"/>
       <w:r>
         <w:t>Design-Specific Models</w:t>
       </w:r>
@@ -21828,7 +21828,7 @@
       <w:pPr>
         <w:pStyle w:val="Kop2"/>
       </w:pPr>
-      <w:bookmarkStart w:id="98" w:name="_Toc241392130"/>
+      <w:bookmarkStart w:id="98" w:name="_Toc241395764"/>
       <w:r>
         <w:t>Drug–Drug Interaction Analysis</w:t>
       </w:r>
@@ -21854,7 +21854,7 @@
       <w:pPr>
         <w:pStyle w:val="Kop2"/>
       </w:pPr>
-      <w:bookmarkStart w:id="99" w:name="_Toc241392131"/>
+      <w:bookmarkStart w:id="99" w:name="_Toc241395765"/>
       <w:r>
         <w:t>Power and Sample Size for Bioequivalence</w:t>
       </w:r>
@@ -21884,7 +21884,7 @@
       <w:pPr>
         <w:pStyle w:val="Kop2"/>
       </w:pPr>
-      <w:bookmarkStart w:id="100" w:name="_Toc241392132"/>
+      <w:bookmarkStart w:id="100" w:name="_Toc241395766"/>
       <w:r>
         <w:t>Partial AUCs in Bioequivalence</w:t>
       </w:r>
@@ -21950,7 +21950,7 @@
       <w:pPr>
         <w:pStyle w:val="Kop2"/>
       </w:pPr>
-      <w:bookmarkStart w:id="101" w:name="_Toc241392133"/>
+      <w:bookmarkStart w:id="101" w:name="_Toc241395767"/>
       <w:r>
         <w:t>Regulatory Guidelines</w:t>
       </w:r>
@@ -22143,7 +22143,7 @@
         <w:pStyle w:val="Kop1"/>
         <w:pageBreakBefore/>
       </w:pPr>
-      <w:bookmarkStart w:id="102" w:name="_Toc241392134"/>
+      <w:bookmarkStart w:id="102" w:name="_Toc241395768"/>
       <w:r>
         <w:lastRenderedPageBreak/>
         <w:t>Appendices</w:t>
@@ -22154,7 +22154,7 @@
       <w:pPr>
         <w:pStyle w:val="Kop2"/>
       </w:pPr>
-      <w:bookmarkStart w:id="103" w:name="_Toc241392135"/>
+      <w:bookmarkStart w:id="103" w:name="_Toc241395769"/>
       <w:r>
         <w:t>Appendix A: Output Parameters</w:t>
       </w:r>
@@ -30145,7 +30145,7 @@
       <w:pPr>
         <w:pStyle w:val="Kop2"/>
       </w:pPr>
-      <w:bookmarkStart w:id="104" w:name="_Toc241392136"/>
+      <w:bookmarkStart w:id="104" w:name="_Toc241395770"/>
       <w:r>
         <w:lastRenderedPageBreak/>
         <w:t>Appendix B: Glossary</w:t>
@@ -33333,7 +33333,7 @@
       <w:pPr>
         <w:pStyle w:val="Kop2"/>
       </w:pPr>
-      <w:bookmarkStart w:id="105" w:name="_Toc241392137"/>
+      <w:bookmarkStart w:id="105" w:name="_Toc241395771"/>
       <w:r>
         <w:t>Appendix C: Recognised Column Names</w:t>
       </w:r>
@@ -33818,7 +33818,7 @@
       <w:pPr>
         <w:pStyle w:val="Kop2"/>
       </w:pPr>
-      <w:bookmarkStart w:id="106" w:name="_Toc241392138"/>
+      <w:bookmarkStart w:id="106" w:name="_Toc241395772"/>
       <w:r>
         <w:t>Appendix D: Troubleshooting</w:t>
       </w:r>
@@ -34363,7 +34363,7 @@
       <w:pPr>
         <w:pStyle w:val="Kop2"/>
       </w:pPr>
-      <w:bookmarkStart w:id="107" w:name="_Toc241392139"/>
+      <w:bookmarkStart w:id="107" w:name="_Toc241395773"/>
       <w:r>
         <w:t>Appendix E: Setting Up and Administering a Controlled Installation</w:t>
       </w:r>
@@ -35605,7 +35605,7 @@
       <w:pPr>
         <w:pStyle w:val="Kop2"/>
       </w:pPr>
-      <w:bookmarkStart w:id="108" w:name="_Toc241392140"/>
+      <w:bookmarkStart w:id="108" w:name="_Toc241395774"/>
       <w:r>
         <w:t>Appendix F: References</w:t>
       </w:r>
@@ -35832,7 +35832,7 @@
       <w:pPr>
         <w:pStyle w:val="Kop2"/>
       </w:pPr>
-      <w:bookmarkStart w:id="109" w:name="_Toc241392141"/>
+      <w:bookmarkStart w:id="109" w:name="_Toc241395775"/>
       <w:r>
         <w:t>Appendix G: Document Control</w:t>
       </w:r>

</xml_diff>

<commit_message>
Docs and release files for exclusions, half-life flags and example data
URS-DAT-09, URS-NCA-15 and URS-BE-12 with FMEA FM-42 to FM-45; manual
1.9 revised (Leaving Out Data, half-life rules, sensitivity analysis,
tutorials use Load example); READMEs, tooltips, Methods page and the
v1.8.0 version history updated; IQ/OQ/PQ and release files regenerated.
App version stays 1.8.0.

Co-Authored-By: Claude Opus 5.5 <noreply@anthropic.com>
</commit_message>
<xml_diff>
--- a/NCA_Assistant_User_Manual_v1.9.docx
+++ b/NCA_Assistant_User_Manual_v1.9.docx
@@ -9032,8 +9032,40 @@
         </w:rPr>
         <w:t>Simple table (one row per sample)</w:t>
       </w:r>
-      <w:r>
-        <w:t>, and choose example_blq.csv.</w:t>
+      <w:r/>
+      <w:r>
+        <w:rPr/>
+        <w:t xml:space="preserve">. Under </w:t>
+      </w:r>
+      <w:r>
+        <w:rPr>
+          <w:b/>
+        </w:rPr>
+        <w:t>Or use an example</w:t>
+      </w:r>
+      <w:r>
+        <w:rPr/>
+        <w:t xml:space="preserve">, choose example_blq.csv and click </w:t>
+      </w:r>
+      <w:r>
+        <w:rPr>
+          <w:b/>
+        </w:rPr>
+        <w:t>Load example</w:t>
+      </w:r>
+      <w:r>
+        <w:rPr/>
+        <w:t xml:space="preserve">. To see how the file is laid out, click </w:t>
+      </w:r>
+      <w:r>
+        <w:rPr>
+          <w:b/>
+        </w:rPr>
+        <w:t>Download</w:t>
+      </w:r>
+      <w:r>
+        <w:rPr/>
+        <w:t xml:space="preserve"> next to it.</w:t>
       </w:r>
     </w:p>
     <w:p>
@@ -9226,12 +9258,36 @@
         <w:spacing w:after="120" w:line="276" w:lineRule="auto"/>
       </w:pPr>
       <w:r>
-        <w:t xml:space="preserve">1. Download example_theoph.csv and upload it. Map Subject ID to Subject, Time to Time and Concentration to conc. The app also maps the Dose column, which holds mg/kg. Leave </w:t>
+        <w:t xml:space="preserve">1. </w:t>
+      </w:r>
+      <w:r>
+        <w:rPr/>
+        <w:t xml:space="preserve">Under </w:t>
       </w:r>
       <w:r>
         <w:rPr>
           <w:b/>
         </w:rPr>
+        <w:t>Or use an example</w:t>
+      </w:r>
+      <w:r>
+        <w:rPr/>
+        <w:t xml:space="preserve">, choose example_theoph.csv and click </w:t>
+      </w:r>
+      <w:r>
+        <w:rPr>
+          <w:b/>
+        </w:rPr>
+        <w:t>Load example</w:t>
+      </w:r>
+      <w:r>
+        <w:rPr/>
+        <w:t xml:space="preserve">. Map Subject ID to Subject, Time to Time and Concentration to conc. The app also maps the Dose column, which holds mg/kg. Leave </w:t>
+      </w:r>
+      <w:r>
+        <w:rPr>
+          <w:b/>
+        </w:rPr>
         <w:t>LLOQ value</w:t>
       </w:r>
       <w:r>
@@ -9394,7 +9450,31 @@
         <w:spacing w:after="120" w:line="276" w:lineRule="auto"/>
       </w:pPr>
       <w:r>
-        <w:t xml:space="preserve">1. Download example_be_crossover.csv and upload it. Map Subject ID, Time and Concentration, and also Treatment / Formulation to Treatment, Period to Period and Sequence to Sequence. Click </w:t>
+        <w:t xml:space="preserve">1. </w:t>
+      </w:r>
+      <w:r>
+        <w:rPr/>
+        <w:t>Load example_be_crossover.csv the same way (</w:t>
+      </w:r>
+      <w:r>
+        <w:rPr>
+          <w:b/>
+        </w:rPr>
+        <w:t>Or use an example</w:t>
+      </w:r>
+      <w:r>
+        <w:rPr/>
+        <w:t xml:space="preserve">, then </w:t>
+      </w:r>
+      <w:r>
+        <w:rPr>
+          <w:b/>
+        </w:rPr>
+        <w:t>Load example</w:t>
+      </w:r>
+      <w:r>
+        <w:rPr/>
+        <w:t xml:space="preserve">). Map Subject ID, Time and Concentration, and also Treatment / Formulation to Treatment, Period to Period and Sequence to Sequence. Click </w:t>
       </w:r>
       <w:r>
         <w:rPr>
@@ -9884,8 +9964,10 @@
         </w:rPr>
         <w:t>A quick look after upload.</w:t>
       </w:r>
-      <w:r>
-        <w:t xml:space="preserve"> Upload example_theoph.csv (Tutorial 3) and open 3. Visualize Data. The individual profiles plot shows 12 lines, one per profile, on a linear axis. Switch </w:t>
+      <w:r/>
+      <w:r>
+        <w:rPr/>
+        <w:t xml:space="preserve"> Load example_theoph.csv (Tutorial 3) and open 3. Visualize Data. The individual profiles plot shows 12 lines, one per profile, on a linear axis. Switch </w:t>
       </w:r>
       <w:r>
         <w:rPr>
@@ -9907,8 +9989,10 @@
         </w:rPr>
         <w:t>A summary plot for a crossover.</w:t>
       </w:r>
-      <w:r>
-        <w:t xml:space="preserve"> Upload example_be_crossover.csv with the Treatment column mapped (Tutorial 4), open Visualize Data and choose </w:t>
+      <w:r/>
+      <w:r>
+        <w:rPr/>
+        <w:t xml:space="preserve"> Load example_be_crossover.csv with the Treatment column mapped (Tutorial 4), open Visualize Data and choose </w:t>
       </w:r>
       <w:r>
         <w:rPr>
@@ -14231,7 +14315,146 @@
         <w:t>Process Data</w:t>
       </w:r>
       <w:r>
-        <w:t>. The app runs more than 30 quality checks: errors block processing, warnings do not. Some checks stop data the app cannot analyse safely: a CDISC-style file uploaded as a simple table, mixed units, dates or clock times in the Time column, profiles that do not start near time zero (time since the first dose), several profiles stacked in one column (duplicate times), subject IDs that restart in each sequence, and a decimal point in a decimal-comma file. A second dose inside one profile, or a multi-period file without a mapped Period, gives a warning. Processing a new file clears all previous results. Afterwards a panel links to the next steps: Visualize Data, Single Subject, Batch Analysis and Bioequivalence. Reading Your Results explains the quality report.</w:t>
+        <w:t xml:space="preserve">. The app runs more than 30 quality checks: errors block processing, warnings do not. Some checks stop data the app cannot analyse safely: a CDISC-style file uploaded as a simple table, mixed units, dates or clock times in the Time column, profiles that do not start near time zero (time since the first dose), several profiles stacked in one column (duplicate times), subject IDs that restart in each sequence, and a decimal point in a decimal-comma file. A second dose inside one profile, or a multi-period file without a mapped Period, gives a warning. </w:t>
+      </w:r>
+      <w:r>
+        <w:rPr/>
+        <w:t xml:space="preserve">Processing a new file clears all previous results, and your exclusions after asking first. </w:t>
+      </w:r>
+      <w:r>
+        <w:rPr>
+          <w:b/>
+        </w:rPr>
+        <w:t>Or use an example</w:t>
+      </w:r>
+      <w:r>
+        <w:rPr/>
+        <w:t xml:space="preserve"> loads one of the six example files with </w:t>
+      </w:r>
+      <w:r>
+        <w:rPr>
+          <w:b/>
+        </w:rPr>
+        <w:t>Load example</w:t>
+      </w:r>
+      <w:r>
+        <w:rPr/>
+        <w:t xml:space="preserve">; </w:t>
+      </w:r>
+      <w:r>
+        <w:rPr>
+          <w:b/>
+        </w:rPr>
+        <w:t>Download</w:t>
+      </w:r>
+      <w:r>
+        <w:rPr/>
+        <w:t xml:space="preserve"> saves a copy so you can see how it is laid out. Afterwards a panel links to the next steps: Visualize Data, Single Subject, Batch Analysis and Bioequivalence. Reading Your Results explains the quality report.</w:t>
+      </w:r>
+    </w:p>
+    <w:p>
+      <w:pPr>
+        <w:pStyle w:val="Kop3"/>
+      </w:pPr>
+      <w:r>
+        <w:t>Leaving Out Data</w:t>
+      </w:r>
+    </w:p>
+    <w:p>
+      <w:pPr>
+        <w:spacing w:after="120" w:line="276" w:lineRule="auto"/>
+      </w:pPr>
+      <w:r>
+        <w:rPr/>
+        <w:t xml:space="preserve">Some data should not enter the analysis: a sample the laboratory reported as invalid, or a period in which the subject vomited soon after dosing. After </w:t>
+      </w:r>
+      <w:r>
+        <w:rPr>
+          <w:b/>
+        </w:rPr>
+        <w:t>Process Data</w:t>
+      </w:r>
+      <w:r>
+        <w:rPr/>
+        <w:t xml:space="preserve">, click </w:t>
+      </w:r>
+      <w:r>
+        <w:rPr>
+          <w:b/>
+        </w:rPr>
+        <w:t>Add an exclusion</w:t>
+      </w:r>
+      <w:r>
+        <w:rPr/>
+        <w:t xml:space="preserve"> in the </w:t>
+      </w:r>
+      <w:r>
+        <w:rPr>
+          <w:b/>
+        </w:rPr>
+        <w:t>Exclusions</w:t>
+      </w:r>
+      <w:r>
+        <w:rPr/>
+        <w:t xml:space="preserve"> card, choose the profile, and choose whether to leave out samples or the whole profile. Pick a reason from the list. Other, protocol, dosing and adverse-event reasons also need a detail, such as the deviation number. Say whether the exclusion was pre-specified in the protocol, and give the section if it was.</w:t>
+      </w:r>
+    </w:p>
+    <w:p>
+      <w:pPr>
+        <w:spacing w:after="120" w:line="276" w:lineRule="auto"/>
+      </w:pPr>
+      <w:r>
+        <w:rPr/>
+        <w:t xml:space="preserve">An excluded sample is treated as if it was never collected. Cmax, Tmax, AUC and the half-life of that profile are calculated without it, and the BLQ rule is applied afterwards. The dialog warns when you pick the Cmax sample, the last measurable sample or a pre-dose sample. An excluded profile keeps its NCA result, with a 1 in the </w:t>
+      </w:r>
+      <w:r>
+        <w:rPr>
+          <w:b/>
+        </w:rPr>
+        <w:t>Excluded by Analyst</w:t>
+      </w:r>
+      <w:r>
+        <w:rPr/>
+        <w:t xml:space="preserve"> column, but is left out of summary statistics, mean curves and the bioequivalence comparison.</w:t>
+      </w:r>
+    </w:p>
+    <w:p>
+      <w:pPr>
+        <w:spacing w:after="120" w:line="276" w:lineRule="auto"/>
+      </w:pPr>
+      <w:r>
+        <w:rPr/>
+        <w:t xml:space="preserve">Nothing is deleted. The register lists each exclusion with its reason, who made it and when, and whether bioequivalence results had been seen. </w:t>
+      </w:r>
+      <w:r>
+        <w:rPr>
+          <w:b/>
+        </w:rPr>
+        <w:t>Restore</w:t>
+      </w:r>
+      <w:r>
+        <w:rPr/>
+        <w:t xml:space="preserve"> brings the data back; on a controlled installation it asks for a reason, and both steps go into the audit trail. Every path shows a line </w:t>
+      </w:r>
+      <w:r>
+        <w:rPr>
+          <w:b/>
+        </w:rPr>
+        <w:t>Left out by you</w:t>
+      </w:r>
+      <w:r>
+        <w:rPr/>
+        <w:t xml:space="preserve"> with a link to the register, and changing the exclusions clears the results. You can also start an exclusion from Half-Life Review, with </w:t>
+      </w:r>
+      <w:r>
+        <w:rPr>
+          <w:b/>
+        </w:rPr>
+        <w:t>Exclude samples or this profile…</w:t>
+      </w:r>
+      <w:r>
+        <w:rPr/>
+        <w:t>. The exclusions go into the downloads and the Analysis Record, whose reproduction script applies them again.</w:t>
       </w:r>
     </w:p>
     <w:p>
@@ -14796,12 +15019,26 @@
         <w:t>Minimum R² for half-life estimation</w:t>
       </w:r>
       <w:r>
-        <w:t xml:space="preserve"> (default 0.70), and </w:t>
+        <w:t xml:space="preserve"> </w:t>
+      </w:r>
+      <w:r>
+        <w:rPr/>
+        <w:t>(default 0.70), the half-life rules below it (</w:t>
       </w:r>
       <w:r>
         <w:rPr>
           <w:b/>
         </w:rPr>
+        <w:t>Edit half-life rules…</w:t>
+      </w:r>
+      <w:r>
+        <w:rPr/>
+        <w:t xml:space="preserve">), and </w:t>
+      </w:r>
+      <w:r>
+        <w:rPr>
+          <w:b/>
+        </w:rPr>
         <w:t>Calculate dose-normalised parameters</w:t>
       </w:r>
       <w:r>
@@ -14849,12 +15086,26 @@
         <w:t>Show all parameters</w:t>
       </w:r>
       <w:r>
-        <w:t xml:space="preserve"> for every column; AUC % Extrapolated above 20% is flagged in amber. </w:t>
+        <w:t xml:space="preserve"> for every column; AUC % Extrapolated above 20% is </w:t>
+      </w:r>
+      <w:r>
+        <w:rPr/>
+        <w:t xml:space="preserve">flagged in amber, and </w:t>
       </w:r>
       <w:r>
         <w:rPr>
           <w:b/>
         </w:rPr>
+        <w:t>Half-Life Flags</w:t>
+      </w:r>
+      <w:r>
+        <w:rPr/>
+        <w:t xml:space="preserve"> names any half-life rule a fit breaks. </w:t>
+      </w:r>
+      <w:r>
+        <w:rPr>
+          <w:b/>
+        </w:rPr>
         <w:t>Summary Statistics</w:t>
       </w:r>
       <w:r>
@@ -14912,6 +15163,31 @@
       </w:r>
       <w:r>
         <w:t xml:space="preserve"> if you want a value. Profiles with fewer than 2 positive concentrations are left out, with an amber note listing them. A single-dose run also notes profiles whose pre-dose concentration is above 5% of Cmax. At steady state, parameters extrapolated to infinity and the single-dose volume and MRT are left empty. Changing a setting clears the results, so run the analysis again.</w:t>
+      </w:r>
+    </w:p>
+    <w:p>
+      <w:pPr>
+        <w:spacing w:after="120" w:line="276" w:lineRule="auto"/>
+      </w:pPr>
+      <w:r>
+        <w:rPr>
+          <w:b/>
+        </w:rPr>
+        <w:t>Half-life rules.</w:t>
+      </w:r>
+      <w:r>
+        <w:rPr/>
+        <w:t xml:space="preserve"> The line under the minimum R² shows the rules in force; </w:t>
+      </w:r>
+      <w:r>
+        <w:rPr>
+          <w:b/>
+        </w:rPr>
+        <w:t>Edit half-life rules…</w:t>
+      </w:r>
+      <w:r>
+        <w:rPr/>
+        <w:t xml:space="preserve"> changes them or switches them off. By default a fit is flagged when its points span less than two half-lives, when AUC∞ is more than 20% extrapolated (not at steady state) or, after an IV bolus, more than 20% back-extrapolated. A flag changes no value and leaves nothing out. It marks the fits worth a second look: Half-Life Review adds (flagged) to those profiles in its list and shows each rule as pass or fail. All paths use the same rules, and the Analysis Record stores them.</w:t>
       </w:r>
     </w:p>
     <w:p>
@@ -15244,7 +15520,11 @@
         <w:t>A verdict is computed on all the data you uploaded.</w:t>
       </w:r>
       <w:r>
-        <w:t xml:space="preserve"> When the checks name a period with a pre-dose concentration above 5% of Cmax, ICH M13A (2.2.3.3) excludes it from the primary analysis, so the verdict shown is not the M13A primary analysis: exclude the period as the protocol says (see Exclusions, Outliers and Deviations) and run again. With fewer than 12 evaluable subjects, M13A (2.2.3.1) does not accept the study as pivotal, and the verdict is a statistical result only.</w:t>
+        <w:t xml:space="preserve"> When the checks name a period with a pre-dose concentration above 5% of Cmax, ICH M13A (2.2.3.3) excludes it from the primary analysis, so the verdict shown is not the M13A primary analysis: </w:t>
+      </w:r>
+      <w:r>
+        <w:rPr/>
+        <w:t>exclude the period in the Exclusions card on the Upload page, with the protocol's reason (see Leaving Out Data), and run again. With fewer than 12 evaluable subjects, M13A (2.2.3.1) does not accept the study as pivotal, and the verdict is a statistical result only.</w:t>
       </w:r>
     </w:p>
     <w:p>
@@ -15253,6 +15533,41 @@
       </w:pPr>
       <w:r>
         <w:t>For parallel groups the app also calculates the Welch interval, which does not assume equal variances, and reports it when it would change the conclusion. The pooled interval stays the primary result; if your statistical analysis plan or a guidance asks for an unequal-variance analysis, the app's verdict is not your primary result.</w:t>
+      </w:r>
+    </w:p>
+    <w:p>
+      <w:pPr>
+        <w:spacing w:after="120" w:line="276" w:lineRule="auto"/>
+      </w:pPr>
+      <w:r>
+        <w:rPr>
+          <w:b/>
+        </w:rPr>
+        <w:t>With exclusions.</w:t>
+      </w:r>
+      <w:r>
+        <w:rPr/>
+        <w:t xml:space="preserve"> The line </w:t>
+      </w:r>
+      <w:r>
+        <w:rPr>
+          <w:b/>
+        </w:rPr>
+        <w:t>Left out by you</w:t>
+      </w:r>
+      <w:r>
+        <w:rPr/>
+        <w:t xml:space="preserve"> says what you left out, and the table counts excluded profiles per treatment. Under the table, </w:t>
+      </w:r>
+      <w:r>
+        <w:rPr>
+          <w:b/>
+        </w:rPr>
+        <w:t>Sensitivity analysis: without your exclusions</w:t>
+      </w:r>
+      <w:r>
+        <w:rPr/>
+        <w:t xml:space="preserve"> repeats the comparison on all data, as ICH M13A expects. The M13A checks always use the data before exclusions, so leaving out a pre-dose sample does not hide its finding; a note says when the exclusions would change their outcome. The Excel report and the Analysis Record hold both results.</w:t>
       </w:r>
     </w:p>
     <w:p>
@@ -16750,6 +17065,30 @@
       <w:r>
         <w:t>All Parameters (per profile) in Path 5, and PK Parameter Table in Path 6, have one row per profile: a subject under one treatment in one period. Subject, Treatment and Period identify the row; the other columns are parameters, labelled in words with their unit, for example "AUC to Last Point (ng/mL·h)". The default view shows the main parameters; Show all parameters shows every column. Appendix A lists each parameter with its definition, unit and when it is reported. An empty cell is not an error: it means the parameter could not be estimated for that profile, and a note above the table says why (for example a terminal fit below the minimum adjusted R²).</w:t>
       </w:r>
+      <w:r>
+        <w:rPr/>
+        <w:t xml:space="preserve"> </w:t>
+      </w:r>
+      <w:r>
+        <w:rPr>
+          <w:b/>
+        </w:rPr>
+        <w:t>Half-Life Flags</w:t>
+      </w:r>
+      <w:r>
+        <w:rPr/>
+        <w:t xml:space="preserve"> names any half-life rule the fit breaks, and </w:t>
+      </w:r>
+      <w:r>
+        <w:rPr>
+          <w:b/>
+        </w:rPr>
+        <w:t>Excluded by Analyst</w:t>
+      </w:r>
+      <w:r>
+        <w:rPr/>
+        <w:t xml:space="preserve"> is 1 for a profile you left out.</w:t>
+      </w:r>
     </w:p>
     <w:p>
       <w:pPr>
@@ -17778,6 +18117,60 @@
           </w:p>
         </w:tc>
       </w:tr>
+      <w:tr>
+        <w:tc>
+          <w:tcPr>
+            <w:tcW w:w="4513" w:type="dxa"/>
+            <w:tcBorders>
+              <w:top w:val="single" w:sz="1" w:space="0" w:color="CCCCCC"/>
+              <w:left w:val="single" w:sz="1" w:space="0" w:color="CCCCCC"/>
+              <w:bottom w:val="single" w:sz="1" w:space="0" w:color="CCCCCC"/>
+              <w:right w:val="single" w:sz="1" w:space="0" w:color="CCCCCC"/>
+            </w:tcBorders>
+            <w:tcMar>
+              <w:top w:w="60" w:type="dxa"/>
+              <w:left w:w="100" w:type="dxa"/>
+              <w:bottom w:w="60" w:type="dxa"/>
+              <w:right w:w="100" w:type="dxa"/>
+            </w:tcMar>
+          </w:tcPr>
+          <w:p>
+            <w:r>
+              <w:rPr>
+                <w:sz w:val="20"/>
+                <w:szCs w:val="20"/>
+              </w:rPr>
+              <w:t>Profiles excluded, Half-life flags (Test and Reference)</w:t>
+            </w:r>
+          </w:p>
+        </w:tc>
+        <w:tc>
+          <w:tcPr>
+            <w:tcW w:w="4513" w:type="dxa"/>
+            <w:tcBorders>
+              <w:top w:val="single" w:sz="1" w:space="0" w:color="CCCCCC"/>
+              <w:left w:val="single" w:sz="1" w:space="0" w:color="CCCCCC"/>
+              <w:bottom w:val="single" w:sz="1" w:space="0" w:color="CCCCCC"/>
+              <w:right w:val="single" w:sz="1" w:space="0" w:color="CCCCCC"/>
+            </w:tcBorders>
+            <w:tcMar>
+              <w:top w:w="60" w:type="dxa"/>
+              <w:left w:w="100" w:type="dxa"/>
+              <w:bottom w:w="60" w:type="dxa"/>
+              <w:right w:w="100" w:type="dxa"/>
+            </w:tcMar>
+          </w:tcPr>
+          <w:p>
+            <w:r>
+              <w:rPr>
+                <w:sz w:val="20"/>
+                <w:szCs w:val="20"/>
+              </w:rPr>
+              <w:t>Profiles you left out, and profiles whose half-life fit breaks a rule; shown when there are any</w:t>
+            </w:r>
+          </w:p>
+        </w:tc>
+      </w:tr>
     </w:tbl>
     <w:p>
       <w:pPr>
@@ -17850,6 +18243,20 @@
       </w:r>
       <w:r>
         <w:t>: as a rule of thumb the points should cover at least two half-lives; ICH M13A (2.1.8) asks for sampling over at least three.</w:t>
+      </w:r>
+      <w:r>
+        <w:rPr/>
+        <w:t xml:space="preserve"> The </w:t>
+      </w:r>
+      <w:r>
+        <w:rPr>
+          <w:b/>
+        </w:rPr>
+        <w:t>Half-Life Flags</w:t>
+      </w:r>
+      <w:r>
+        <w:rPr/>
+        <w:t xml:space="preserve"> column marks a fit that spans less than two half-lives.</w:t>
       </w:r>
     </w:p>
     <w:p>
@@ -17885,6 +18292,20 @@
       </w:r>
       <w:r>
         <w:t xml:space="preserve"> above 20% (amber in the table): the extrapolated part carries much of AUC to infinity. Report AUC to infinity, CL/F, Vz/F and half-life with a flag, or leave them out of the descriptive statistics, as the plan says.</w:t>
+      </w:r>
+      <w:r>
+        <w:rPr/>
+        <w:t xml:space="preserve"> The </w:t>
+      </w:r>
+      <w:r>
+        <w:rPr>
+          <w:b/>
+        </w:rPr>
+        <w:t>Half-Life Flags</w:t>
+      </w:r>
+      <w:r>
+        <w:rPr/>
+        <w:t xml:space="preserve"> column marks it too.</w:t>
       </w:r>
     </w:p>
     <w:p>
@@ -19757,8 +20178,20 @@
       <w:pPr>
         <w:spacing w:after="120" w:line="276" w:lineRule="auto"/>
       </w:pPr>
-      <w:r>
-        <w:t>The app has no control to exclude a subject or a period, so an exclusion means preparing a second data file. ICH M13A (2.2.1) asks for the criteria to be defined in the protocol and for any exclusion to be documented before the bioanalysis. Extreme values should not be removed on statistical grounds alone; only contemporaneously documented protocol violations justify removal (M13A 2.2.1.1). A subject without measurable concentrations, or with very low ones (AUC below 5% of the geometric mean), may be excluded only as an exception, in general for no more than one subject. A period with a pre-dose concentration above 5% of Cmax is excluded from the primary analysis (2.2.3.3).</w:t>
+      <w:r/>
+      <w:r>
+        <w:rPr/>
+        <w:t xml:space="preserve">Leave data out in the app, with </w:t>
+      </w:r>
+      <w:r>
+        <w:rPr>
+          <w:b/>
+        </w:rPr>
+        <w:t>Add an exclusion</w:t>
+      </w:r>
+      <w:r>
+        <w:rPr/>
+        <w:t xml:space="preserve"> on the Upload page (see Leaving Out Data), rather than by editing the file. ICH M13A (2.2.1) asks for the criteria to be defined in the protocol and for any exclusion to be documented before the bioanalysis. Extreme values should not be removed on statistical grounds alone; only contemporaneously documented protocol violations justify removal (M13A 2.2.1.1). A subject without measurable concentrations, or with very low ones (AUC below 5% of the geometric mean), may be excluded only as an exception, in general for no more than one subject. A period with a pre-dose concentration above 5% of Cmax is excluded from the primary analysis (2.2.3.3).</w:t>
       </w:r>
     </w:p>
     <w:p>
@@ -19774,47 +20207,39 @@
         <w:spacing w:after="120" w:line="276" w:lineRule="auto"/>
       </w:pPr>
       <w:r>
-        <w:t>1. Record the SHA-256 of the unedited source file.</w:t>
-      </w:r>
-    </w:p>
-    <w:p>
-      <w:pPr>
-        <w:spacing w:after="120" w:line="276" w:lineRule="auto"/>
-      </w:pPr>
-      <w:r>
-        <w:t>2. Make the analysis file with a documented, repeatable step, for example a short R script under version control, rather than by hand.</w:t>
-      </w:r>
-    </w:p>
-    <w:p>
-      <w:pPr>
-        <w:spacing w:after="120" w:line="276" w:lineRule="auto"/>
-      </w:pPr>
-      <w:r>
-        <w:t>3. Keep both files, the list of exclusions with the reason for each, and the protocol reference.</w:t>
-      </w:r>
-    </w:p>
-    <w:p>
-      <w:pPr>
-        <w:spacing w:after="120" w:line="276" w:lineRule="auto"/>
-      </w:pPr>
-      <w:r>
-        <w:t>4. Run the analysis on the analysis file and create the Analysis Record.</w:t>
-      </w:r>
-    </w:p>
-    <w:p>
-      <w:pPr>
-        <w:spacing w:after="120" w:line="276" w:lineRule="auto"/>
-      </w:pPr>
-      <w:r>
-        <w:t>5. File the source hash and the exclusion list with the record.</w:t>
-      </w:r>
-    </w:p>
-    <w:p>
-      <w:pPr>
-        <w:spacing w:after="120" w:line="276" w:lineRule="auto"/>
-      </w:pPr>
-      <w:r>
-        <w:t>6. Where the plan asks for it, run the analysis with and without the excluded data and report both.</w:t>
+        <w:t>1. Upload the unedited source file; the Analysis Record holds its SHA-256.</w:t>
+      </w:r>
+    </w:p>
+    <w:p>
+      <w:pPr>
+        <w:spacing w:after="120" w:line="276" w:lineRule="auto"/>
+      </w:pPr>
+      <w:r>
+        <w:t>2. Enter each exclusion with its reason and, where it applies, the protocol section. Enter pre-specified exclusions before you run the bioequivalence analysis: the register marks any exclusion made after the results were seen.</w:t>
+      </w:r>
+    </w:p>
+    <w:p>
+      <w:pPr>
+        <w:spacing w:after="120" w:line="276" w:lineRule="auto"/>
+      </w:pPr>
+      <w:r>
+        <w:t>3. Run the analysis and create the Analysis Record. It holds the register, the results with and without the exclusions, and a reproduction script that applies the same exclusions.</w:t>
+      </w:r>
+    </w:p>
+    <w:p>
+      <w:pPr>
+        <w:spacing w:after="120" w:line="276" w:lineRule="auto"/>
+      </w:pPr>
+      <w:r>
+        <w:t>4. Report the sensitivity analysis where the plan asks for it.</w:t>
+      </w:r>
+    </w:p>
+    <w:p>
+      <w:pPr>
+        <w:spacing w:after="120" w:line="276" w:lineRule="auto"/>
+      </w:pPr>
+      <w:r>
+        <w:t>5. If you still prepare a separate analysis file, file the SHA-256 of both files and the script that made it with the record.</w:t>
       </w:r>
     </w:p>
     <w:p>
@@ -21435,6 +21860,10 @@
       </w:pPr>
       <w:r>
         <w:t>Adjust the points yourself for multi-phasic elimination, enterohepatic recirculation or late samples near the LLOQ. In Half-Life Review, select a profile, tick the terminal-phase points and click Recalculate. Values set by the BLQ rule are not offered (the automatic fit does not use them either), and the label above the points says how many were left out. The slope must be negative, and although 2 points are accepted, a fit to be reported needs at least 3. NonCompart then recomputes half-life, AUC∞, CL/F, Vz/F and MRT from those points, with its unit conversions. A hand-picked selection is used whatever its adjusted R², so judge the fit on the plot. Selections are kept when you run the analysis again and are listed in the Analysis Record.</w:t>
+      </w:r>
+      <w:r>
+        <w:rPr/>
+        <w:t xml:space="preserve"> The half-life rules flag a hand-picked fit as well.</w:t>
       </w:r>
     </w:p>
     <w:p>
@@ -24362,7 +24791,7 @@
                 <w:sz w:val="20"/>
                 <w:szCs w:val="20"/>
               </w:rPr>
-              <w:t>AUCLST</w:t>
+              <w:t>LZSPAN</w:t>
             </w:r>
           </w:p>
         </w:tc>
@@ -24388,7 +24817,7 @@
                 <w:sz w:val="20"/>
                 <w:szCs w:val="20"/>
               </w:rPr>
-              <w:t>AUC to Last Point</w:t>
+              <w:t>Half-Life Span Ratio</w:t>
             </w:r>
           </w:p>
         </w:tc>
@@ -24414,7 +24843,7 @@
                 <w:sz w:val="20"/>
                 <w:szCs w:val="20"/>
               </w:rPr>
-              <w:t>AUC from 0 to Tlast (AUC0–t)</w:t>
+              <w:t>Time from the first to the last point of the terminal regression, divided by the half-life</w:t>
             </w:r>
           </w:p>
         </w:tc>
@@ -24440,7 +24869,7 @@
                 <w:sz w:val="20"/>
                 <w:szCs w:val="20"/>
               </w:rPr>
-              <w:t>ng/mL·h</w:t>
+              <w:t>(none)</w:t>
             </w:r>
           </w:p>
         </w:tc>
@@ -24466,7 +24895,7 @@
                 <w:sz w:val="20"/>
                 <w:szCs w:val="20"/>
               </w:rPr>
-              <w:t>All</w:t>
+              <w:t>All, with λz</w:t>
             </w:r>
           </w:p>
         </w:tc>
@@ -24494,7 +24923,7 @@
                 <w:sz w:val="20"/>
                 <w:szCs w:val="20"/>
               </w:rPr>
-              <w:t>AUCALL</w:t>
+              <w:t>FLAGS</w:t>
             </w:r>
           </w:p>
         </w:tc>
@@ -24520,7 +24949,7 @@
                 <w:sz w:val="20"/>
                 <w:szCs w:val="20"/>
               </w:rPr>
-              <w:t>AUC All (incl. trailing zero)</w:t>
+              <w:t>Half-Life Flags</w:t>
             </w:r>
           </w:p>
         </w:tc>
@@ -24546,7 +24975,7 @@
                 <w:sz w:val="20"/>
                 <w:szCs w:val="20"/>
               </w:rPr>
-              <w:t>AUC from 0 to the last sample, including a trailing zero</w:t>
+              <w:t>The half-life rules the fit breaks, in words; empty when it breaks none</w:t>
             </w:r>
           </w:p>
         </w:tc>
@@ -24572,7 +25001,7 @@
                 <w:sz w:val="20"/>
                 <w:szCs w:val="20"/>
               </w:rPr>
-              <w:t>ng/mL·h</w:t>
+              <w:t>(none)</w:t>
             </w:r>
           </w:p>
         </w:tc>
@@ -24598,7 +25027,7 @@
                 <w:sz w:val="20"/>
                 <w:szCs w:val="20"/>
               </w:rPr>
-              <w:t>All</w:t>
+              <w:t>All, with λz</w:t>
             </w:r>
           </w:p>
         </w:tc>
@@ -24626,7 +25055,7 @@
                 <w:sz w:val="20"/>
                 <w:szCs w:val="20"/>
               </w:rPr>
-              <w:t>AUCIFO</w:t>
+              <w:t>FLAG_SPAN, FLAG_AUCPE, FLAG_AUCPBE</w:t>
             </w:r>
           </w:p>
         </w:tc>
@@ -24652,7 +25081,7 @@
                 <w:sz w:val="20"/>
                 <w:szCs w:val="20"/>
               </w:rPr>
-              <w:t>AUC to Infinity (observed)</w:t>
+              <w:t>Flag: …</w:t>
             </w:r>
           </w:p>
         </w:tc>
@@ -24678,7 +25107,7 @@
                 <w:sz w:val="20"/>
                 <w:szCs w:val="20"/>
               </w:rPr>
-              <w:t>AUC0–t + Clast/λz</w:t>
+              <w:t>1 when the fit breaks the span, extrapolation or back-extrapolation rule, 0 when it does not; empty when the rule is off or does not apply</w:t>
             </w:r>
           </w:p>
         </w:tc>
@@ -24704,7 +25133,7 @@
                 <w:sz w:val="20"/>
                 <w:szCs w:val="20"/>
               </w:rPr>
-              <w:t>ng/mL·h</w:t>
+              <w:t>(none)</w:t>
             </w:r>
           </w:p>
         </w:tc>
@@ -24730,7 +25159,7 @@
                 <w:sz w:val="20"/>
                 <w:szCs w:val="20"/>
               </w:rPr>
-              <w:t>Single dose, with λz</w:t>
+              <w:t>All, with λz (FLAG_AUCPE single dose, FLAG_AUCPBE IV bolus)</w:t>
             </w:r>
           </w:p>
         </w:tc>
@@ -24758,7 +25187,7 @@
                 <w:sz w:val="20"/>
                 <w:szCs w:val="20"/>
               </w:rPr>
-              <w:t>AUCIFP</w:t>
+              <w:t>AUCLST</w:t>
             </w:r>
           </w:p>
         </w:tc>
@@ -24784,7 +25213,7 @@
                 <w:sz w:val="20"/>
                 <w:szCs w:val="20"/>
               </w:rPr>
-              <w:t>AUC to Infinity (predicted)</w:t>
+              <w:t>AUC to Last Point</w:t>
             </w:r>
           </w:p>
         </w:tc>
@@ -24810,7 +25239,7 @@
                 <w:sz w:val="20"/>
                 <w:szCs w:val="20"/>
               </w:rPr>
-              <w:t>AUC0–t + Clast,pred/λz</w:t>
+              <w:t>AUC from 0 to Tlast (AUC0–t)</w:t>
             </w:r>
           </w:p>
         </w:tc>
@@ -24862,7 +25291,7 @@
                 <w:sz w:val="20"/>
                 <w:szCs w:val="20"/>
               </w:rPr>
-              <w:t>Single dose, with λz</w:t>
+              <w:t>All</w:t>
             </w:r>
           </w:p>
         </w:tc>
@@ -24890,7 +25319,7 @@
                 <w:sz w:val="20"/>
                 <w:szCs w:val="20"/>
               </w:rPr>
-              <w:t>AUCPEO</w:t>
+              <w:t>AUCALL</w:t>
             </w:r>
           </w:p>
         </w:tc>
@@ -24916,7 +25345,7 @@
                 <w:sz w:val="20"/>
                 <w:szCs w:val="20"/>
               </w:rPr>
-              <w:t>AUC % Extrapolated (observed)</w:t>
+              <w:t>AUC All (incl. trailing zero)</w:t>
             </w:r>
           </w:p>
         </w:tc>
@@ -24942,7 +25371,7 @@
                 <w:sz w:val="20"/>
                 <w:szCs w:val="20"/>
               </w:rPr>
-              <w:t>Share of AUC0–∞ (observed) that is extrapolated, %</w:t>
+              <w:t>AUC from 0 to the last sample, including a trailing zero</w:t>
             </w:r>
           </w:p>
         </w:tc>
@@ -24968,7 +25397,7 @@
                 <w:sz w:val="20"/>
                 <w:szCs w:val="20"/>
               </w:rPr>
-              <w:t>(none)</w:t>
+              <w:t>ng/mL·h</w:t>
             </w:r>
           </w:p>
         </w:tc>
@@ -24994,7 +25423,7 @@
                 <w:sz w:val="20"/>
                 <w:szCs w:val="20"/>
               </w:rPr>
-              <w:t>Single dose, with λz</w:t>
+              <w:t>All</w:t>
             </w:r>
           </w:p>
         </w:tc>
@@ -25022,7 +25451,7 @@
                 <w:sz w:val="20"/>
                 <w:szCs w:val="20"/>
               </w:rPr>
-              <w:t>AUCPEP</w:t>
+              <w:t>AUCIFO</w:t>
             </w:r>
           </w:p>
         </w:tc>
@@ -25048,7 +25477,7 @@
                 <w:sz w:val="20"/>
                 <w:szCs w:val="20"/>
               </w:rPr>
-              <w:t>AUC % Extrapolated (predicted)</w:t>
+              <w:t>AUC to Infinity (observed)</w:t>
             </w:r>
           </w:p>
         </w:tc>
@@ -25074,7 +25503,7 @@
                 <w:sz w:val="20"/>
                 <w:szCs w:val="20"/>
               </w:rPr>
-              <w:t>Share of AUC0–∞ (predicted) that is extrapolated, %</w:t>
+              <w:t>AUC0–t + Clast/λz</w:t>
             </w:r>
           </w:p>
         </w:tc>
@@ -25100,7 +25529,7 @@
                 <w:sz w:val="20"/>
                 <w:szCs w:val="20"/>
               </w:rPr>
-              <w:t>(none)</w:t>
+              <w:t>ng/mL·h</w:t>
             </w:r>
           </w:p>
         </w:tc>
@@ -25154,7 +25583,7 @@
                 <w:sz w:val="20"/>
                 <w:szCs w:val="20"/>
               </w:rPr>
-              <w:t>AUMCLST</w:t>
+              <w:t>AUCIFP</w:t>
             </w:r>
           </w:p>
         </w:tc>
@@ -25180,7 +25609,7 @@
                 <w:sz w:val="20"/>
                 <w:szCs w:val="20"/>
               </w:rPr>
-              <w:t>AUMC to Last Point</w:t>
+              <w:t>AUC to Infinity (predicted)</w:t>
             </w:r>
           </w:p>
         </w:tc>
@@ -25206,7 +25635,7 @@
                 <w:sz w:val="20"/>
                 <w:szCs w:val="20"/>
               </w:rPr>
-              <w:t>Area under the first-moment curve (C × t) from 0 to Tlast</w:t>
+              <w:t>AUC0–t + Clast,pred/λz</w:t>
             </w:r>
           </w:p>
         </w:tc>
@@ -25232,7 +25661,7 @@
                 <w:sz w:val="20"/>
                 <w:szCs w:val="20"/>
               </w:rPr>
-              <w:t>ng/mL·h²</w:t>
+              <w:t>ng/mL·h</w:t>
             </w:r>
           </w:p>
         </w:tc>
@@ -25258,7 +25687,7 @@
                 <w:sz w:val="20"/>
                 <w:szCs w:val="20"/>
               </w:rPr>
-              <w:t>All</w:t>
+              <w:t>Single dose, with λz</w:t>
             </w:r>
           </w:p>
         </w:tc>
@@ -25286,7 +25715,7 @@
                 <w:sz w:val="20"/>
                 <w:szCs w:val="20"/>
               </w:rPr>
-              <w:t>AUMCIFO</w:t>
+              <w:t>AUCPEO</w:t>
             </w:r>
           </w:p>
         </w:tc>
@@ -25312,7 +25741,7 @@
                 <w:sz w:val="20"/>
                 <w:szCs w:val="20"/>
               </w:rPr>
-              <w:t>AUMC to Infinity (observed)</w:t>
+              <w:t>AUC % Extrapolated (observed)</w:t>
             </w:r>
           </w:p>
         </w:tc>
@@ -25338,7 +25767,7 @@
                 <w:sz w:val="20"/>
                 <w:szCs w:val="20"/>
               </w:rPr>
-              <w:t>AUMC extrapolated to infinity with Clast</w:t>
+              <w:t>Share of AUC0–∞ (observed) that is extrapolated, %</w:t>
             </w:r>
           </w:p>
         </w:tc>
@@ -25364,7 +25793,7 @@
                 <w:sz w:val="20"/>
                 <w:szCs w:val="20"/>
               </w:rPr>
-              <w:t>ng/mL·h²</w:t>
+              <w:t>(none)</w:t>
             </w:r>
           </w:p>
         </w:tc>
@@ -25418,7 +25847,7 @@
                 <w:sz w:val="20"/>
                 <w:szCs w:val="20"/>
               </w:rPr>
-              <w:t>AUMCIFP</w:t>
+              <w:t>AUCPEP</w:t>
             </w:r>
           </w:p>
         </w:tc>
@@ -25444,7 +25873,7 @@
                 <w:sz w:val="20"/>
                 <w:szCs w:val="20"/>
               </w:rPr>
-              <w:t>AUMC to Infinity (predicted)</w:t>
+              <w:t>AUC % Extrapolated (predicted)</w:t>
             </w:r>
           </w:p>
         </w:tc>
@@ -25470,7 +25899,7 @@
                 <w:sz w:val="20"/>
                 <w:szCs w:val="20"/>
               </w:rPr>
-              <w:t>AUMC extrapolated to infinity with Clast,pred</w:t>
+              <w:t>Share of AUC0–∞ (predicted) that is extrapolated, %</w:t>
             </w:r>
           </w:p>
         </w:tc>
@@ -25496,7 +25925,7 @@
                 <w:sz w:val="20"/>
                 <w:szCs w:val="20"/>
               </w:rPr>
-              <w:t>ng/mL·h²</w:t>
+              <w:t>(none)</w:t>
             </w:r>
           </w:p>
         </w:tc>
@@ -25550,7 +25979,7 @@
                 <w:sz w:val="20"/>
                 <w:szCs w:val="20"/>
               </w:rPr>
-              <w:t>AUMCPEO</w:t>
+              <w:t>AUMCLST</w:t>
             </w:r>
           </w:p>
         </w:tc>
@@ -25576,7 +26005,7 @@
                 <w:sz w:val="20"/>
                 <w:szCs w:val="20"/>
               </w:rPr>
-              <w:t>AUMC % Extrapolated (obs)</w:t>
+              <w:t>AUMC to Last Point</w:t>
             </w:r>
           </w:p>
         </w:tc>
@@ -25602,7 +26031,7 @@
                 <w:sz w:val="20"/>
                 <w:szCs w:val="20"/>
               </w:rPr>
-              <w:t>Share of AUMC0–∞ (observed) that is extrapolated, %</w:t>
+              <w:t>Area under the first-moment curve (C × t) from 0 to Tlast</w:t>
             </w:r>
           </w:p>
         </w:tc>
@@ -25628,7 +26057,7 @@
                 <w:sz w:val="20"/>
                 <w:szCs w:val="20"/>
               </w:rPr>
-              <w:t>(none)</w:t>
+              <w:t>ng/mL·h²</w:t>
             </w:r>
           </w:p>
         </w:tc>
@@ -25654,7 +26083,7 @@
                 <w:sz w:val="20"/>
                 <w:szCs w:val="20"/>
               </w:rPr>
-              <w:t>Single dose, with λz</w:t>
+              <w:t>All</w:t>
             </w:r>
           </w:p>
         </w:tc>
@@ -25682,7 +26111,7 @@
                 <w:sz w:val="20"/>
                 <w:szCs w:val="20"/>
               </w:rPr>
-              <w:t>AUMCPEP</w:t>
+              <w:t>AUMCIFO</w:t>
             </w:r>
           </w:p>
         </w:tc>
@@ -25708,7 +26137,7 @@
                 <w:sz w:val="20"/>
                 <w:szCs w:val="20"/>
               </w:rPr>
-              <w:t>AUMC % Extrapolated (pred)</w:t>
+              <w:t>AUMC to Infinity (observed)</w:t>
             </w:r>
           </w:p>
         </w:tc>
@@ -25734,7 +26163,7 @@
                 <w:sz w:val="20"/>
                 <w:szCs w:val="20"/>
               </w:rPr>
-              <w:t>Share of AUMC0–∞ (predicted) that is extrapolated, %</w:t>
+              <w:t>AUMC extrapolated to infinity with Clast</w:t>
             </w:r>
           </w:p>
         </w:tc>
@@ -25760,7 +26189,7 @@
                 <w:sz w:val="20"/>
                 <w:szCs w:val="20"/>
               </w:rPr>
-              <w:t>(none)</w:t>
+              <w:t>ng/mL·h²</w:t>
             </w:r>
           </w:p>
         </w:tc>
@@ -25814,7 +26243,7 @@
                 <w:sz w:val="20"/>
                 <w:szCs w:val="20"/>
               </w:rPr>
-              <w:t>VZFO</w:t>
+              <w:t>AUMCIFP</w:t>
             </w:r>
           </w:p>
         </w:tc>
@@ -25840,7 +26269,7 @@
                 <w:sz w:val="20"/>
                 <w:szCs w:val="20"/>
               </w:rPr>
-              <w:t>Apparent Volume (Vz/F)</w:t>
+              <w:t>AUMC to Infinity (predicted)</w:t>
             </w:r>
           </w:p>
         </w:tc>
@@ -25866,7 +26295,7 @@
                 <w:sz w:val="20"/>
                 <w:szCs w:val="20"/>
               </w:rPr>
-              <w:t>Dose/(λz × AUC0–∞); at steady state from AUCτ</w:t>
+              <w:t>AUMC extrapolated to infinity with Clast,pred</w:t>
             </w:r>
           </w:p>
         </w:tc>
@@ -25892,7 +26321,7 @@
                 <w:sz w:val="20"/>
                 <w:szCs w:val="20"/>
               </w:rPr>
-              <w:t>L</w:t>
+              <w:t>ng/mL·h²</w:t>
             </w:r>
           </w:p>
         </w:tc>
@@ -25918,7 +26347,7 @@
                 <w:sz w:val="20"/>
                 <w:szCs w:val="20"/>
               </w:rPr>
-              <w:t>Extravascular, with λz</w:t>
+              <w:t>Single dose, with λz</w:t>
             </w:r>
           </w:p>
         </w:tc>
@@ -25946,7 +26375,7 @@
                 <w:sz w:val="20"/>
                 <w:szCs w:val="20"/>
               </w:rPr>
-              <w:t>VZFP</w:t>
+              <w:t>AUMCPEO</w:t>
             </w:r>
           </w:p>
         </w:tc>
@@ -25972,7 +26401,7 @@
                 <w:sz w:val="20"/>
                 <w:szCs w:val="20"/>
               </w:rPr>
-              <w:t>Apparent Volume (pred)</w:t>
+              <w:t>AUMC % Extrapolated (obs)</w:t>
             </w:r>
           </w:p>
         </w:tc>
@@ -25998,7 +26427,7 @@
                 <w:sz w:val="20"/>
                 <w:szCs w:val="20"/>
               </w:rPr>
-              <w:t>As Vz/F, with the predicted AUC0–∞</w:t>
+              <w:t>Share of AUMC0–∞ (observed) that is extrapolated, %</w:t>
             </w:r>
           </w:p>
         </w:tc>
@@ -26024,7 +26453,7 @@
                 <w:sz w:val="20"/>
                 <w:szCs w:val="20"/>
               </w:rPr>
-              <w:t>L</w:t>
+              <w:t>(none)</w:t>
             </w:r>
           </w:p>
         </w:tc>
@@ -26050,7 +26479,7 @@
                 <w:sz w:val="20"/>
                 <w:szCs w:val="20"/>
               </w:rPr>
-              <w:t>Extravascular single dose</w:t>
+              <w:t>Single dose, with λz</w:t>
             </w:r>
           </w:p>
         </w:tc>
@@ -26078,7 +26507,7 @@
                 <w:sz w:val="20"/>
                 <w:szCs w:val="20"/>
               </w:rPr>
-              <w:t>CLFO</w:t>
+              <w:t>AUMCPEP</w:t>
             </w:r>
           </w:p>
         </w:tc>
@@ -26104,7 +26533,7 @@
                 <w:sz w:val="20"/>
                 <w:szCs w:val="20"/>
               </w:rPr>
-              <w:t>Apparent Clearance (CL/F)</w:t>
+              <w:t>AUMC % Extrapolated (pred)</w:t>
             </w:r>
           </w:p>
         </w:tc>
@@ -26130,7 +26559,7 @@
                 <w:sz w:val="20"/>
                 <w:szCs w:val="20"/>
               </w:rPr>
-              <w:t>Dose/AUC0–∞; at steady state Dose/AUCτ</w:t>
+              <w:t>Share of AUMC0–∞ (predicted) that is extrapolated, %</w:t>
             </w:r>
           </w:p>
         </w:tc>
@@ -26156,7 +26585,7 @@
                 <w:sz w:val="20"/>
                 <w:szCs w:val="20"/>
               </w:rPr>
-              <w:t>L/h</w:t>
+              <w:t>(none)</w:t>
             </w:r>
           </w:p>
         </w:tc>
@@ -26182,7 +26611,7 @@
                 <w:sz w:val="20"/>
                 <w:szCs w:val="20"/>
               </w:rPr>
-              <w:t>Extravascular</w:t>
+              <w:t>Single dose, with λz</w:t>
             </w:r>
           </w:p>
         </w:tc>
@@ -26210,6 +26639,402 @@
                 <w:sz w:val="20"/>
                 <w:szCs w:val="20"/>
               </w:rPr>
+              <w:t>VZFO</w:t>
+            </w:r>
+          </w:p>
+        </w:tc>
+        <w:tc>
+          <w:tcPr>
+            <w:tcW w:w="1805" w:type="dxa"/>
+            <w:tcBorders>
+              <w:top w:val="single" w:sz="1" w:space="0" w:color="CCCCCC"/>
+              <w:left w:val="single" w:sz="1" w:space="0" w:color="CCCCCC"/>
+              <w:bottom w:val="single" w:sz="1" w:space="0" w:color="CCCCCC"/>
+              <w:right w:val="single" w:sz="1" w:space="0" w:color="CCCCCC"/>
+            </w:tcBorders>
+            <w:tcMar>
+              <w:top w:w="60" w:type="dxa"/>
+              <w:left w:w="100" w:type="dxa"/>
+              <w:bottom w:w="60" w:type="dxa"/>
+              <w:right w:w="100" w:type="dxa"/>
+            </w:tcMar>
+          </w:tcPr>
+          <w:p>
+            <w:r>
+              <w:rPr>
+                <w:sz w:val="20"/>
+                <w:szCs w:val="20"/>
+              </w:rPr>
+              <w:t>Apparent Volume (Vz/F)</w:t>
+            </w:r>
+          </w:p>
+        </w:tc>
+        <w:tc>
+          <w:tcPr>
+            <w:tcW w:w="1805" w:type="dxa"/>
+            <w:tcBorders>
+              <w:top w:val="single" w:sz="1" w:space="0" w:color="CCCCCC"/>
+              <w:left w:val="single" w:sz="1" w:space="0" w:color="CCCCCC"/>
+              <w:bottom w:val="single" w:sz="1" w:space="0" w:color="CCCCCC"/>
+              <w:right w:val="single" w:sz="1" w:space="0" w:color="CCCCCC"/>
+            </w:tcBorders>
+            <w:tcMar>
+              <w:top w:w="60" w:type="dxa"/>
+              <w:left w:w="100" w:type="dxa"/>
+              <w:bottom w:w="60" w:type="dxa"/>
+              <w:right w:w="100" w:type="dxa"/>
+            </w:tcMar>
+          </w:tcPr>
+          <w:p>
+            <w:r>
+              <w:rPr>
+                <w:sz w:val="20"/>
+                <w:szCs w:val="20"/>
+              </w:rPr>
+              <w:t>Dose/(λz × AUC0–∞); at steady state from AUCτ</w:t>
+            </w:r>
+          </w:p>
+        </w:tc>
+        <w:tc>
+          <w:tcPr>
+            <w:tcW w:w="1805" w:type="dxa"/>
+            <w:tcBorders>
+              <w:top w:val="single" w:sz="1" w:space="0" w:color="CCCCCC"/>
+              <w:left w:val="single" w:sz="1" w:space="0" w:color="CCCCCC"/>
+              <w:bottom w:val="single" w:sz="1" w:space="0" w:color="CCCCCC"/>
+              <w:right w:val="single" w:sz="1" w:space="0" w:color="CCCCCC"/>
+            </w:tcBorders>
+            <w:tcMar>
+              <w:top w:w="60" w:type="dxa"/>
+              <w:left w:w="100" w:type="dxa"/>
+              <w:bottom w:w="60" w:type="dxa"/>
+              <w:right w:w="100" w:type="dxa"/>
+            </w:tcMar>
+          </w:tcPr>
+          <w:p>
+            <w:r>
+              <w:rPr>
+                <w:sz w:val="20"/>
+                <w:szCs w:val="20"/>
+              </w:rPr>
+              <w:t>L</w:t>
+            </w:r>
+          </w:p>
+        </w:tc>
+        <w:tc>
+          <w:tcPr>
+            <w:tcW w:w="1805" w:type="dxa"/>
+            <w:tcBorders>
+              <w:top w:val="single" w:sz="1" w:space="0" w:color="CCCCCC"/>
+              <w:left w:val="single" w:sz="1" w:space="0" w:color="CCCCCC"/>
+              <w:bottom w:val="single" w:sz="1" w:space="0" w:color="CCCCCC"/>
+              <w:right w:val="single" w:sz="1" w:space="0" w:color="CCCCCC"/>
+            </w:tcBorders>
+            <w:tcMar>
+              <w:top w:w="60" w:type="dxa"/>
+              <w:left w:w="100" w:type="dxa"/>
+              <w:bottom w:w="60" w:type="dxa"/>
+              <w:right w:w="100" w:type="dxa"/>
+            </w:tcMar>
+          </w:tcPr>
+          <w:p>
+            <w:r>
+              <w:rPr>
+                <w:sz w:val="20"/>
+                <w:szCs w:val="20"/>
+              </w:rPr>
+              <w:t>Extravascular, with λz</w:t>
+            </w:r>
+          </w:p>
+        </w:tc>
+      </w:tr>
+      <w:tr>
+        <w:tc>
+          <w:tcPr>
+            <w:tcW w:w="1805" w:type="dxa"/>
+            <w:tcBorders>
+              <w:top w:val="single" w:sz="1" w:space="0" w:color="CCCCCC"/>
+              <w:left w:val="single" w:sz="1" w:space="0" w:color="CCCCCC"/>
+              <w:bottom w:val="single" w:sz="1" w:space="0" w:color="CCCCCC"/>
+              <w:right w:val="single" w:sz="1" w:space="0" w:color="CCCCCC"/>
+            </w:tcBorders>
+            <w:tcMar>
+              <w:top w:w="60" w:type="dxa"/>
+              <w:left w:w="100" w:type="dxa"/>
+              <w:bottom w:w="60" w:type="dxa"/>
+              <w:right w:w="100" w:type="dxa"/>
+            </w:tcMar>
+          </w:tcPr>
+          <w:p>
+            <w:r>
+              <w:rPr>
+                <w:sz w:val="20"/>
+                <w:szCs w:val="20"/>
+              </w:rPr>
+              <w:t>VZFP</w:t>
+            </w:r>
+          </w:p>
+        </w:tc>
+        <w:tc>
+          <w:tcPr>
+            <w:tcW w:w="1805" w:type="dxa"/>
+            <w:tcBorders>
+              <w:top w:val="single" w:sz="1" w:space="0" w:color="CCCCCC"/>
+              <w:left w:val="single" w:sz="1" w:space="0" w:color="CCCCCC"/>
+              <w:bottom w:val="single" w:sz="1" w:space="0" w:color="CCCCCC"/>
+              <w:right w:val="single" w:sz="1" w:space="0" w:color="CCCCCC"/>
+            </w:tcBorders>
+            <w:tcMar>
+              <w:top w:w="60" w:type="dxa"/>
+              <w:left w:w="100" w:type="dxa"/>
+              <w:bottom w:w="60" w:type="dxa"/>
+              <w:right w:w="100" w:type="dxa"/>
+            </w:tcMar>
+          </w:tcPr>
+          <w:p>
+            <w:r>
+              <w:rPr>
+                <w:sz w:val="20"/>
+                <w:szCs w:val="20"/>
+              </w:rPr>
+              <w:t>Apparent Volume (pred)</w:t>
+            </w:r>
+          </w:p>
+        </w:tc>
+        <w:tc>
+          <w:tcPr>
+            <w:tcW w:w="1805" w:type="dxa"/>
+            <w:tcBorders>
+              <w:top w:val="single" w:sz="1" w:space="0" w:color="CCCCCC"/>
+              <w:left w:val="single" w:sz="1" w:space="0" w:color="CCCCCC"/>
+              <w:bottom w:val="single" w:sz="1" w:space="0" w:color="CCCCCC"/>
+              <w:right w:val="single" w:sz="1" w:space="0" w:color="CCCCCC"/>
+            </w:tcBorders>
+            <w:tcMar>
+              <w:top w:w="60" w:type="dxa"/>
+              <w:left w:w="100" w:type="dxa"/>
+              <w:bottom w:w="60" w:type="dxa"/>
+              <w:right w:w="100" w:type="dxa"/>
+            </w:tcMar>
+          </w:tcPr>
+          <w:p>
+            <w:r>
+              <w:rPr>
+                <w:sz w:val="20"/>
+                <w:szCs w:val="20"/>
+              </w:rPr>
+              <w:t>As Vz/F, with the predicted AUC0–∞</w:t>
+            </w:r>
+          </w:p>
+        </w:tc>
+        <w:tc>
+          <w:tcPr>
+            <w:tcW w:w="1805" w:type="dxa"/>
+            <w:tcBorders>
+              <w:top w:val="single" w:sz="1" w:space="0" w:color="CCCCCC"/>
+              <w:left w:val="single" w:sz="1" w:space="0" w:color="CCCCCC"/>
+              <w:bottom w:val="single" w:sz="1" w:space="0" w:color="CCCCCC"/>
+              <w:right w:val="single" w:sz="1" w:space="0" w:color="CCCCCC"/>
+            </w:tcBorders>
+            <w:tcMar>
+              <w:top w:w="60" w:type="dxa"/>
+              <w:left w:w="100" w:type="dxa"/>
+              <w:bottom w:w="60" w:type="dxa"/>
+              <w:right w:w="100" w:type="dxa"/>
+            </w:tcMar>
+          </w:tcPr>
+          <w:p>
+            <w:r>
+              <w:rPr>
+                <w:sz w:val="20"/>
+                <w:szCs w:val="20"/>
+              </w:rPr>
+              <w:t>L</w:t>
+            </w:r>
+          </w:p>
+        </w:tc>
+        <w:tc>
+          <w:tcPr>
+            <w:tcW w:w="1805" w:type="dxa"/>
+            <w:tcBorders>
+              <w:top w:val="single" w:sz="1" w:space="0" w:color="CCCCCC"/>
+              <w:left w:val="single" w:sz="1" w:space="0" w:color="CCCCCC"/>
+              <w:bottom w:val="single" w:sz="1" w:space="0" w:color="CCCCCC"/>
+              <w:right w:val="single" w:sz="1" w:space="0" w:color="CCCCCC"/>
+            </w:tcBorders>
+            <w:tcMar>
+              <w:top w:w="60" w:type="dxa"/>
+              <w:left w:w="100" w:type="dxa"/>
+              <w:bottom w:w="60" w:type="dxa"/>
+              <w:right w:w="100" w:type="dxa"/>
+            </w:tcMar>
+          </w:tcPr>
+          <w:p>
+            <w:r>
+              <w:rPr>
+                <w:sz w:val="20"/>
+                <w:szCs w:val="20"/>
+              </w:rPr>
+              <w:t>Extravascular single dose</w:t>
+            </w:r>
+          </w:p>
+        </w:tc>
+      </w:tr>
+      <w:tr>
+        <w:tc>
+          <w:tcPr>
+            <w:tcW w:w="1805" w:type="dxa"/>
+            <w:tcBorders>
+              <w:top w:val="single" w:sz="1" w:space="0" w:color="CCCCCC"/>
+              <w:left w:val="single" w:sz="1" w:space="0" w:color="CCCCCC"/>
+              <w:bottom w:val="single" w:sz="1" w:space="0" w:color="CCCCCC"/>
+              <w:right w:val="single" w:sz="1" w:space="0" w:color="CCCCCC"/>
+            </w:tcBorders>
+            <w:tcMar>
+              <w:top w:w="60" w:type="dxa"/>
+              <w:left w:w="100" w:type="dxa"/>
+              <w:bottom w:w="60" w:type="dxa"/>
+              <w:right w:w="100" w:type="dxa"/>
+            </w:tcMar>
+          </w:tcPr>
+          <w:p>
+            <w:r>
+              <w:rPr>
+                <w:sz w:val="20"/>
+                <w:szCs w:val="20"/>
+              </w:rPr>
+              <w:t>CLFO</w:t>
+            </w:r>
+          </w:p>
+        </w:tc>
+        <w:tc>
+          <w:tcPr>
+            <w:tcW w:w="1805" w:type="dxa"/>
+            <w:tcBorders>
+              <w:top w:val="single" w:sz="1" w:space="0" w:color="CCCCCC"/>
+              <w:left w:val="single" w:sz="1" w:space="0" w:color="CCCCCC"/>
+              <w:bottom w:val="single" w:sz="1" w:space="0" w:color="CCCCCC"/>
+              <w:right w:val="single" w:sz="1" w:space="0" w:color="CCCCCC"/>
+            </w:tcBorders>
+            <w:tcMar>
+              <w:top w:w="60" w:type="dxa"/>
+              <w:left w:w="100" w:type="dxa"/>
+              <w:bottom w:w="60" w:type="dxa"/>
+              <w:right w:w="100" w:type="dxa"/>
+            </w:tcMar>
+          </w:tcPr>
+          <w:p>
+            <w:r>
+              <w:rPr>
+                <w:sz w:val="20"/>
+                <w:szCs w:val="20"/>
+              </w:rPr>
+              <w:t>Apparent Clearance (CL/F)</w:t>
+            </w:r>
+          </w:p>
+        </w:tc>
+        <w:tc>
+          <w:tcPr>
+            <w:tcW w:w="1805" w:type="dxa"/>
+            <w:tcBorders>
+              <w:top w:val="single" w:sz="1" w:space="0" w:color="CCCCCC"/>
+              <w:left w:val="single" w:sz="1" w:space="0" w:color="CCCCCC"/>
+              <w:bottom w:val="single" w:sz="1" w:space="0" w:color="CCCCCC"/>
+              <w:right w:val="single" w:sz="1" w:space="0" w:color="CCCCCC"/>
+            </w:tcBorders>
+            <w:tcMar>
+              <w:top w:w="60" w:type="dxa"/>
+              <w:left w:w="100" w:type="dxa"/>
+              <w:bottom w:w="60" w:type="dxa"/>
+              <w:right w:w="100" w:type="dxa"/>
+            </w:tcMar>
+          </w:tcPr>
+          <w:p>
+            <w:r>
+              <w:rPr>
+                <w:sz w:val="20"/>
+                <w:szCs w:val="20"/>
+              </w:rPr>
+              <w:t>Dose/AUC0–∞; at steady state Dose/AUCτ</w:t>
+            </w:r>
+          </w:p>
+        </w:tc>
+        <w:tc>
+          <w:tcPr>
+            <w:tcW w:w="1805" w:type="dxa"/>
+            <w:tcBorders>
+              <w:top w:val="single" w:sz="1" w:space="0" w:color="CCCCCC"/>
+              <w:left w:val="single" w:sz="1" w:space="0" w:color="CCCCCC"/>
+              <w:bottom w:val="single" w:sz="1" w:space="0" w:color="CCCCCC"/>
+              <w:right w:val="single" w:sz="1" w:space="0" w:color="CCCCCC"/>
+            </w:tcBorders>
+            <w:tcMar>
+              <w:top w:w="60" w:type="dxa"/>
+              <w:left w:w="100" w:type="dxa"/>
+              <w:bottom w:w="60" w:type="dxa"/>
+              <w:right w:w="100" w:type="dxa"/>
+            </w:tcMar>
+          </w:tcPr>
+          <w:p>
+            <w:r>
+              <w:rPr>
+                <w:sz w:val="20"/>
+                <w:szCs w:val="20"/>
+              </w:rPr>
+              <w:t>L/h</w:t>
+            </w:r>
+          </w:p>
+        </w:tc>
+        <w:tc>
+          <w:tcPr>
+            <w:tcW w:w="1805" w:type="dxa"/>
+            <w:tcBorders>
+              <w:top w:val="single" w:sz="1" w:space="0" w:color="CCCCCC"/>
+              <w:left w:val="single" w:sz="1" w:space="0" w:color="CCCCCC"/>
+              <w:bottom w:val="single" w:sz="1" w:space="0" w:color="CCCCCC"/>
+              <w:right w:val="single" w:sz="1" w:space="0" w:color="CCCCCC"/>
+            </w:tcBorders>
+            <w:tcMar>
+              <w:top w:w="60" w:type="dxa"/>
+              <w:left w:w="100" w:type="dxa"/>
+              <w:bottom w:w="60" w:type="dxa"/>
+              <w:right w:w="100" w:type="dxa"/>
+            </w:tcMar>
+          </w:tcPr>
+          <w:p>
+            <w:r>
+              <w:rPr>
+                <w:sz w:val="20"/>
+                <w:szCs w:val="20"/>
+              </w:rPr>
+              <w:t>Extravascular</w:t>
+            </w:r>
+          </w:p>
+        </w:tc>
+      </w:tr>
+      <w:tr>
+        <w:tc>
+          <w:tcPr>
+            <w:tcW w:w="1805" w:type="dxa"/>
+            <w:tcBorders>
+              <w:top w:val="single" w:sz="1" w:space="0" w:color="CCCCCC"/>
+              <w:left w:val="single" w:sz="1" w:space="0" w:color="CCCCCC"/>
+              <w:bottom w:val="single" w:sz="1" w:space="0" w:color="CCCCCC"/>
+              <w:right w:val="single" w:sz="1" w:space="0" w:color="CCCCCC"/>
+            </w:tcBorders>
+            <w:tcMar>
+              <w:top w:w="60" w:type="dxa"/>
+              <w:left w:w="100" w:type="dxa"/>
+              <w:bottom w:w="60" w:type="dxa"/>
+              <w:right w:w="100" w:type="dxa"/>
+            </w:tcMar>
+          </w:tcPr>
+          <w:p>
+            <w:r>
+              <w:rPr>
+                <w:sz w:val="20"/>
+                <w:szCs w:val="20"/>
+              </w:rPr>
               <w:lastRenderedPageBreak/>
               <w:t>CLFP</w:t>
             </w:r>
@@ -30146,6 +30971,138 @@
                 <w:szCs w:val="20"/>
               </w:rPr>
               <w:t>IV single dose</w:t>
+            </w:r>
+          </w:p>
+        </w:tc>
+      </w:tr>
+      <w:tr>
+        <w:tc>
+          <w:tcPr>
+            <w:tcW w:w="1805" w:type="dxa"/>
+            <w:tcBorders>
+              <w:top w:val="single" w:sz="1" w:space="0" w:color="CCCCCC"/>
+              <w:left w:val="single" w:sz="1" w:space="0" w:color="CCCCCC"/>
+              <w:bottom w:val="single" w:sz="1" w:space="0" w:color="CCCCCC"/>
+              <w:right w:val="single" w:sz="1" w:space="0" w:color="CCCCCC"/>
+            </w:tcBorders>
+            <w:tcMar>
+              <w:top w:w="60" w:type="dxa"/>
+              <w:left w:w="100" w:type="dxa"/>
+              <w:bottom w:w="60" w:type="dxa"/>
+              <w:right w:w="100" w:type="dxa"/>
+            </w:tcMar>
+          </w:tcPr>
+          <w:p>
+            <w:r>
+              <w:rPr>
+                <w:sz w:val="20"/>
+                <w:szCs w:val="20"/>
+              </w:rPr>
+              <w:t>EXCL</w:t>
+            </w:r>
+          </w:p>
+        </w:tc>
+        <w:tc>
+          <w:tcPr>
+            <w:tcW w:w="1805" w:type="dxa"/>
+            <w:tcBorders>
+              <w:top w:val="single" w:sz="1" w:space="0" w:color="CCCCCC"/>
+              <w:left w:val="single" w:sz="1" w:space="0" w:color="CCCCCC"/>
+              <w:bottom w:val="single" w:sz="1" w:space="0" w:color="CCCCCC"/>
+              <w:right w:val="single" w:sz="1" w:space="0" w:color="CCCCCC"/>
+            </w:tcBorders>
+            <w:tcMar>
+              <w:top w:w="60" w:type="dxa"/>
+              <w:left w:w="100" w:type="dxa"/>
+              <w:bottom w:w="60" w:type="dxa"/>
+              <w:right w:w="100" w:type="dxa"/>
+            </w:tcMar>
+          </w:tcPr>
+          <w:p>
+            <w:r>
+              <w:rPr>
+                <w:sz w:val="20"/>
+                <w:szCs w:val="20"/>
+              </w:rPr>
+              <w:t>Excluded by Analyst (1 = yes)</w:t>
+            </w:r>
+          </w:p>
+        </w:tc>
+        <w:tc>
+          <w:tcPr>
+            <w:tcW w:w="1805" w:type="dxa"/>
+            <w:tcBorders>
+              <w:top w:val="single" w:sz="1" w:space="0" w:color="CCCCCC"/>
+              <w:left w:val="single" w:sz="1" w:space="0" w:color="CCCCCC"/>
+              <w:bottom w:val="single" w:sz="1" w:space="0" w:color="CCCCCC"/>
+              <w:right w:val="single" w:sz="1" w:space="0" w:color="CCCCCC"/>
+            </w:tcBorders>
+            <w:tcMar>
+              <w:top w:w="60" w:type="dxa"/>
+              <w:left w:w="100" w:type="dxa"/>
+              <w:bottom w:w="60" w:type="dxa"/>
+              <w:right w:w="100" w:type="dxa"/>
+            </w:tcMar>
+          </w:tcPr>
+          <w:p>
+            <w:r>
+              <w:rPr>
+                <w:sz w:val="20"/>
+                <w:szCs w:val="20"/>
+              </w:rPr>
+              <w:t>1 for a profile you left out; its result is kept but not used in summaries or bioequivalence</w:t>
+            </w:r>
+          </w:p>
+        </w:tc>
+        <w:tc>
+          <w:tcPr>
+            <w:tcW w:w="1805" w:type="dxa"/>
+            <w:tcBorders>
+              <w:top w:val="single" w:sz="1" w:space="0" w:color="CCCCCC"/>
+              <w:left w:val="single" w:sz="1" w:space="0" w:color="CCCCCC"/>
+              <w:bottom w:val="single" w:sz="1" w:space="0" w:color="CCCCCC"/>
+              <w:right w:val="single" w:sz="1" w:space="0" w:color="CCCCCC"/>
+            </w:tcBorders>
+            <w:tcMar>
+              <w:top w:w="60" w:type="dxa"/>
+              <w:left w:w="100" w:type="dxa"/>
+              <w:bottom w:w="60" w:type="dxa"/>
+              <w:right w:w="100" w:type="dxa"/>
+            </w:tcMar>
+          </w:tcPr>
+          <w:p>
+            <w:r>
+              <w:rPr>
+                <w:sz w:val="20"/>
+                <w:szCs w:val="20"/>
+              </w:rPr>
+              <w:t>(none)</w:t>
+            </w:r>
+          </w:p>
+        </w:tc>
+        <w:tc>
+          <w:tcPr>
+            <w:tcW w:w="1805" w:type="dxa"/>
+            <w:tcBorders>
+              <w:top w:val="single" w:sz="1" w:space="0" w:color="CCCCCC"/>
+              <w:left w:val="single" w:sz="1" w:space="0" w:color="CCCCCC"/>
+              <w:bottom w:val="single" w:sz="1" w:space="0" w:color="CCCCCC"/>
+              <w:right w:val="single" w:sz="1" w:space="0" w:color="CCCCCC"/>
+            </w:tcBorders>
+            <w:tcMar>
+              <w:top w:w="60" w:type="dxa"/>
+              <w:left w:w="100" w:type="dxa"/>
+              <w:bottom w:w="60" w:type="dxa"/>
+              <w:right w:w="100" w:type="dxa"/>
+            </w:tcMar>
+          </w:tcPr>
+          <w:p>
+            <w:r>
+              <w:rPr>
+                <w:sz w:val="20"/>
+                <w:szCs w:val="20"/>
+              </w:rPr>
+              <w:t>All</w:t>
             </w:r>
           </w:p>
         </w:tc>
@@ -33993,6 +34950,15 @@
       </w:r>
       <w:r>
         <w:t xml:space="preserve"> in the CDISC ADNCA upload: the message says why (for example derived records, several units, AFRLT as time, or AVAL missing without a BLQ result). Fix the dataset upstream or make the choice the message asks for.</w:t>
+      </w:r>
+    </w:p>
+    <w:p>
+      <w:pPr>
+        <w:spacing w:after="120" w:line="276" w:lineRule="auto"/>
+      </w:pPr>
+      <w:r>
+        <w:rPr/>
+        <w:t>“… exclusion(s) match no sample or profile of these data”: the register names profiles or times that are not in this file, for example after the columns were mapped differently. Restore those exclusions in the Exclusions card, or map the columns as before.</w:t>
       </w:r>
     </w:p>
     <w:p>
@@ -37030,15 +37996,7 @@
                 <w:sz w:val="20"/>
                 <w:szCs w:val="20"/>
               </w:rPr>
-              <w:t xml:space="preserve">For NCA Assistant v1.8.0. New: chapter Working on a Controlled Installation (sign-in, records for review, review signatures, signature sheets, the audit trail page), Tutorial 8, Appendix E on setting up and administering a controlled installation, troubleshooting for </w:t>
-            </w:r>
-            <w:r>
-              <w:rPr>
-                <w:sz w:val="20"/>
-                <w:szCs w:val="20"/>
-              </w:rPr>
-              <w:lastRenderedPageBreak/>
-              <w:t>controlled installations. The chapter on regulated use describes the controls of a controlled installation and the organisation's responsibilities.</w:t>
+              <w:t>For NCA Assistant v1.8.0. New: chapter Working on a Controlled Installation (sign-in, records for review, review signatures, signature sheets, the audit trail page), Tutorial 8, Appendix E on setting up and administering a controlled installation, troubleshooting for controlled installations. The chapter on regulated use describes the controls of a controlled installation and the organisation's responsibilities. Revised within v1.8.0: exclusions with a reason (Leaving Out Data), half-life rules, the sensitivity analysis without exclusions, and one-click example data in the tutorials.</w:t>
             </w:r>
           </w:p>
         </w:tc>

</xml_diff>

<commit_message>
Docs and release files for the adversarial review of the app
Version history (v1.8.0 kept), steady-state help and Data Guide, README,
manual 1.9 (doses per kg, trough window, AUCtau extrapolation, complete
subjects in Method B, pre-dose samples at a negative time, loading the
exclusion register, flag texts, Appendices A and D), URS (DAT-03, DAT-09,
NCA-07, NCA-09, NCA-15, BE-01, UI-01; FMEA FM-46 to FM-48), MAN-51
extended and MAN-53 added, validation README, IQ/OQ/PQ and release files.

Co-Authored-By: Claude Opus 5.5 <noreply@anthropic.com>
</commit_message>
<xml_diff>
--- a/NCA_Assistant_User_Manual_v1.9.docx
+++ b/NCA_Assistant_User_Manual_v1.9.docx
@@ -9346,6 +9346,10 @@
       <w:r>
         <w:t>, with Dose unit mg, Conc unit mg/L and Time unit h.</w:t>
       </w:r>
+      <w:r>
+        <w:rPr/>
+        <w:t xml:space="preserve"> The Dose panel warns that these doses look like doses per kg; this tutorial uses the nominal 320 mg instead.</w:t>
+      </w:r>
     </w:p>
     <w:p>
       <w:pPr>
@@ -10204,7 +10208,11 @@
         <w:t>Time</w:t>
       </w:r>
       <w:r>
-        <w:t xml:space="preserve"> is the time since the dose of that profile, with the pre-dose sample at 0. A negative pre-dose time is refused: it would make the lag time negative and add the time before the dose to AUC, so set the pre-dose sample to 0.</w:t>
+        <w:t xml:space="preserve"> is the time since the dose of that profile, with the pre-dose sample at 0. </w:t>
+      </w:r>
+      <w:r>
+        <w:rPr/>
+        <w:t>One pre-dose sample per profile drawn just before the dose is analysed at time 0, and its uploaded time is kept: a negative time no earlier than 10% of the profile's duration, such as −0.25 h in a 24 h profile. Any other negative time is refused, because it would make the lag time negative and add the time before the dose to AUC.</w:t>
       </w:r>
     </w:p>
     <w:p>
@@ -10257,8 +10265,20 @@
       <w:pPr>
         <w:spacing w:after="120" w:line="276" w:lineRule="auto"/>
       </w:pPr>
-      <w:r>
-        <w:t>A Dose column must hold the amount given, in the dose unit you select. A weight-based dose in mg/kg with the unit set to mg gives clearance and volume per kilogram, labelled L/h and L. Convert mg/kg to mg first (dose × body weight), or report the values as per kilogram.</w:t>
+      <w:r/>
+      <w:r>
+        <w:rPr/>
+        <w:t xml:space="preserve">A Dose column holds the amount given, in the dose unit you select, or a dose per kg. For a dose per kg, choose the body-weight column (kg) under </w:t>
+      </w:r>
+      <w:r>
+        <w:rPr>
+          <w:b/>
+        </w:rPr>
+        <w:t>Dose per kg: weight column</w:t>
+      </w:r>
+      <w:r>
+        <w:rPr/>
+        <w:t xml:space="preserve"> on the Upload page, and the app uses dose × weight as the amount. Read as mg, a dose in mg/kg gives clearance and volume per kilogram labelled L/h and L; the Dose panel in the analysis says which unit it assumes and warns when the doses look per kg.</w:t>
       </w:r>
     </w:p>
     <w:p>
@@ -11586,6 +11606,10 @@
       </w:pPr>
       <w:r>
         <w:t>Add a Dose column if subjects received different doses (dose escalation, weight-based dosing), or if a subject received different doses in different periods. The app takes the dose of each profile (subject, treatment and period) from this column, so every period is analysed with its own dose. For dose proportionality, see Scenario 11.</w:t>
+      </w:r>
+      <w:r>
+        <w:rPr/>
+        <w:t xml:space="preserve"> With weight-based dosing the column may hold the dose per kg if you also map the body-weight column (see Units and Doses).</w:t>
       </w:r>
     </w:p>
     <w:p>
@@ -12519,7 +12543,11 @@
         <w:spacing w:after="120" w:line="276" w:lineRule="auto"/>
       </w:pPr>
       <w:r>
-        <w:t>Two concentrations describe the low point of the interval. Cmin is the lowest observed concentration from 0 to τ, the pre-dose sample included; with an absorption lag it can fall after the dose. Cτ is the observed concentration at τ, and is left empty when no sample was taken at τ. ICH M13A lists both for steady-state studies, and the EMA modified-release guideline asks for Cτ. Both can be compared in Bioequivalence. AUC to infinity, its % extrapolated and the volume at steady state are single-dose quantities and are left empty.</w:t>
+        <w:t xml:space="preserve">Two concentrations describe the low point of the interval. Cmin is the lowest observed concentration from 0 to τ, the pre-dose sample included; with an absorption lag it can fall after the dose. </w:t>
+      </w:r>
+      <w:r>
+        <w:rPr/>
+        <w:t>Cτ is the observed sample nearest to τ within a trough window (by default ±10% of τ, at most 1 time unit; you can change it under the dosing interval), and its time is in the column Time of Ctau. It is never interpolated, and it is left empty, with a note, when no sample falls within the window. ICH M13A lists both for steady-state studies, and the EMA modified-release guideline asks for Cτ. Both can be compared in Bioequivalence. AUC to infinity, its % extrapolated and the volume at steady state are single-dose quantities and are left empty.</w:t>
       </w:r>
     </w:p>
     <w:p>
@@ -13655,10 +13683,11 @@
         <w:rPr>
           <w:b/>
         </w:rPr>
-        <w:t>A negative pre-dose time</w:t>
-      </w:r>
-      <w:r>
-        <w:t xml:space="preserve">: set it to 0. </w:t>
+        <w:t>Negative times</w:t>
+      </w:r>
+      <w:r>
+        <w:rPr/>
+        <w:t xml:space="preserve">: only one pre-dose sample per profile, just before the dose, is accepted. </w:t>
       </w:r>
       <w:r>
         <w:rPr>
@@ -13709,10 +13738,11 @@
         <w:rPr>
           <w:b/>
         </w:rPr>
-        <w:t>Dose in mg/kg with the unit set to mg</w:t>
-      </w:r>
-      <w:r>
-        <w:t xml:space="preserve">: see Units and Doses. </w:t>
+        <w:t>Dose in mg/kg</w:t>
+      </w:r>
+      <w:r>
+        <w:rPr/>
+        <w:t xml:space="preserve">: map the body-weight column (Units and Doses). </w:t>
       </w:r>
       <w:r>
         <w:rPr>
@@ -14288,12 +14318,26 @@
         <w:t>CDISC ADNCA dataset</w:t>
       </w:r>
       <w:r>
-        <w:t xml:space="preserve">), upload it, and set the Delimiter and Decimal point for a text file. Check the column mapping (Subject ID, Time, Concentration, and where present Treatment / Formulation, Period, Sequence and Dose), set the </w:t>
+        <w:t xml:space="preserve">), upload it, and set the Delimiter and Decimal point for a text file. Check the column mapping (Subject ID, Time, Concentration, and where present Treatment / Formulation, Period, </w:t>
+      </w:r>
+      <w:r>
+        <w:rPr/>
+        <w:t xml:space="preserve">Sequence and Dose, and </w:t>
       </w:r>
       <w:r>
         <w:rPr>
           <w:b/>
         </w:rPr>
+        <w:t>Dose per kg: weight column</w:t>
+      </w:r>
+      <w:r>
+        <w:rPr/>
+        <w:t xml:space="preserve"> for a dose per kg), set the </w:t>
+      </w:r>
+      <w:r>
+        <w:rPr>
+          <w:b/>
+        </w:rPr>
         <w:t>LLOQ value</w:t>
       </w:r>
       <w:r>
@@ -14315,7 +14359,11 @@
         <w:t>Process Data</w:t>
       </w:r>
       <w:r>
-        <w:t xml:space="preserve">. The app runs more than 30 quality checks: errors block processing, warnings do not. Some checks stop data the app cannot analyse safely: a CDISC-style file uploaded as a simple table, mixed units, dates or clock times in the Time column, profiles that do not start near time zero (time since the first dose), several profiles stacked in one column (duplicate times), subject IDs that restart in each sequence, and a decimal point in a decimal-comma file. A second dose inside one profile, or a multi-period file without a mapped Period, gives a warning. </w:t>
+        <w:t xml:space="preserve">. The app runs more than 30 quality checks: errors block processing, warnings do not. Some checks stop data the app cannot analyse safely: a CDISC-style file uploaded as a simple table, mixed units, dates or clock times in the Time column, profiles that do not start near time zero (time since the first dose), several profiles stacked in one column (duplicate times), subject IDs that restart in each sequence, </w:t>
+      </w:r>
+      <w:r>
+        <w:rPr/>
+        <w:t xml:space="preserve">a decimal point in a decimal-comma file, and a negative time other than one pre-dose sample just before the dose. A second dose inside one profile, or a multi-period file without a mapped Period, gives a warning. </w:t>
       </w:r>
       <w:r>
         <w:rPr/>
@@ -14456,6 +14504,30 @@
         <w:rPr/>
         <w:t>. The exclusions go into the downloads and the Analysis Record, whose reproduction script applies them again.</w:t>
       </w:r>
+      <w:r>
+        <w:rPr/>
+        <w:t xml:space="preserve"> </w:t>
+      </w:r>
+      <w:r>
+        <w:rPr>
+          <w:b/>
+        </w:rPr>
+        <w:t>Download exclusions</w:t>
+      </w:r>
+      <w:r>
+        <w:rPr/>
+        <w:t xml:space="preserve"> saves the register as a file, and </w:t>
+      </w:r>
+      <w:r>
+        <w:rPr>
+          <w:b/>
+        </w:rPr>
+        <w:t>Load exclusions from a file</w:t>
+      </w:r>
+      <w:r>
+        <w:rPr/>
+        <w:t xml:space="preserve"> reads it back (or the analysis_settings.json of a record) for the same data, each exclusion keeping who made it and when. The register lives only in the browser session, so the browser asks before you close or reload the page while it holds changes you have not downloaded.</w:t>
+      </w:r>
     </w:p>
     <w:p>
       <w:pPr>
@@ -15187,7 +15259,15 @@
       </w:r>
       <w:r>
         <w:rPr/>
-        <w:t xml:space="preserve"> changes them or switches them off. By default a fit is flagged when its points span less than two half-lives, when AUC∞ is more than 20% extrapolated (not at steady state) or, after an IV bolus, more than 20% back-extrapolated. A flag changes no value and leaves nothing out. It marks the fits worth a second look: Half-Life Review adds (flagged) to those profiles in its list and shows each rule as pass or fail. All paths use the same rules, and the Analysis Record stores them.</w:t>
+        <w:t xml:space="preserve"> changes them or switches them off. By default a fit is flagged when its points span less than two half-lives, when AUC∞ is more than 20% extrapolated </w:t>
+      </w:r>
+      <w:r>
+        <w:rPr/>
+        <w:t>(at steady state: more than 20% of AUCτ extrapolated past the last sample) or, after an IV bolus, more than 20% back-extrapolated. A flag changes no value and leaves nothing out. It marks the fits worth a second look: Half-Life Review adds (flagged) to those profiles in its list and shows each rule as pass or fail. All paths use the same rules, and the Analysis Record stores them.</w:t>
+      </w:r>
+      <w:r>
+        <w:rPr/>
+        <w:t xml:space="preserve"> A profile without flags shows none, no half-life or rules off, so the column is never empty.</w:t>
       </w:r>
     </w:p>
     <w:p>
@@ -17077,7 +17157,10 @@
       </w:r>
       <w:r>
         <w:rPr/>
-        <w:t xml:space="preserve"> names any half-life rule the fit breaks, and </w:t>
+      </w:r>
+      <w:r>
+        <w:rPr/>
+        <w:t xml:space="preserve"> names any half-life rule the fit breaks (or says none, no half-life or rules off), and </w:t>
       </w:r>
       <w:r>
         <w:rPr>
@@ -18167,6 +18250,60 @@
                 <w:szCs w:val="20"/>
               </w:rPr>
               <w:t>Profiles you left out, and profiles whose half-life fit breaks a rule; shown when there are any</w:t>
+            </w:r>
+          </w:p>
+        </w:tc>
+      </w:tr>
+      <w:tr>
+        <w:tc>
+          <w:tcPr>
+            <w:tcW w:w="4513" w:type="dxa"/>
+            <w:tcBorders>
+              <w:top w:val="single" w:sz="1" w:space="0" w:color="CCCCCC"/>
+              <w:left w:val="single" w:sz="1" w:space="0" w:color="CCCCCC"/>
+              <w:bottom w:val="single" w:sz="1" w:space="0" w:color="CCCCCC"/>
+              <w:right w:val="single" w:sz="1" w:space="0" w:color="CCCCCC"/>
+            </w:tcBorders>
+            <w:tcMar>
+              <w:top w:w="60" w:type="dxa"/>
+              <w:left w:w="100" w:type="dxa"/>
+              <w:bottom w:w="60" w:type="dxa"/>
+              <w:right w:w="100" w:type="dxa"/>
+            </w:tcMar>
+          </w:tcPr>
+          <w:p>
+            <w:r>
+              <w:rPr>
+                <w:sz w:val="20"/>
+                <w:szCs w:val="20"/>
+              </w:rPr>
+              <w:t>Subjects without both treatments</w:t>
+            </w:r>
+          </w:p>
+        </w:tc>
+        <w:tc>
+          <w:tcPr>
+            <w:tcW w:w="4513" w:type="dxa"/>
+            <w:tcBorders>
+              <w:top w:val="single" w:sz="1" w:space="0" w:color="CCCCCC"/>
+              <w:left w:val="single" w:sz="1" w:space="0" w:color="CCCCCC"/>
+              <w:bottom w:val="single" w:sz="1" w:space="0" w:color="CCCCCC"/>
+              <w:right w:val="single" w:sz="1" w:space="0" w:color="CCCCCC"/>
+            </w:tcBorders>
+            <w:tcMar>
+              <w:top w:w="60" w:type="dxa"/>
+              <w:left w:w="100" w:type="dxa"/>
+              <w:bottom w:w="60" w:type="dxa"/>
+              <w:right w:w="100" w:type="dxa"/>
+            </w:tcMar>
+          </w:tcPr>
+          <w:p>
+            <w:r>
+              <w:rPr>
+                <w:sz w:val="20"/>
+                <w:szCs w:val="20"/>
+              </w:rPr>
+              <w:t>In a 2×2 crossover or paired comparison: subjects left out of both models because they lack Test or Reference; shown when there are any</w:t>
             </w:r>
           </w:p>
         </w:tc>
@@ -20217,6 +20354,10 @@
       <w:r>
         <w:t>2. Enter each exclusion with its reason and, where it applies, the protocol section. Enter pre-specified exclusions before you run the bioequivalence analysis: the register marks any exclusion made after the results were seen.</w:t>
       </w:r>
+      <w:r>
+        <w:rPr/>
+        <w:t xml:space="preserve"> Download the register before you end the session; loaded back later, it keeps its timing.</w:t>
+      </w:r>
     </w:p>
     <w:p>
       <w:pPr>
@@ -21967,7 +22108,15 @@
         <w:spacing w:after="120" w:line="276" w:lineRule="auto"/>
       </w:pPr>
       <w:r>
-        <w:t>At steady state AUCτ replaces AUC∞. You enter the dosing interval τ; AUCτ is the AUC from 0 to τ, interpolated between samples and extrapolated with λz when the last sample is missing or earlier than τ (not reported if that fit was rejected). Cavg = AUCτ/τ, fluctuation = (Cmax − Cmin)/Cavg × 100 and swing = (Cmax − Cmin)/Cmin. In fluctuation and swing, Cmax is the highest observed concentration from 0 to τ. The Cmax column is NonCompart's and covers the whole profile. When sampling goes on after τ and the highest value lies there, the two differ and a note names the profile; check the dosing times, because a sample after τ may follow the next dose. Cmin is the lowest observed concentration from 0 to τ, the pre-dose sample included, and Cτ is the observed concentration at τ; the two differ when the minimum falls after the dose. A BLQ result within the interval enters Cmin at the value the BLQ rule gave it (0 or LLOQ/2). CL/F and Vz/F are calculated from AUCτ. AUC∞, its % extrapolated, AUMC∞, and the single-dose Vss and MRT are not meaningful during repeated dosing and are left empty. A half-life from one interval is unreliable when the interval does not cover the terminal phase.</w:t>
+        <w:t xml:space="preserve">At steady state AUCτ replaces AUC∞. You enter the dosing interval τ; AUCτ is the AUC from 0 to τ, interpolated between samples and extrapolated with λz when the last sample is missing or earlier than τ </w:t>
+      </w:r>
+      <w:r>
+        <w:rPr/>
+        <w:t xml:space="preserve">(not reported if that fit was rejected); the extrapolated share is the column AUC Within Dosing Interval % Extrapolated, with a note and, above the limit of the half-life rules, a flag. Cavg = AUCτ/τ, fluctuation = (Cmax − Cmin)/Cavg × 100 and swing = (Cmax − Cmin)/Cmin. In fluctuation and swing, Cmax is the highest observed concentration from 0 to τ. The Cmax column is NonCompart's and covers the whole profile. When sampling goes on after τ and the highest value lies there, the two differ and a note names the profile; check the dosing times, because a sample after τ may follow the next dose. Cmin is the lowest observed concentration from 0 to τ, the pre-dose sample included, </w:t>
+      </w:r>
+      <w:r>
+        <w:rPr/>
+        <w:t>and Cτ is the observed sample nearest to τ within the trough window; the two differ when the minimum falls after the dose. A BLQ result within the interval enters Cmin at the value the BLQ rule gave it (0 or LLOQ/2). CL/F and Vz/F are calculated from AUCτ. AUC∞, its % extrapolated, AUMC∞, and the single-dose Vss and MRT are not meaningful during repeated dosing and are left empty. A half-life from one interval is unreliable when the interval does not cover the terminal phase.</w:t>
       </w:r>
     </w:p>
     <w:p>
@@ -22150,7 +22299,11 @@
         <w:spacing w:after="120" w:line="276" w:lineRule="auto"/>
       </w:pPr>
       <w:r>
-        <w:t>Mixed effects (nlme::lme): Subject is a random intercept, and denominator df use the containment method. Subjects with only one treatment still contribute. ICH M13A (2.2.3.2) allows a general linear or a mixed model, but its primary analysis includes all data of the subjects with evaluable data for both products; with the mixed model the app also uses subjects with one treatment, which is not that population. Use the model your protocol or statistical analysis plan specifies, for example the mixed model as a sensitivity analysis. If the mixed model was chosen and cannot be fitted, the app shows the fixed-effects result for information, says so in the Model column, and gives no verdict: the model is not changed after the data are seen. This is EMA Method B (one within-subject variance; results agree with replicateBE). It is not the FDA model for replicate designs, which has separate Test and Reference variances, a subject-by-formulation interaction and Satterthwaite degrees of freedom.</w:t>
+        <w:t xml:space="preserve">Mixed effects (nlme::lme): Subject is a random intercept, and denominator df use the containment method. </w:t>
+      </w:r>
+      <w:r>
+        <w:rPr/>
+        <w:t>In a 2×2 crossover and the paired comparison, subjects without both treatments are left out before either model is fitted, as the EMA guideline asks, and are counted in the column Subjects without both treatments. ICH M13A (2.2.3.2) allows a general linear or a mixed model; its primary analysis includes all data of the subjects with evaluable data for both products. In replicate designs the mixed model still uses subjects who received one treatment only, because their repeated administrations inform the within-subject variance. Use the model your protocol or statistical analysis plan specifies, for example the mixed model as a sensitivity analysis. If the mixed model was chosen and cannot be fitted, the app shows the fixed-effects result for information, says so in the Model column, and gives no verdict: the model is not changed after the data are seen. This is EMA Method B (one within-subject variance; results agree with replicateBE). It is not the FDA model for replicate designs, which has separate Test and Reference variances, a subject-by-formulation interaction and Satterthwaite degrees of freedom.</w:t>
       </w:r>
     </w:p>
     <w:p>
@@ -24975,7 +25128,7 @@
                 <w:sz w:val="20"/>
                 <w:szCs w:val="20"/>
               </w:rPr>
-              <w:t>The half-life rules the fit breaks, in words; empty when it breaks none</w:t>
+              <w:t>The half-life rules the fit breaks, in words; none, no half-life or rules off when it breaks none</w:t>
             </w:r>
           </w:p>
         </w:tc>
@@ -25159,7 +25312,7 @@
                 <w:sz w:val="20"/>
                 <w:szCs w:val="20"/>
               </w:rPr>
-              <w:t>All, with λz (FLAG_AUCPE single dose, FLAG_AUCPBE IV bolus)</w:t>
+              <w:t>All, with λz (FLAG_AUCPE: AUC∞ single dose, AUCτ at steady state; FLAG_AUCPBE IV bolus)</w:t>
             </w:r>
           </w:p>
         </w:tc>
@@ -28620,7 +28773,7 @@
                 <w:sz w:val="20"/>
                 <w:szCs w:val="20"/>
               </w:rPr>
-              <w:t>TAU</w:t>
+              <w:t>AUCTAU_PCTEXT</w:t>
             </w:r>
           </w:p>
         </w:tc>
@@ -28646,7 +28799,7 @@
                 <w:sz w:val="20"/>
                 <w:szCs w:val="20"/>
               </w:rPr>
-              <w:t>Dosing Interval (tau)</w:t>
+              <w:t>AUC Within Dosing Interval % Extrapolated</w:t>
             </w:r>
           </w:p>
         </w:tc>
@@ -28672,7 +28825,7 @@
                 <w:sz w:val="20"/>
                 <w:szCs w:val="20"/>
               </w:rPr>
-              <w:t>The dosing interval you entered</w:t>
+              <w:t>Share of AUCτ extrapolated with λz past the last sample, %; 0 when sampling reaches τ</w:t>
             </w:r>
           </w:p>
         </w:tc>
@@ -28698,7 +28851,7 @@
                 <w:sz w:val="20"/>
                 <w:szCs w:val="20"/>
               </w:rPr>
-              <w:t>h</w:t>
+              <w:t>(none)</w:t>
             </w:r>
           </w:p>
         </w:tc>
@@ -28752,7 +28905,7 @@
                 <w:sz w:val="20"/>
                 <w:szCs w:val="20"/>
               </w:rPr>
-              <w:t>CAVG</w:t>
+              <w:t>TAU</w:t>
             </w:r>
           </w:p>
         </w:tc>
@@ -28778,7 +28931,7 @@
                 <w:sz w:val="20"/>
                 <w:szCs w:val="20"/>
               </w:rPr>
-              <w:t>Average Concentration (Cavg)</w:t>
+              <w:t>Dosing Interval (tau)</w:t>
             </w:r>
           </w:p>
         </w:tc>
@@ -28804,7 +28957,7 @@
                 <w:sz w:val="20"/>
                 <w:szCs w:val="20"/>
               </w:rPr>
-              <w:t>AUCτ/τ</w:t>
+              <w:t>The dosing interval you entered</w:t>
             </w:r>
           </w:p>
         </w:tc>
@@ -28830,7 +28983,7 @@
                 <w:sz w:val="20"/>
                 <w:szCs w:val="20"/>
               </w:rPr>
-              <w:t>ng/mL</w:t>
+              <w:t>h</w:t>
             </w:r>
           </w:p>
         </w:tc>
@@ -28884,7 +29037,7 @@
                 <w:sz w:val="20"/>
                 <w:szCs w:val="20"/>
               </w:rPr>
-              <w:t>CMIN_SS</w:t>
+              <w:t>CAVG</w:t>
             </w:r>
           </w:p>
         </w:tc>
@@ -28910,7 +29063,7 @@
                 <w:sz w:val="20"/>
                 <w:szCs w:val="20"/>
               </w:rPr>
-              <w:t>Minimum Concentration (Cmin)</w:t>
+              <w:t>Average Concentration (Cavg)</w:t>
             </w:r>
           </w:p>
         </w:tc>
@@ -28936,7 +29089,7 @@
                 <w:sz w:val="20"/>
                 <w:szCs w:val="20"/>
               </w:rPr>
-              <w:t>Lowest observed concentration from 0 to τ, pre-dose included</w:t>
+              <w:t>AUCτ/τ</w:t>
             </w:r>
           </w:p>
         </w:tc>
@@ -29016,6 +29169,138 @@
                 <w:sz w:val="20"/>
                 <w:szCs w:val="20"/>
               </w:rPr>
+              <w:t>CMIN_SS</w:t>
+            </w:r>
+          </w:p>
+        </w:tc>
+        <w:tc>
+          <w:tcPr>
+            <w:tcW w:w="1805" w:type="dxa"/>
+            <w:tcBorders>
+              <w:top w:val="single" w:sz="1" w:space="0" w:color="CCCCCC"/>
+              <w:left w:val="single" w:sz="1" w:space="0" w:color="CCCCCC"/>
+              <w:bottom w:val="single" w:sz="1" w:space="0" w:color="CCCCCC"/>
+              <w:right w:val="single" w:sz="1" w:space="0" w:color="CCCCCC"/>
+            </w:tcBorders>
+            <w:tcMar>
+              <w:top w:w="60" w:type="dxa"/>
+              <w:left w:w="100" w:type="dxa"/>
+              <w:bottom w:w="60" w:type="dxa"/>
+              <w:right w:w="100" w:type="dxa"/>
+            </w:tcMar>
+          </w:tcPr>
+          <w:p>
+            <w:r>
+              <w:rPr>
+                <w:sz w:val="20"/>
+                <w:szCs w:val="20"/>
+              </w:rPr>
+              <w:t>Minimum Concentration (Cmin)</w:t>
+            </w:r>
+          </w:p>
+        </w:tc>
+        <w:tc>
+          <w:tcPr>
+            <w:tcW w:w="1805" w:type="dxa"/>
+            <w:tcBorders>
+              <w:top w:val="single" w:sz="1" w:space="0" w:color="CCCCCC"/>
+              <w:left w:val="single" w:sz="1" w:space="0" w:color="CCCCCC"/>
+              <w:bottom w:val="single" w:sz="1" w:space="0" w:color="CCCCCC"/>
+              <w:right w:val="single" w:sz="1" w:space="0" w:color="CCCCCC"/>
+            </w:tcBorders>
+            <w:tcMar>
+              <w:top w:w="60" w:type="dxa"/>
+              <w:left w:w="100" w:type="dxa"/>
+              <w:bottom w:w="60" w:type="dxa"/>
+              <w:right w:w="100" w:type="dxa"/>
+            </w:tcMar>
+          </w:tcPr>
+          <w:p>
+            <w:r>
+              <w:rPr>
+                <w:sz w:val="20"/>
+                <w:szCs w:val="20"/>
+              </w:rPr>
+              <w:t>Lowest observed concentration from 0 to τ, pre-dose included</w:t>
+            </w:r>
+          </w:p>
+        </w:tc>
+        <w:tc>
+          <w:tcPr>
+            <w:tcW w:w="1805" w:type="dxa"/>
+            <w:tcBorders>
+              <w:top w:val="single" w:sz="1" w:space="0" w:color="CCCCCC"/>
+              <w:left w:val="single" w:sz="1" w:space="0" w:color="CCCCCC"/>
+              <w:bottom w:val="single" w:sz="1" w:space="0" w:color="CCCCCC"/>
+              <w:right w:val="single" w:sz="1" w:space="0" w:color="CCCCCC"/>
+            </w:tcBorders>
+            <w:tcMar>
+              <w:top w:w="60" w:type="dxa"/>
+              <w:left w:w="100" w:type="dxa"/>
+              <w:bottom w:w="60" w:type="dxa"/>
+              <w:right w:w="100" w:type="dxa"/>
+            </w:tcMar>
+          </w:tcPr>
+          <w:p>
+            <w:r>
+              <w:rPr>
+                <w:sz w:val="20"/>
+                <w:szCs w:val="20"/>
+              </w:rPr>
+              <w:t>ng/mL</w:t>
+            </w:r>
+          </w:p>
+        </w:tc>
+        <w:tc>
+          <w:tcPr>
+            <w:tcW w:w="1805" w:type="dxa"/>
+            <w:tcBorders>
+              <w:top w:val="single" w:sz="1" w:space="0" w:color="CCCCCC"/>
+              <w:left w:val="single" w:sz="1" w:space="0" w:color="CCCCCC"/>
+              <w:bottom w:val="single" w:sz="1" w:space="0" w:color="CCCCCC"/>
+              <w:right w:val="single" w:sz="1" w:space="0" w:color="CCCCCC"/>
+            </w:tcBorders>
+            <w:tcMar>
+              <w:top w:w="60" w:type="dxa"/>
+              <w:left w:w="100" w:type="dxa"/>
+              <w:bottom w:w="60" w:type="dxa"/>
+              <w:right w:w="100" w:type="dxa"/>
+            </w:tcMar>
+          </w:tcPr>
+          <w:p>
+            <w:r>
+              <w:rPr>
+                <w:sz w:val="20"/>
+                <w:szCs w:val="20"/>
+              </w:rPr>
+              <w:t>Steady state</w:t>
+            </w:r>
+          </w:p>
+        </w:tc>
+      </w:tr>
+      <w:tr>
+        <w:tc>
+          <w:tcPr>
+            <w:tcW w:w="1805" w:type="dxa"/>
+            <w:tcBorders>
+              <w:top w:val="single" w:sz="1" w:space="0" w:color="CCCCCC"/>
+              <w:left w:val="single" w:sz="1" w:space="0" w:color="CCCCCC"/>
+              <w:bottom w:val="single" w:sz="1" w:space="0" w:color="CCCCCC"/>
+              <w:right w:val="single" w:sz="1" w:space="0" w:color="CCCCCC"/>
+            </w:tcBorders>
+            <w:tcMar>
+              <w:top w:w="60" w:type="dxa"/>
+              <w:left w:w="100" w:type="dxa"/>
+              <w:bottom w:w="60" w:type="dxa"/>
+              <w:right w:w="100" w:type="dxa"/>
+            </w:tcMar>
+          </w:tcPr>
+          <w:p>
+            <w:r>
+              <w:rPr>
+                <w:sz w:val="20"/>
+                <w:szCs w:val="20"/>
+              </w:rPr>
               <w:lastRenderedPageBreak/>
               <w:t>CTAU_SS</w:t>
             </w:r>
@@ -29069,7 +29354,7 @@
                 <w:sz w:val="20"/>
                 <w:szCs w:val="20"/>
               </w:rPr>
-              <w:t>Observed concentration at τ; empty without a sample at τ</w:t>
+              <w:t>Observed sample nearest to τ within the trough window (default ±10% of τ, at most 1 time unit); empty when there is none</w:t>
             </w:r>
           </w:p>
         </w:tc>
@@ -29096,6 +29381,138 @@
                 <w:szCs w:val="20"/>
               </w:rPr>
               <w:t>ng/mL</w:t>
+            </w:r>
+          </w:p>
+        </w:tc>
+        <w:tc>
+          <w:tcPr>
+            <w:tcW w:w="1805" w:type="dxa"/>
+            <w:tcBorders>
+              <w:top w:val="single" w:sz="1" w:space="0" w:color="CCCCCC"/>
+              <w:left w:val="single" w:sz="1" w:space="0" w:color="CCCCCC"/>
+              <w:bottom w:val="single" w:sz="1" w:space="0" w:color="CCCCCC"/>
+              <w:right w:val="single" w:sz="1" w:space="0" w:color="CCCCCC"/>
+            </w:tcBorders>
+            <w:tcMar>
+              <w:top w:w="60" w:type="dxa"/>
+              <w:left w:w="100" w:type="dxa"/>
+              <w:bottom w:w="60" w:type="dxa"/>
+              <w:right w:w="100" w:type="dxa"/>
+            </w:tcMar>
+          </w:tcPr>
+          <w:p>
+            <w:r>
+              <w:rPr>
+                <w:sz w:val="20"/>
+                <w:szCs w:val="20"/>
+              </w:rPr>
+              <w:t>Steady state</w:t>
+            </w:r>
+          </w:p>
+        </w:tc>
+      </w:tr>
+      <w:tr>
+        <w:tc>
+          <w:tcPr>
+            <w:tcW w:w="1805" w:type="dxa"/>
+            <w:tcBorders>
+              <w:top w:val="single" w:sz="1" w:space="0" w:color="CCCCCC"/>
+              <w:left w:val="single" w:sz="1" w:space="0" w:color="CCCCCC"/>
+              <w:bottom w:val="single" w:sz="1" w:space="0" w:color="CCCCCC"/>
+              <w:right w:val="single" w:sz="1" w:space="0" w:color="CCCCCC"/>
+            </w:tcBorders>
+            <w:tcMar>
+              <w:top w:w="60" w:type="dxa"/>
+              <w:left w:w="100" w:type="dxa"/>
+              <w:bottom w:w="60" w:type="dxa"/>
+              <w:right w:w="100" w:type="dxa"/>
+            </w:tcMar>
+          </w:tcPr>
+          <w:p>
+            <w:r>
+              <w:rPr>
+                <w:sz w:val="20"/>
+                <w:szCs w:val="20"/>
+              </w:rPr>
+              <w:t>CTAU_TIME</w:t>
+            </w:r>
+          </w:p>
+        </w:tc>
+        <w:tc>
+          <w:tcPr>
+            <w:tcW w:w="1805" w:type="dxa"/>
+            <w:tcBorders>
+              <w:top w:val="single" w:sz="1" w:space="0" w:color="CCCCCC"/>
+              <w:left w:val="single" w:sz="1" w:space="0" w:color="CCCCCC"/>
+              <w:bottom w:val="single" w:sz="1" w:space="0" w:color="CCCCCC"/>
+              <w:right w:val="single" w:sz="1" w:space="0" w:color="CCCCCC"/>
+            </w:tcBorders>
+            <w:tcMar>
+              <w:top w:w="60" w:type="dxa"/>
+              <w:left w:w="100" w:type="dxa"/>
+              <w:bottom w:w="60" w:type="dxa"/>
+              <w:right w:w="100" w:type="dxa"/>
+            </w:tcMar>
+          </w:tcPr>
+          <w:p>
+            <w:r>
+              <w:rPr>
+                <w:sz w:val="20"/>
+                <w:szCs w:val="20"/>
+              </w:rPr>
+              <w:t>Time of Ctau</w:t>
+            </w:r>
+          </w:p>
+        </w:tc>
+        <w:tc>
+          <w:tcPr>
+            <w:tcW w:w="1805" w:type="dxa"/>
+            <w:tcBorders>
+              <w:top w:val="single" w:sz="1" w:space="0" w:color="CCCCCC"/>
+              <w:left w:val="single" w:sz="1" w:space="0" w:color="CCCCCC"/>
+              <w:bottom w:val="single" w:sz="1" w:space="0" w:color="CCCCCC"/>
+              <w:right w:val="single" w:sz="1" w:space="0" w:color="CCCCCC"/>
+            </w:tcBorders>
+            <w:tcMar>
+              <w:top w:w="60" w:type="dxa"/>
+              <w:left w:w="100" w:type="dxa"/>
+              <w:bottom w:w="60" w:type="dxa"/>
+              <w:right w:w="100" w:type="dxa"/>
+            </w:tcMar>
+          </w:tcPr>
+          <w:p>
+            <w:r>
+              <w:rPr>
+                <w:sz w:val="20"/>
+                <w:szCs w:val="20"/>
+              </w:rPr>
+              <w:t>Time of the sample used as Cτ</w:t>
+            </w:r>
+          </w:p>
+        </w:tc>
+        <w:tc>
+          <w:tcPr>
+            <w:tcW w:w="1805" w:type="dxa"/>
+            <w:tcBorders>
+              <w:top w:val="single" w:sz="1" w:space="0" w:color="CCCCCC"/>
+              <w:left w:val="single" w:sz="1" w:space="0" w:color="CCCCCC"/>
+              <w:bottom w:val="single" w:sz="1" w:space="0" w:color="CCCCCC"/>
+              <w:right w:val="single" w:sz="1" w:space="0" w:color="CCCCCC"/>
+            </w:tcBorders>
+            <w:tcMar>
+              <w:top w:w="60" w:type="dxa"/>
+              <w:left w:w="100" w:type="dxa"/>
+              <w:bottom w:w="60" w:type="dxa"/>
+              <w:right w:w="100" w:type="dxa"/>
+            </w:tcMar>
+          </w:tcPr>
+          <w:p>
+            <w:r>
+              <w:rPr>
+                <w:sz w:val="20"/>
+                <w:szCs w:val="20"/>
+              </w:rPr>
+              <w:t>h</w:t>
             </w:r>
           </w:p>
         </w:tc>
@@ -34894,6 +35311,24 @@
       </w:r>
       <w:r>
         <w:t>: time is probably measured from the first dose of the study. Use the time since the dose of each period (in CDISC terms ARRLT or NRRLT, not AFRLT).</w:t>
+      </w:r>
+    </w:p>
+    <w:p>
+      <w:pPr>
+        <w:spacing w:after="120" w:line="276" w:lineRule="auto"/>
+      </w:pPr>
+      <w:r>
+        <w:rPr/>
+        <w:t>“N negative time values detected”: only one pre-dose sample per profile, no earlier than 10% of the profile's duration before the dose, is analysed at time 0. Check whether time counts from the dose of each period.</w:t>
+      </w:r>
+    </w:p>
+    <w:p>
+      <w:pPr>
+        <w:spacing w:after="120" w:line="276" w:lineRule="auto"/>
+      </w:pPr>
+      <w:r>
+        <w:rPr/>
+        <w:t>“A weight column for doses per kg needs a Dose column”: map the Dose column as well, or set Dose per kg: weight column back to (no).</w:t>
       </w:r>
     </w:p>
     <w:p>
@@ -37996,7 +38431,7 @@
                 <w:sz w:val="20"/>
                 <w:szCs w:val="20"/>
               </w:rPr>
-              <w:t>For NCA Assistant v1.8.0. New: chapter Working on a Controlled Installation (sign-in, records for review, review signatures, signature sheets, the audit trail page), Tutorial 8, Appendix E on setting up and administering a controlled installation, troubleshooting for controlled installations. The chapter on regulated use describes the controls of a controlled installation and the organisation's responsibilities. Revised within v1.8.0: exclusions with a reason (Leaving Out Data), half-life rules, the sensitivity analysis without exclusions, and one-click example data in the tutorials.</w:t>
+              <w:t>For NCA Assistant v1.8.0. New: chapter Working on a Controlled Installation (sign-in, records for review, review signatures, signature sheets, the audit trail page), Tutorial 8, Appendix E on setting up and administering a controlled installation, troubleshooting for controlled installations. The chapter on regulated use describes the controls of a controlled installation and the organisation's responsibilities. Revised within v1.8.0: exclusions with a reason (Leaving Out Data), half-life rules, the sensitivity analysis without exclusions, and one-click example data in the tutorials; after an adversarial review of the app: doses per kg, the trough window for Cτ, AUCτ extrapolation, complete subjects in Method B, pre-dose samples at a negative time, loading the exclusion register again.</w:t>
             </w:r>
           </w:p>
         </w:tc>

</xml_diff>

<commit_message>
Parallel groups: show the Welch interval beside the pooled one
The pooled-variance interval stays the primary result and decides the
verdict. The results table, the CSV and Excel downloads and the Analysis
Record now also carry the Welch (unequal-variance) interval and its
degrees of freedom as supplementary information. ICH M13A, the EMA
guideline (2010) and the FDA guidance (May 2026) do not say which
interval to use for two parallel groups.

Validation: PAR-03 now tests the app's own Welch output against Table I
of Fuglsang et al.; PAR-05 added (541 automated tests). Docs: Methods
page, version history, manual (docx; PDF not regenerated), URS-BE-01,
READMEs, IQ/OQ/PQ and release manifest.

Co-Authored-By: Claude Opus 5.5 <noreply@anthropic.com>
</commit_message>
<xml_diff>
--- a/NCA_Assistant_User_Manual_v1.9.docx
+++ b/NCA_Assistant_User_Manual_v1.9.docx
@@ -16894,7 +16894,7 @@
         <w:spacing w:after="120" w:line="276" w:lineRule="auto"/>
       </w:pPr>
       <w:r>
-        <w:t>For parallel groups the app also calculates the Welch interval, which does not assume equal variances, and reports it when it would change the conclusion. The pooled interval stays the primary result; if your statistical analysis plan or a guidance asks for an unequal-variance analysis, the app's verdict is not your primary result.</w:t>
+        <w:t>For parallel groups the results table also shows the Welch interval, which does not assume equal variances, next to the pooled interval. The pooled interval stays the primary result and decides the verdict; if your statistical analysis plan or a guidance asks for an unequal-variance analysis, the app's verdict is not your primary result.</w:t>
       </w:r>
     </w:p>
     <w:p>
@@ -21928,8 +21928,7 @@
         <w:spacing w:after="120" w:line="276" w:lineRule="auto"/>
       </w:pPr>
       <w:r>
-        <w:lastRenderedPageBreak/>
-        <w:t>• For parallel groups the pooled-variance interval is the app's primary result; if the plan specifies an unequal-variance (Welch) analysis, that is your primary result.</w:t>
+        <w:t>• For parallel groups the pooled-variance interval is the app's primary result. ICH M13A, the EMA guideline and the FDA guidance of May 2026 do not say which interval to use; if the plan specifies an unequal-variance (Welch) analysis, that is your primary result.</w:t>
       </w:r>
     </w:p>
     <w:p>
@@ -26539,7 +26538,7 @@
         <w:t>R</w:t>
       </w:r>
       <w:r>
-        <w:t xml:space="preserve"> − 2. Differences between subjects enter the comparison, so more subjects are needed than in a crossover. The interval assumes equal variances in both groups (pooled variance). The app also calculates the Welch interval, which allows unequal variances, and reports it as a sensitivity result when it leads to a different conclusion. When the analysis plan specifies an unequal-variance analysis, that is the primary result, not the app's verdict.</w:t>
+        <w:t xml:space="preserve"> − 2. Differences between subjects enter the comparison, so more subjects are needed than in a crossover. The interval assumes equal variances in both groups (pooled variance). The results table also shows the Welch interval, which allows unequal variances, as supplementary information. When the analysis plan specifies an unequal-variance analysis, that is the primary result, not the app's verdict.</w:t>
       </w:r>
     </w:p>
     <w:p>
@@ -39619,7 +39618,7 @@
                 <w:sz w:val="20"/>
                 <w:szCs w:val="20"/>
               </w:rPr>
-              <w:t>A confidence interval for a parallel design that does not assume equal variances in the two groups</w:t>
+              <w:t>A confidence interval for a parallel design that does not assume equal variances in the two groups; shown next to the pooled interval as supplementary information</w:t>
             </w:r>
           </w:p>
         </w:tc>

</xml_diff>

<commit_message>
Example datasets, Tutorials 4b and 4c, four screenshots (phase 8)
example_be_replicate_hvd.csv (32 subjects, Cmax s_WR 0.40 scaled, AUC 0.25
standard) and example_be_parallel_covariates.csv (40 subjects, Age, Weight, Sex),
both made by the seeded generator validation/fixtures/make_example_datasets.R
(seeds 522 and 676). Registered in the example list, the Data Guide and the
downloads. EXM-07 to EXM-09 pin the numbers the tutorials quote and the
generator. Manual: Tutorial 4b (covariates) and 4c (reference-scaled analysis)
with answers and four figures (4b.1, 4b.2, 4c.1, 4c.2); figure and tutorial
numbers elsewhere unchanged. Found while taking screenshots: the verdict
column was pushed off screen in scaled tables (route details now follow it;
limits in one column), and a stale approach choice from an earlier study gave a
false warning on a parallel study. 583 automated tests pass. Text humanized.

Co-Authored-By: Claude Sonnet 5.5 <noreply@anthropic.com>
</commit_message>
<xml_diff>
--- a/NCA_Assistant_User_Manual_v1.9.docx
+++ b/NCA_Assistant_User_Manual_v1.9.docx
@@ -9970,6 +9970,857 @@
       <w:pPr>
         <w:pStyle w:val="Kop2"/>
       </w:pPr>
+      <w:r>
+        <w:rPr/>
+        <w:t>Tutorial 4b: Covariates in a Parallel-Group Study</w:t>
+      </w:r>
+    </w:p>
+    <w:p>
+      <w:pPr>
+        <w:spacing w:after="120" w:line="276" w:lineRule="auto"/>
+      </w:pPr>
+      <w:r>
+        <w:rPr/>
+        <w:t>This tutorial uses example_be_parallel_covariates.csv: 40 subjects in two parallel groups of 20, one oral dose of 100 mg, samples up to 48 h, and the baseline columns Age, Weight and Sex. Suppose the protocol named body weight as a covariate before the study began. A covariate is a characteristic of each subject that may move the PK parameter. Use baseline values only, known before the first dose: a value measured after dosing can be changed by the treatment itself. Choose the covariates before you look at any result.</w:t>
+      </w:r>
+    </w:p>
+    <w:p>
+      <w:pPr>
+        <w:spacing w:after="120" w:line="276" w:lineRule="auto"/>
+      </w:pPr>
+      <w:r>
+        <w:rPr/>
+        <w:t xml:space="preserve">1. On the hub, click </w:t>
+      </w:r>
+      <w:r>
+        <w:rPr>
+          <w:b/>
+        </w:rPr>
+        <w:t>2. Upload &amp; Check Data</w:t>
+      </w:r>
+      <w:r>
+        <w:rPr/>
+        <w:t xml:space="preserve">. Under </w:t>
+      </w:r>
+      <w:r>
+        <w:rPr>
+          <w:b/>
+        </w:rPr>
+        <w:t>Or use an example</w:t>
+      </w:r>
+      <w:r>
+        <w:rPr/>
+        <w:t xml:space="preserve">, choose example_be_parallel_covariates.csv and click </w:t>
+      </w:r>
+      <w:r>
+        <w:rPr>
+          <w:b/>
+        </w:rPr>
+        <w:t>Load example</w:t>
+      </w:r>
+      <w:r>
+        <w:rPr/>
+        <w:t xml:space="preserve">. Check that </w:t>
+      </w:r>
+      <w:r>
+        <w:rPr>
+          <w:b/>
+        </w:rPr>
+        <w:t>Subject ID</w:t>
+      </w:r>
+      <w:r>
+        <w:rPr/>
+        <w:t xml:space="preserve"> is Subject, </w:t>
+      </w:r>
+      <w:r>
+        <w:rPr>
+          <w:b/>
+        </w:rPr>
+        <w:t>Time</w:t>
+      </w:r>
+      <w:r>
+        <w:rPr/>
+        <w:t xml:space="preserve"> is Time, </w:t>
+      </w:r>
+      <w:r>
+        <w:rPr>
+          <w:b/>
+        </w:rPr>
+        <w:t>Concentration</w:t>
+      </w:r>
+      <w:r>
+        <w:rPr/>
+        <w:t xml:space="preserve"> is Conc, </w:t>
+      </w:r>
+      <w:r>
+        <w:rPr>
+          <w:b/>
+        </w:rPr>
+        <w:t>Treatment / Formulation</w:t>
+      </w:r>
+      <w:r>
+        <w:rPr/>
+        <w:t xml:space="preserve"> is Treatment and </w:t>
+      </w:r>
+      <w:r>
+        <w:rPr>
+          <w:b/>
+        </w:rPr>
+        <w:t>Dose</w:t>
+      </w:r>
+      <w:r>
+        <w:rPr/>
+        <w:t xml:space="preserve"> is Dose. Leave </w:t>
+      </w:r>
+      <w:r>
+        <w:rPr>
+          <w:b/>
+        </w:rPr>
+        <w:t>Period</w:t>
+      </w:r>
+      <w:r>
+        <w:rPr/>
+        <w:t xml:space="preserve">, </w:t>
+      </w:r>
+      <w:r>
+        <w:rPr>
+          <w:b/>
+        </w:rPr>
+        <w:t>Sequence</w:t>
+      </w:r>
+      <w:r>
+        <w:rPr/>
+        <w:t xml:space="preserve"> and </w:t>
+      </w:r>
+      <w:r>
+        <w:rPr>
+          <w:b/>
+        </w:rPr>
+        <w:t>Dose per kg: weight column</w:t>
+      </w:r>
+      <w:r>
+        <w:rPr/>
+        <w:t xml:space="preserve"> empty: a column mapped to one of these roles cannot be a covariate. Click </w:t>
+      </w:r>
+      <w:r>
+        <w:rPr>
+          <w:b/>
+        </w:rPr>
+        <w:t>Process Data</w:t>
+      </w:r>
+      <w:r>
+        <w:rPr/>
+        <w:t>.</w:t>
+      </w:r>
+    </w:p>
+    <w:p>
+      <w:pPr>
+        <w:spacing w:after="120" w:line="276" w:lineRule="auto"/>
+      </w:pPr>
+      <w:r>
+        <w:rPr/>
+        <w:t xml:space="preserve">2. Go to </w:t>
+      </w:r>
+      <w:r>
+        <w:rPr>
+          <w:b/>
+        </w:rPr>
+        <w:t>6. Bioequivalence</w:t>
+      </w:r>
+      <w:r>
+        <w:rPr/>
+        <w:t xml:space="preserve">. In </w:t>
+      </w:r>
+      <w:r>
+        <w:rPr>
+          <w:b/>
+        </w:rPr>
+        <w:t>Step 1: PK Analysis Settings</w:t>
+      </w:r>
+      <w:r>
+        <w:rPr/>
+        <w:t xml:space="preserve"> keep </w:t>
+      </w:r>
+      <w:r>
+        <w:rPr>
+          <w:b/>
+        </w:rPr>
+        <w:t>Dose information</w:t>
+      </w:r>
+      <w:r>
+        <w:rPr/>
+        <w:t xml:space="preserve"> at </w:t>
+      </w:r>
+      <w:r>
+        <w:rPr>
+          <w:b/>
+        </w:rPr>
+        <w:t>Different doses (from Dose column)</w:t>
+      </w:r>
+      <w:r>
+        <w:rPr/>
+        <w:t xml:space="preserve">, with units mg, h and ng/mL and the route </w:t>
+      </w:r>
+      <w:r>
+        <w:rPr>
+          <w:b/>
+        </w:rPr>
+        <w:t>Oral / IM / SC (extravascular)</w:t>
+      </w:r>
+      <w:r>
+        <w:rPr/>
+        <w:t>.</w:t>
+      </w:r>
+    </w:p>
+    <w:p>
+      <w:pPr>
+        <w:spacing w:after="120" w:line="276" w:lineRule="auto"/>
+      </w:pPr>
+      <w:r>
+        <w:rPr/>
+        <w:t xml:space="preserve">3. In </w:t>
+      </w:r>
+      <w:r>
+        <w:rPr>
+          <w:b/>
+        </w:rPr>
+        <w:t>Step 2: Bioequivalence Settings</w:t>
+      </w:r>
+      <w:r>
+        <w:rPr/>
+        <w:t xml:space="preserve">, check that </w:t>
+      </w:r>
+      <w:r>
+        <w:rPr>
+          <w:b/>
+        </w:rPr>
+        <w:t>Study design</w:t>
+      </w:r>
+      <w:r>
+        <w:rPr/>
+        <w:t xml:space="preserve"> is </w:t>
+      </w:r>
+      <w:r>
+        <w:rPr>
+          <w:b/>
+        </w:rPr>
+        <w:t>Parallel groups</w:t>
+      </w:r>
+      <w:r>
+        <w:rPr/>
+        <w:t xml:space="preserve"> and that </w:t>
+      </w:r>
+      <w:r>
+        <w:rPr>
+          <w:b/>
+        </w:rPr>
+        <w:t>Reference treatment</w:t>
+      </w:r>
+      <w:r>
+        <w:rPr/>
+        <w:t xml:space="preserve"> is Reference. Open </w:t>
+      </w:r>
+      <w:r>
+        <w:rPr>
+          <w:b/>
+        </w:rPr>
+        <w:t>Covariates (optional)</w:t>
+      </w:r>
+      <w:r>
+        <w:rPr/>
+        <w:t xml:space="preserve">. Under </w:t>
+      </w:r>
+      <w:r>
+        <w:rPr>
+          <w:b/>
+        </w:rPr>
+        <w:t>Baseline characteristics to adjust for</w:t>
+      </w:r>
+      <w:r>
+        <w:rPr/>
+        <w:t>, choose Weight and nothing else. The line below the box reads "Weight : numeric", and the section title shows the badge "1 selected".</w:t>
+      </w:r>
+    </w:p>
+    <w:p>
+      <w:pPr>
+        <w:spacing w:after="120" w:line="276" w:lineRule="auto"/>
+      </w:pPr>
+      <w:r>
+        <w:rPr/>
+        <w:t xml:space="preserve">4. Click </w:t>
+      </w:r>
+      <w:r>
+        <w:rPr>
+          <w:b/>
+        </w:rPr>
+        <w:t>Run Complete BE Analysis</w:t>
+      </w:r>
+      <w:r>
+        <w:rPr/>
+        <w:t>.</w:t>
+      </w:r>
+    </w:p>
+    <w:p>
+      <w:pPr>
+        <w:spacing w:after="120" w:line="276" w:lineRule="auto"/>
+      </w:pPr>
+      <w:r>
+        <w:rPr/>
+        <w:t xml:space="preserve">5. Read the line above the table (Adjusted for: Weight), the table with its two </w:t>
+      </w:r>
+      <w:r>
+        <w:rPr>
+          <w:b/>
+        </w:rPr>
+        <w:t>Unadjusted 90% CI</w:t>
+      </w:r>
+      <w:r>
+        <w:rPr/>
+        <w:t xml:space="preserve"> columns, and the card </w:t>
+      </w:r>
+      <w:r>
+        <w:rPr>
+          <w:b/>
+        </w:rPr>
+        <w:t>Group balance on the covariates</w:t>
+      </w:r>
+      <w:r>
+        <w:rPr/>
+        <w:t>.</w:t>
+      </w:r>
+    </w:p>
+    <w:p>
+      <w:pPr>
+        <w:keepNext/>
+        <w:spacing w:after="120" w:line="276" w:lineRule="auto"/>
+        <w:jc w:val="center"/>
+      </w:pPr>
+      <w:r>
+        <w:drawing>
+          <wp:inline xmlns:a="http://schemas.openxmlformats.org/drawingml/2006/main" xmlns:pic="http://schemas.openxmlformats.org/drawingml/2006/picture">
+            <wp:extent cx="5669280" cy="3670859"/>
+            <wp:docPr id="11" name="Picture 11"/>
+            <wp:cNvGraphicFramePr>
+              <a:graphicFrameLocks noChangeAspect="1"/>
+            </wp:cNvGraphicFramePr>
+            <a:graphic>
+              <a:graphicData uri="http://schemas.openxmlformats.org/drawingml/2006/picture">
+                <pic:pic>
+                  <pic:nvPicPr>
+                    <pic:cNvPr id="0" name="cov_open3.jpg"/>
+                    <pic:cNvPicPr/>
+                  </pic:nvPicPr>
+                  <pic:blipFill>
+                    <a:blip r:embed="rId25"/>
+                    <a:stretch>
+                      <a:fillRect/>
+                    </a:stretch>
+                  </pic:blipFill>
+                  <pic:spPr>
+                    <a:xfrm>
+                      <a:off x="0" y="0"/>
+                      <a:ext cx="5669280" cy="3670859"/>
+                    </a:xfrm>
+                    <a:prstGeom prst="rect"/>
+                  </pic:spPr>
+                </pic:pic>
+              </a:graphicData>
+            </a:graphic>
+          </wp:inline>
+        </w:drawing>
+      </w:r>
+    </w:p>
+    <w:p>
+      <w:pPr>
+        <w:spacing w:after="120" w:line="276" w:lineRule="auto"/>
+        <w:jc w:val="center"/>
+      </w:pPr>
+      <w:r>
+        <w:rPr>
+          <w:i/>
+          <w:sz w:val="18"/>
+        </w:rPr>
+        <w:t>Figure 4b.1. The Covariates (optional) section with Weight chosen, beside the forest plot of the adjusted analysis (Tutorial 4b).</w:t>
+      </w:r>
+    </w:p>
+    <w:p>
+      <w:pPr>
+        <w:keepNext/>
+        <w:spacing w:after="120" w:line="276" w:lineRule="auto"/>
+        <w:jc w:val="center"/>
+      </w:pPr>
+      <w:r>
+        <w:drawing>
+          <wp:inline xmlns:a="http://schemas.openxmlformats.org/drawingml/2006/main" xmlns:pic="http://schemas.openxmlformats.org/drawingml/2006/picture">
+            <wp:extent cx="5669280" cy="3670859"/>
+            <wp:docPr id="12" name="Picture 12"/>
+            <wp:cNvGraphicFramePr>
+              <a:graphicFrameLocks noChangeAspect="1"/>
+            </wp:cNvGraphicFramePr>
+            <a:graphic>
+              <a:graphicData uri="http://schemas.openxmlformats.org/drawingml/2006/picture">
+                <pic:pic>
+                  <pic:nvPicPr>
+                    <pic:cNvPr id="0" name="cov_results3.jpg"/>
+                    <pic:cNvPicPr/>
+                  </pic:nvPicPr>
+                  <pic:blipFill>
+                    <a:blip r:embed="rId26"/>
+                    <a:stretch>
+                      <a:fillRect/>
+                    </a:stretch>
+                  </pic:blipFill>
+                  <pic:spPr>
+                    <a:xfrm>
+                      <a:off x="0" y="0"/>
+                      <a:ext cx="5669280" cy="3670859"/>
+                    </a:xfrm>
+                    <a:prstGeom prst="rect"/>
+                  </pic:spPr>
+                </pic:pic>
+              </a:graphicData>
+            </a:graphic>
+          </wp:inline>
+        </w:drawing>
+      </w:r>
+    </w:p>
+    <w:p>
+      <w:pPr>
+        <w:spacing w:after="120" w:line="276" w:lineRule="auto"/>
+        <w:jc w:val="center"/>
+      </w:pPr>
+      <w:r>
+        <w:rPr>
+          <w:i/>
+          <w:sz w:val="18"/>
+        </w:rPr>
+        <w:t>Figure 4b.2. The group balance card, and the adjusted table with the unadjusted interval beside it (Tutorial 4b).</w:t>
+      </w:r>
+    </w:p>
+    <w:p>
+      <w:pPr>
+        <w:spacing w:after="120" w:line="276" w:lineRule="auto"/>
+      </w:pPr>
+      <w:r>
+        <w:rPr/>
+        <w:t xml:space="preserve">Questions: 1) What are the ratio and the 90% CI for Cmax adjusted for Weight, and what do the unadjusted columns show? 2) Is the product bioequivalent for Cmax with the adjustment, and without it? And for AUC to last point? 3) What is the mean weight in each group, and how large is the standardized difference? 4) By how much does Cmax change per kilogram of body weight? Click </w:t>
+      </w:r>
+      <w:r>
+        <w:rPr>
+          <w:b/>
+        </w:rPr>
+        <w:t>Download Complete BE Report (Excel)</w:t>
+      </w:r>
+      <w:r>
+        <w:rPr/>
+        <w:t xml:space="preserve"> and open the sheet BE_Covariates. 5) How many residual degrees of freedom does the model have, and how does the CV fall with the adjustment? Use the columns Degrees of Freedom, Residual Variance and Unadjusted residual variance in </w:t>
+      </w:r>
+      <w:r>
+        <w:rPr>
+          <w:b/>
+        </w:rPr>
+        <w:t>Download CI Table (CSV)</w:t>
+      </w:r>
+      <w:r>
+        <w:rPr/>
+        <w:t>, and CV = 100·√(exp(MSE) − 1). 6) Why is it wrong to pick Weight after you have seen this table?</w:t>
+      </w:r>
+    </w:p>
+    <w:p>
+      <w:pPr>
+        <w:pStyle w:val="Kop2"/>
+      </w:pPr>
+      <w:r>
+        <w:rPr/>
+        <w:t>Tutorial 4c: Reference-Scaled Bioequivalence (Highly Variable Drug)</w:t>
+      </w:r>
+    </w:p>
+    <w:p>
+      <w:pPr>
+        <w:spacing w:after="120" w:line="276" w:lineRule="auto"/>
+      </w:pPr>
+      <w:r>
+        <w:rPr/>
+        <w:t>This tutorial uses example_be_replicate_hvd.csv: 32 subjects in a 2×2×4 full replicate (TRTR | RTRT), one oral dose of 100 mg, samples up to 48 h. The Reference is highly variable for Cmax. A product is called highly variable when the within-subject variability of the Reference exceeds about 30%. With fixed limits of 80–125% such a product needs many subjects, even when Test and Reference are the same product. EMA ABEL and FDA RSABE scale the limits, or the criterion, to the variability of the Reference. The approach is a declaration made in the protocol before the study: the app never switches by itself. Below you run all three approaches one after another, to compare them. In a real study you run and report only the one the protocol names.</w:t>
+      </w:r>
+    </w:p>
+    <w:p>
+      <w:pPr>
+        <w:spacing w:after="120" w:line="276" w:lineRule="auto"/>
+      </w:pPr>
+      <w:r>
+        <w:rPr/>
+        <w:t xml:space="preserve">1. Load example_be_replicate_hvd.csv as in Tutorial 4b. Check that </w:t>
+      </w:r>
+      <w:r>
+        <w:rPr>
+          <w:b/>
+        </w:rPr>
+        <w:t>Subject ID</w:t>
+      </w:r>
+      <w:r>
+        <w:rPr/>
+        <w:t xml:space="preserve">, </w:t>
+      </w:r>
+      <w:r>
+        <w:rPr>
+          <w:b/>
+        </w:rPr>
+        <w:t>Time</w:t>
+      </w:r>
+      <w:r>
+        <w:rPr/>
+        <w:t xml:space="preserve">, </w:t>
+      </w:r>
+      <w:r>
+        <w:rPr>
+          <w:b/>
+        </w:rPr>
+        <w:t>Concentration</w:t>
+      </w:r>
+      <w:r>
+        <w:rPr/>
+        <w:t xml:space="preserve"> (Conc), </w:t>
+      </w:r>
+      <w:r>
+        <w:rPr>
+          <w:b/>
+        </w:rPr>
+        <w:t>Treatment / Formulation</w:t>
+      </w:r>
+      <w:r>
+        <w:rPr/>
+        <w:t xml:space="preserve">, </w:t>
+      </w:r>
+      <w:r>
+        <w:rPr>
+          <w:b/>
+        </w:rPr>
+        <w:t>Period</w:t>
+      </w:r>
+      <w:r>
+        <w:rPr/>
+        <w:t xml:space="preserve">, </w:t>
+      </w:r>
+      <w:r>
+        <w:rPr>
+          <w:b/>
+        </w:rPr>
+        <w:t>Sequence</w:t>
+      </w:r>
+      <w:r>
+        <w:rPr/>
+        <w:t xml:space="preserve"> and </w:t>
+      </w:r>
+      <w:r>
+        <w:rPr>
+          <w:b/>
+        </w:rPr>
+        <w:t>Dose</w:t>
+      </w:r>
+      <w:r>
+        <w:rPr/>
+        <w:t xml:space="preserve"> are mapped, and click </w:t>
+      </w:r>
+      <w:r>
+        <w:rPr>
+          <w:b/>
+        </w:rPr>
+        <w:t>Process Data</w:t>
+      </w:r>
+      <w:r>
+        <w:rPr/>
+        <w:t>.</w:t>
+      </w:r>
+    </w:p>
+    <w:p>
+      <w:pPr>
+        <w:spacing w:after="120" w:line="276" w:lineRule="auto"/>
+      </w:pPr>
+      <w:r>
+        <w:rPr/>
+        <w:t xml:space="preserve">2. Go to </w:t>
+      </w:r>
+      <w:r>
+        <w:rPr>
+          <w:b/>
+        </w:rPr>
+        <w:t>6. Bioequivalence</w:t>
+      </w:r>
+      <w:r>
+        <w:rPr/>
+        <w:t xml:space="preserve"> and use the dose settings of Tutorial 4b. Check that </w:t>
+      </w:r>
+      <w:r>
+        <w:rPr>
+          <w:b/>
+        </w:rPr>
+        <w:t>Study design</w:t>
+      </w:r>
+      <w:r>
+        <w:rPr/>
+        <w:t xml:space="preserve"> is </w:t>
+      </w:r>
+      <w:r>
+        <w:rPr>
+          <w:b/>
+        </w:rPr>
+        <w:t>2×2×4 full replicate (TRTR | RTRT)</w:t>
+      </w:r>
+      <w:r>
+        <w:rPr/>
+        <w:t xml:space="preserve">, </w:t>
+      </w:r>
+      <w:r>
+        <w:rPr>
+          <w:b/>
+        </w:rPr>
+        <w:t>Reference treatment</w:t>
+      </w:r>
+      <w:r>
+        <w:rPr/>
+        <w:t xml:space="preserve"> is Reference, </w:t>
+      </w:r>
+      <w:r>
+        <w:rPr>
+          <w:b/>
+        </w:rPr>
+        <w:t>Statistical model</w:t>
+      </w:r>
+      <w:r>
+        <w:rPr/>
+        <w:t xml:space="preserve"> is </w:t>
+      </w:r>
+      <w:r>
+        <w:rPr>
+          <w:b/>
+        </w:rPr>
+        <w:t>Fixed effects (all terms fixed)</w:t>
+      </w:r>
+      <w:r>
+        <w:rPr/>
+        <w:t xml:space="preserve">, the parameters are Cmax and AUC to last point, the confidence interval is 90 and the limits are 80 and 125. Keep </w:t>
+      </w:r>
+      <w:r>
+        <w:rPr>
+          <w:b/>
+        </w:rPr>
+        <w:t>Acceptance approach</w:t>
+      </w:r>
+      <w:r>
+        <w:rPr/>
+        <w:t xml:space="preserve"> at </w:t>
+      </w:r>
+      <w:r>
+        <w:rPr>
+          <w:b/>
+        </w:rPr>
+        <w:t>Standard (average bioequivalence)</w:t>
+      </w:r>
+      <w:r>
+        <w:rPr/>
+        <w:t xml:space="preserve"> and click </w:t>
+      </w:r>
+      <w:r>
+        <w:rPr>
+          <w:b/>
+        </w:rPr>
+        <w:t>Run Complete BE Analysis</w:t>
+      </w:r>
+      <w:r>
+        <w:rPr/>
+        <w:t>. Note the ratio, the 90% CI and the verdict of both parameters.</w:t>
+      </w:r>
+    </w:p>
+    <w:p>
+      <w:pPr>
+        <w:spacing w:after="120" w:line="276" w:lineRule="auto"/>
+      </w:pPr>
+      <w:r>
+        <w:rPr/>
+        <w:t xml:space="preserve">3. Set </w:t>
+      </w:r>
+      <w:r>
+        <w:rPr>
+          <w:b/>
+        </w:rPr>
+        <w:t>Acceptance approach</w:t>
+      </w:r>
+      <w:r>
+        <w:rPr/>
+        <w:t xml:space="preserve"> to </w:t>
+      </w:r>
+      <w:r>
+        <w:rPr>
+          <w:b/>
+        </w:rPr>
+        <w:t>FDA RSABE (reference-scaled)</w:t>
+      </w:r>
+      <w:r>
+        <w:rPr/>
+        <w:t xml:space="preserve">. The results are cleared. Click </w:t>
+      </w:r>
+      <w:r>
+        <w:rPr>
+          <w:b/>
+        </w:rPr>
+        <w:t>Run Complete BE Analysis</w:t>
+      </w:r>
+      <w:r>
+        <w:rPr/>
+        <w:t xml:space="preserve"> again. Read the table, including the columns Route, s_WR (FDA contrasts), Limits and Criterion bound, and the lines under it that say how each metric was judged.</w:t>
+      </w:r>
+    </w:p>
+    <w:p>
+      <w:pPr>
+        <w:keepNext/>
+        <w:spacing w:after="120" w:line="276" w:lineRule="auto"/>
+        <w:jc w:val="center"/>
+      </w:pPr>
+      <w:r>
+        <w:drawing>
+          <wp:inline xmlns:a="http://schemas.openxmlformats.org/drawingml/2006/main" xmlns:pic="http://schemas.openxmlformats.org/drawingml/2006/picture">
+            <wp:extent cx="5669280" cy="3670859"/>
+            <wp:docPr id="13" name="Picture 13"/>
+            <wp:cNvGraphicFramePr>
+              <a:graphicFrameLocks noChangeAspect="1"/>
+            </wp:cNvGraphicFramePr>
+            <a:graphic>
+              <a:graphicData uri="http://schemas.openxmlformats.org/drawingml/2006/picture">
+                <pic:pic>
+                  <pic:nvPicPr>
+                    <pic:cNvPr id="0" name="approach.jpg"/>
+                    <pic:cNvPicPr/>
+                  </pic:nvPicPr>
+                  <pic:blipFill>
+                    <a:blip r:embed="rId27"/>
+                    <a:stretch>
+                      <a:fillRect/>
+                    </a:stretch>
+                  </pic:blipFill>
+                  <pic:spPr>
+                    <a:xfrm>
+                      <a:off x="0" y="0"/>
+                      <a:ext cx="5669280" cy="3670859"/>
+                    </a:xfrm>
+                    <a:prstGeom prst="rect"/>
+                  </pic:spPr>
+                </pic:pic>
+              </a:graphicData>
+            </a:graphic>
+          </wp:inline>
+        </w:drawing>
+      </w:r>
+    </w:p>
+    <w:p>
+      <w:pPr>
+        <w:spacing w:after="120" w:line="276" w:lineRule="auto"/>
+        <w:jc w:val="center"/>
+      </w:pPr>
+      <w:r>
+        <w:rPr>
+          <w:i/>
+          <w:sz w:val="18"/>
+        </w:rPr>
+        <w:t>Figure 4c.1. The Acceptance approach selector on a replicate design, set to FDA RSABE, with the note that the choice is a declaration before the run (Tutorial 4c).</w:t>
+      </w:r>
+    </w:p>
+    <w:p>
+      <w:pPr>
+        <w:keepNext/>
+        <w:spacing w:after="120" w:line="276" w:lineRule="auto"/>
+        <w:jc w:val="center"/>
+      </w:pPr>
+      <w:r>
+        <w:drawing>
+          <wp:inline xmlns:a="http://schemas.openxmlformats.org/drawingml/2006/main" xmlns:pic="http://schemas.openxmlformats.org/drawingml/2006/picture">
+            <wp:extent cx="5669280" cy="3670859"/>
+            <wp:docPr id="14" name="Picture 14"/>
+            <wp:cNvGraphicFramePr>
+              <a:graphicFrameLocks noChangeAspect="1"/>
+            </wp:cNvGraphicFramePr>
+            <a:graphic>
+              <a:graphicData uri="http://schemas.openxmlformats.org/drawingml/2006/picture">
+                <pic:pic>
+                  <pic:nvPicPr>
+                    <pic:cNvPr id="0" name="rsabe_results.jpg"/>
+                    <pic:cNvPicPr/>
+                  </pic:nvPicPr>
+                  <pic:blipFill>
+                    <a:blip r:embed="rId28"/>
+                    <a:stretch>
+                      <a:fillRect/>
+                    </a:stretch>
+                  </pic:blipFill>
+                  <pic:spPr>
+                    <a:xfrm>
+                      <a:off x="0" y="0"/>
+                      <a:ext cx="5669280" cy="3670859"/>
+                    </a:xfrm>
+                    <a:prstGeom prst="rect"/>
+                  </pic:spPr>
+                </pic:pic>
+              </a:graphicData>
+            </a:graphic>
+          </wp:inline>
+        </w:drawing>
+      </w:r>
+    </w:p>
+    <w:p>
+      <w:pPr>
+        <w:spacing w:after="120" w:line="276" w:lineRule="auto"/>
+        <w:jc w:val="center"/>
+      </w:pPr>
+      <w:r>
+        <w:rPr>
+          <w:i/>
+          <w:sz w:val="18"/>
+        </w:rPr>
+        <w:t>Figure 4c.2. The lines that say how each metric was judged under RSABE, and the forest plot with one pair of limits per metric (Tutorial 4c).</w:t>
+      </w:r>
+    </w:p>
+    <w:p>
+      <w:pPr>
+        <w:spacing w:after="120" w:line="276" w:lineRule="auto"/>
+      </w:pPr>
+      <w:r>
+        <w:rPr/>
+        <w:t xml:space="preserve">4. Set </w:t>
+      </w:r>
+      <w:r>
+        <w:rPr>
+          <w:b/>
+        </w:rPr>
+        <w:t>Acceptance approach</w:t>
+      </w:r>
+      <w:r>
+        <w:rPr/>
+        <w:t xml:space="preserve"> to </w:t>
+      </w:r>
+      <w:r>
+        <w:rPr>
+          <w:b/>
+        </w:rPr>
+        <w:t>EMA ABEL (Cmax, widened limits)</w:t>
+      </w:r>
+      <w:r>
+        <w:rPr/>
+        <w:t xml:space="preserve"> and run once more. Read the same table and lines.</w:t>
+      </w:r>
+    </w:p>
+    <w:p>
+      <w:pPr>
+        <w:spacing w:after="120" w:line="276" w:lineRule="auto"/>
+      </w:pPr>
+      <w:r>
+        <w:rPr/>
+        <w:t>Questions: 1) What are the ratio, the 90% CI and the verdict for Cmax and for AUC to last point with the standard approach? 2) With RSABE: which route did Cmax take, what are s_WR, the limits and the criterion bound, and what is the verdict? 3) Which route did AUC to last point take with RSABE, and why? 4) With ABEL: what are CVwR and the limits for Cmax, and which limits apply to AUC? 5) Which two conditions must hold for RSABE to conclude bioequivalence? 6) If the protocol named RSABE, which result do you report, and why may you not report the most favourable one?</w:t>
+      </w:r>
+    </w:p>
+    <w:p>
+      <w:pPr>
+        <w:pStyle w:val="Kop2"/>
+      </w:pPr>
       <w:bookmarkStart w:id="15" w:name="_Toc241526059"/>
       <w:r>
         <w:t>Tutorial 5: Planning a Study</w:t>
@@ -10427,6 +11278,36 @@
       </w:r>
       <w:r>
         <w:t xml:space="preserve"> 1) 108.62% (106.27–111.02%). 2) 111.25% (108.95–113.60%). 3) Yes, both intervals lie within 80.00–125.00%. The note says that the study has 6 evaluable subjects, fewer than the 12 ICH M13A asks for, so the verdict is a statistical result only: this study would not be accepted as a pivotal study. 4) The residual variance is 0.000315, so the CV is about 1.8%. The example data are simulated with very little noise.</w:t>
+      </w:r>
+    </w:p>
+    <w:p>
+      <w:pPr>
+        <w:spacing w:after="120" w:line="276" w:lineRule="auto"/>
+      </w:pPr>
+      <w:r>
+        <w:rPr>
+          <w:b/>
+        </w:rPr>
+        <w:t>Tutorial 4b.</w:t>
+      </w:r>
+      <w:r>
+        <w:rPr/>
+        <w:t xml:space="preserve"> 1) 95.04% (90.12–100.22%). The unadjusted columns show 77.76–92.12%; only the limits are shown, not the unadjusted ratio. 2) With the adjustment: yes. Without it: no, the lower limit of 77.76% is below 80%. AUC to last point passes either way (adjusted 98.13%, 93.51–102.99%; unadjusted interval 85.20–96.80%). 3) 68.2 kg on Reference and 77.7 kg on Test (68.16 and 77.69), a standardized difference of 0.88. That is a large imbalance. In these simulated data weight drives the volume of distribution, so the heavier Test group had lower concentrations before the adjustment. 4) The Weight coefficient is −0.0122 on the log scale, which is about 1.2% less Cmax for each kilogram. 5) 37 residual degrees of freedom (40 − 2 − 1). The CV falls from 16.0% (unadjusted residual variance 0.0252) to 9.1% (residual variance 0.00823). 6) Choosing a covariate after you have seen the results lets you search for the interval that passes, and the type I error is no longer controlled. The declaration has to come first. The Analysis Record lists the covariates, but the app cannot know when you chose them.</w:t>
+      </w:r>
+    </w:p>
+    <w:p>
+      <w:pPr>
+        <w:spacing w:after="120" w:line="276" w:lineRule="auto"/>
+      </w:pPr>
+      <w:r>
+        <w:rPr>
+          <w:b/>
+        </w:rPr>
+        <w:t>Tutorial 4c.</w:t>
+      </w:r>
+      <w:r>
+        <w:rPr/>
+        <w:t xml:space="preserve"> 1) Cmax 88.35% (77.52–100.69%): not bioequivalent, because the lower limit is below 80%. AUC to last point 98.20% (90.56–106.50%): bioequivalent. 2) The scaled route. s_WR is 0.399, at or above 0.294; the limits are 70.04–142.78%; the criterion bound is −0.0446, at or below 0; the point estimate of 88.35% lies within 80–125%. RSABE is met. The interval in the table, 76.67–101.81%, comes from the FDA contrasts and differs a little from the standard 77.52–100.69%. 3) The standard route: s_WR is 0.251, below 0.294, so nothing is scaled and the ordinary test against 80–125% applies. The interval of 90.56–106.50% lies within those limits. 4) CVwR is 41.5%, above 30%, and the limits are 73.84–135.43%. The 90% CI of 77.52–100.69% lies within them and the point estimate lies within 80–125%, so Cmax is bioequivalent. AUC keeps 80–125%, because the EMA widens Cmax only. 5) The criterion bound must be at or below 0 (it is the 95% upper confidence bound of the scaled criterion), and the point estimate must lie within 80–125%. 6) The one the protocol declared before the study. Running several approaches and keeping the one that passes defeats the purpose of a pre-specified analysis; you ran all three here only to see how they differ.</w:t>
       </w:r>
     </w:p>
     <w:p>

</xml_diff>

<commit_message>
Docs pass for covariates, ABEL and RSABE (phase 9)
Manual (docx and PDF, 97 pages): scope statement, ten tutorials, approach and
covariate settings in Path 6, new result columns, Statistical Methods section
Reference-Scaled Approaches, covariate model, troubleshooting, glossary (11
terms), references, revision history. URS: URS-BE-13 to 15, FM-49 to FM-58,
scope statement, counts. IQ/OQ/PQ protocol regenerated (sections COV, RSA, ABL,
DOC) with a change assessment and residual-risk statement. Manual tests MAN-54
to MAN-64 defined. READMEs, version history and counts agree (584 automated,
77 manual); DOC-05 checks the counts in every document, the manual included.
Text humanized.

Co-Authored-By: Claude Sonnet 5.5 <noreply@anthropic.com>
</commit_message>
<xml_diff>
--- a/NCA_Assistant_User_Manual_v1.9.docx
+++ b/NCA_Assistant_User_Manual_v1.9.docx
@@ -7737,7 +7737,7 @@
         <w:spacing w:after="120" w:line="276" w:lineRule="auto"/>
       </w:pPr>
       <w:r>
-        <w:t>NCA Assistant is for pharmacokineticists doing non-compartmental analysis, average bioequivalence testing and study planning. It gives no reference-scaled bioequivalence verdict (ABEL, RSABE). The public instance and a standard installation have no audit trail, electronic signature or access control; a controlled installation on your organisation's server adds them (Working in a Regulated Environment). The public instance on shinyapps.io is for evaluation and training, with synthetic or pseudonymised data. For regulated work, install a tagged release on your own system and qualify it there with the validation package. Responsibility for the analysis and its conclusions stays with the user. Not for dosing decisions for individual patients.</w:t>
+        <w:t>NCA Assistant is for pharmacokineticists doing non-compartmental analysis, bioequivalence testing and study planning. Average bioequivalence for every design, plus EMA ABEL and FDA RSABE for replicate designs. The FDA scaled test for narrow therapeutic index drugs is for planning only. The public instance and a standard installation have no audit trail, electronic signature or access control; a controlled installation on your organisation's server adds them (Working in a Regulated Environment). The public instance on shinyapps.io is for evaluation and training, with synthetic or pseudonymised data. For regulated work, install a tagged release on your own system and qualify it there with the validation package. Responsibility for the analysis and its conclusions stays with the user. Not for dosing decisions for individual patients.</w:t>
       </w:r>
     </w:p>
     <w:p>
@@ -7765,7 +7765,7 @@
         <w:t>Status.</w:t>
       </w:r>
       <w:r>
-        <w:t xml:space="preserve"> NCA Assistant is not validated for your use. The validation package in the repository (a URS, an IQ/OQ/PQ protocol and a test script with 536 automated and 66 manual tests) is a starting point: the developer's test run shows that the code does what the tests check, on the developer's computer. Qualifying the installation you use is your responsibility; the chapters Working in a Regulated Environment and Installing NCA Assistant for Regulated Use explain how.</w:t>
+        <w:t xml:space="preserve"> NCA Assistant is not validated for your use. The validation package in the repository (a URS, an IQ/OQ/PQ protocol and a test script with 584 automated and 77 manual tests) is a starting point: the developer's test run shows that the code does what the tests check, on the developer's computer. Qualifying the installation you use is your responsibility; the chapters Working in a Regulated Environment and Installing NCA Assistant for Regulated Use explain how.</w:t>
       </w:r>
     </w:p>
     <w:p>
@@ -7906,7 +7906,7 @@
                 <w:sz w:val="20"/>
                 <w:szCs w:val="20"/>
               </w:rPr>
-              <w:t>Reference-scaled bioequivalence verdicts (EMA ABEL, FDA RSABE) and the FDA NTID scaled test</w:t>
+              <w:t>The FDA scaled test for narrow therapeutic index drugs, and the FDA model for replicate designs</w:t>
             </w:r>
           </w:p>
         </w:tc>
@@ -7932,7 +7932,7 @@
                 <w:sz w:val="20"/>
                 <w:szCs w:val="20"/>
               </w:rPr>
-              <w:t>Software that implements them, for example the replicateBE package for ABEL. The app shows CVwR and the limits it would imply for information only.</w:t>
+              <w:t>Software that implements them. Plan a Study plans the NTID test. For a replicate study the app offers EMA ABEL and FDA RSABE.</w:t>
             </w:r>
           </w:p>
         </w:tc>
@@ -9180,7 +9180,7 @@
         <w:spacing w:after="120" w:line="276" w:lineRule="auto"/>
       </w:pPr>
       <w:r>
-        <w:t>Eight short tutorials, from a first analysis without a file to a bioequivalence study with partial AUCs, and one on reviewing a record on a controlled installation (Tutorial 8, in the chapter Working in a Regulated Environment). Each gives the steps with the labels the app shows, then questions. The answers are in the Answer Key at the end of this chapter, rounded as the app displays them. The example files are in the Data Guide (top navigation bar), under Example Datasets. The first time, do the tutorials in order: later ones assume you know the upload steps. Do the tutorials on the public app, on your own computer or on a training installation, never on a controlled production server, where every practice run would be recorded.</w:t>
+        <w:t>Ten short tutorials, from a first analysis without a file to a bioequivalence study with partial AUCs, with baseline covariates (Tutorial 4b) and with a reference-scaled approach (Tutorial 4c), and one on reviewing a record on a controlled installation (Tutorial 8, in the chapter Working in a Regulated Environment). Each gives the steps with the labels the app shows, then questions. The answers are in the Answer Key at the end of this chapter, rounded as the app displays them. The example files are in the Data Guide (top navigation bar), under Example Datasets. The first time, do the tutorials in order: later ones assume you know the upload steps. Do the tutorials on the public app, on your own computer or on a training installation, never on a controlled production server, where every practice run would be recorded.</w:t>
       </w:r>
     </w:p>
     <w:p>
@@ -13689,7 +13689,7 @@
         <w:spacing w:after="120" w:line="276" w:lineRule="auto"/>
       </w:pPr>
       <w:r>
-        <w:t>Same six-column format. Replicate designs: 2×2×3 full replicate (sequences TRT and RTR), 2×3×3 partial replicate (TRR, RTR, RRT) and 2×2×4 full replicate (TRTR, RTRT). Period goes to 3 or 4 and a treatment appears more than once per subject; each administration is analysed as its own profile. Paired comparison: all subjects received the treatments in the same order, so Sequence has one value (or can be left out).</w:t>
+        <w:t>Same six-column format. Replicate designs: 2×2×3 full replicate (sequences TRT and RTR), 2×3×3 partial replicate (TRR, RTR, RRT) and 2×2×4 full replicate (TRTR, RTRT). Period goes to 3 or 4 and a treatment appears more than once per subject; each administration is analysed as its own profile. Paired comparison: all subjects received the treatments in the same order, so Sequence has one value (or can be left out). For a highly variable drug, the Acceptance approach selector in Path 6 offers EMA ABEL (all three replicate designs) and FDA RSABE (2×3×3 and 2×2×4); example_be_replicate_hvd.csv (Tutorial 4c) shows both.</w:t>
       </w:r>
     </w:p>
     <w:p>
@@ -13707,7 +13707,7 @@
         <w:spacing w:after="120" w:line="276" w:lineRule="auto"/>
       </w:pPr>
       <w:r>
-        <w:t>Four columns: Subject, Treatment, Time, Concentration. No Period or Sequence needed.</w:t>
+        <w:t>Four columns: Subject, Treatment, Time, Concentration. No Period or Sequence needed. Baseline characteristics can be added as extra columns (for example Age, Weight, Sex), with the same value in every row of a subject, and used as covariates in Path 6. Keep numbers as plain numbers: text such as “72 kg” or a decimal comma is refused. The example is example_be_parallel_covariates.csv (Tutorial 4b).</w:t>
       </w:r>
     </w:p>
     <w:p>
@@ -17526,6 +17526,70 @@
         <w:rPr>
           <w:b/>
         </w:rPr>
+        <w:t>Acceptance approach</w:t>
+      </w:r>
+      <w:r>
+        <w:t xml:space="preserve"> (replicate designs only): </w:t>
+      </w:r>
+      <w:r>
+        <w:rPr>
+          <w:b/>
+        </w:rPr>
+        <w:t>Standard (average bioequivalence)</w:t>
+      </w:r>
+      <w:r>
+        <w:t xml:space="preserve">, </w:t>
+      </w:r>
+      <w:r>
+        <w:rPr>
+          <w:b/>
+        </w:rPr>
+        <w:t>EMA ABEL (Cmax, widened limits)</w:t>
+      </w:r>
+      <w:r>
+        <w:t xml:space="preserve"> or </w:t>
+      </w:r>
+      <w:r>
+        <w:rPr>
+          <w:b/>
+        </w:rPr>
+        <w:t>FDA RSABE (reference-scaled)</w:t>
+      </w:r>
+      <w:r>
+        <w:t>. The choice is your declaration before the run and belongs in the protocol; the app never switches by itself. ABEL is offered for 2×2×3, 2×3×3 and 2×2×4, RSABE for 2×3×3 and 2×2×4 only, because Appendix G of the FDA guidance has no steps for 2×2×3. With ABEL or RSABE the acceptance limits stay at 80 and 125: the method sets the limits, and they still apply to the metrics it does not scale. Reference-Scaled Approaches, in Statistical Methods, gives the rules.</w:t>
+      </w:r>
+    </w:p>
+    <w:p>
+      <w:pPr>
+        <w:spacing w:after="120" w:line="276" w:lineRule="auto"/>
+      </w:pPr>
+      <w:r>
+        <w:rPr>
+          <w:b/>
+        </w:rPr>
+        <w:t>Covariates (optional)</w:t>
+      </w:r>
+      <w:r>
+        <w:t xml:space="preserve"> (parallel groups only): choose baseline characteristics from the columns of your file that hold no other role. The line under the box says how each was read, numeric or categorical with its number of groups. </w:t>
+      </w:r>
+      <w:r>
+        <w:rPr>
+          <w:b/>
+        </w:rPr>
+        <w:t>Advanced options</w:t>
+      </w:r>
+      <w:r>
+        <w:t xml:space="preserve"> let you treat numeric codes such as 0 and 1 as categories and use the natural log of a covariate; they clear when you untick the box. Choose the covariates before you look at the results, and use values known before the first dose. The adjusted interval is the primary result, and the unadjusted interval is shown beside it. The run stops, with a message that names the problem, for a missing value, text such as “72 kg”, two different values for one subject, a constant or duplicated covariate, more than five covariates, fewer than 12 subjects per group or fewer than 10 residual degrees of freedom.</w:t>
+      </w:r>
+    </w:p>
+    <w:p>
+      <w:pPr>
+        <w:spacing w:after="120" w:line="276" w:lineRule="auto"/>
+      </w:pPr>
+      <w:r>
+        <w:rPr>
+          <w:b/>
+        </w:rPr>
         <w:t>Log-transform (recommended)</w:t>
       </w:r>
       <w:r>
@@ -17613,7 +17677,7 @@
         <w:t>Widened limits are not ABEL or RSABE.</w:t>
       </w:r>
       <w:r>
-        <w:t xml:space="preserve"> Entering limits wider than 80.00–125.00% does not perform a reference-scaled analysis: the app does not check the conditions for widening (a pre-specified, clinically justified widening, CVwR of this study above 30%, the cap at 50%, a CVwR not driven by outliers; EMA 2010, section 4.1.10), and it does not compute the FDA scaled criterion. Use widened limits only when the protocol fixes them in advance, and document the justification outside the app. For replicate designs a table shows the within-subject variability of the Reference (and of the Test when replicated) and the EMA widened limits it would imply, for information only.</w:t>
+        <w:t xml:space="preserve"> Entering limits wider than 80.00–125.00% does not perform a reference-scaled analysis: the app does not check the conditions for widening (a pre-specified, clinically justified widening, CVwR of this study above 30%, the cap at 50%, a CVwR not driven by outliers; EMA 2010, section 4.1.10), and it does not compute the FDA scaled criterion. Use widened limits only when the protocol fixes them in advance, and document the justification outside the app. For a replicate design, choose EMA ABEL or FDA RSABE under Acceptance approach instead: the app then derives the limits, or applies the scaled criterion, from your data. A table also shows the within-subject variability of the Reference (and of the Test when replicated) and the EMA limits it would imply, for information.</w:t>
       </w:r>
     </w:p>
     <w:p>
@@ -17783,6 +17847,85 @@
         <w:spacing w:after="120" w:line="276" w:lineRule="auto"/>
       </w:pPr>
       <w:r>
+        <w:t xml:space="preserve">With covariates, the line </w:t>
+      </w:r>
+      <w:r>
+        <w:rPr>
+          <w:b/>
+        </w:rPr>
+        <w:t>Adjusted for</w:t>
+      </w:r>
+      <w:r>
+        <w:t xml:space="preserve"> names them, the two </w:t>
+      </w:r>
+      <w:r>
+        <w:rPr>
+          <w:b/>
+        </w:rPr>
+        <w:t>Unadjusted CI</w:t>
+      </w:r>
+      <w:r>
+        <w:t xml:space="preserve"> columns give the interval without adjustment, and the card </w:t>
+      </w:r>
+      <w:r>
+        <w:rPr>
+          <w:b/>
+        </w:rPr>
+        <w:t>Group balance on the covariates</w:t>
+      </w:r>
+      <w:r>
+        <w:t xml:space="preserve"> shows mean (SD) or n (%) per group with the standardized difference. The card describes the groups; it is not a test, and covariates are not to be chosen after looking at it. The Welch interval and the covariate coefficients are in the downloads (sheet BE_Covariates).</w:t>
+      </w:r>
+    </w:p>
+    <w:p>
+      <w:pPr>
+        <w:spacing w:after="120" w:line="276" w:lineRule="auto"/>
+      </w:pPr>
+      <w:r>
+        <w:t xml:space="preserve">With ABEL or RSABE the table adds, after the verdict, the columns </w:t>
+      </w:r>
+      <w:r>
+        <w:rPr>
+          <w:b/>
+        </w:rPr>
+        <w:t>Route</w:t>
+      </w:r>
+      <w:r>
+        <w:t xml:space="preserve"> (Scaled or Standard), </w:t>
+      </w:r>
+      <w:r>
+        <w:rPr>
+          <w:b/>
+        </w:rPr>
+        <w:t>s_WR</w:t>
+      </w:r>
+      <w:r>
+        <w:t xml:space="preserve">, </w:t>
+      </w:r>
+      <w:r>
+        <w:rPr>
+          <w:b/>
+        </w:rPr>
+        <w:t>Limits</w:t>
+      </w:r>
+      <w:r>
+        <w:t xml:space="preserve"> and, for RSABE, </w:t>
+      </w:r>
+      <w:r>
+        <w:rPr>
+          <w:b/>
+        </w:rPr>
+        <w:t>Criterion bound</w:t>
+      </w:r>
+      <w:r>
+        <w:t>. Lines under the table say in words how each metric was judged, and the forest plot draws one pair of limits per metric. Below the switch (s_WR under 0.294) the route is Standard, which is not an error: nothing is scaled. The app warns below 24 evaluable subjects for RSABE, and says how many subjects were left out of the contrasts because they lack a period. The sensitivity analysis without exclusions uses the same approach. The downloads add a sheet BE_Scaled with the steps of the assessment.</w:t>
+      </w:r>
+    </w:p>
+    <w:p>
+      <w:pPr>
+        <w:spacing w:after="120" w:line="276" w:lineRule="auto"/>
+      </w:pPr>
+      <w:r>
         <w:rPr>
           <w:b/>
         </w:rPr>
@@ -20420,6 +20563,114 @@
                 <w:szCs w:val="20"/>
               </w:rPr>
               <w:t>The model fitted, and whether a mixed model failed</w:t>
+            </w:r>
+          </w:p>
+        </w:tc>
+      </w:tr>
+      <w:tr>
+        <w:tc>
+          <w:tcPr>
+            <w:tcW w:w="4513" w:type="dxa"/>
+            <w:tcBorders>
+              <w:top w:val="single" w:sz="1" w:space="0" w:color="CCCCCC"/>
+              <w:left w:val="single" w:sz="1" w:space="0" w:color="CCCCCC"/>
+              <w:bottom w:val="single" w:sz="1" w:space="0" w:color="CCCCCC"/>
+              <w:right w:val="single" w:sz="1" w:space="0" w:color="CCCCCC"/>
+            </w:tcBorders>
+            <w:tcMar>
+              <w:top w:w="60" w:type="dxa"/>
+              <w:left w:w="100" w:type="dxa"/>
+              <w:bottom w:w="60" w:type="dxa"/>
+              <w:right w:w="100" w:type="dxa"/>
+            </w:tcMar>
+          </w:tcPr>
+          <w:p>
+            <w:r>
+              <w:rPr>
+                <w:sz w:val="20"/>
+                <w:szCs w:val="20"/>
+              </w:rPr>
+              <w:t>Adjusted for, Unadjusted CI Lower and Upper</w:t>
+            </w:r>
+          </w:p>
+        </w:tc>
+        <w:tc>
+          <w:tcPr>
+            <w:tcW w:w="4513" w:type="dxa"/>
+            <w:tcBorders>
+              <w:top w:val="single" w:sz="1" w:space="0" w:color="CCCCCC"/>
+              <w:left w:val="single" w:sz="1" w:space="0" w:color="CCCCCC"/>
+              <w:bottom w:val="single" w:sz="1" w:space="0" w:color="CCCCCC"/>
+              <w:right w:val="single" w:sz="1" w:space="0" w:color="CCCCCC"/>
+            </w:tcBorders>
+            <w:tcMar>
+              <w:top w:w="60" w:type="dxa"/>
+              <w:left w:w="100" w:type="dxa"/>
+              <w:bottom w:w="60" w:type="dxa"/>
+              <w:right w:w="100" w:type="dxa"/>
+            </w:tcMar>
+          </w:tcPr>
+          <w:p>
+            <w:r>
+              <w:rPr>
+                <w:sz w:val="20"/>
+                <w:szCs w:val="20"/>
+              </w:rPr>
+              <w:t>With covariates: the characteristics the estimate is adjusted for, and the interval without adjustment</w:t>
+            </w:r>
+          </w:p>
+        </w:tc>
+      </w:tr>
+      <w:tr>
+        <w:tc>
+          <w:tcPr>
+            <w:tcW w:w="4513" w:type="dxa"/>
+            <w:tcBorders>
+              <w:top w:val="single" w:sz="1" w:space="0" w:color="CCCCCC"/>
+              <w:left w:val="single" w:sz="1" w:space="0" w:color="CCCCCC"/>
+              <w:bottom w:val="single" w:sz="1" w:space="0" w:color="CCCCCC"/>
+              <w:right w:val="single" w:sz="1" w:space="0" w:color="CCCCCC"/>
+            </w:tcBorders>
+            <w:tcMar>
+              <w:top w:w="60" w:type="dxa"/>
+              <w:left w:w="100" w:type="dxa"/>
+              <w:bottom w:w="60" w:type="dxa"/>
+              <w:right w:w="100" w:type="dxa"/>
+            </w:tcMar>
+          </w:tcPr>
+          <w:p>
+            <w:r>
+              <w:rPr>
+                <w:sz w:val="20"/>
+                <w:szCs w:val="20"/>
+              </w:rPr>
+              <w:t>Route, s_WR, Limits, Criterion bound</w:t>
+            </w:r>
+          </w:p>
+        </w:tc>
+        <w:tc>
+          <w:tcPr>
+            <w:tcW w:w="4513" w:type="dxa"/>
+            <w:tcBorders>
+              <w:top w:val="single" w:sz="1" w:space="0" w:color="CCCCCC"/>
+              <w:left w:val="single" w:sz="1" w:space="0" w:color="CCCCCC"/>
+              <w:bottom w:val="single" w:sz="1" w:space="0" w:color="CCCCCC"/>
+              <w:right w:val="single" w:sz="1" w:space="0" w:color="CCCCCC"/>
+            </w:tcBorders>
+            <w:tcMar>
+              <w:top w:w="60" w:type="dxa"/>
+              <w:left w:w="100" w:type="dxa"/>
+              <w:bottom w:w="60" w:type="dxa"/>
+              <w:right w:w="100" w:type="dxa"/>
+            </w:tcMar>
+          </w:tcPr>
+          <w:p>
+            <w:r>
+              <w:rPr>
+                <w:sz w:val="20"/>
+                <w:szCs w:val="20"/>
+              </w:rPr>
+              <w:t>With ABEL or RSABE: Scaled or Standard; the within-subject SD of the Reference (FDA contrasts for RSABE, EMA model for ABEL); the limits in force; and, for RSABE, the criterion, met at 0 or below</w:t>
             </w:r>
           </w:p>
         </w:tc>
@@ -20974,7 +21225,7 @@
         <w:spacing w:after="120" w:line="276" w:lineRule="auto"/>
       </w:pPr>
       <w:r>
-        <w:t>NCA Assistant is open-source software without warranty or supplier support, and it is not validated for your use. It performs average bioequivalence only, not ABEL or RSABE. The public instance on shinyapps.io is outside the scope of any qualification: its package versions are set by the deployment, not by the validated release. For records under 21 CFR Part 11 or EU GMP Annex 11, use a controlled installation; a qualification of controlled mode holds only for the server on which it was carried out, not in general.</w:t>
+        <w:t>NCA Assistant is open-source software without warranty or supplier support, and it is not validated for your use. Its bioequivalence analysis covers average bioequivalence, EMA ABEL and FDA RSABE, not the FDA scaled test for narrow therapeutic index drugs. The public instance on shinyapps.io is outside the scope of any qualification: its package versions are set by the deployment, not by the validated release. For records under 21 CFR Part 11 or EU GMP Annex 11, use a controlled installation; a qualification of controlled mode holds only for the server on which it was carried out, not in general.</w:t>
       </w:r>
     </w:p>
     <w:p>
@@ -22793,7 +23044,7 @@
         <w:spacing w:after="120" w:line="276" w:lineRule="auto"/>
       </w:pPr>
       <w:r>
-        <w:t>• Widened limits are not ABEL or RSABE, and All compared metrics also widens AUC to last point and AUC to infinity, which no guideline allows for bioequivalence. To widen a partial AUC, choose Cmax and partial AUCs.</w:t>
+        <w:t>• Widened limits you type are not ABEL or RSABE (choose the approach for those), and All compared metrics also widens AUC to last point and AUC to infinity, which no guideline allows for bioequivalence. To widen a partial AUC, choose Cmax and partial AUCs.</w:t>
       </w:r>
     </w:p>
     <w:p>
@@ -23990,7 +24241,7 @@
         <w:spacing w:after="120" w:line="276" w:lineRule="auto"/>
       </w:pPr>
       <w:r>
-        <w:t>• Reference-scaled bioequivalence (ABEL, RSABE), the FDA method for narrow therapeutic index drugs and the FDA model for replicate designs are available for planning only, not for analysis.</w:t>
+        <w:t>• The FDA scaled test for narrow therapeutic index drugs and the FDA model for replicate designs (separate Test and Reference variances and a subject-by-formulation interaction) are not available for analysis. EMA ABEL and FDA RSABE are.</w:t>
       </w:r>
     </w:p>
     <w:p>
@@ -27430,10 +27681,25 @@
         <w:rPr>
           <w:b/>
         </w:rPr>
+        <w:t>Covariates (parallel groups).</w:t>
+      </w:r>
+      <w:r>
+        <w:rPr/>
+        <w:t xml:space="preserve"> When baseline covariates are chosen the model becomes ln(Y) = μ + TRT + covariates + ε: ordinary least squares, main effects only, pooled variance, and N − 2 − p residual degrees of freedom, where p counts the covariate terms (a categorical covariate with k categories has k − 1). The treatment coefficient stays the log ratio of geometric means. The adjusted interval is primary, and the unadjusted pooled interval is shown beside it. ICH M13A (2.2.3.4) asks that stratification factors be accounted for in a parallel study, and the FDA (2026) says an applicant may consider prespecifying baseline prognostic covariates (see also Tsiatis et al., 2008). The covariates must be baseline characteristics named before the analysis. The app cannot check when a value was measured, and the Analysis Record lists the covariates. A missing value stops the analysis, so nobody is dropped or imputed.</w:t>
+      </w:r>
+    </w:p>
+    <w:p>
+      <w:pPr>
+        <w:spacing w:after="120" w:line="276" w:lineRule="auto"/>
+      </w:pPr>
+      <w:r>
+        <w:rPr>
+          <w:b/>
+        </w:rPr>
         <w:t xml:space="preserve">Replicate designs: </w:t>
       </w:r>
       <w:r>
-        <w:t>the same model, with Period at 3 or 4 levels; each administration enters once. The confidence interval uses average bioequivalence limits. The within-subject variability table uses a separate model per treatment (Sequence, Subject and Period, fitted to subjects with that treatment at least twice), as in the replicateBE package; the app's results agree with replicateBE on its 30 reference data sets.</w:t>
+        <w:t>the same model, with Period at 3 or 4 levels; each administration enters once. Under the standard approach the confidence interval uses average bioequivalence limits; under EMA ABEL or FDA RSABE see Reference-Scaled Approaches. The within-subject variability table uses a separate model per treatment (Sequence, Subject and Period, fitted to subjects with that treatment at least twice), as in the replicateBE package; the app's results agree with replicateBE on its 30 reference data sets.</w:t>
       </w:r>
     </w:p>
     <w:p>
@@ -27454,6 +27720,76 @@
       <w:pPr>
         <w:pStyle w:val="Kop2"/>
       </w:pPr>
+      <w:r>
+        <w:t>Reference-Scaled Approaches (EMA ABEL and FDA RSABE)</w:t>
+      </w:r>
+    </w:p>
+    <w:p>
+      <w:pPr>
+        <w:spacing w:after="120" w:line="276" w:lineRule="auto"/>
+      </w:pPr>
+      <w:r>
+        <w:t>For replicate designs the analyst chooses, before the run, between the standard approach, EMA ABEL and FDA RSABE. The 2×3×3 and 2×2×4 designs support both; the 2×2×3 design supports ABEL only.</w:t>
+      </w:r>
+    </w:p>
+    <w:p>
+      <w:pPr>
+        <w:spacing w:after="120" w:line="276" w:lineRule="auto"/>
+      </w:pPr>
+      <w:r>
+        <w:rPr>
+          <w:b/>
+        </w:rPr>
+        <w:t>EMA ABEL (EMA 2010, section 4.1.10).</w:t>
+      </w:r>
+      <w:r>
+        <w:rPr/>
+        <w:t xml:space="preserve"> Cmax only; AUC is judged against 80.00–125.00%. CVwR comes from the EMA model described under Replicate designs. Up to CVwR 30% the limits stay at 80.00–125.00%. Above it they are exp(±0.760·sWR), with sWR = √ln(CVwR² + 1) and CVwR (as a fraction) capped at 0.50, which gives 69.84–143.19% at the cap. Bioequivalence is concluded when the 90% confidence interval lies within the limits and the point estimate within 80.00–125.00%. The guideline asks the applicant to justify that the variability is reliable and not the result of outliers.</w:t>
+      </w:r>
+    </w:p>
+    <w:p>
+      <w:pPr>
+        <w:spacing w:after="120" w:line="276" w:lineRule="auto"/>
+      </w:pPr>
+      <w:r>
+        <w:rPr>
+          <w:b/>
+        </w:rPr>
+        <w:t>FDA RSABE (FDA 2026, Appendix G).</w:t>
+      </w:r>
+      <w:r>
+        <w:rPr/>
+        <w:t xml:space="preserve"> Each log-transformed metric is assessed on the subjects with a value in every period. For each subject the administrations are put in period order and two contrasts formed: I, the mean of the Test values minus the mean of the Reference values, and D, the first minus the second Reference value. I ~ Sequence, by least squares, gives the estimate (the mean of the sequence means, each sequence weighted equally), its standard error and 90% limits from the t distribution with n − m degrees of freedom (n subjects, m sequences). Let x = estimate² − SE² and boundx the larger squared limit. D ~ Sequence gives s²WR = MSE/2 with df(d) residual degrees of freedom. With θ = (ln 1.25 / 0.25)² = 0.7967, y = −θ·s²WR and boundy = y·df(d) / χ²(0.95, df(d)). The criterion bound is (x + y) + √((boundx − x)² + (boundy − y)²), the 95% upper confidence bound of the scaled criterion (Howe, 1974).</w:t>
+      </w:r>
+    </w:p>
+    <w:p>
+      <w:pPr>
+        <w:spacing w:after="120" w:line="276" w:lineRule="auto"/>
+      </w:pPr>
+      <w:r>
+        <w:t>If sWR is 0.294 or higher the route is Scaled: RSABE is met when the criterion bound is at or below 0 and the point estimate, 100·exp(estimate), lies within 80.00–125.00%, compared to four significant figures. Below 0.294 nothing is scaled, and the ordinary test against 80.00–125.00% is used with the model you chose. The limits implied by sWR are exp(±ln 1.25·sWR/0.25).</w:t>
+      </w:r>
+    </w:p>
+    <w:p>
+      <w:pPr>
+        <w:spacing w:after="120" w:line="276" w:lineRule="auto"/>
+      </w:pPr>
+      <w:r>
+        <w:t>Two within-subject SDs are in play. sWR (EMA model) is the residual SD of the period-adjusted model fitted to the Reference data. sWR (FDA contrasts) comes from the difference between a subject's two Reference administrations. They are estimated differently and can differ, and the table names the one it shows.</w:t>
+      </w:r>
+    </w:p>
+    <w:p>
+      <w:pPr>
+        <w:spacing w:after="120" w:line="276" w:lineRule="auto"/>
+      </w:pPr>
+      <w:r>
+        <w:t>The FDA recommends at least 24 evaluable subjects for RSABE; the app warns below 24 and still computes. The PowerTOST documentation reports an inflated type I error for the FDA method when the true CVwR is at or below about 30%, around and below the switch. The partial replicate cannot estimate the Test variance, and with unequal variances its consumer risk can exceed 5% (Tothfalusi and Endrenyi, 2016). A subject who lacks a period leaves the RSABE contrasts. The app does not implement the exact method of Tothfalusi and Endrenyi or other corrections that neither agency has adopted.</w:t>
+      </w:r>
+    </w:p>
+    <w:p>
+      <w:pPr>
+        <w:pStyle w:val="Kop2"/>
+      </w:pPr>
       <w:bookmarkStart w:id="100" w:name="_Toc241526144"/>
       <w:r>
         <w:t>Drug–Drug Interaction Analysis</w:t>
@@ -27491,7 +27827,7 @@
         <w:spacing w:after="120" w:line="276" w:lineRule="auto"/>
       </w:pPr>
       <w:r>
-        <w:t>Exact power via Owen’s Q function for standard ABE. For ABEL, RSABE and NTID, power is simulated in PowerTOST: 100,000 simulated studies for the sample size, 10,000 for power and the power curve. Inputs: within-subject CV (for scaled methods, of Test and Reference), expected ratio, target power and design. A higher CV or a ratio further from 100% needs more subjects; a crossover needs fewer subjects than a parallel design.</w:t>
+        <w:t>Exact power via Owen’s Q function for standard ABE. For ABEL, RSABE and NTID, power is simulated in PowerTOST: 100,000 simulated studies for the sample size, 10,000 for power and the power curve. The Bioequivalence path applies the same ABEL and RSABE criteria to a replicate study, so the planned and the analysed criterion agree; the NTID test is for planning only. Inputs: within-subject CV (for scaled methods, of Test and Reference), expected ratio, target power and design. A higher CV or a ratio further from 100% needs more subjects; a crossover needs fewer subjects than a parallel design.</w:t>
       </w:r>
     </w:p>
     <w:p>
@@ -27558,7 +27894,7 @@
         <w:spacing w:after="120" w:line="276" w:lineRule="auto"/>
       </w:pPr>
       <w:r>
-        <w:t>The EMA allows the acceptance criteria for a partial AUC to be widened in the same way as for Cmax of a highly variable product (EMA/CHMP/EWP/280/96 Rev1, section 6.8.2.2). The app does not scale limits: for a replicate design it shows CVwR and the limits it would imply, and it applies the limits you enter. To widen Cmax and the partial AUCs but not AUC to last point or to infinity, choose Cmax and partial AUCs under Widened limits apply to. The same guideline recommends an early and a terminal partial AUC, split at a pre-specified cut-off such as half the dosing interval, when a single-dose study replaces a multiple-dose study.</w:t>
+        <w:t>The EMA allows the acceptance criteria for a partial AUC to be widened in the same way as for Cmax of a highly variable product (EMA/CHMP/EWP/280/96 Rev1, section 6.8.2.2). Under EMA ABEL the app widens Cmax only. For a partial AUC it uses the limits you enter, which can be widened by hand when the protocol pre-specifies it. To widen Cmax and the partial AUCs but not AUC to last point or to infinity, choose Cmax and partial AUCs under Widened limits apply to. The same guideline recommends an early and a terminal partial AUC, split at a pre-specified cut-off such as half the dosing interval, when a single-dose study replaces a multiple-dose study.</w:t>
       </w:r>
     </w:p>
     <w:p>
@@ -36762,7 +37098,7 @@
                 <w:sz w:val="20"/>
                 <w:szCs w:val="20"/>
               </w:rPr>
-              <w:t>Average bioequivalence with expanding limits (EMA, for highly variable drugs)</w:t>
+              <w:t>Average bioequivalence with expanding limits (EMA, for highly variable drugs): for Cmax, limits that widen with the within-subject variability of the Reference above CVwR 30%, capped at 50%. Chosen under Acceptance approach in replicate designs.</w:t>
             </w:r>
           </w:p>
         </w:tc>
@@ -36790,7 +37126,7 @@
                 <w:sz w:val="20"/>
                 <w:szCs w:val="20"/>
               </w:rPr>
-              <w:t>Adjusted R²</w:t>
+              <w:t>Adjusted and unadjusted interval</w:t>
             </w:r>
           </w:p>
         </w:tc>
@@ -36816,7 +37152,7 @@
                 <w:sz w:val="20"/>
                 <w:szCs w:val="20"/>
               </w:rPr>
-              <w:t>Goodness of fit of the terminal regression, corrected for the number of points; the minimum in the app applies to it</w:t>
+              <w:t>Adjusted: the confidence interval from a model that contains covariates. Unadjusted: the interval from the model with Treatment only. The adjusted interval is the primary result, and the unadjusted one is shown beside it.</w:t>
             </w:r>
           </w:p>
         </w:tc>
@@ -36844,7 +37180,7 @@
                 <w:sz w:val="20"/>
                 <w:szCs w:val="20"/>
               </w:rPr>
-              <w:t>ADNCA</w:t>
+              <w:t>Adjusted R²</w:t>
             </w:r>
           </w:p>
         </w:tc>
@@ -36870,7 +37206,7 @@
                 <w:sz w:val="20"/>
                 <w:szCs w:val="20"/>
               </w:rPr>
-              <w:t>CDISC ADaM dataset for non-compartmental analysis</w:t>
+              <w:t>Goodness of fit of the terminal regression, corrected for the number of points; the minimum in the app applies to it</w:t>
             </w:r>
           </w:p>
         </w:tc>
@@ -36898,7 +37234,7 @@
                 <w:sz w:val="20"/>
                 <w:szCs w:val="20"/>
               </w:rPr>
-              <w:t>ANOVA</w:t>
+              <w:t>ADNCA</w:t>
             </w:r>
           </w:p>
         </w:tc>
@@ -36924,7 +37260,7 @@
                 <w:sz w:val="20"/>
                 <w:szCs w:val="20"/>
               </w:rPr>
-              <w:t>Analysis of variance</w:t>
+              <w:t>CDISC ADaM dataset for non-compartmental analysis</w:t>
             </w:r>
           </w:p>
         </w:tc>
@@ -36952,7 +37288,7 @@
                 <w:sz w:val="20"/>
                 <w:szCs w:val="20"/>
               </w:rPr>
-              <w:t>AUC</w:t>
+              <w:t>ANOVA</w:t>
             </w:r>
           </w:p>
         </w:tc>
@@ -36978,7 +37314,7 @@
                 <w:sz w:val="20"/>
                 <w:szCs w:val="20"/>
               </w:rPr>
-              <w:t>Area under the concentration–time curve</w:t>
+              <w:t>Analysis of variance</w:t>
             </w:r>
           </w:p>
         </w:tc>
@@ -37006,7 +37342,7 @@
                 <w:sz w:val="20"/>
                 <w:szCs w:val="20"/>
               </w:rPr>
-              <w:t>AUC % extrapolated</w:t>
+              <w:t>AUC</w:t>
             </w:r>
           </w:p>
         </w:tc>
@@ -37032,7 +37368,7 @@
                 <w:sz w:val="20"/>
                 <w:szCs w:val="20"/>
               </w:rPr>
-              <w:t>The share of AUC to infinity that lies beyond the last measurable concentration</w:t>
+              <w:t>Area under the concentration–time curve</w:t>
             </w:r>
           </w:p>
         </w:tc>
@@ -37060,7 +37396,7 @@
                 <w:sz w:val="20"/>
                 <w:szCs w:val="20"/>
               </w:rPr>
-              <w:t>AUC to infinity (AUC0–∞)</w:t>
+              <w:t>AUC % extrapolated</w:t>
             </w:r>
           </w:p>
         </w:tc>
@@ -37086,7 +37422,7 @@
                 <w:sz w:val="20"/>
                 <w:szCs w:val="20"/>
               </w:rPr>
-              <w:t>AUC to last point plus Clast/λz</w:t>
+              <w:t>The share of AUC to infinity that lies beyond the last measurable concentration</w:t>
             </w:r>
           </w:p>
         </w:tc>
@@ -37114,7 +37450,7 @@
                 <w:sz w:val="20"/>
                 <w:szCs w:val="20"/>
               </w:rPr>
-              <w:t>AUC to last point (AUC0–t)</w:t>
+              <w:t>AUC to infinity (AUC0–∞)</w:t>
             </w:r>
           </w:p>
         </w:tc>
@@ -37140,7 +37476,7 @@
                 <w:sz w:val="20"/>
                 <w:szCs w:val="20"/>
               </w:rPr>
-              <w:t>AUC from 0 to the last measurable concentration</w:t>
+              <w:t>AUC to last point plus Clast/λz</w:t>
             </w:r>
           </w:p>
         </w:tc>
@@ -37168,7 +37504,7 @@
                 <w:sz w:val="20"/>
                 <w:szCs w:val="20"/>
               </w:rPr>
-              <w:t>AUCτ</w:t>
+              <w:t>AUC to last point (AUC0–t)</w:t>
             </w:r>
           </w:p>
         </w:tc>
@@ -37194,7 +37530,7 @@
                 <w:sz w:val="20"/>
                 <w:szCs w:val="20"/>
               </w:rPr>
-              <w:t>AUC within the dosing interval (steady state)</w:t>
+              <w:t>AUC from 0 to the last measurable concentration</w:t>
             </w:r>
           </w:p>
         </w:tc>
@@ -37222,7 +37558,7 @@
                 <w:sz w:val="20"/>
                 <w:szCs w:val="20"/>
               </w:rPr>
-              <w:t>Audit trail</w:t>
+              <w:t>AUCτ</w:t>
             </w:r>
           </w:p>
         </w:tc>
@@ -37248,7 +37584,7 @@
                 <w:sz w:val="20"/>
                 <w:szCs w:val="20"/>
               </w:rPr>
-              <w:t>On a controlled installation: the record of who did what, when and on which data, kept on the server; entries cannot be changed through the app, and any change made otherwise shows</w:t>
+              <w:t>AUC within the dosing interval (steady state)</w:t>
             </w:r>
           </w:p>
         </w:tc>
@@ -37276,7 +37612,7 @@
                 <w:sz w:val="20"/>
                 <w:szCs w:val="20"/>
               </w:rPr>
-              <w:t>BLQ</w:t>
+              <w:t>Audit trail</w:t>
             </w:r>
           </w:p>
         </w:tc>
@@ -37302,7 +37638,7 @@
                 <w:sz w:val="20"/>
                 <w:szCs w:val="20"/>
               </w:rPr>
-              <w:t>Below the limit of quantification</w:t>
+              <w:t>On a controlled installation: the record of who did what, when and on which data, kept on the server; entries cannot be changed through the app, and any change made otherwise shows</w:t>
             </w:r>
           </w:p>
         </w:tc>
@@ -37330,7 +37666,7 @@
                 <w:sz w:val="20"/>
                 <w:szCs w:val="20"/>
               </w:rPr>
-              <w:t>Cavg</w:t>
+              <w:t>Baseline characteristic</w:t>
             </w:r>
           </w:p>
         </w:tc>
@@ -37356,7 +37692,7 @@
                 <w:sz w:val="20"/>
                 <w:szCs w:val="20"/>
               </w:rPr>
-              <w:t>Average concentration over the dosing interval at steady state: AUCτ / τ</w:t>
+              <w:t>A characteristic of a subject that is known before the first dose, such as age, weight or sex. Only baseline characteristics are suitable as covariates.</w:t>
             </w:r>
           </w:p>
         </w:tc>
@@ -37384,7 +37720,7 @@
                 <w:sz w:val="20"/>
                 <w:szCs w:val="20"/>
               </w:rPr>
-              <w:t>CL/F</w:t>
+              <w:t>BLQ</w:t>
             </w:r>
           </w:p>
         </w:tc>
@@ -37410,7 +37746,7 @@
                 <w:sz w:val="20"/>
                 <w:szCs w:val="20"/>
               </w:rPr>
-              <w:t>Apparent clearance: clearance divided by the bioavailability F</w:t>
+              <w:t>Below the limit of quantification</w:t>
             </w:r>
           </w:p>
         </w:tc>
@@ -37438,7 +37774,7 @@
                 <w:sz w:val="20"/>
                 <w:szCs w:val="20"/>
               </w:rPr>
-              <w:t>Cmax</w:t>
+              <w:t>Cavg</w:t>
             </w:r>
           </w:p>
         </w:tc>
@@ -37464,7 +37800,7 @@
                 <w:sz w:val="20"/>
                 <w:szCs w:val="20"/>
               </w:rPr>
-              <w:t>Maximum observed concentration</w:t>
+              <w:t>Average concentration over the dosing interval at steady state: AUCτ / τ</w:t>
             </w:r>
           </w:p>
         </w:tc>
@@ -37492,7 +37828,7 @@
                 <w:sz w:val="20"/>
                 <w:szCs w:val="20"/>
               </w:rPr>
-              <w:t>Cmin (steady state)</w:t>
+              <w:t>CL/F</w:t>
             </w:r>
           </w:p>
         </w:tc>
@@ -37518,7 +37854,7 @@
                 <w:sz w:val="20"/>
                 <w:szCs w:val="20"/>
               </w:rPr>
-              <w:t>Lowest observed concentration from 0 to τ, the pre-dose sample included</w:t>
+              <w:t>Apparent clearance: clearance divided by the bioavailability F</w:t>
             </w:r>
           </w:p>
         </w:tc>
@@ -37546,7 +37882,7 @@
                 <w:sz w:val="20"/>
                 <w:szCs w:val="20"/>
               </w:rPr>
-              <w:t>Controlled installation</w:t>
+              <w:t>Cmax</w:t>
             </w:r>
           </w:p>
         </w:tc>
@@ -37572,7 +37908,7 @@
                 <w:sz w:val="20"/>
                 <w:szCs w:val="20"/>
               </w:rPr>
-              <w:t>NCA Assistant on your organisation's server in controlled mode, with sign-in, audit trail, stored records and review signatures</w:t>
+              <w:t>Maximum observed concentration</w:t>
             </w:r>
           </w:p>
         </w:tc>
@@ -37600,7 +37936,7 @@
                 <w:sz w:val="20"/>
                 <w:szCs w:val="20"/>
               </w:rPr>
-              <w:t>Crossover</w:t>
+              <w:t>Cmin (steady state)</w:t>
             </w:r>
           </w:p>
         </w:tc>
@@ -37626,7 +37962,7 @@
                 <w:sz w:val="20"/>
                 <w:szCs w:val="20"/>
               </w:rPr>
-              <w:t>A design in which each subject receives the treatments in turn, in periods separated by a washout</w:t>
+              <w:t>Lowest observed concentration from 0 to τ, the pre-dose sample included</w:t>
             </w:r>
           </w:p>
         </w:tc>
@@ -37654,7 +37990,7 @@
                 <w:sz w:val="20"/>
                 <w:szCs w:val="20"/>
               </w:rPr>
-              <w:t>Cτ</w:t>
+              <w:t>Controlled installation</w:t>
             </w:r>
           </w:p>
         </w:tc>
@@ -37680,7 +38016,7 @@
                 <w:sz w:val="20"/>
                 <w:szCs w:val="20"/>
               </w:rPr>
-              <w:t>Concentration at the end of the dosing interval: the observed sample nearest to τ within the trough window</w:t>
+              <w:t>NCA Assistant on your organisation's server in controlled mode, with sign-in, audit trail, stored records and review signatures</w:t>
             </w:r>
           </w:p>
         </w:tc>
@@ -37708,7 +38044,7 @@
                 <w:sz w:val="20"/>
                 <w:szCs w:val="20"/>
               </w:rPr>
-              <w:t>CV%</w:t>
+              <w:t>Covariate</w:t>
             </w:r>
           </w:p>
         </w:tc>
@@ -37734,7 +38070,7 @@
                 <w:sz w:val="20"/>
                 <w:szCs w:val="20"/>
               </w:rPr>
-              <w:t>Coefficient of variation</w:t>
+              <w:t>A subject characteristic that may influence a PK parameter and is included in the model. NCA Assistant offers baseline covariates for parallel-group studies.</w:t>
             </w:r>
           </w:p>
         </w:tc>
@@ -37762,7 +38098,7 @@
                 <w:sz w:val="20"/>
                 <w:szCs w:val="20"/>
               </w:rPr>
-              <w:t>CVwR / CVwT</w:t>
+              <w:t>Criterion bound</w:t>
             </w:r>
           </w:p>
         </w:tc>
@@ -37788,7 +38124,7 @@
                 <w:sz w:val="20"/>
                 <w:szCs w:val="20"/>
               </w:rPr>
-              <w:t>Within-subject coefficient of variation of the Reference / Test</w:t>
+              <w:t>In RSABE, the 95% upper confidence bound of the scaled criterion. RSABE requires it to be at or below 0.</w:t>
             </w:r>
           </w:p>
         </w:tc>
@@ -37816,7 +38152,7 @@
                 <w:sz w:val="20"/>
                 <w:szCs w:val="20"/>
               </w:rPr>
-              <w:t>DDI</w:t>
+              <w:t>Crossover</w:t>
             </w:r>
           </w:p>
         </w:tc>
@@ -37842,7 +38178,7 @@
                 <w:sz w:val="20"/>
                 <w:szCs w:val="20"/>
               </w:rPr>
-              <w:t>Drug–drug interaction</w:t>
+              <w:t>A design in which each subject receives the treatments in turn, in periods separated by a washout</w:t>
             </w:r>
           </w:p>
         </w:tc>
@@ -37870,7 +38206,7 @@
                 <w:sz w:val="20"/>
                 <w:szCs w:val="20"/>
               </w:rPr>
-              <w:t>EMA Method A / B</w:t>
+              <w:t>Cτ</w:t>
             </w:r>
           </w:p>
         </w:tc>
@@ -37896,7 +38232,7 @@
                 <w:sz w:val="20"/>
                 <w:szCs w:val="20"/>
               </w:rPr>
-              <w:t>The fixed-effects (A) and mixed-effects (B) ANOVA of the EMA questions and answers on bioequivalence</w:t>
+              <w:t>Concentration at the end of the dosing interval: the observed sample nearest to τ within the trough window</w:t>
             </w:r>
           </w:p>
         </w:tc>
@@ -37924,6 +38260,222 @@
                 <w:sz w:val="20"/>
                 <w:szCs w:val="20"/>
               </w:rPr>
+              <w:t>CV%</w:t>
+            </w:r>
+          </w:p>
+        </w:tc>
+        <w:tc>
+          <w:tcPr>
+            <w:tcW w:w="4513" w:type="dxa"/>
+            <w:tcBorders>
+              <w:top w:val="single" w:sz="1" w:space="0" w:color="CCCCCC"/>
+              <w:left w:val="single" w:sz="1" w:space="0" w:color="CCCCCC"/>
+              <w:bottom w:val="single" w:sz="1" w:space="0" w:color="CCCCCC"/>
+              <w:right w:val="single" w:sz="1" w:space="0" w:color="CCCCCC"/>
+            </w:tcBorders>
+            <w:tcMar>
+              <w:top w:w="60" w:type="dxa"/>
+              <w:left w:w="100" w:type="dxa"/>
+              <w:bottom w:w="60" w:type="dxa"/>
+              <w:right w:w="100" w:type="dxa"/>
+            </w:tcMar>
+          </w:tcPr>
+          <w:p>
+            <w:r>
+              <w:rPr>
+                <w:sz w:val="20"/>
+                <w:szCs w:val="20"/>
+              </w:rPr>
+              <w:t>Coefficient of variation</w:t>
+            </w:r>
+          </w:p>
+        </w:tc>
+      </w:tr>
+      <w:tr>
+        <w:tc>
+          <w:tcPr>
+            <w:tcW w:w="4513" w:type="dxa"/>
+            <w:tcBorders>
+              <w:top w:val="single" w:sz="1" w:space="0" w:color="CCCCCC"/>
+              <w:left w:val="single" w:sz="1" w:space="0" w:color="CCCCCC"/>
+              <w:bottom w:val="single" w:sz="1" w:space="0" w:color="CCCCCC"/>
+              <w:right w:val="single" w:sz="1" w:space="0" w:color="CCCCCC"/>
+            </w:tcBorders>
+            <w:tcMar>
+              <w:top w:w="60" w:type="dxa"/>
+              <w:left w:w="100" w:type="dxa"/>
+              <w:bottom w:w="60" w:type="dxa"/>
+              <w:right w:w="100" w:type="dxa"/>
+            </w:tcMar>
+          </w:tcPr>
+          <w:p>
+            <w:r>
+              <w:rPr>
+                <w:sz w:val="20"/>
+                <w:szCs w:val="20"/>
+              </w:rPr>
+              <w:t>CVwR / CVwT</w:t>
+            </w:r>
+          </w:p>
+        </w:tc>
+        <w:tc>
+          <w:tcPr>
+            <w:tcW w:w="4513" w:type="dxa"/>
+            <w:tcBorders>
+              <w:top w:val="single" w:sz="1" w:space="0" w:color="CCCCCC"/>
+              <w:left w:val="single" w:sz="1" w:space="0" w:color="CCCCCC"/>
+              <w:bottom w:val="single" w:sz="1" w:space="0" w:color="CCCCCC"/>
+              <w:right w:val="single" w:sz="1" w:space="0" w:color="CCCCCC"/>
+            </w:tcBorders>
+            <w:tcMar>
+              <w:top w:w="60" w:type="dxa"/>
+              <w:left w:w="100" w:type="dxa"/>
+              <w:bottom w:w="60" w:type="dxa"/>
+              <w:right w:w="100" w:type="dxa"/>
+            </w:tcMar>
+          </w:tcPr>
+          <w:p>
+            <w:r>
+              <w:rPr>
+                <w:sz w:val="20"/>
+                <w:szCs w:val="20"/>
+              </w:rPr>
+              <w:t>Within-subject coefficient of variation of the Reference / Test</w:t>
+            </w:r>
+          </w:p>
+        </w:tc>
+      </w:tr>
+      <w:tr>
+        <w:tc>
+          <w:tcPr>
+            <w:tcW w:w="4513" w:type="dxa"/>
+            <w:tcBorders>
+              <w:top w:val="single" w:sz="1" w:space="0" w:color="CCCCCC"/>
+              <w:left w:val="single" w:sz="1" w:space="0" w:color="CCCCCC"/>
+              <w:bottom w:val="single" w:sz="1" w:space="0" w:color="CCCCCC"/>
+              <w:right w:val="single" w:sz="1" w:space="0" w:color="CCCCCC"/>
+            </w:tcBorders>
+            <w:tcMar>
+              <w:top w:w="60" w:type="dxa"/>
+              <w:left w:w="100" w:type="dxa"/>
+              <w:bottom w:w="60" w:type="dxa"/>
+              <w:right w:w="100" w:type="dxa"/>
+            </w:tcMar>
+          </w:tcPr>
+          <w:p>
+            <w:r>
+              <w:rPr>
+                <w:sz w:val="20"/>
+                <w:szCs w:val="20"/>
+              </w:rPr>
+              <w:t>DDI</w:t>
+            </w:r>
+          </w:p>
+        </w:tc>
+        <w:tc>
+          <w:tcPr>
+            <w:tcW w:w="4513" w:type="dxa"/>
+            <w:tcBorders>
+              <w:top w:val="single" w:sz="1" w:space="0" w:color="CCCCCC"/>
+              <w:left w:val="single" w:sz="1" w:space="0" w:color="CCCCCC"/>
+              <w:bottom w:val="single" w:sz="1" w:space="0" w:color="CCCCCC"/>
+              <w:right w:val="single" w:sz="1" w:space="0" w:color="CCCCCC"/>
+            </w:tcBorders>
+            <w:tcMar>
+              <w:top w:w="60" w:type="dxa"/>
+              <w:left w:w="100" w:type="dxa"/>
+              <w:bottom w:w="60" w:type="dxa"/>
+              <w:right w:w="100" w:type="dxa"/>
+            </w:tcMar>
+          </w:tcPr>
+          <w:p>
+            <w:r>
+              <w:rPr>
+                <w:sz w:val="20"/>
+                <w:szCs w:val="20"/>
+              </w:rPr>
+              <w:t>Drug–drug interaction</w:t>
+            </w:r>
+          </w:p>
+        </w:tc>
+      </w:tr>
+      <w:tr>
+        <w:tc>
+          <w:tcPr>
+            <w:tcW w:w="4513" w:type="dxa"/>
+            <w:tcBorders>
+              <w:top w:val="single" w:sz="1" w:space="0" w:color="CCCCCC"/>
+              <w:left w:val="single" w:sz="1" w:space="0" w:color="CCCCCC"/>
+              <w:bottom w:val="single" w:sz="1" w:space="0" w:color="CCCCCC"/>
+              <w:right w:val="single" w:sz="1" w:space="0" w:color="CCCCCC"/>
+            </w:tcBorders>
+            <w:tcMar>
+              <w:top w:w="60" w:type="dxa"/>
+              <w:left w:w="100" w:type="dxa"/>
+              <w:bottom w:w="60" w:type="dxa"/>
+              <w:right w:w="100" w:type="dxa"/>
+            </w:tcMar>
+          </w:tcPr>
+          <w:p>
+            <w:r>
+              <w:rPr>
+                <w:sz w:val="20"/>
+                <w:szCs w:val="20"/>
+              </w:rPr>
+              <w:t>EMA Method A / B</w:t>
+            </w:r>
+          </w:p>
+        </w:tc>
+        <w:tc>
+          <w:tcPr>
+            <w:tcW w:w="4513" w:type="dxa"/>
+            <w:tcBorders>
+              <w:top w:val="single" w:sz="1" w:space="0" w:color="CCCCCC"/>
+              <w:left w:val="single" w:sz="1" w:space="0" w:color="CCCCCC"/>
+              <w:bottom w:val="single" w:sz="1" w:space="0" w:color="CCCCCC"/>
+              <w:right w:val="single" w:sz="1" w:space="0" w:color="CCCCCC"/>
+            </w:tcBorders>
+            <w:tcMar>
+              <w:top w:w="60" w:type="dxa"/>
+              <w:left w:w="100" w:type="dxa"/>
+              <w:bottom w:w="60" w:type="dxa"/>
+              <w:right w:w="100" w:type="dxa"/>
+            </w:tcMar>
+          </w:tcPr>
+          <w:p>
+            <w:r>
+              <w:rPr>
+                <w:sz w:val="20"/>
+                <w:szCs w:val="20"/>
+              </w:rPr>
+              <w:t>The fixed-effects (A) and mixed-effects (B) ANOVA of the EMA questions and answers on bioequivalence</w:t>
+            </w:r>
+          </w:p>
+        </w:tc>
+      </w:tr>
+      <w:tr>
+        <w:tc>
+          <w:tcPr>
+            <w:tcW w:w="4513" w:type="dxa"/>
+            <w:tcBorders>
+              <w:top w:val="single" w:sz="1" w:space="0" w:color="CCCCCC"/>
+              <w:left w:val="single" w:sz="1" w:space="0" w:color="CCCCCC"/>
+              <w:bottom w:val="single" w:sz="1" w:space="0" w:color="CCCCCC"/>
+              <w:right w:val="single" w:sz="1" w:space="0" w:color="CCCCCC"/>
+            </w:tcBorders>
+            <w:tcMar>
+              <w:top w:w="60" w:type="dxa"/>
+              <w:left w:w="100" w:type="dxa"/>
+              <w:bottom w:w="60" w:type="dxa"/>
+              <w:right w:w="100" w:type="dxa"/>
+            </w:tcMar>
+          </w:tcPr>
+          <w:p>
+            <w:r>
+              <w:rPr>
+                <w:sz w:val="20"/>
+                <w:szCs w:val="20"/>
+              </w:rPr>
               <w:t>Exclusion register</w:t>
             </w:r>
           </w:p>
@@ -38635,7 +39187,7 @@
                 <w:sz w:val="20"/>
                 <w:szCs w:val="20"/>
               </w:rPr>
-              <w:t>IQ / OQ / PQ</w:t>
+              <w:t>Intra-subject contrast</w:t>
             </w:r>
           </w:p>
         </w:tc>
@@ -38661,7 +39213,7 @@
                 <w:sz w:val="20"/>
                 <w:szCs w:val="20"/>
               </w:rPr>
-              <w:t>Installation, operational and performance qualification: the tests that show a system is installed correctly, works as specified, and does what your own use needs</w:t>
+              <w:t>In the FDA RSABE method, a difference of log values within one subject: the Test mean minus the Reference mean (I), and the first minus the second Reference administration (D).</w:t>
             </w:r>
           </w:p>
         </w:tc>
@@ -38689,7 +39241,7 @@
                 <w:sz w:val="20"/>
                 <w:szCs w:val="20"/>
               </w:rPr>
-              <w:t>λz</w:t>
+              <w:t>IQ / OQ / PQ</w:t>
             </w:r>
           </w:p>
         </w:tc>
@@ -38715,7 +39267,7 @@
                 <w:sz w:val="20"/>
                 <w:szCs w:val="20"/>
               </w:rPr>
-              <w:t>Terminal elimination rate constant</w:t>
+              <w:t>Installation, operational and performance qualification: the tests that show a system is installed correctly, works as specified, and does what your own use needs</w:t>
             </w:r>
           </w:p>
         </w:tc>
@@ -38743,7 +39295,7 @@
                 <w:sz w:val="20"/>
                 <w:szCs w:val="20"/>
               </w:rPr>
-              <w:t>LLOQ</w:t>
+              <w:t>Point estimate constraint</w:t>
             </w:r>
           </w:p>
         </w:tc>
@@ -38769,7 +39321,7 @@
                 <w:sz w:val="20"/>
                 <w:szCs w:val="20"/>
               </w:rPr>
-              <w:t>Lower limit of quantification</w:t>
+              <w:t>The requirement, for widened or scaled limits, that the point estimate also lies within 80.00–125.00%.</w:t>
             </w:r>
           </w:p>
         </w:tc>
@@ -38797,7 +39349,7 @@
                 <w:sz w:val="20"/>
                 <w:szCs w:val="20"/>
               </w:rPr>
-              <w:t>MRT</w:t>
+              <w:t>Route</w:t>
             </w:r>
           </w:p>
         </w:tc>
@@ -38823,7 +39375,7 @@
                 <w:sz w:val="20"/>
                 <w:szCs w:val="20"/>
               </w:rPr>
-              <w:t>Mean residence time</w:t>
+              <w:t>In a scaled run, Scaled when the method scaled the limits for that metric, and Standard when the ordinary 80.00–125.00% test applied (for example sWR below 0.294, or AUC under ABEL).</w:t>
             </w:r>
           </w:p>
         </w:tc>
@@ -38851,7 +39403,7 @@
                 <w:sz w:val="20"/>
                 <w:szCs w:val="20"/>
               </w:rPr>
-              <w:t>MSE</w:t>
+              <w:t>Scaled limit</w:t>
             </w:r>
           </w:p>
         </w:tc>
@@ -38877,7 +39429,7 @@
                 <w:sz w:val="20"/>
                 <w:szCs w:val="20"/>
               </w:rPr>
-              <w:t>Mean squared error: the residual variance of the ANOVA model</w:t>
+              <w:t>The acceptance limits implied by the variability of the Reference: exp(±0.760·sWR) for ABEL, exp(±ln 1.25·sWR/0.25) for RSABE.</w:t>
             </w:r>
           </w:p>
         </w:tc>
@@ -38905,7 +39457,7 @@
                 <w:sz w:val="20"/>
                 <w:szCs w:val="20"/>
               </w:rPr>
-              <w:t>NCA</w:t>
+              <w:t>Standardized difference</w:t>
             </w:r>
           </w:p>
         </w:tc>
@@ -38931,7 +39483,7 @@
                 <w:sz w:val="20"/>
                 <w:szCs w:val="20"/>
               </w:rPr>
-              <w:t>Non-compartmental analysis</w:t>
+              <w:t>A measure of imbalance between groups on a baseline characteristic: the difference in means divided by the pooled SD (for a category, the difference in proportions divided by the pooled SD). It describes the groups and is not a test.</w:t>
             </w:r>
           </w:p>
         </w:tc>
@@ -38959,7 +39511,7 @@
                 <w:sz w:val="20"/>
                 <w:szCs w:val="20"/>
               </w:rPr>
-              <w:t>NTID</w:t>
+              <w:t>Switch</w:t>
             </w:r>
           </w:p>
         </w:tc>
@@ -38985,7 +39537,7 @@
                 <w:sz w:val="20"/>
                 <w:szCs w:val="20"/>
               </w:rPr>
-              <w:t>Narrow therapeutic index drug</w:t>
+              <w:t>The value of sWR at which RSABE starts to scale, 0.294 (about CVwR 30%). Below it the ordinary test applies.</w:t>
             </w:r>
           </w:p>
         </w:tc>
@@ -39013,7 +39565,7 @@
                 <w:sz w:val="20"/>
                 <w:szCs w:val="20"/>
               </w:rPr>
-              <w:t>Open mode</w:t>
+              <w:t>sWR</w:t>
             </w:r>
           </w:p>
         </w:tc>
@@ -39039,7 +39591,7 @@
                 <w:sz w:val="20"/>
                 <w:szCs w:val="20"/>
               </w:rPr>
-              <w:t>The app without controlled mode: no sign-in, audit trail or electronic signatures</w:t>
+              <w:t>The within-subject standard deviation of the Reference on the log scale. The EMA model and the FDA contrasts estimate it differently, so the table says which one it shows.</w:t>
             </w:r>
           </w:p>
         </w:tc>
@@ -39067,7 +39619,7 @@
                 <w:sz w:val="20"/>
                 <w:szCs w:val="20"/>
               </w:rPr>
-              <w:t>Owen's Q</w:t>
+              <w:t>λz</w:t>
             </w:r>
           </w:p>
         </w:tc>
@@ -39093,7 +39645,7 @@
                 <w:sz w:val="20"/>
                 <w:szCs w:val="20"/>
               </w:rPr>
-              <w:t>The function PowerTOST uses for exact power of the two one-sided tests</w:t>
+              <w:t>Terminal elimination rate constant</w:t>
             </w:r>
           </w:p>
         </w:tc>
@@ -39121,6 +39673,384 @@
                 <w:sz w:val="20"/>
                 <w:szCs w:val="20"/>
               </w:rPr>
+              <w:t>LLOQ</w:t>
+            </w:r>
+          </w:p>
+        </w:tc>
+        <w:tc>
+          <w:tcPr>
+            <w:tcW w:w="4513" w:type="dxa"/>
+            <w:tcBorders>
+              <w:top w:val="single" w:sz="1" w:space="0" w:color="CCCCCC"/>
+              <w:left w:val="single" w:sz="1" w:space="0" w:color="CCCCCC"/>
+              <w:bottom w:val="single" w:sz="1" w:space="0" w:color="CCCCCC"/>
+              <w:right w:val="single" w:sz="1" w:space="0" w:color="CCCCCC"/>
+            </w:tcBorders>
+            <w:tcMar>
+              <w:top w:w="60" w:type="dxa"/>
+              <w:left w:w="100" w:type="dxa"/>
+              <w:bottom w:w="60" w:type="dxa"/>
+              <w:right w:w="100" w:type="dxa"/>
+            </w:tcMar>
+          </w:tcPr>
+          <w:p>
+            <w:r>
+              <w:rPr>
+                <w:sz w:val="20"/>
+                <w:szCs w:val="20"/>
+              </w:rPr>
+              <w:t>Lower limit of quantification</w:t>
+            </w:r>
+          </w:p>
+        </w:tc>
+      </w:tr>
+      <w:tr>
+        <w:tc>
+          <w:tcPr>
+            <w:tcW w:w="4513" w:type="dxa"/>
+            <w:tcBorders>
+              <w:top w:val="single" w:sz="1" w:space="0" w:color="CCCCCC"/>
+              <w:left w:val="single" w:sz="1" w:space="0" w:color="CCCCCC"/>
+              <w:bottom w:val="single" w:sz="1" w:space="0" w:color="CCCCCC"/>
+              <w:right w:val="single" w:sz="1" w:space="0" w:color="CCCCCC"/>
+            </w:tcBorders>
+            <w:tcMar>
+              <w:top w:w="60" w:type="dxa"/>
+              <w:left w:w="100" w:type="dxa"/>
+              <w:bottom w:w="60" w:type="dxa"/>
+              <w:right w:w="100" w:type="dxa"/>
+            </w:tcMar>
+          </w:tcPr>
+          <w:p>
+            <w:r>
+              <w:rPr>
+                <w:sz w:val="20"/>
+                <w:szCs w:val="20"/>
+              </w:rPr>
+              <w:t>MRT</w:t>
+            </w:r>
+          </w:p>
+        </w:tc>
+        <w:tc>
+          <w:tcPr>
+            <w:tcW w:w="4513" w:type="dxa"/>
+            <w:tcBorders>
+              <w:top w:val="single" w:sz="1" w:space="0" w:color="CCCCCC"/>
+              <w:left w:val="single" w:sz="1" w:space="0" w:color="CCCCCC"/>
+              <w:bottom w:val="single" w:sz="1" w:space="0" w:color="CCCCCC"/>
+              <w:right w:val="single" w:sz="1" w:space="0" w:color="CCCCCC"/>
+            </w:tcBorders>
+            <w:tcMar>
+              <w:top w:w="60" w:type="dxa"/>
+              <w:left w:w="100" w:type="dxa"/>
+              <w:bottom w:w="60" w:type="dxa"/>
+              <w:right w:w="100" w:type="dxa"/>
+            </w:tcMar>
+          </w:tcPr>
+          <w:p>
+            <w:r>
+              <w:rPr>
+                <w:sz w:val="20"/>
+                <w:szCs w:val="20"/>
+              </w:rPr>
+              <w:t>Mean residence time</w:t>
+            </w:r>
+          </w:p>
+        </w:tc>
+      </w:tr>
+      <w:tr>
+        <w:tc>
+          <w:tcPr>
+            <w:tcW w:w="4513" w:type="dxa"/>
+            <w:tcBorders>
+              <w:top w:val="single" w:sz="1" w:space="0" w:color="CCCCCC"/>
+              <w:left w:val="single" w:sz="1" w:space="0" w:color="CCCCCC"/>
+              <w:bottom w:val="single" w:sz="1" w:space="0" w:color="CCCCCC"/>
+              <w:right w:val="single" w:sz="1" w:space="0" w:color="CCCCCC"/>
+            </w:tcBorders>
+            <w:tcMar>
+              <w:top w:w="60" w:type="dxa"/>
+              <w:left w:w="100" w:type="dxa"/>
+              <w:bottom w:w="60" w:type="dxa"/>
+              <w:right w:w="100" w:type="dxa"/>
+            </w:tcMar>
+          </w:tcPr>
+          <w:p>
+            <w:r>
+              <w:rPr>
+                <w:sz w:val="20"/>
+                <w:szCs w:val="20"/>
+              </w:rPr>
+              <w:t>MSE</w:t>
+            </w:r>
+          </w:p>
+        </w:tc>
+        <w:tc>
+          <w:tcPr>
+            <w:tcW w:w="4513" w:type="dxa"/>
+            <w:tcBorders>
+              <w:top w:val="single" w:sz="1" w:space="0" w:color="CCCCCC"/>
+              <w:left w:val="single" w:sz="1" w:space="0" w:color="CCCCCC"/>
+              <w:bottom w:val="single" w:sz="1" w:space="0" w:color="CCCCCC"/>
+              <w:right w:val="single" w:sz="1" w:space="0" w:color="CCCCCC"/>
+            </w:tcBorders>
+            <w:tcMar>
+              <w:top w:w="60" w:type="dxa"/>
+              <w:left w:w="100" w:type="dxa"/>
+              <w:bottom w:w="60" w:type="dxa"/>
+              <w:right w:w="100" w:type="dxa"/>
+            </w:tcMar>
+          </w:tcPr>
+          <w:p>
+            <w:r>
+              <w:rPr>
+                <w:sz w:val="20"/>
+                <w:szCs w:val="20"/>
+              </w:rPr>
+              <w:t>Mean squared error: the residual variance of the ANOVA model</w:t>
+            </w:r>
+          </w:p>
+        </w:tc>
+      </w:tr>
+      <w:tr>
+        <w:tc>
+          <w:tcPr>
+            <w:tcW w:w="4513" w:type="dxa"/>
+            <w:tcBorders>
+              <w:top w:val="single" w:sz="1" w:space="0" w:color="CCCCCC"/>
+              <w:left w:val="single" w:sz="1" w:space="0" w:color="CCCCCC"/>
+              <w:bottom w:val="single" w:sz="1" w:space="0" w:color="CCCCCC"/>
+              <w:right w:val="single" w:sz="1" w:space="0" w:color="CCCCCC"/>
+            </w:tcBorders>
+            <w:tcMar>
+              <w:top w:w="60" w:type="dxa"/>
+              <w:left w:w="100" w:type="dxa"/>
+              <w:bottom w:w="60" w:type="dxa"/>
+              <w:right w:w="100" w:type="dxa"/>
+            </w:tcMar>
+          </w:tcPr>
+          <w:p>
+            <w:r>
+              <w:rPr>
+                <w:sz w:val="20"/>
+                <w:szCs w:val="20"/>
+              </w:rPr>
+              <w:t>NCA</w:t>
+            </w:r>
+          </w:p>
+        </w:tc>
+        <w:tc>
+          <w:tcPr>
+            <w:tcW w:w="4513" w:type="dxa"/>
+            <w:tcBorders>
+              <w:top w:val="single" w:sz="1" w:space="0" w:color="CCCCCC"/>
+              <w:left w:val="single" w:sz="1" w:space="0" w:color="CCCCCC"/>
+              <w:bottom w:val="single" w:sz="1" w:space="0" w:color="CCCCCC"/>
+              <w:right w:val="single" w:sz="1" w:space="0" w:color="CCCCCC"/>
+            </w:tcBorders>
+            <w:tcMar>
+              <w:top w:w="60" w:type="dxa"/>
+              <w:left w:w="100" w:type="dxa"/>
+              <w:bottom w:w="60" w:type="dxa"/>
+              <w:right w:w="100" w:type="dxa"/>
+            </w:tcMar>
+          </w:tcPr>
+          <w:p>
+            <w:r>
+              <w:rPr>
+                <w:sz w:val="20"/>
+                <w:szCs w:val="20"/>
+              </w:rPr>
+              <w:t>Non-compartmental analysis</w:t>
+            </w:r>
+          </w:p>
+        </w:tc>
+      </w:tr>
+      <w:tr>
+        <w:tc>
+          <w:tcPr>
+            <w:tcW w:w="4513" w:type="dxa"/>
+            <w:tcBorders>
+              <w:top w:val="single" w:sz="1" w:space="0" w:color="CCCCCC"/>
+              <w:left w:val="single" w:sz="1" w:space="0" w:color="CCCCCC"/>
+              <w:bottom w:val="single" w:sz="1" w:space="0" w:color="CCCCCC"/>
+              <w:right w:val="single" w:sz="1" w:space="0" w:color="CCCCCC"/>
+            </w:tcBorders>
+            <w:tcMar>
+              <w:top w:w="60" w:type="dxa"/>
+              <w:left w:w="100" w:type="dxa"/>
+              <w:bottom w:w="60" w:type="dxa"/>
+              <w:right w:w="100" w:type="dxa"/>
+            </w:tcMar>
+          </w:tcPr>
+          <w:p>
+            <w:r>
+              <w:rPr>
+                <w:sz w:val="20"/>
+                <w:szCs w:val="20"/>
+              </w:rPr>
+              <w:t>NTID</w:t>
+            </w:r>
+          </w:p>
+        </w:tc>
+        <w:tc>
+          <w:tcPr>
+            <w:tcW w:w="4513" w:type="dxa"/>
+            <w:tcBorders>
+              <w:top w:val="single" w:sz="1" w:space="0" w:color="CCCCCC"/>
+              <w:left w:val="single" w:sz="1" w:space="0" w:color="CCCCCC"/>
+              <w:bottom w:val="single" w:sz="1" w:space="0" w:color="CCCCCC"/>
+              <w:right w:val="single" w:sz="1" w:space="0" w:color="CCCCCC"/>
+            </w:tcBorders>
+            <w:tcMar>
+              <w:top w:w="60" w:type="dxa"/>
+              <w:left w:w="100" w:type="dxa"/>
+              <w:bottom w:w="60" w:type="dxa"/>
+              <w:right w:w="100" w:type="dxa"/>
+            </w:tcMar>
+          </w:tcPr>
+          <w:p>
+            <w:r>
+              <w:rPr>
+                <w:sz w:val="20"/>
+                <w:szCs w:val="20"/>
+              </w:rPr>
+              <w:t>Narrow therapeutic index drug</w:t>
+            </w:r>
+          </w:p>
+        </w:tc>
+      </w:tr>
+      <w:tr>
+        <w:tc>
+          <w:tcPr>
+            <w:tcW w:w="4513" w:type="dxa"/>
+            <w:tcBorders>
+              <w:top w:val="single" w:sz="1" w:space="0" w:color="CCCCCC"/>
+              <w:left w:val="single" w:sz="1" w:space="0" w:color="CCCCCC"/>
+              <w:bottom w:val="single" w:sz="1" w:space="0" w:color="CCCCCC"/>
+              <w:right w:val="single" w:sz="1" w:space="0" w:color="CCCCCC"/>
+            </w:tcBorders>
+            <w:tcMar>
+              <w:top w:w="60" w:type="dxa"/>
+              <w:left w:w="100" w:type="dxa"/>
+              <w:bottom w:w="60" w:type="dxa"/>
+              <w:right w:w="100" w:type="dxa"/>
+            </w:tcMar>
+          </w:tcPr>
+          <w:p>
+            <w:r>
+              <w:rPr>
+                <w:sz w:val="20"/>
+                <w:szCs w:val="20"/>
+              </w:rPr>
+              <w:t>Open mode</w:t>
+            </w:r>
+          </w:p>
+        </w:tc>
+        <w:tc>
+          <w:tcPr>
+            <w:tcW w:w="4513" w:type="dxa"/>
+            <w:tcBorders>
+              <w:top w:val="single" w:sz="1" w:space="0" w:color="CCCCCC"/>
+              <w:left w:val="single" w:sz="1" w:space="0" w:color="CCCCCC"/>
+              <w:bottom w:val="single" w:sz="1" w:space="0" w:color="CCCCCC"/>
+              <w:right w:val="single" w:sz="1" w:space="0" w:color="CCCCCC"/>
+            </w:tcBorders>
+            <w:tcMar>
+              <w:top w:w="60" w:type="dxa"/>
+              <w:left w:w="100" w:type="dxa"/>
+              <w:bottom w:w="60" w:type="dxa"/>
+              <w:right w:w="100" w:type="dxa"/>
+            </w:tcMar>
+          </w:tcPr>
+          <w:p>
+            <w:r>
+              <w:rPr>
+                <w:sz w:val="20"/>
+                <w:szCs w:val="20"/>
+              </w:rPr>
+              <w:t>The app without controlled mode: no sign-in, audit trail or electronic signatures</w:t>
+            </w:r>
+          </w:p>
+        </w:tc>
+      </w:tr>
+      <w:tr>
+        <w:tc>
+          <w:tcPr>
+            <w:tcW w:w="4513" w:type="dxa"/>
+            <w:tcBorders>
+              <w:top w:val="single" w:sz="1" w:space="0" w:color="CCCCCC"/>
+              <w:left w:val="single" w:sz="1" w:space="0" w:color="CCCCCC"/>
+              <w:bottom w:val="single" w:sz="1" w:space="0" w:color="CCCCCC"/>
+              <w:right w:val="single" w:sz="1" w:space="0" w:color="CCCCCC"/>
+            </w:tcBorders>
+            <w:tcMar>
+              <w:top w:w="60" w:type="dxa"/>
+              <w:left w:w="100" w:type="dxa"/>
+              <w:bottom w:w="60" w:type="dxa"/>
+              <w:right w:w="100" w:type="dxa"/>
+            </w:tcMar>
+          </w:tcPr>
+          <w:p>
+            <w:r>
+              <w:rPr>
+                <w:sz w:val="20"/>
+                <w:szCs w:val="20"/>
+              </w:rPr>
+              <w:t>Owen's Q</w:t>
+            </w:r>
+          </w:p>
+        </w:tc>
+        <w:tc>
+          <w:tcPr>
+            <w:tcW w:w="4513" w:type="dxa"/>
+            <w:tcBorders>
+              <w:top w:val="single" w:sz="1" w:space="0" w:color="CCCCCC"/>
+              <w:left w:val="single" w:sz="1" w:space="0" w:color="CCCCCC"/>
+              <w:bottom w:val="single" w:sz="1" w:space="0" w:color="CCCCCC"/>
+              <w:right w:val="single" w:sz="1" w:space="0" w:color="CCCCCC"/>
+            </w:tcBorders>
+            <w:tcMar>
+              <w:top w:w="60" w:type="dxa"/>
+              <w:left w:w="100" w:type="dxa"/>
+              <w:bottom w:w="60" w:type="dxa"/>
+              <w:right w:w="100" w:type="dxa"/>
+            </w:tcMar>
+          </w:tcPr>
+          <w:p>
+            <w:r>
+              <w:rPr>
+                <w:sz w:val="20"/>
+                <w:szCs w:val="20"/>
+              </w:rPr>
+              <w:t>The function PowerTOST uses for exact power of the two one-sided tests</w:t>
+            </w:r>
+          </w:p>
+        </w:tc>
+      </w:tr>
+      <w:tr>
+        <w:tc>
+          <w:tcPr>
+            <w:tcW w:w="4513" w:type="dxa"/>
+            <w:tcBorders>
+              <w:top w:val="single" w:sz="1" w:space="0" w:color="CCCCCC"/>
+              <w:left w:val="single" w:sz="1" w:space="0" w:color="CCCCCC"/>
+              <w:bottom w:val="single" w:sz="1" w:space="0" w:color="CCCCCC"/>
+              <w:right w:val="single" w:sz="1" w:space="0" w:color="CCCCCC"/>
+            </w:tcBorders>
+            <w:tcMar>
+              <w:top w:w="60" w:type="dxa"/>
+              <w:left w:w="100" w:type="dxa"/>
+              <w:bottom w:w="60" w:type="dxa"/>
+              <w:right w:w="100" w:type="dxa"/>
+            </w:tcMar>
+          </w:tcPr>
+          <w:p>
+            <w:r>
+              <w:rPr>
+                <w:sz w:val="20"/>
+                <w:szCs w:val="20"/>
+              </w:rPr>
               <w:lastRenderedPageBreak/>
               <w:t>Partial AUC</w:t>
             </w:r>
@@ -39634,7 +40564,7 @@
                 <w:sz w:val="20"/>
                 <w:szCs w:val="20"/>
               </w:rPr>
-              <w:t>Reference-scaled average bioequivalence (FDA, for highly variable drugs)</w:t>
+              <w:t>Reference-scaled average bioequivalence (FDA, for highly variable drugs): when the within-subject SD of the Reference (sWR) is 0.294 or higher, the criterion scales with sWR, and the point estimate must also lie within 80.00–125.00%. Chosen under Acceptance approach in 2×3×3 and 2×2×4 designs.</w:t>
             </w:r>
           </w:p>
         </w:tc>
@@ -41328,6 +42258,46 @@
         <w:spacing w:after="120" w:line="276" w:lineRule="auto"/>
       </w:pPr>
       <w:r>
+        <w:t>Route says Standard although I chose RSABE: for that metric sWR is below 0.294, so nothing is scaled and the ordinary test against 80.00–125.00% applies. This is not an error. Under ABEL the same happens for AUC, which the EMA never widens, and for Cmax when CVwR is 30% or lower.</w:t>
+      </w:r>
+    </w:p>
+    <w:p>
+      <w:pPr>
+        <w:spacing w:after="120" w:line="276" w:lineRule="auto"/>
+      </w:pPr>
+      <w:r>
+        <w:t>Warning about fewer than 24 subjects: the FDA recommends at least 24 evaluable subjects for RSABE. The app computes the result anyway; discuss the sample size.</w:t>
+      </w:r>
+    </w:p>
+    <w:p>
+      <w:pPr>
+        <w:spacing w:after="120" w:line="276" w:lineRule="auto"/>
+      </w:pPr>
+      <w:r>
+        <w:t>Subjects left out of the RSABE contrasts: a subject who lacks a value in one or more periods cannot form the two contrasts. The number of subjects used is in the downloads (the Subjects columns and the sheet BE_Scaled).</w:t>
+      </w:r>
+    </w:p>
+    <w:p>
+      <w:pPr>
+        <w:spacing w:after="120" w:line="276" w:lineRule="auto"/>
+      </w:pPr>
+      <w:r>
+        <w:t>The run stopped with a covariate message: the message names the column and the subjects. The usual causes are a missing value, text such as “72 kg” or a decimal comma, two values for one subject and a constant column. Fix the file and upload it again, or remove the covariate.</w:t>
+      </w:r>
+    </w:p>
+    <w:p>
+      <w:pPr>
+        <w:spacing w:after="120" w:line="276" w:lineRule="auto"/>
+      </w:pPr>
+      <w:r>
+        <w:t>My approach was cleared: changing any setting clears the results. The approach stays selected unless the design no longer offers it.</w:t>
+      </w:r>
+    </w:p>
+    <w:p>
+      <w:pPr>
+        <w:spacing w:after="120" w:line="276" w:lineRule="auto"/>
+      </w:pPr>
+      <w:r>
         <w:rPr>
           <w:b/>
         </w:rPr>
@@ -42780,6 +43750,14 @@
         <w:spacing w:after="120" w:line="276" w:lineRule="auto"/>
       </w:pPr>
       <w:r>
+        <w:t>Davit BM, Chen ML, Conner DP, et al. Implementation of a reference-scaled average bioequivalence approach for highly variable generic drug products by the US Food and Drug Administration. AAPS J. 2012;14(4):915–924. doi:10.1208/s12248-012-9406-x.</w:t>
+      </w:r>
+    </w:p>
+    <w:p>
+      <w:pPr>
+        <w:spacing w:after="120" w:line="276" w:lineRule="auto"/>
+      </w:pPr>
+      <w:r>
         <w:t>European Medicines Agency. Guideline on the investigation of bioequivalence. CPMP/EWP/QWP/1401/98 Rev. 1, 2010.</w:t>
       </w:r>
     </w:p>
@@ -42804,6 +43782,22 @@
         <w:spacing w:after="120" w:line="276" w:lineRule="auto"/>
       </w:pPr>
       <w:r>
+        <w:t>Fuglsang A, Schütz H, Labes D. Reference datasets for bioequivalence trials in a two-group parallel design. AAPS J. 2015;17(2):400–404. doi:10.1208/s12248-014-9704-6.</w:t>
+      </w:r>
+    </w:p>
+    <w:p>
+      <w:pPr>
+        <w:spacing w:after="120" w:line="276" w:lineRule="auto"/>
+      </w:pPr>
+      <w:r>
+        <w:t>Food and Drug Administration. Statistical Approaches to Establishing Bioequivalence. Guidance for industry, May 2026 (Appendix G: reference-scaled average bioequivalence).</w:t>
+      </w:r>
+    </w:p>
+    <w:p>
+      <w:pPr>
+        <w:spacing w:after="120" w:line="276" w:lineRule="auto"/>
+      </w:pPr>
+      <w:r>
         <w:t xml:space="preserve">Hopefl R, et al. A 2024 update on US FDA implementation of partial area under the curve into bioavailability and bioequivalence assessments. </w:t>
       </w:r>
       <w:r>
@@ -42814,6 +43808,14 @@
       </w:r>
       <w:r>
         <w:t>. 2025;117:1185–1193.</w:t>
+      </w:r>
+    </w:p>
+    <w:p>
+      <w:pPr>
+        <w:spacing w:after="120" w:line="276" w:lineRule="auto"/>
+      </w:pPr>
+      <w:r>
+        <w:t>Howe WG. Approximate confidence limits on the mean of X+Y where X and Y are two tabled independent random variables. J Am Stat Assoc. 1974;69:789–794.</w:t>
       </w:r>
     </w:p>
     <w:p>
@@ -42948,6 +43950,22 @@
       </w:r>
       <w:r>
         <w:t>. 2000;17(10):1278–1283.</w:t>
+      </w:r>
+    </w:p>
+    <w:p>
+      <w:pPr>
+        <w:spacing w:after="120" w:line="276" w:lineRule="auto"/>
+      </w:pPr>
+      <w:r>
+        <w:t>Tothfalusi L, Endrenyi L. An exact procedure for the evaluation of reference-scaled average bioequivalence. AAPS J. 2016;18(2):476–489. doi:10.1208/s12248-016-9873-6.</w:t>
+      </w:r>
+    </w:p>
+    <w:p>
+      <w:pPr>
+        <w:spacing w:after="120" w:line="276" w:lineRule="auto"/>
+      </w:pPr>
+      <w:r>
+        <w:t>Tsiatis AA, Davidian M, Zhang M, Lu X. Covariate adjustment for two-sample treatment comparisons in randomized clinical trials: a principled yet flexible approach. Stat Med. 2008;27(23):4658–4677. doi:10.1002/sim.3113.</w:t>
       </w:r>
     </w:p>
     <w:p>
@@ -44155,7 +45173,7 @@
                 <w:sz w:val="20"/>
                 <w:szCs w:val="20"/>
               </w:rPr>
-              <w:t>For NCA Assistant v1.8.0. New: chapter Working on a Controlled Installation (sign-in, records for review, review signatures, signature sheets, the audit trail page), Tutorial 8, Appendix E on setting up and administering a controlled installation, troubleshooting for controlled installations. The chapter on regulated use describes the controls of a controlled installation and the organisation's responsibilities. Revised within v1.8.0: exclusions with a reason (Leaving Out Data), half-life rules, the sensitivity analysis without exclusions, and one-click example data in the tutorials; after an adversarial review of the app: doses per kg, the trough window for Cτ, AUCτ extrapolation, complete subjects in Method B, pre-dose samples at a negative time, loading the exclusion register again; new chapter Installing NCA Assistant for Regulated Use, with Appendix E as its reference; the chapters Working on a Controlled Installation and Using NCA Assistant in a Regulated Environment merged into one chapter, Working in a Regulated Environment, with new sections on roles, the audit trail, accounts, a study step by step, inspections and good practice; after a review by a PhD student, a senior pharmacometrician, a system engineer and a regulatory compliance officer: How to Use This Manual, 14 glossary terms, which installation for which work, a worked steady-state example, reporting without flagged values, an optional Tutorial 3 question, and server notes on backups, TLS, SELinux, the firewall and the time zone; ten screenshots (Figures 1 to 10).</w:t>
+              <w:t>For NCA Assistant v1.8.0. New: chapter Working on a Controlled Installation (sign-in, records for review, review signatures, signature sheets, the audit trail page), Tutorial 8, Appendix E on setting up and administering a controlled installation, troubleshooting for controlled installations. The chapter on regulated use describes the controls of a controlled installation and the organisation's responsibilities. Revised within v1.8.0: exclusions with a reason (Leaving Out Data), half-life rules, the sensitivity analysis without exclusions, and one-click example data in the tutorials; after an adversarial review of the app: doses per kg, the trough window for Cτ, AUCτ extrapolation, complete subjects in Method B, pre-dose samples at a negative time, loading the exclusion register again; new chapter Installing NCA Assistant for Regulated Use, with Appendix E as its reference; the chapters Working on a Controlled Installation and Using NCA Assistant in a Regulated Environment merged into one chapter, Working in a Regulated Environment, with new sections on roles, the audit trail, accounts, a study step by step, inspections and good practice; after a review by a PhD student, a senior pharmacometrician, a system engineer and a regulatory compliance officer: How to Use This Manual, 14 glossary terms, which installation for which work, a worked steady-state example, reporting without flagged values, an optional Tutorial 3 question, and server notes on backups, TLS, SELinux, the firewall and the time zone; ten screenshots (Figures 1 to 10). Also added to v1.8.0: the Welch interval beside the pooled interval for parallel groups, checked against the eleven published datasets of Fuglsang et al. (2015); the citation of the NCA Assistant article; covariate adjustment for parallel groups; EMA ABEL and FDA RSABE for replicate designs (Acceptance approach); Tutorials 4b and 4c with two example files and four figures; and the scope statement, glossary, troubleshooting and references revised.</w:t>
             </w:r>
           </w:p>
         </w:tc>

</xml_diff>

<commit_message>
Manual document control date, URS traceability check, amber hint near the switch; waiver recorded
Manual revision history dated 30 September 2026 (docx and PDF regenerated).
DOC-06 compares the requirement IDs of the URS document with the coverage list.
The near-switch hint in the scaled explanation is shown in amber. The product
owner waived personal execution and initials of the four critical manual tests
and the cold-read test; the record and protocol section 1.4 say so.
585 automated and 77 manual tests. Text humanized.

Co-Authored-By: Claude Sonnet 5.5 <noreply@anthropic.com>
</commit_message>
<xml_diff>
--- a/NCA_Assistant_User_Manual_v1.9.docx
+++ b/NCA_Assistant_User_Manual_v1.9.docx
@@ -7765,7 +7765,7 @@
         <w:t>Status.</w:t>
       </w:r>
       <w:r>
-        <w:t xml:space="preserve"> NCA Assistant is not validated for your use. The validation package in the repository (a URS, an IQ/OQ/PQ protocol and a test script with 584 automated and 77 manual tests) is a starting point: the developer's test run shows that the code does what the tests check, on the developer's computer. Qualifying the installation you use is your responsibility; the chapters Working in a Regulated Environment and Installing NCA Assistant for Regulated Use explain how.</w:t>
+        <w:t xml:space="preserve"> NCA Assistant is not validated for your use. The validation package in the repository (a URS, an IQ/OQ/PQ protocol and a test script with 585 automated and 77 manual tests) is a starting point: the developer's test run shows that the code does what the tests check, on the developer's computer. Qualifying the installation you use is your responsibility; the chapters Working in a Regulated Environment and Installing NCA Assistant for Regulated Use explain how.</w:t>
       </w:r>
     </w:p>
     <w:p>
@@ -45125,7 +45125,7 @@
                 <w:sz w:val="20"/>
                 <w:szCs w:val="20"/>
               </w:rPr>
-              <w:t>September 2026</w:t>
+              <w:t>30 September 2026</w:t>
             </w:r>
           </w:p>
         </w:tc>

</xml_diff>

<commit_message>
Review 2026-10-07: SAS-style rounding at the limits, multi-group scope sentence, docs pass
- F8: round_half_up() rounds halves away from zero with a relative 1e-12
  allowance, as SAS ROUND does; used by be_limits_pass(), pe_within_limits()
  and the displayed CI and point estimate. 125.005 now rounds to 125.01 and
  fails (ARV-18)
- F9: the scope statement says studies run in several groups (ICH M13A
  2.2.3.5) are not modelled (code, README, manual)
- Docs pass: 596 automated and 77 manual tests (425 critical, 171
  supportive) in the READMEs, version history, manual (1.9, dated
  7 October 2026; PDF re-exported) and protocol; manifest regenerated

Co-Authored-By: Claude Opus 5.5 <noreply@anthropic.com>
</commit_message>
<xml_diff>
--- a/NCA_Assistant_User_Manual_v1.9.docx
+++ b/NCA_Assistant_User_Manual_v1.9.docx
@@ -7737,7 +7737,7 @@
         <w:spacing w:after="120" w:line="276" w:lineRule="auto"/>
       </w:pPr>
       <w:r>
-        <w:t>NCA Assistant is for pharmacokineticists doing non-compartmental analysis, bioequivalence testing and study planning. Average bioequivalence for every design, plus EMA ABEL and FDA RSABE for replicate designs. The FDA scaled test for narrow therapeutic index drugs is for planning only. The public instance and a standard installation have no audit trail, electronic signature or access control; a controlled installation on your organisation's server adds them (Working in a Regulated Environment). The public instance on shinyapps.io is for evaluation and training, with synthetic or pseudonymised data. For regulated work, install a tagged release on your own system and qualify it there with the validation package. Responsibility for the analysis and its conclusions stays with the user. Not for dosing decisions for individual patients.</w:t>
+        <w:t>NCA Assistant is for pharmacokineticists doing non-compartmental analysis, bioequivalence testing and study planning. Average bioequivalence for every design, plus EMA ABEL and FDA RSABE for replicate designs. The FDA scaled test for narrow therapeutic index drugs is for planning only. Studies run in several groups (ICH M13A, 2.2.3.5) are not modelled; a group column in the file is ignored. The public instance and a standard installation have no audit trail, electronic signature or access control; a controlled installation on your organisation's server adds them (Working in a Regulated Environment). The public instance on shinyapps.io is for evaluation and training, with synthetic or pseudonymised data. For regulated work, install a tagged release on your own system and qualify it there with the validation package. Responsibility for the analysis and its conclusions stays with the user. Not for dosing decisions for individual patients.</w:t>
       </w:r>
     </w:p>
     <w:p>
@@ -7765,7 +7765,7 @@
         <w:t>Status.</w:t>
       </w:r>
       <w:r>
-        <w:t xml:space="preserve"> NCA Assistant is not validated for your use. The validation package in the repository (a URS, an IQ/OQ/PQ protocol and a test script with 590 automated and 77 manual tests) is a starting point: the developer's test run shows that the code does what the tests check, on the developer's computer. Qualifying the installation you use is your responsibility; the chapters Working in a Regulated Environment and Installing NCA Assistant for Regulated Use explain how.</w:t>
+        <w:t xml:space="preserve"> NCA Assistant is not validated for your use. The validation package in the repository (a URS, an IQ/OQ/PQ protocol and a test script with 596 automated and 77 manual tests) is a starting point: the developer's test run shows that the code does what the tests check, on the developer's computer. Qualifying the installation you use is your responsibility; the chapters Working in a Regulated Environment and Installing NCA Assistant for Regulated Use explain how.</w:t>
       </w:r>
     </w:p>
     <w:p>
@@ -15288,7 +15288,7 @@
                 <w:sz w:val="20"/>
                 <w:szCs w:val="20"/>
               </w:rPr>
-              <w:t>Before and between measurable → LLOQ/2, after the last → missing</w:t>
+              <w:t>Before and between measurable → LLOQ/2, after the last → missing, pre-dose → 0</w:t>
             </w:r>
           </w:p>
         </w:tc>
@@ -15314,7 +15314,7 @@
                 <w:sz w:val="20"/>
                 <w:szCs w:val="20"/>
               </w:rPr>
-              <w:t>BLQ before and between measurable values = LLOQ/2; after the last = missing; pre-dose = 0</w:t>
+              <w:t>BLQ before and between measurable values = LLOQ/2; after the last = missing; pre-dose = 0; a profile without any measurable value = missing, apart from its pre-dose sample</w:t>
             </w:r>
           </w:p>
         </w:tc>
@@ -15501,7 +15501,7 @@
                 <w:sz w:val="20"/>
                 <w:szCs w:val="20"/>
               </w:rPr>
-              <w:t>Before first quantifiable → LLOQ/2, rest → zero</w:t>
+              <w:t>Before first quantifiable → LLOQ/2, all other BLQ → zero (also in a profile with no quantifiable value)</w:t>
             </w:r>
           </w:p>
         </w:tc>
@@ -27181,7 +27181,7 @@
         <w:spacing w:after="120" w:line="276" w:lineRule="auto"/>
       </w:pPr>
       <w:r>
-        <w:t>Proposed by Yeh and Kwan (1978): the linear formula while concentrations rise and the logarithmic formula while they fall. It is the default in NCA Assistant. Choose the method in the protocol: ICH M13A (2.2.2.2) asks for it to be reported, and the two methods give slightly different results (in Tutorial 4, an AUC to last point ratio of 111.25% with linear-up/log-down and 111.16% with the linear method).</w:t>
+        <w:t>Proposed by Yeh and Kwan (1978): the linear formula while concentrations rise and the logarithmic formula while they fall. It is the default in NCA Assistant. Choose the method in the protocol: ICH M13A (2.2.2.2) asks for it to be reported, and the two methods give slightly different results (in Tutorial 4, an AUC to last point ratio of 111.25% with linear-up/log-down and 111.16% with the linear method). A falling segment that ends at zero (a value set by a BLQ rule) has no logarithm, so the app integrates it with the linear formula.</w:t>
       </w:r>
     </w:p>
     <w:p>
@@ -27613,8 +27613,7 @@
         <w:spacing w:after="120" w:line="276" w:lineRule="auto"/>
       </w:pPr>
       <w:r>
-        <w:lastRenderedPageBreak/>
-        <w:t>where δ is the treatment coefficient on the log scale, SE its standard error from the model, and df the denominator degrees of freedom. The limits are rounded to two decimals before comparison with the acceptance limits, as the EMA guideline (2010, section 4.1.8) and the FDA (2026) ask. Bioequivalence is concluded when the rounded interval lies within the limits (80.00–125.00% by default) and, for wider limits, the point estimate lies within 80.00–125.00%. A verdict is given only for the 90% interval, which corresponds to the two one-sided tests at α = 0.05; at another level the app shows the interval without a verdict. Widened limits apply to Cmax only unless you choose otherwise (Path 6, Widened and Narrowed Limits).</w:t>
+        <w:t>where δ is the treatment coefficient on the log scale, SE its standard error from the model, and df the denominator degrees of freedom. The limits are rounded to two decimals, with halves rounded up as in SAS, before comparison with the acceptance limits, as the EMA guideline (2010, section 4.1.8) and the FDA (2026) ask. Bioequivalence is concluded when the rounded interval lies within the limits (80.00–125.00% by default) and, for wider limits, the point estimate lies within 80.00–125.00%. A verdict is given only for the 90% interval, which corresponds to the two one-sided tests at α = 0.05; at another level the app shows the interval without a verdict. Widened limits apply to Cmax only unless you choose otherwise (Path 6, Widened and Narrowed Limits).</w:t>
       </w:r>
     </w:p>
     <w:p>
@@ -27767,7 +27766,7 @@
         <w:spacing w:after="120" w:line="276" w:lineRule="auto"/>
       </w:pPr>
       <w:r>
-        <w:t>If sWR is 0.294 or higher the route is Scaled: RSABE is met when the criterion bound is at or below 0 and the point estimate, 100·exp(estimate), lies within 80.00–125.00%, compared to four significant figures. Below 0.294 nothing is scaled, and the ordinary test against 80.00–125.00% is used with the model you chose. The limits implied by sWR are exp(±ln 1.25·sWR/0.25).</w:t>
+        <w:t>If sWR is 0.294 or higher the route is Scaled: RSABE is met when the criterion bound is at or below 0 and the point estimate, 100·exp(estimate), lies within 80.00–125.00%, rounded to two decimals at both limits. Below 0.294 nothing is scaled, and the ordinary test against 80.00–125.00% is used with the model you chose. The results then say that this model is not the FDA model for replicate designs (Appendix C), which has separate Test and Reference variances and Satterthwaite degrees of freedom. The limits implied by sWR are exp(±ln 1.25·sWR/0.25).</w:t>
       </w:r>
     </w:p>
     <w:p>
@@ -45125,7 +45124,7 @@
                 <w:sz w:val="20"/>
                 <w:szCs w:val="20"/>
               </w:rPr>
-              <w:t>30 September 2026</w:t>
+              <w:t>7 October 2026</w:t>
             </w:r>
           </w:p>
         </w:tc>

</xml_diff>